<commit_message>
Update .gitignore, enhance documentation, and modify log files for improved clarity and functionality
</commit_message>
<xml_diff>
--- a/Documentation/Doku-Felix.docx
+++ b/Documentation/Doku-Felix.docx
@@ -222,8 +222,17 @@
           <w:b/>
           <w:color w:val="000000"/>
         </w:rPr>
-        <w:t>Höhere Technische Bundeslehr- und Versuchsanstalt Anichstraße</w:t>
-      </w:r>
+        <w:t xml:space="preserve">Höhere Technische Bundeslehr- und Versuchsanstalt </w:t>
+      </w:r>
+      <w:proofErr w:type="spellStart"/>
+      <w:r>
+        <w:rPr>
+          <w:b/>
+          <w:color w:val="000000"/>
+        </w:rPr>
+        <w:t>Anichstraße</w:t>
+      </w:r>
+      <w:proofErr w:type="spellEnd"/>
     </w:p>
     <w:p>
       <w:pPr>
@@ -567,7 +576,21 @@
         <w:rPr>
           <w:color w:val="000000"/>
         </w:rPr>
-        <w:t>Ansprechperson: Gogl Matthias</w:t>
+        <w:t xml:space="preserve">Ansprechperson: </w:t>
+      </w:r>
+      <w:proofErr w:type="spellStart"/>
+      <w:r>
+        <w:rPr>
+          <w:color w:val="000000"/>
+        </w:rPr>
+        <w:t>Gogl</w:t>
+      </w:r>
+      <w:proofErr w:type="spellEnd"/>
+      <w:r>
+        <w:rPr>
+          <w:color w:val="000000"/>
+        </w:rPr>
+        <w:t xml:space="preserve"> Matthias</w:t>
       </w:r>
     </w:p>
     <w:p>
@@ -763,7 +786,21 @@
         <w:rPr>
           <w:color w:val="0000FF"/>
         </w:rPr>
-        <w:t>Text: kurze Zusammenfassung der Diplomarbeit (max ½ Seite)</w:t>
+        <w:t>Text: kurze Zusammenfassung der Diplomarbeit (</w:t>
+      </w:r>
+      <w:proofErr w:type="spellStart"/>
+      <w:r>
+        <w:rPr>
+          <w:color w:val="0000FF"/>
+        </w:rPr>
+        <w:t>max</w:t>
+      </w:r>
+      <w:proofErr w:type="spellEnd"/>
+      <w:r>
+        <w:rPr>
+          <w:color w:val="0000FF"/>
+        </w:rPr>
+        <w:t xml:space="preserve"> ½ Seite)</w:t>
       </w:r>
     </w:p>
     <w:p>
@@ -791,7 +828,21 @@
         <w:rPr>
           <w:color w:val="0000FF"/>
         </w:rPr>
-        <w:t>Text: kurze Zusammenfassung der Diplomarbeit (max ½ Seite)</w:t>
+        <w:t>Text: kurze Zusammenfassung der Diplomarbeit (</w:t>
+      </w:r>
+      <w:proofErr w:type="spellStart"/>
+      <w:r>
+        <w:rPr>
+          <w:color w:val="0000FF"/>
+        </w:rPr>
+        <w:t>max</w:t>
+      </w:r>
+      <w:proofErr w:type="spellEnd"/>
+      <w:r>
+        <w:rPr>
+          <w:color w:val="0000FF"/>
+        </w:rPr>
+        <w:t xml:space="preserve"> ½ Seite)</w:t>
       </w:r>
     </w:p>
     <w:p>
@@ -931,7 +982,15 @@
         <w:pStyle w:val="Text"/>
       </w:pPr>
       <w:r>
-        <w:t xml:space="preserve">Der Sperrvermerk wird dann ins Dokument eingebunden, wenn die Auftraggeberin, der Auftraggeber dies aus verständlichen Gründen vorgibt. WENN ein Sperrvermerk notwendig ist, dann werden die Seiten, die es betrifft in der Bibliotheksversion NICHT in die DA eingebunden (Vorgabe der HTL Anichstraße), die Seiten bleiben LEER, damit beugen wir vor, dass ein gesperrtes Exemplar versehentlich öffentlich ausgegeben werden kann. Die Betreuerin, der Betreuer benötigen für die Notenfindung ein vollständiges Dokument. </w:t>
+        <w:t xml:space="preserve">Der Sperrvermerk wird dann ins Dokument eingebunden, wenn die Auftraggeberin, der Auftraggeber dies aus verständlichen Gründen vorgibt. WENN ein Sperrvermerk notwendig ist, dann werden die Seiten, die es betrifft in der Bibliotheksversion NICHT in die DA eingebunden (Vorgabe der HTL </w:t>
+      </w:r>
+      <w:proofErr w:type="spellStart"/>
+      <w:r>
+        <w:t>Anichstraße</w:t>
+      </w:r>
+      <w:proofErr w:type="spellEnd"/>
+      <w:r>
+        <w:t xml:space="preserve">), die Seiten bleiben LEER, damit beugen wir vor, dass ein gesperrtes Exemplar versehentlich öffentlich ausgegeben werden kann. Die Betreuerin, der Betreuer benötigen für die Notenfindung ein vollständiges Dokument. </w:t>
       </w:r>
     </w:p>
     <w:p>
@@ -1023,7 +1082,7 @@
             </w:rPr>
             <w:fldChar w:fldCharType="separate"/>
           </w:r>
-          <w:hyperlink w:anchor="_Toc221019677" w:history="1">
+          <w:hyperlink w:anchor="_Toc221613868" w:history="1">
             <w:r>
               <w:rPr>
                 <w:rStyle w:val="Hyperlink"/>
@@ -1069,7 +1128,7 @@
                 <w:noProof/>
                 <w:webHidden/>
               </w:rPr>
-              <w:instrText xml:space="preserve"> PAGEREF _Toc221019677 \h </w:instrText>
+              <w:instrText xml:space="preserve"> PAGEREF _Toc221613868 \h </w:instrText>
             </w:r>
             <w:r>
               <w:rPr>
@@ -1117,7 +1176,7 @@
               <w14:ligatures w14:val="standardContextual"/>
             </w:rPr>
           </w:pPr>
-          <w:hyperlink w:anchor="_Toc221019678" w:history="1">
+          <w:hyperlink w:anchor="_Toc221613869" w:history="1">
             <w:r>
               <w:rPr>
                 <w:rStyle w:val="Hyperlink"/>
@@ -1163,7 +1222,7 @@
                 <w:noProof/>
                 <w:webHidden/>
               </w:rPr>
-              <w:instrText xml:space="preserve"> PAGEREF _Toc221019678 \h </w:instrText>
+              <w:instrText xml:space="preserve"> PAGEREF _Toc221613869 \h </w:instrText>
             </w:r>
             <w:r>
               <w:rPr>
@@ -1211,7 +1270,7 @@
               <w14:ligatures w14:val="standardContextual"/>
             </w:rPr>
           </w:pPr>
-          <w:hyperlink w:anchor="_Toc221019679" w:history="1">
+          <w:hyperlink w:anchor="_Toc221613870" w:history="1">
             <w:r>
               <w:rPr>
                 <w:rStyle w:val="Hyperlink"/>
@@ -1257,7 +1316,7 @@
                 <w:noProof/>
                 <w:webHidden/>
               </w:rPr>
-              <w:instrText xml:space="preserve"> PAGEREF _Toc221019679 \h </w:instrText>
+              <w:instrText xml:space="preserve"> PAGEREF _Toc221613870 \h </w:instrText>
             </w:r>
             <w:r>
               <w:rPr>
@@ -1301,7 +1360,7 @@
               <w14:ligatures w14:val="standardContextual"/>
             </w:rPr>
           </w:pPr>
-          <w:hyperlink w:anchor="_Toc221019680" w:history="1">
+          <w:hyperlink w:anchor="_Toc221613871" w:history="1">
             <w:r>
               <w:rPr>
                 <w:rStyle w:val="Hyperlink"/>
@@ -1347,7 +1406,7 @@
                 <w:noProof/>
                 <w:webHidden/>
               </w:rPr>
-              <w:instrText xml:space="preserve"> PAGEREF _Toc221019680 \h </w:instrText>
+              <w:instrText xml:space="preserve"> PAGEREF _Toc221613871 \h </w:instrText>
             </w:r>
             <w:r>
               <w:rPr>
@@ -1395,7 +1454,7 @@
               <w14:ligatures w14:val="standardContextual"/>
             </w:rPr>
           </w:pPr>
-          <w:hyperlink w:anchor="_Toc221019681" w:history="1">
+          <w:hyperlink w:anchor="_Toc221613872" w:history="1">
             <w:r>
               <w:rPr>
                 <w:rStyle w:val="Hyperlink"/>
@@ -1441,7 +1500,7 @@
                 <w:noProof/>
                 <w:webHidden/>
               </w:rPr>
-              <w:instrText xml:space="preserve"> PAGEREF _Toc221019681 \h </w:instrText>
+              <w:instrText xml:space="preserve"> PAGEREF _Toc221613872 \h </w:instrText>
             </w:r>
             <w:r>
               <w:rPr>
@@ -1489,7 +1548,7 @@
               <w14:ligatures w14:val="standardContextual"/>
             </w:rPr>
           </w:pPr>
-          <w:hyperlink w:anchor="_Toc221019682" w:history="1">
+          <w:hyperlink w:anchor="_Toc221613873" w:history="1">
             <w:r>
               <w:rPr>
                 <w:rStyle w:val="Hyperlink"/>
@@ -1535,7 +1594,7 @@
                 <w:noProof/>
                 <w:webHidden/>
               </w:rPr>
-              <w:instrText xml:space="preserve"> PAGEREF _Toc221019682 \h </w:instrText>
+              <w:instrText xml:space="preserve"> PAGEREF _Toc221613873 \h </w:instrText>
             </w:r>
             <w:r>
               <w:rPr>
@@ -1583,7 +1642,7 @@
               <w14:ligatures w14:val="standardContextual"/>
             </w:rPr>
           </w:pPr>
-          <w:hyperlink w:anchor="_Toc221019683" w:history="1">
+          <w:hyperlink w:anchor="_Toc221613874" w:history="1">
             <w:r>
               <w:rPr>
                 <w:rStyle w:val="Hyperlink"/>
@@ -1637,7 +1696,7 @@
                 <w:noProof/>
                 <w:webHidden/>
               </w:rPr>
-              <w:instrText xml:space="preserve"> PAGEREF _Toc221019683 \h </w:instrText>
+              <w:instrText xml:space="preserve"> PAGEREF _Toc221613874 \h </w:instrText>
             </w:r>
             <w:r>
               <w:rPr>
@@ -1685,7 +1744,7 @@
               <w14:ligatures w14:val="standardContextual"/>
             </w:rPr>
           </w:pPr>
-          <w:hyperlink w:anchor="_Toc221019684" w:history="1">
+          <w:hyperlink w:anchor="_Toc221613875" w:history="1">
             <w:r>
               <w:rPr>
                 <w:rStyle w:val="Hyperlink"/>
@@ -1731,7 +1790,7 @@
                 <w:noProof/>
                 <w:webHidden/>
               </w:rPr>
-              <w:instrText xml:space="preserve"> PAGEREF _Toc221019684 \h </w:instrText>
+              <w:instrText xml:space="preserve"> PAGEREF _Toc221613875 \h </w:instrText>
             </w:r>
             <w:r>
               <w:rPr>
@@ -1779,7 +1838,7 @@
               <w14:ligatures w14:val="standardContextual"/>
             </w:rPr>
           </w:pPr>
-          <w:hyperlink w:anchor="_Toc221019685" w:history="1">
+          <w:hyperlink w:anchor="_Toc221613876" w:history="1">
             <w:r>
               <w:rPr>
                 <w:rStyle w:val="Hyperlink"/>
@@ -1825,7 +1884,7 @@
                 <w:noProof/>
                 <w:webHidden/>
               </w:rPr>
-              <w:instrText xml:space="preserve"> PAGEREF _Toc221019685 \h </w:instrText>
+              <w:instrText xml:space="preserve"> PAGEREF _Toc221613876 \h </w:instrText>
             </w:r>
             <w:r>
               <w:rPr>
@@ -1873,7 +1932,7 @@
               <w14:ligatures w14:val="standardContextual"/>
             </w:rPr>
           </w:pPr>
-          <w:hyperlink w:anchor="_Toc221019686" w:history="1">
+          <w:hyperlink w:anchor="_Toc221613877" w:history="1">
             <w:r>
               <w:rPr>
                 <w:rStyle w:val="Hyperlink"/>
@@ -1919,7 +1978,7 @@
                 <w:noProof/>
                 <w:webHidden/>
               </w:rPr>
-              <w:instrText xml:space="preserve"> PAGEREF _Toc221019686 \h </w:instrText>
+              <w:instrText xml:space="preserve"> PAGEREF _Toc221613877 \h </w:instrText>
             </w:r>
             <w:r>
               <w:rPr>
@@ -1967,7 +2026,7 @@
               <w14:ligatures w14:val="standardContextual"/>
             </w:rPr>
           </w:pPr>
-          <w:hyperlink w:anchor="_Toc221019687" w:history="1">
+          <w:hyperlink w:anchor="_Toc221613878" w:history="1">
             <w:r>
               <w:rPr>
                 <w:rStyle w:val="Hyperlink"/>
@@ -2013,7 +2072,7 @@
                 <w:noProof/>
                 <w:webHidden/>
               </w:rPr>
-              <w:instrText xml:space="preserve"> PAGEREF _Toc221019687 \h </w:instrText>
+              <w:instrText xml:space="preserve"> PAGEREF _Toc221613878 \h </w:instrText>
             </w:r>
             <w:r>
               <w:rPr>
@@ -2061,7 +2120,7 @@
               <w14:ligatures w14:val="standardContextual"/>
             </w:rPr>
           </w:pPr>
-          <w:hyperlink w:anchor="_Toc221019688" w:history="1">
+          <w:hyperlink w:anchor="_Toc221613879" w:history="1">
             <w:r>
               <w:rPr>
                 <w:rStyle w:val="Hyperlink"/>
@@ -2107,7 +2166,7 @@
                 <w:noProof/>
                 <w:webHidden/>
               </w:rPr>
-              <w:instrText xml:space="preserve"> PAGEREF _Toc221019688 \h </w:instrText>
+              <w:instrText xml:space="preserve"> PAGEREF _Toc221613879 \h </w:instrText>
             </w:r>
             <w:r>
               <w:rPr>
@@ -2151,7 +2210,7 @@
               <w14:ligatures w14:val="standardContextual"/>
             </w:rPr>
           </w:pPr>
-          <w:hyperlink w:anchor="_Toc221019689" w:history="1">
+          <w:hyperlink w:anchor="_Toc221613880" w:history="1">
             <w:r>
               <w:rPr>
                 <w:rStyle w:val="Hyperlink"/>
@@ -2197,7 +2256,7 @@
                 <w:noProof/>
                 <w:webHidden/>
               </w:rPr>
-              <w:instrText xml:space="preserve"> PAGEREF _Toc221019689 \h </w:instrText>
+              <w:instrText xml:space="preserve"> PAGEREF _Toc221613880 \h </w:instrText>
             </w:r>
             <w:r>
               <w:rPr>
@@ -2245,7 +2304,7 @@
               <w14:ligatures w14:val="standardContextual"/>
             </w:rPr>
           </w:pPr>
-          <w:hyperlink w:anchor="_Toc221019690" w:history="1">
+          <w:hyperlink w:anchor="_Toc221613881" w:history="1">
             <w:r>
               <w:rPr>
                 <w:rStyle w:val="Hyperlink"/>
@@ -2291,7 +2350,7 @@
                 <w:noProof/>
                 <w:webHidden/>
               </w:rPr>
-              <w:instrText xml:space="preserve"> PAGEREF _Toc221019690 \h </w:instrText>
+              <w:instrText xml:space="preserve"> PAGEREF _Toc221613881 \h </w:instrText>
             </w:r>
             <w:r>
               <w:rPr>
@@ -2339,7 +2398,7 @@
               <w14:ligatures w14:val="standardContextual"/>
             </w:rPr>
           </w:pPr>
-          <w:hyperlink w:anchor="_Toc221019691" w:history="1">
+          <w:hyperlink w:anchor="_Toc221613882" w:history="1">
             <w:r>
               <w:rPr>
                 <w:rStyle w:val="Hyperlink"/>
@@ -2385,7 +2444,7 @@
                 <w:noProof/>
                 <w:webHidden/>
               </w:rPr>
-              <w:instrText xml:space="preserve"> PAGEREF _Toc221019691 \h </w:instrText>
+              <w:instrText xml:space="preserve"> PAGEREF _Toc221613882 \h </w:instrText>
             </w:r>
             <w:r>
               <w:rPr>
@@ -2405,7 +2464,7 @@
                 <w:noProof/>
                 <w:webHidden/>
               </w:rPr>
-              <w:t>6</w:t>
+              <w:t>7</w:t>
             </w:r>
             <w:r>
               <w:rPr>
@@ -2433,7 +2492,7 @@
               <w14:ligatures w14:val="standardContextual"/>
             </w:rPr>
           </w:pPr>
-          <w:hyperlink w:anchor="_Toc221019692" w:history="1">
+          <w:hyperlink w:anchor="_Toc221613883" w:history="1">
             <w:r>
               <w:rPr>
                 <w:rStyle w:val="Hyperlink"/>
@@ -2456,17 +2515,17 @@
             <w:r>
               <w:rPr>
                 <w:rStyle w:val="Hyperlink"/>
-                <w:i/>
-                <w:noProof/>
-              </w:rPr>
-              <w:t>Optional</w:t>
+                <w:noProof/>
+              </w:rPr>
+              <w:t>Tiefenmessung mit Stereo</w:t>
             </w:r>
             <w:r>
               <w:rPr>
                 <w:rStyle w:val="Hyperlink"/>
                 <w:noProof/>
               </w:rPr>
-              <w:t>: Überschrift der 3. Ebene (FV = Überschrift3)</w:t>
+              <w:noBreakHyphen/>
+              <w:t>Vision und Tiefenkameras</w:t>
             </w:r>
             <w:r>
               <w:rPr>
@@ -2487,7 +2546,7 @@
                 <w:noProof/>
                 <w:webHidden/>
               </w:rPr>
-              <w:instrText xml:space="preserve"> PAGEREF _Toc221019692 \h </w:instrText>
+              <w:instrText xml:space="preserve"> PAGEREF _Toc221613883 \h </w:instrText>
             </w:r>
             <w:r>
               <w:rPr>
@@ -2507,7 +2566,7 @@
                 <w:noProof/>
                 <w:webHidden/>
               </w:rPr>
-              <w:t>6</w:t>
+              <w:t>7</w:t>
             </w:r>
             <w:r>
               <w:rPr>
@@ -2535,7 +2594,7 @@
               <w14:ligatures w14:val="standardContextual"/>
             </w:rPr>
           </w:pPr>
-          <w:hyperlink w:anchor="_Toc221019693" w:history="1">
+          <w:hyperlink w:anchor="_Toc221613884" w:history="1">
             <w:r>
               <w:rPr>
                 <w:rStyle w:val="Hyperlink"/>
@@ -2560,6 +2619,491 @@
                 <w:rStyle w:val="Hyperlink"/>
                 <w:noProof/>
               </w:rPr>
+              <w:t>Punktwolken und dreidimensionale Geometrie</w:t>
+            </w:r>
+            <w:r>
+              <w:rPr>
+                <w:noProof/>
+                <w:webHidden/>
+              </w:rPr>
+              <w:tab/>
+            </w:r>
+            <w:r>
+              <w:rPr>
+                <w:noProof/>
+                <w:webHidden/>
+              </w:rPr>
+              <w:fldChar w:fldCharType="begin"/>
+            </w:r>
+            <w:r>
+              <w:rPr>
+                <w:noProof/>
+                <w:webHidden/>
+              </w:rPr>
+              <w:instrText xml:space="preserve"> PAGEREF _Toc221613884 \h </w:instrText>
+            </w:r>
+            <w:r>
+              <w:rPr>
+                <w:noProof/>
+                <w:webHidden/>
+              </w:rPr>
+            </w:r>
+            <w:r>
+              <w:rPr>
+                <w:noProof/>
+                <w:webHidden/>
+              </w:rPr>
+              <w:fldChar w:fldCharType="separate"/>
+            </w:r>
+            <w:r>
+              <w:rPr>
+                <w:noProof/>
+                <w:webHidden/>
+              </w:rPr>
+              <w:t>8</w:t>
+            </w:r>
+            <w:r>
+              <w:rPr>
+                <w:noProof/>
+                <w:webHidden/>
+              </w:rPr>
+              <w:fldChar w:fldCharType="end"/>
+            </w:r>
+          </w:hyperlink>
+        </w:p>
+        <w:p>
+          <w:pPr>
+            <w:pStyle w:val="Verzeichnis3"/>
+            <w:tabs>
+              <w:tab w:val="left" w:pos="1200"/>
+              <w:tab w:val="right" w:leader="dot" w:pos="9016"/>
+            </w:tabs>
+            <w:rPr>
+              <w:rFonts w:asciiTheme="minorHAnsi" w:eastAsiaTheme="minorEastAsia" w:hAnsiTheme="minorHAnsi" w:cstheme="minorBidi"/>
+              <w:noProof/>
+              <w:kern w:val="2"/>
+              <w:sz w:val="24"/>
+              <w:szCs w:val="24"/>
+              <w:lang w:val="de-AT" w:eastAsia="de-AT"/>
+              <w14:ligatures w14:val="standardContextual"/>
+            </w:rPr>
+          </w:pPr>
+          <w:hyperlink w:anchor="_Toc221613885" w:history="1">
+            <w:r>
+              <w:rPr>
+                <w:rStyle w:val="Hyperlink"/>
+                <w:noProof/>
+                <w:lang w:val="de-AT"/>
+              </w:rPr>
+              <w:t>3.2.3</w:t>
+            </w:r>
+            <w:r>
+              <w:rPr>
+                <w:rFonts w:asciiTheme="minorHAnsi" w:eastAsiaTheme="minorEastAsia" w:hAnsiTheme="minorHAnsi" w:cstheme="minorBidi"/>
+                <w:noProof/>
+                <w:kern w:val="2"/>
+                <w:sz w:val="24"/>
+                <w:szCs w:val="24"/>
+                <w:lang w:val="de-AT" w:eastAsia="de-AT"/>
+                <w14:ligatures w14:val="standardContextual"/>
+              </w:rPr>
+              <w:tab/>
+            </w:r>
+            <w:r>
+              <w:rPr>
+                <w:rStyle w:val="Hyperlink"/>
+                <w:noProof/>
+                <w:lang w:val="de-AT"/>
+              </w:rPr>
+              <w:t>Grundlagen der Bildverarbeitung und Code</w:t>
+            </w:r>
+            <w:r>
+              <w:rPr>
+                <w:rStyle w:val="Hyperlink"/>
+                <w:noProof/>
+                <w:lang w:val="de-AT"/>
+              </w:rPr>
+              <w:noBreakHyphen/>
+              <w:t>Erkennung</w:t>
+            </w:r>
+            <w:r>
+              <w:rPr>
+                <w:noProof/>
+                <w:webHidden/>
+              </w:rPr>
+              <w:tab/>
+            </w:r>
+            <w:r>
+              <w:rPr>
+                <w:noProof/>
+                <w:webHidden/>
+              </w:rPr>
+              <w:fldChar w:fldCharType="begin"/>
+            </w:r>
+            <w:r>
+              <w:rPr>
+                <w:noProof/>
+                <w:webHidden/>
+              </w:rPr>
+              <w:instrText xml:space="preserve"> PAGEREF _Toc221613885 \h </w:instrText>
+            </w:r>
+            <w:r>
+              <w:rPr>
+                <w:noProof/>
+                <w:webHidden/>
+              </w:rPr>
+            </w:r>
+            <w:r>
+              <w:rPr>
+                <w:noProof/>
+                <w:webHidden/>
+              </w:rPr>
+              <w:fldChar w:fldCharType="separate"/>
+            </w:r>
+            <w:r>
+              <w:rPr>
+                <w:noProof/>
+                <w:webHidden/>
+              </w:rPr>
+              <w:t>9</w:t>
+            </w:r>
+            <w:r>
+              <w:rPr>
+                <w:noProof/>
+                <w:webHidden/>
+              </w:rPr>
+              <w:fldChar w:fldCharType="end"/>
+            </w:r>
+          </w:hyperlink>
+        </w:p>
+        <w:p>
+          <w:pPr>
+            <w:pStyle w:val="Verzeichnis3"/>
+            <w:tabs>
+              <w:tab w:val="left" w:pos="1200"/>
+              <w:tab w:val="right" w:leader="dot" w:pos="9016"/>
+            </w:tabs>
+            <w:rPr>
+              <w:rFonts w:asciiTheme="minorHAnsi" w:eastAsiaTheme="minorEastAsia" w:hAnsiTheme="minorHAnsi" w:cstheme="minorBidi"/>
+              <w:noProof/>
+              <w:kern w:val="2"/>
+              <w:sz w:val="24"/>
+              <w:szCs w:val="24"/>
+              <w:lang w:val="de-AT" w:eastAsia="de-AT"/>
+              <w14:ligatures w14:val="standardContextual"/>
+            </w:rPr>
+          </w:pPr>
+          <w:hyperlink w:anchor="_Toc221613886" w:history="1">
+            <w:r>
+              <w:rPr>
+                <w:rStyle w:val="Hyperlink"/>
+                <w:noProof/>
+                <w:lang w:val="de-AT"/>
+              </w:rPr>
+              <w:t>3.2.4</w:t>
+            </w:r>
+            <w:r>
+              <w:rPr>
+                <w:rFonts w:asciiTheme="minorHAnsi" w:eastAsiaTheme="minorEastAsia" w:hAnsiTheme="minorHAnsi" w:cstheme="minorBidi"/>
+                <w:noProof/>
+                <w:kern w:val="2"/>
+                <w:sz w:val="24"/>
+                <w:szCs w:val="24"/>
+                <w:lang w:val="de-AT" w:eastAsia="de-AT"/>
+                <w14:ligatures w14:val="standardContextual"/>
+              </w:rPr>
+              <w:tab/>
+            </w:r>
+            <w:r>
+              <w:rPr>
+                <w:rStyle w:val="Hyperlink"/>
+                <w:noProof/>
+                <w:lang w:val="de-AT"/>
+              </w:rPr>
+              <w:t>Gewichtserfassung - Systemübersicht</w:t>
+            </w:r>
+            <w:r>
+              <w:rPr>
+                <w:noProof/>
+                <w:webHidden/>
+              </w:rPr>
+              <w:tab/>
+            </w:r>
+            <w:r>
+              <w:rPr>
+                <w:noProof/>
+                <w:webHidden/>
+              </w:rPr>
+              <w:fldChar w:fldCharType="begin"/>
+            </w:r>
+            <w:r>
+              <w:rPr>
+                <w:noProof/>
+                <w:webHidden/>
+              </w:rPr>
+              <w:instrText xml:space="preserve"> PAGEREF _Toc221613886 \h </w:instrText>
+            </w:r>
+            <w:r>
+              <w:rPr>
+                <w:noProof/>
+                <w:webHidden/>
+              </w:rPr>
+            </w:r>
+            <w:r>
+              <w:rPr>
+                <w:noProof/>
+                <w:webHidden/>
+              </w:rPr>
+              <w:fldChar w:fldCharType="separate"/>
+            </w:r>
+            <w:r>
+              <w:rPr>
+                <w:noProof/>
+                <w:webHidden/>
+              </w:rPr>
+              <w:t>10</w:t>
+            </w:r>
+            <w:r>
+              <w:rPr>
+                <w:noProof/>
+                <w:webHidden/>
+              </w:rPr>
+              <w:fldChar w:fldCharType="end"/>
+            </w:r>
+          </w:hyperlink>
+        </w:p>
+        <w:p>
+          <w:pPr>
+            <w:pStyle w:val="Verzeichnis3"/>
+            <w:tabs>
+              <w:tab w:val="left" w:pos="1200"/>
+              <w:tab w:val="right" w:leader="dot" w:pos="9016"/>
+            </w:tabs>
+            <w:rPr>
+              <w:rFonts w:asciiTheme="minorHAnsi" w:eastAsiaTheme="minorEastAsia" w:hAnsiTheme="minorHAnsi" w:cstheme="minorBidi"/>
+              <w:noProof/>
+              <w:kern w:val="2"/>
+              <w:sz w:val="24"/>
+              <w:szCs w:val="24"/>
+              <w:lang w:val="de-AT" w:eastAsia="de-AT"/>
+              <w14:ligatures w14:val="standardContextual"/>
+            </w:rPr>
+          </w:pPr>
+          <w:hyperlink w:anchor="_Toc221613887" w:history="1">
+            <w:r>
+              <w:rPr>
+                <w:rStyle w:val="Hyperlink"/>
+                <w:noProof/>
+                <w:lang w:val="de-AT"/>
+              </w:rPr>
+              <w:t>3.2.5</w:t>
+            </w:r>
+            <w:r>
+              <w:rPr>
+                <w:rFonts w:asciiTheme="minorHAnsi" w:eastAsiaTheme="minorEastAsia" w:hAnsiTheme="minorHAnsi" w:cstheme="minorBidi"/>
+                <w:noProof/>
+                <w:kern w:val="2"/>
+                <w:sz w:val="24"/>
+                <w:szCs w:val="24"/>
+                <w:lang w:val="de-AT" w:eastAsia="de-AT"/>
+                <w14:ligatures w14:val="standardContextual"/>
+              </w:rPr>
+              <w:tab/>
+            </w:r>
+            <w:r>
+              <w:rPr>
+                <w:rStyle w:val="Hyperlink"/>
+                <w:noProof/>
+                <w:lang w:val="de-AT"/>
+              </w:rPr>
+              <w:t>Systemintegration und Datenverarbeitung</w:t>
+            </w:r>
+            <w:r>
+              <w:rPr>
+                <w:noProof/>
+                <w:webHidden/>
+              </w:rPr>
+              <w:tab/>
+            </w:r>
+            <w:r>
+              <w:rPr>
+                <w:noProof/>
+                <w:webHidden/>
+              </w:rPr>
+              <w:fldChar w:fldCharType="begin"/>
+            </w:r>
+            <w:r>
+              <w:rPr>
+                <w:noProof/>
+                <w:webHidden/>
+              </w:rPr>
+              <w:instrText xml:space="preserve"> PAGEREF _Toc221613887 \h </w:instrText>
+            </w:r>
+            <w:r>
+              <w:rPr>
+                <w:noProof/>
+                <w:webHidden/>
+              </w:rPr>
+            </w:r>
+            <w:r>
+              <w:rPr>
+                <w:noProof/>
+                <w:webHidden/>
+              </w:rPr>
+              <w:fldChar w:fldCharType="separate"/>
+            </w:r>
+            <w:r>
+              <w:rPr>
+                <w:noProof/>
+                <w:webHidden/>
+              </w:rPr>
+              <w:t>11</w:t>
+            </w:r>
+            <w:r>
+              <w:rPr>
+                <w:noProof/>
+                <w:webHidden/>
+              </w:rPr>
+              <w:fldChar w:fldCharType="end"/>
+            </w:r>
+          </w:hyperlink>
+        </w:p>
+        <w:p>
+          <w:pPr>
+            <w:pStyle w:val="Verzeichnis3"/>
+            <w:tabs>
+              <w:tab w:val="left" w:pos="1200"/>
+              <w:tab w:val="right" w:leader="dot" w:pos="9016"/>
+            </w:tabs>
+            <w:rPr>
+              <w:rFonts w:asciiTheme="minorHAnsi" w:eastAsiaTheme="minorEastAsia" w:hAnsiTheme="minorHAnsi" w:cstheme="minorBidi"/>
+              <w:noProof/>
+              <w:kern w:val="2"/>
+              <w:sz w:val="24"/>
+              <w:szCs w:val="24"/>
+              <w:lang w:val="de-AT" w:eastAsia="de-AT"/>
+              <w14:ligatures w14:val="standardContextual"/>
+            </w:rPr>
+          </w:pPr>
+          <w:hyperlink w:anchor="_Toc221613888" w:history="1">
+            <w:r>
+              <w:rPr>
+                <w:rStyle w:val="Hyperlink"/>
+                <w:noProof/>
+              </w:rPr>
+              <w:t>3.2.6</w:t>
+            </w:r>
+            <w:r>
+              <w:rPr>
+                <w:rFonts w:asciiTheme="minorHAnsi" w:eastAsiaTheme="minorEastAsia" w:hAnsiTheme="minorHAnsi" w:cstheme="minorBidi"/>
+                <w:noProof/>
+                <w:kern w:val="2"/>
+                <w:sz w:val="24"/>
+                <w:szCs w:val="24"/>
+                <w:lang w:val="de-AT" w:eastAsia="de-AT"/>
+                <w14:ligatures w14:val="standardContextual"/>
+              </w:rPr>
+              <w:tab/>
+            </w:r>
+            <w:r>
+              <w:rPr>
+                <w:rStyle w:val="Hyperlink"/>
+                <w:noProof/>
+              </w:rPr>
+              <w:t>Verwendung von Literatur, Internetquellen und KI</w:t>
+            </w:r>
+            <w:r>
+              <w:rPr>
+                <w:noProof/>
+                <w:webHidden/>
+              </w:rPr>
+              <w:tab/>
+            </w:r>
+            <w:r>
+              <w:rPr>
+                <w:noProof/>
+                <w:webHidden/>
+              </w:rPr>
+              <w:fldChar w:fldCharType="begin"/>
+            </w:r>
+            <w:r>
+              <w:rPr>
+                <w:noProof/>
+                <w:webHidden/>
+              </w:rPr>
+              <w:instrText xml:space="preserve"> PAGEREF _Toc221613888 \h </w:instrText>
+            </w:r>
+            <w:r>
+              <w:rPr>
+                <w:noProof/>
+                <w:webHidden/>
+              </w:rPr>
+            </w:r>
+            <w:r>
+              <w:rPr>
+                <w:noProof/>
+                <w:webHidden/>
+              </w:rPr>
+              <w:fldChar w:fldCharType="separate"/>
+            </w:r>
+            <w:r>
+              <w:rPr>
+                <w:noProof/>
+                <w:webHidden/>
+              </w:rPr>
+              <w:t>12</w:t>
+            </w:r>
+            <w:r>
+              <w:rPr>
+                <w:noProof/>
+                <w:webHidden/>
+              </w:rPr>
+              <w:fldChar w:fldCharType="end"/>
+            </w:r>
+          </w:hyperlink>
+        </w:p>
+        <w:p>
+          <w:pPr>
+            <w:pStyle w:val="Verzeichnis3"/>
+            <w:tabs>
+              <w:tab w:val="left" w:pos="1200"/>
+              <w:tab w:val="right" w:leader="dot" w:pos="9016"/>
+            </w:tabs>
+            <w:rPr>
+              <w:rFonts w:asciiTheme="minorHAnsi" w:eastAsiaTheme="minorEastAsia" w:hAnsiTheme="minorHAnsi" w:cstheme="minorBidi"/>
+              <w:noProof/>
+              <w:kern w:val="2"/>
+              <w:sz w:val="24"/>
+              <w:szCs w:val="24"/>
+              <w:lang w:val="de-AT" w:eastAsia="de-AT"/>
+              <w14:ligatures w14:val="standardContextual"/>
+            </w:rPr>
+          </w:pPr>
+          <w:hyperlink w:anchor="_Toc221613889" w:history="1">
+            <w:r>
+              <w:rPr>
+                <w:rStyle w:val="Hyperlink"/>
+                <w:noProof/>
+              </w:rPr>
+              <w:t>3.2.7</w:t>
+            </w:r>
+            <w:r>
+              <w:rPr>
+                <w:rFonts w:asciiTheme="minorHAnsi" w:eastAsiaTheme="minorEastAsia" w:hAnsiTheme="minorHAnsi" w:cstheme="minorBidi"/>
+                <w:noProof/>
+                <w:kern w:val="2"/>
+                <w:sz w:val="24"/>
+                <w:szCs w:val="24"/>
+                <w:lang w:val="de-AT" w:eastAsia="de-AT"/>
+                <w14:ligatures w14:val="standardContextual"/>
+              </w:rPr>
+              <w:tab/>
+            </w:r>
+            <w:r>
+              <w:rPr>
+                <w:rStyle w:val="Hyperlink"/>
+                <w:noProof/>
+              </w:rPr>
               <w:t>Weitere Hinweise</w:t>
             </w:r>
             <w:r>
@@ -2581,7 +3125,7 @@
                 <w:noProof/>
                 <w:webHidden/>
               </w:rPr>
-              <w:instrText xml:space="preserve"> PAGEREF _Toc221019693 \h </w:instrText>
+              <w:instrText xml:space="preserve"> PAGEREF _Toc221613889 \h </w:instrText>
             </w:r>
             <w:r>
               <w:rPr>
@@ -2601,7 +3145,7 @@
                 <w:noProof/>
                 <w:webHidden/>
               </w:rPr>
-              <w:t>6</w:t>
+              <w:t>12</w:t>
             </w:r>
             <w:r>
               <w:rPr>
@@ -2629,7 +3173,7 @@
               <w14:ligatures w14:val="standardContextual"/>
             </w:rPr>
           </w:pPr>
-          <w:hyperlink w:anchor="_Toc221019694" w:history="1">
+          <w:hyperlink w:anchor="_Toc221613890" w:history="1">
             <w:r>
               <w:rPr>
                 <w:rStyle w:val="Hyperlink"/>
@@ -2675,7 +3219,7 @@
                 <w:noProof/>
                 <w:webHidden/>
               </w:rPr>
-              <w:instrText xml:space="preserve"> PAGEREF _Toc221019694 \h </w:instrText>
+              <w:instrText xml:space="preserve"> PAGEREF _Toc221613890 \h </w:instrText>
             </w:r>
             <w:r>
               <w:rPr>
@@ -2695,7 +3239,7 @@
                 <w:noProof/>
                 <w:webHidden/>
               </w:rPr>
-              <w:t>8</w:t>
+              <w:t>14</w:t>
             </w:r>
             <w:r>
               <w:rPr>
@@ -2723,7 +3267,7 @@
               <w14:ligatures w14:val="standardContextual"/>
             </w:rPr>
           </w:pPr>
-          <w:hyperlink w:anchor="_Toc221019695" w:history="1">
+          <w:hyperlink w:anchor="_Toc221613891" w:history="1">
             <w:r>
               <w:rPr>
                 <w:rStyle w:val="Hyperlink"/>
@@ -2769,7 +3313,7 @@
                 <w:noProof/>
                 <w:webHidden/>
               </w:rPr>
-              <w:instrText xml:space="preserve"> PAGEREF _Toc221019695 \h </w:instrText>
+              <w:instrText xml:space="preserve"> PAGEREF _Toc221613891 \h </w:instrText>
             </w:r>
             <w:r>
               <w:rPr>
@@ -2789,7 +3333,7 @@
                 <w:noProof/>
                 <w:webHidden/>
               </w:rPr>
-              <w:t>9</w:t>
+              <w:t>14</w:t>
             </w:r>
             <w:r>
               <w:rPr>
@@ -2817,7 +3361,7 @@
               <w14:ligatures w14:val="standardContextual"/>
             </w:rPr>
           </w:pPr>
-          <w:hyperlink w:anchor="_Toc221019696" w:history="1">
+          <w:hyperlink w:anchor="_Toc221613892" w:history="1">
             <w:r>
               <w:rPr>
                 <w:rStyle w:val="Hyperlink"/>
@@ -2863,7 +3407,7 @@
                 <w:noProof/>
                 <w:webHidden/>
               </w:rPr>
-              <w:instrText xml:space="preserve"> PAGEREF _Toc221019696 \h </w:instrText>
+              <w:instrText xml:space="preserve"> PAGEREF _Toc221613892 \h </w:instrText>
             </w:r>
             <w:r>
               <w:rPr>
@@ -2883,7 +3427,7 @@
                 <w:noProof/>
                 <w:webHidden/>
               </w:rPr>
-              <w:t>9</w:t>
+              <w:t>14</w:t>
             </w:r>
             <w:r>
               <w:rPr>
@@ -2911,7 +3455,7 @@
               <w14:ligatures w14:val="standardContextual"/>
             </w:rPr>
           </w:pPr>
-          <w:hyperlink w:anchor="_Toc221019697" w:history="1">
+          <w:hyperlink w:anchor="_Toc221613893" w:history="1">
             <w:r>
               <w:rPr>
                 <w:rStyle w:val="Hyperlink"/>
@@ -2957,7 +3501,7 @@
                 <w:noProof/>
                 <w:webHidden/>
               </w:rPr>
-              <w:instrText xml:space="preserve"> PAGEREF _Toc221019697 \h </w:instrText>
+              <w:instrText xml:space="preserve"> PAGEREF _Toc221613893 \h </w:instrText>
             </w:r>
             <w:r>
               <w:rPr>
@@ -2977,7 +3521,7 @@
                 <w:noProof/>
                 <w:webHidden/>
               </w:rPr>
-              <w:t>9</w:t>
+              <w:t>14</w:t>
             </w:r>
             <w:r>
               <w:rPr>
@@ -3001,7 +3545,7 @@
               <w14:ligatures w14:val="standardContextual"/>
             </w:rPr>
           </w:pPr>
-          <w:hyperlink w:anchor="_Toc221019698" w:history="1">
+          <w:hyperlink w:anchor="_Toc221613894" w:history="1">
             <w:r>
               <w:rPr>
                 <w:rStyle w:val="Hyperlink"/>
@@ -3047,7 +3591,7 @@
                 <w:noProof/>
                 <w:webHidden/>
               </w:rPr>
-              <w:instrText xml:space="preserve"> PAGEREF _Toc221019698 \h </w:instrText>
+              <w:instrText xml:space="preserve"> PAGEREF _Toc221613894 \h </w:instrText>
             </w:r>
             <w:r>
               <w:rPr>
@@ -3067,7 +3611,7 @@
                 <w:noProof/>
                 <w:webHidden/>
               </w:rPr>
-              <w:t>10</w:t>
+              <w:t>15</w:t>
             </w:r>
             <w:r>
               <w:rPr>
@@ -3095,7 +3639,7 @@
               <w14:ligatures w14:val="standardContextual"/>
             </w:rPr>
           </w:pPr>
-          <w:hyperlink w:anchor="_Toc221019699" w:history="1">
+          <w:hyperlink w:anchor="_Toc221613895" w:history="1">
             <w:r>
               <w:rPr>
                 <w:rStyle w:val="Hyperlink"/>
@@ -3141,7 +3685,7 @@
                 <w:noProof/>
                 <w:webHidden/>
               </w:rPr>
-              <w:instrText xml:space="preserve"> PAGEREF _Toc221019699 \h </w:instrText>
+              <w:instrText xml:space="preserve"> PAGEREF _Toc221613895 \h </w:instrText>
             </w:r>
             <w:r>
               <w:rPr>
@@ -3161,7 +3705,7 @@
                 <w:noProof/>
                 <w:webHidden/>
               </w:rPr>
-              <w:t>10</w:t>
+              <w:t>15</w:t>
             </w:r>
             <w:r>
               <w:rPr>
@@ -3189,7 +3733,7 @@
               <w14:ligatures w14:val="standardContextual"/>
             </w:rPr>
           </w:pPr>
-          <w:hyperlink w:anchor="_Toc221019700" w:history="1">
+          <w:hyperlink w:anchor="_Toc221613896" w:history="1">
             <w:r>
               <w:rPr>
                 <w:rStyle w:val="Hyperlink"/>
@@ -3235,7 +3779,7 @@
                 <w:noProof/>
                 <w:webHidden/>
               </w:rPr>
-              <w:instrText xml:space="preserve"> PAGEREF _Toc221019700 \h </w:instrText>
+              <w:instrText xml:space="preserve"> PAGEREF _Toc221613896 \h </w:instrText>
             </w:r>
             <w:r>
               <w:rPr>
@@ -3255,7 +3799,7 @@
                 <w:noProof/>
                 <w:webHidden/>
               </w:rPr>
-              <w:t>10</w:t>
+              <w:t>15</w:t>
             </w:r>
             <w:r>
               <w:rPr>
@@ -3279,7 +3823,7 @@
               <w14:ligatures w14:val="standardContextual"/>
             </w:rPr>
           </w:pPr>
-          <w:hyperlink w:anchor="_Toc221019701" w:history="1">
+          <w:hyperlink w:anchor="_Toc221613897" w:history="1">
             <w:r>
               <w:rPr>
                 <w:rStyle w:val="Hyperlink"/>
@@ -3325,7 +3869,7 @@
                 <w:noProof/>
                 <w:webHidden/>
               </w:rPr>
-              <w:instrText xml:space="preserve"> PAGEREF _Toc221019701 \h </w:instrText>
+              <w:instrText xml:space="preserve"> PAGEREF _Toc221613897 \h </w:instrText>
             </w:r>
             <w:r>
               <w:rPr>
@@ -3345,7 +3889,7 @@
                 <w:noProof/>
                 <w:webHidden/>
               </w:rPr>
-              <w:t>11</w:t>
+              <w:t>16</w:t>
             </w:r>
             <w:r>
               <w:rPr>
@@ -3369,7 +3913,7 @@
               <w14:ligatures w14:val="standardContextual"/>
             </w:rPr>
           </w:pPr>
-          <w:hyperlink w:anchor="_Toc221019702" w:history="1">
+          <w:hyperlink w:anchor="_Toc221613898" w:history="1">
             <w:r>
               <w:rPr>
                 <w:rStyle w:val="Hyperlink"/>
@@ -3415,7 +3959,7 @@
                 <w:noProof/>
                 <w:webHidden/>
               </w:rPr>
-              <w:instrText xml:space="preserve"> PAGEREF _Toc221019702 \h </w:instrText>
+              <w:instrText xml:space="preserve"> PAGEREF _Toc221613898 \h </w:instrText>
             </w:r>
             <w:r>
               <w:rPr>
@@ -3435,7 +3979,7 @@
                 <w:noProof/>
                 <w:webHidden/>
               </w:rPr>
-              <w:t>12</w:t>
+              <w:t>17</w:t>
             </w:r>
             <w:r>
               <w:rPr>
@@ -3459,7 +4003,7 @@
               <w14:ligatures w14:val="standardContextual"/>
             </w:rPr>
           </w:pPr>
-          <w:hyperlink w:anchor="_Toc221019703" w:history="1">
+          <w:hyperlink w:anchor="_Toc221613899" w:history="1">
             <w:r>
               <w:rPr>
                 <w:rStyle w:val="Hyperlink"/>
@@ -3505,7 +4049,7 @@
                 <w:noProof/>
                 <w:webHidden/>
               </w:rPr>
-              <w:instrText xml:space="preserve"> PAGEREF _Toc221019703 \h </w:instrText>
+              <w:instrText xml:space="preserve"> PAGEREF _Toc221613899 \h </w:instrText>
             </w:r>
             <w:r>
               <w:rPr>
@@ -3525,7 +4069,7 @@
                 <w:noProof/>
                 <w:webHidden/>
               </w:rPr>
-              <w:t>13</w:t>
+              <w:t>18</w:t>
             </w:r>
             <w:r>
               <w:rPr>
@@ -3553,7 +4097,7 @@
               <w14:ligatures w14:val="standardContextual"/>
             </w:rPr>
           </w:pPr>
-          <w:hyperlink w:anchor="_Toc221019704" w:history="1">
+          <w:hyperlink w:anchor="_Toc221613900" w:history="1">
             <w:r>
               <w:rPr>
                 <w:rStyle w:val="Hyperlink"/>
@@ -3599,7 +4143,7 @@
                 <w:noProof/>
                 <w:webHidden/>
               </w:rPr>
-              <w:instrText xml:space="preserve"> PAGEREF _Toc221019704 \h </w:instrText>
+              <w:instrText xml:space="preserve"> PAGEREF _Toc221613900 \h </w:instrText>
             </w:r>
             <w:r>
               <w:rPr>
@@ -3619,7 +4163,7 @@
                 <w:noProof/>
                 <w:webHidden/>
               </w:rPr>
-              <w:t>13</w:t>
+              <w:t>18</w:t>
             </w:r>
             <w:r>
               <w:rPr>
@@ -3647,7 +4191,7 @@
               <w14:ligatures w14:val="standardContextual"/>
             </w:rPr>
           </w:pPr>
-          <w:hyperlink w:anchor="_Toc221019705" w:history="1">
+          <w:hyperlink w:anchor="_Toc221613901" w:history="1">
             <w:r>
               <w:rPr>
                 <w:rStyle w:val="Hyperlink"/>
@@ -3693,7 +4237,7 @@
                 <w:noProof/>
                 <w:webHidden/>
               </w:rPr>
-              <w:instrText xml:space="preserve"> PAGEREF _Toc221019705 \h </w:instrText>
+              <w:instrText xml:space="preserve"> PAGEREF _Toc221613901 \h </w:instrText>
             </w:r>
             <w:r>
               <w:rPr>
@@ -3713,7 +4257,7 @@
                 <w:noProof/>
                 <w:webHidden/>
               </w:rPr>
-              <w:t>13</w:t>
+              <w:t>18</w:t>
             </w:r>
             <w:r>
               <w:rPr>
@@ -3741,7 +4285,7 @@
               <w14:ligatures w14:val="standardContextual"/>
             </w:rPr>
           </w:pPr>
-          <w:hyperlink w:anchor="_Toc221019706" w:history="1">
+          <w:hyperlink w:anchor="_Toc221613902" w:history="1">
             <w:r>
               <w:rPr>
                 <w:rStyle w:val="Hyperlink"/>
@@ -3787,7 +4331,7 @@
                 <w:noProof/>
                 <w:webHidden/>
               </w:rPr>
-              <w:instrText xml:space="preserve"> PAGEREF _Toc221019706 \h </w:instrText>
+              <w:instrText xml:space="preserve"> PAGEREF _Toc221613902 \h </w:instrText>
             </w:r>
             <w:r>
               <w:rPr>
@@ -3807,7 +4351,7 @@
                 <w:noProof/>
                 <w:webHidden/>
               </w:rPr>
-              <w:t>13</w:t>
+              <w:t>18</w:t>
             </w:r>
             <w:r>
               <w:rPr>
@@ -3835,7 +4379,7 @@
               <w14:ligatures w14:val="standardContextual"/>
             </w:rPr>
           </w:pPr>
-          <w:hyperlink w:anchor="_Toc221019707" w:history="1">
+          <w:hyperlink w:anchor="_Toc221613903" w:history="1">
             <w:r>
               <w:rPr>
                 <w:rStyle w:val="Hyperlink"/>
@@ -3881,7 +4425,7 @@
                 <w:noProof/>
                 <w:webHidden/>
               </w:rPr>
-              <w:instrText xml:space="preserve"> PAGEREF _Toc221019707 \h </w:instrText>
+              <w:instrText xml:space="preserve"> PAGEREF _Toc221613903 \h </w:instrText>
             </w:r>
             <w:r>
               <w:rPr>
@@ -3901,7 +4445,7 @@
                 <w:noProof/>
                 <w:webHidden/>
               </w:rPr>
-              <w:t>13</w:t>
+              <w:t>18</w:t>
             </w:r>
             <w:r>
               <w:rPr>
@@ -3925,7 +4469,7 @@
               <w14:ligatures w14:val="standardContextual"/>
             </w:rPr>
           </w:pPr>
-          <w:hyperlink w:anchor="_Toc221019708" w:history="1">
+          <w:hyperlink w:anchor="_Toc221613904" w:history="1">
             <w:r>
               <w:rPr>
                 <w:rStyle w:val="Hyperlink"/>
@@ -3971,7 +4515,7 @@
                 <w:noProof/>
                 <w:webHidden/>
               </w:rPr>
-              <w:instrText xml:space="preserve"> PAGEREF _Toc221019708 \h </w:instrText>
+              <w:instrText xml:space="preserve"> PAGEREF _Toc221613904 \h </w:instrText>
             </w:r>
             <w:r>
               <w:rPr>
@@ -3991,7 +4535,7 @@
                 <w:noProof/>
                 <w:webHidden/>
               </w:rPr>
-              <w:t>14</w:t>
+              <w:t>19</w:t>
             </w:r>
             <w:r>
               <w:rPr>
@@ -4057,7 +4601,7 @@
       <w:bookmarkStart w:id="12" w:name="_Ref211230122"/>
       <w:bookmarkStart w:id="13" w:name="_Ref211230230"/>
       <w:bookmarkStart w:id="14" w:name="_Ref200464507"/>
-      <w:bookmarkStart w:id="15" w:name="_Toc221019677"/>
+      <w:bookmarkStart w:id="15" w:name="_Toc221613868"/>
       <w:r>
         <w:lastRenderedPageBreak/>
         <w:t>Einleitung</w:t>
@@ -4169,7 +4713,23 @@
           <w:color w:val="0066FF"/>
           <w:szCs w:val="28"/>
         </w:rPr>
-        <w:t>Mithilfe der folgenden Messungen wird die Funktionalität der selbstgebauten Hardware geprüft. (Nicht: Ich habe Messungen dürchgeführt…)</w:t>
+        <w:t xml:space="preserve">Mithilfe der folgenden Messungen wird die Funktionalität der selbstgebauten Hardware geprüft. (Nicht: Ich habe Messungen </w:t>
+      </w:r>
+      <w:proofErr w:type="spellStart"/>
+      <w:r>
+        <w:rPr>
+          <w:color w:val="0066FF"/>
+          <w:szCs w:val="28"/>
+        </w:rPr>
+        <w:t>dürchgeführt</w:t>
+      </w:r>
+      <w:proofErr w:type="spellEnd"/>
+      <w:r>
+        <w:rPr>
+          <w:color w:val="0066FF"/>
+          <w:szCs w:val="28"/>
+        </w:rPr>
+        <w:t>…)</w:t>
       </w:r>
     </w:p>
     <w:p>
@@ -4183,7 +4743,7 @@
       <w:bookmarkStart w:id="20" w:name="_Toc210560241"/>
       <w:bookmarkStart w:id="21" w:name="_Toc84751232"/>
       <w:bookmarkStart w:id="22" w:name="_Toc211138145"/>
-      <w:bookmarkStart w:id="23" w:name="_Toc221019678"/>
+      <w:bookmarkStart w:id="23" w:name="_Toc221613869"/>
       <w:r>
         <w:t>Vertiefende Aufgabenstellung</w:t>
       </w:r>
@@ -4233,7 +4793,7 @@
       <w:bookmarkStart w:id="29" w:name="_Toc210560295"/>
       <w:bookmarkStart w:id="30" w:name="_Toc84751233"/>
       <w:bookmarkStart w:id="31" w:name="_Toc211137894"/>
-      <w:bookmarkStart w:id="32" w:name="_Toc221019679"/>
+      <w:bookmarkStart w:id="32" w:name="_Toc221613870"/>
       <w:bookmarkEnd w:id="24"/>
       <w:bookmarkEnd w:id="25"/>
       <w:bookmarkEnd w:id="26"/>
@@ -4272,34 +4832,155 @@
           <w:color w:val="0066FF"/>
           <w:szCs w:val="28"/>
         </w:rPr>
-        <w:t>Text (FV = Text): ….</w:t>
-      </w:r>
+        <w:t>Text (FV = Text):</w:t>
+      </w:r>
+      <w:proofErr w:type="gramStart"/>
+      <w:r>
+        <w:rPr>
+          <w:color w:val="0066FF"/>
+          <w:szCs w:val="28"/>
+        </w:rPr>
+        <w:t xml:space="preserve"> ….</w:t>
+      </w:r>
+      <w:proofErr w:type="gramEnd"/>
     </w:p>
     <w:p>
       <w:pPr>
         <w:pStyle w:val="berschrift1"/>
       </w:pPr>
-      <w:bookmarkStart w:id="33" w:name="_Toc221019680"/>
-      <w:bookmarkStart w:id="34" w:name="_Ref200464718"/>
+      <w:bookmarkStart w:id="33" w:name="_Ref200464718"/>
+      <w:bookmarkStart w:id="34" w:name="_Toc221613871"/>
       <w:r>
         <w:lastRenderedPageBreak/>
-        <w:t>Dokumentation Schiechtl Alexander</w:t>
+        <w:t xml:space="preserve">Dokumentation </w:t>
+      </w:r>
+      <w:proofErr w:type="spellStart"/>
+      <w:r>
+        <w:t>Schiechtl</w:t>
+      </w:r>
+      <w:proofErr w:type="spellEnd"/>
+      <w:r>
+        <w:t xml:space="preserve"> Alexander</w:t>
+      </w:r>
+      <w:bookmarkEnd w:id="34"/>
+      <w:r>
+        <w:t xml:space="preserve"> </w:t>
       </w:r>
       <w:bookmarkEnd w:id="33"/>
+    </w:p>
+    <w:p>
+      <w:pPr>
+        <w:pStyle w:val="berschrift2"/>
+      </w:pPr>
+      <w:bookmarkStart w:id="35" w:name="_Toc221613872"/>
+      <w:r>
+        <w:t>Einleitung</w:t>
+      </w:r>
+      <w:bookmarkEnd w:id="35"/>
+    </w:p>
+    <w:p>
+      <w:pPr>
+        <w:pStyle w:val="Text"/>
+        <w:rPr>
+          <w:color w:val="0066FF"/>
+        </w:rPr>
+      </w:pPr>
+      <w:r>
+        <w:rPr>
+          <w:color w:val="0066FF"/>
+        </w:rPr>
+        <w:t xml:space="preserve">(FV = Text) Einführung in den individuellen Teil der </w:t>
+      </w:r>
+      <w:proofErr w:type="spellStart"/>
+      <w:r>
+        <w:rPr>
+          <w:color w:val="0066FF"/>
+        </w:rPr>
+        <w:t>Schüler:in</w:t>
+      </w:r>
+      <w:proofErr w:type="spellEnd"/>
+      <w:r>
+        <w:rPr>
+          <w:color w:val="0066FF"/>
+        </w:rPr>
+        <w:t xml:space="preserve"> .</w:t>
+      </w:r>
+    </w:p>
+    <w:p>
+      <w:pPr>
+        <w:pStyle w:val="Text"/>
+        <w:rPr>
+          <w:color w:val="0066FF"/>
+        </w:rPr>
+      </w:pPr>
+      <w:r>
+        <w:rPr>
+          <w:b/>
+          <w:color w:val="0066FF"/>
+        </w:rPr>
+        <w:t>Hinweis</w:t>
+      </w:r>
+      <w:r>
+        <w:rPr>
+          <w:color w:val="0066FF"/>
+        </w:rPr>
+        <w:t xml:space="preserve">: </w:t>
+      </w:r>
+    </w:p>
+    <w:p>
+      <w:pPr>
+        <w:pStyle w:val="Text"/>
+        <w:rPr>
+          <w:color w:val="0066FF"/>
+        </w:rPr>
+      </w:pPr>
+      <w:r>
+        <w:rPr>
+          <w:color w:val="0066FF"/>
+        </w:rPr>
+        <w:t xml:space="preserve">Jedes Kapitel der DA beginnt mit der Überschrift1 (Ebene1), davor ist immer ein Abschnittswechsel einzufügen. Damit erhält man einerseits eine gute, übersichtliche Struktur des Dokuments, andererseits kann für jedes Kapitel eine spezifische Kopf- und Fußzeile erstellt werden. In der Kopfzeile steht der Titel des Kapitels (Mitte), in der Fußzeile der Name der </w:t>
+      </w:r>
+      <w:proofErr w:type="spellStart"/>
+      <w:r>
+        <w:rPr>
+          <w:color w:val="0066FF"/>
+        </w:rPr>
+        <w:t>Schüler:in</w:t>
+      </w:r>
+      <w:proofErr w:type="spellEnd"/>
+      <w:r>
+        <w:rPr>
+          <w:color w:val="0066FF"/>
+        </w:rPr>
+        <w:t xml:space="preserve"> (links), Kapitel </w:t>
+      </w:r>
+      <w:proofErr w:type="spellStart"/>
+      <w:r>
+        <w:rPr>
+          <w:color w:val="0066FF"/>
+        </w:rPr>
+        <w:t>Nr</w:t>
+      </w:r>
+      <w:proofErr w:type="spellEnd"/>
+      <w:r>
+        <w:rPr>
+          <w:color w:val="0066FF"/>
+        </w:rPr>
+        <w:t xml:space="preserve"> (Mitte), Seitenzahl (rechts).</w:t>
+      </w:r>
+    </w:p>
+    <w:p>
+      <w:pPr>
+        <w:pStyle w:val="berschrift2"/>
+      </w:pPr>
+      <w:bookmarkStart w:id="36" w:name="_Toc221613873"/>
+      <w:r>
+        <w:t>Theoretische Grundlagen</w:t>
+      </w:r>
+      <w:bookmarkEnd w:id="36"/>
       <w:r>
         <w:t xml:space="preserve"> </w:t>
       </w:r>
-      <w:bookmarkEnd w:id="34"/>
-    </w:p>
-    <w:p>
-      <w:pPr>
-        <w:pStyle w:val="berschrift2"/>
-      </w:pPr>
-      <w:bookmarkStart w:id="35" w:name="_Toc221019681"/>
-      <w:r>
-        <w:t>Einleitung</w:t>
-      </w:r>
-      <w:bookmarkEnd w:id="35"/>
     </w:p>
     <w:p>
       <w:pPr>
@@ -4312,8 +4993,54 @@
         <w:rPr>
           <w:color w:val="0066FF"/>
         </w:rPr>
-        <w:t>(FV = Text) Einführung in den individuellen Teil der Schüler:in .</w:t>
-      </w:r>
+        <w:t xml:space="preserve">(FV = Text) Beschreibung der theoretischen Grundlagen. Wichtig dabei ist die Angabe der verwendeten Literatur- und Internetquellen, sowie die korrekte Angabe der Verwendung KI, wenn </w:t>
+      </w:r>
+      <w:proofErr w:type="gramStart"/>
+      <w:r>
+        <w:rPr>
+          <w:color w:val="0066FF"/>
+        </w:rPr>
+        <w:t xml:space="preserve">von dieser </w:t>
+      </w:r>
+      <w:r>
+        <w:rPr>
+          <w:b/>
+          <w:color w:val="0066FF"/>
+        </w:rPr>
+        <w:t>fachliche Inhalte</w:t>
+      </w:r>
+      <w:proofErr w:type="gramEnd"/>
+      <w:r>
+        <w:rPr>
+          <w:color w:val="0066FF"/>
+        </w:rPr>
+        <w:t xml:space="preserve"> abgefragt wurden.</w:t>
+      </w:r>
+    </w:p>
+    <w:p>
+      <w:pPr>
+        <w:pStyle w:val="berschrift3"/>
+      </w:pPr>
+      <w:bookmarkStart w:id="37" w:name="_Toc221613874"/>
+      <w:r>
+        <w:rPr>
+          <w:i/>
+        </w:rPr>
+        <w:t>Optional</w:t>
+      </w:r>
+      <w:r>
+        <w:t>: Überschrift der 3. Ebene (</w:t>
+      </w:r>
+      <w:r>
+        <w:rPr>
+          <w:color w:val="0066FF"/>
+        </w:rPr>
+        <w:t>FV = Überschrift3</w:t>
+      </w:r>
+      <w:r>
+        <w:t>)</w:t>
+      </w:r>
+      <w:bookmarkEnd w:id="37"/>
     </w:p>
     <w:p>
       <w:pPr>
@@ -4324,146 +5051,62 @@
       </w:pPr>
       <w:r>
         <w:rPr>
+          <w:color w:val="0066FF"/>
+        </w:rPr>
+        <w:t>Text…</w:t>
+      </w:r>
+    </w:p>
+    <w:p>
+      <w:pPr>
+        <w:pStyle w:val="berschrift3"/>
+      </w:pPr>
+      <w:bookmarkStart w:id="38" w:name="_Toc221613875"/>
+      <w:r>
+        <w:rPr>
+          <w:color w:val="0066FF"/>
+        </w:rPr>
+        <w:t>Weitere Hinweise</w:t>
+      </w:r>
+      <w:bookmarkEnd w:id="38"/>
+      <w:r>
+        <w:t xml:space="preserve"> </w:t>
+      </w:r>
+    </w:p>
+    <w:p>
+      <w:pPr>
+        <w:pStyle w:val="Text"/>
+        <w:rPr>
+          <w:color w:val="0066FF"/>
+        </w:rPr>
+      </w:pPr>
+      <w:r>
+        <w:rPr>
+          <w:color w:val="0066FF"/>
+        </w:rPr>
+        <w:t xml:space="preserve">In </w:t>
+      </w:r>
+      <w:r>
+        <w:rPr>
           <w:b/>
           <w:color w:val="0066FF"/>
         </w:rPr>
-        <w:t>Hinweis</w:t>
-      </w:r>
-      <w:r>
-        <w:rPr>
-          <w:color w:val="0066FF"/>
-        </w:rPr>
-        <w:t xml:space="preserve">: </w:t>
-      </w:r>
-    </w:p>
-    <w:p>
-      <w:pPr>
-        <w:pStyle w:val="Text"/>
-        <w:rPr>
-          <w:color w:val="0066FF"/>
-        </w:rPr>
-      </w:pPr>
-      <w:r>
-        <w:rPr>
-          <w:color w:val="0066FF"/>
-        </w:rPr>
-        <w:t>Jedes Kapitel der DA beginnt mit der Überschrift1 (Ebene1), davor ist immer ein Abschnittswechsel einzufügen. Damit erhält man einerseits eine gute, übersichtliche Struktur des Dokuments, andererseits kann für jedes Kapitel eine spezifische Kopf- und Fußzeile erstellt werden. In der Kopfzeile steht der Titel des Kapitels (Mitte), in der Fußzeile der Name der Schüler:in (links), Kapitel Nr (Mitte), Seitenzahl (rechts).</w:t>
-      </w:r>
-    </w:p>
-    <w:p>
-      <w:pPr>
-        <w:pStyle w:val="berschrift2"/>
-      </w:pPr>
-      <w:bookmarkStart w:id="36" w:name="_Toc221019682"/>
-      <w:r>
-        <w:t>Theoretische Grundlagen</w:t>
-      </w:r>
-      <w:bookmarkEnd w:id="36"/>
-      <w:r>
-        <w:t xml:space="preserve"> </w:t>
-      </w:r>
-    </w:p>
-    <w:p>
-      <w:pPr>
-        <w:pStyle w:val="Text"/>
-        <w:rPr>
-          <w:color w:val="0066FF"/>
-        </w:rPr>
-      </w:pPr>
-      <w:r>
-        <w:rPr>
-          <w:color w:val="0066FF"/>
-        </w:rPr>
-        <w:t xml:space="preserve">(FV = Text) Beschreibung der theoretischen Grundlagen. Wichtig dabei ist die Angabe der verwendeten Literatur- und Internetquellen, sowie die korrekte Angabe der Verwendung KI, wenn von dieser </w:t>
-      </w:r>
+        <w:t xml:space="preserve">blau </w:t>
+      </w:r>
+      <w:proofErr w:type="spellStart"/>
       <w:r>
         <w:rPr>
           <w:b/>
           <w:color w:val="0066FF"/>
         </w:rPr>
-        <w:t>fachliche Inhalte</w:t>
-      </w:r>
-      <w:r>
-        <w:rPr>
-          <w:color w:val="0066FF"/>
-        </w:rPr>
-        <w:t xml:space="preserve"> abgefragt wurden.</w:t>
-      </w:r>
-    </w:p>
-    <w:p>
-      <w:pPr>
-        <w:pStyle w:val="berschrift3"/>
-      </w:pPr>
-      <w:bookmarkStart w:id="37" w:name="_Toc221019683"/>
-      <w:r>
-        <w:rPr>
-          <w:i/>
-        </w:rPr>
-        <w:t>Optional</w:t>
-      </w:r>
-      <w:r>
-        <w:t>: Überschrift der 3. Ebene (</w:t>
-      </w:r>
-      <w:r>
-        <w:rPr>
-          <w:color w:val="0066FF"/>
-        </w:rPr>
-        <w:t>FV = Überschrift3</w:t>
-      </w:r>
-      <w:r>
-        <w:t>)</w:t>
-      </w:r>
-      <w:bookmarkEnd w:id="37"/>
-    </w:p>
-    <w:p>
-      <w:pPr>
-        <w:pStyle w:val="Text"/>
-        <w:rPr>
-          <w:color w:val="0066FF"/>
-        </w:rPr>
-      </w:pPr>
-      <w:r>
-        <w:rPr>
-          <w:color w:val="0066FF"/>
-        </w:rPr>
-        <w:t>Text…</w:t>
-      </w:r>
-    </w:p>
-    <w:p>
-      <w:pPr>
-        <w:pStyle w:val="berschrift3"/>
-      </w:pPr>
-      <w:bookmarkStart w:id="38" w:name="_Toc221019684"/>
-      <w:r>
-        <w:rPr>
-          <w:color w:val="0066FF"/>
-        </w:rPr>
-        <w:t>Weitere Hinweise</w:t>
-      </w:r>
-      <w:bookmarkEnd w:id="38"/>
-      <w:r>
-        <w:t xml:space="preserve"> </w:t>
-      </w:r>
-    </w:p>
-    <w:p>
-      <w:pPr>
-        <w:pStyle w:val="Text"/>
-        <w:rPr>
-          <w:color w:val="0066FF"/>
-        </w:rPr>
-      </w:pPr>
-      <w:r>
-        <w:rPr>
-          <w:color w:val="0066FF"/>
-        </w:rPr>
-        <w:t xml:space="preserve">In </w:t>
-      </w:r>
+        <w:t>geschrieber</w:t>
+      </w:r>
+      <w:proofErr w:type="spellEnd"/>
       <w:r>
         <w:rPr>
           <w:b/>
           <w:color w:val="0066FF"/>
         </w:rPr>
-        <w:t>blau geschrieber Text</w:t>
+        <w:t xml:space="preserve"> Text</w:t>
       </w:r>
       <w:r>
         <w:rPr>
@@ -4929,7 +5572,49 @@
         <w:rPr>
           <w:color w:val="0066FF"/>
         </w:rPr>
-        <w:t xml:space="preserve">Tabelle markieren -&gt; Rechsklick -&gt; „Beschriftung einfügen“ -&gt; Text eingeben (in erster Zeile „Beschriftung“ neben „Tabelle Nr“: … Die Nummer der Tabelle wird automatisch erstellt. Als „Position“ wird „Unter dem ausgewähten Element“ wählen. </w:t>
+        <w:t xml:space="preserve">Tabelle markieren -&gt; </w:t>
+      </w:r>
+      <w:proofErr w:type="spellStart"/>
+      <w:r>
+        <w:rPr>
+          <w:color w:val="0066FF"/>
+        </w:rPr>
+        <w:t>Rechsklick</w:t>
+      </w:r>
+      <w:proofErr w:type="spellEnd"/>
+      <w:r>
+        <w:rPr>
+          <w:color w:val="0066FF"/>
+        </w:rPr>
+        <w:t xml:space="preserve"> -&gt; „Beschriftung einfügen“ -&gt; Text eingeben (in erster Zeile „Beschriftung“ neben „Tabelle </w:t>
+      </w:r>
+      <w:proofErr w:type="spellStart"/>
+      <w:r>
+        <w:rPr>
+          <w:color w:val="0066FF"/>
+        </w:rPr>
+        <w:t>Nr</w:t>
+      </w:r>
+      <w:proofErr w:type="spellEnd"/>
+      <w:r>
+        <w:rPr>
+          <w:color w:val="0066FF"/>
+        </w:rPr>
+        <w:t xml:space="preserve">“: … Die Nummer der Tabelle wird automatisch erstellt. Als „Position“ wird „Unter dem </w:t>
+      </w:r>
+      <w:proofErr w:type="spellStart"/>
+      <w:r>
+        <w:rPr>
+          <w:color w:val="0066FF"/>
+        </w:rPr>
+        <w:t>ausgewähten</w:t>
+      </w:r>
+      <w:proofErr w:type="spellEnd"/>
+      <w:r>
+        <w:rPr>
+          <w:color w:val="0066FF"/>
+        </w:rPr>
+        <w:t xml:space="preserve"> Element“ wählen. </w:t>
       </w:r>
     </w:p>
     <w:p>
@@ -4969,11 +5654,33 @@
           <w:color w:val="0066FF"/>
         </w:rPr>
       </w:pPr>
-      <w:r>
-        <w:rPr>
-          <w:color w:val="0066FF"/>
-        </w:rPr>
-        <w:t>jpg, png und ähnliche Bilddateien werden mit „Einfügen“ -&gt; „Bilder“ -&gt; „Dieses Gerät (oder passende Quelle wählen)“ eingefügt. Idealerweise sind Bilder „zentriert“ zu platzieren.</w:t>
+      <w:proofErr w:type="spellStart"/>
+      <w:r>
+        <w:rPr>
+          <w:color w:val="0066FF"/>
+        </w:rPr>
+        <w:t>jpg</w:t>
+      </w:r>
+      <w:proofErr w:type="spellEnd"/>
+      <w:r>
+        <w:rPr>
+          <w:color w:val="0066FF"/>
+        </w:rPr>
+        <w:t xml:space="preserve">, </w:t>
+      </w:r>
+      <w:proofErr w:type="spellStart"/>
+      <w:r>
+        <w:rPr>
+          <w:color w:val="0066FF"/>
+        </w:rPr>
+        <w:t>png</w:t>
+      </w:r>
+      <w:proofErr w:type="spellEnd"/>
+      <w:r>
+        <w:rPr>
+          <w:color w:val="0066FF"/>
+        </w:rPr>
+        <w:t xml:space="preserve"> und ähnliche Bilddateien werden mit „Einfügen“ -&gt; „Bilder“ -&gt; „Dieses Gerät (oder passende Quelle wählen)“ eingefügt. Idealerweise sind Bilder „zentriert“ zu platzieren.</w:t>
       </w:r>
     </w:p>
     <w:p>
@@ -5249,7 +5956,7 @@
       <w:pPr>
         <w:pStyle w:val="berschrift2"/>
       </w:pPr>
-      <w:bookmarkStart w:id="39" w:name="_Toc221019685"/>
+      <w:bookmarkStart w:id="39" w:name="_Toc221613876"/>
       <w:r>
         <w:t>Praktische Umsetzung</w:t>
       </w:r>
@@ -5267,7 +5974,7 @@
       <w:pPr>
         <w:pStyle w:val="berschrift2"/>
       </w:pPr>
-      <w:bookmarkStart w:id="40" w:name="_Toc221019686"/>
+      <w:bookmarkStart w:id="40" w:name="_Toc221613877"/>
       <w:r>
         <w:t>Weitere individuelle Abschnitte</w:t>
       </w:r>
@@ -5287,14 +5994,42 @@
         <w:rPr>
           <w:color w:val="0066FF"/>
         </w:rPr>
-        <w:t>(FV = Text) Diese Abschnitte sind individuell mit Ihren Betreuer:innen festzulegen.</w:t>
+        <w:t xml:space="preserve">(FV = Text) Diese Abschnitte sind individuell </w:t>
+      </w:r>
+      <w:proofErr w:type="gramStart"/>
+      <w:r>
+        <w:rPr>
+          <w:color w:val="0066FF"/>
+        </w:rPr>
+        <w:t xml:space="preserve">mit Ihren </w:t>
+      </w:r>
+      <w:proofErr w:type="spellStart"/>
+      <w:r>
+        <w:rPr>
+          <w:color w:val="0066FF"/>
+        </w:rPr>
+        <w:t>Betreuer</w:t>
+      </w:r>
+      <w:proofErr w:type="gramEnd"/>
+      <w:r>
+        <w:rPr>
+          <w:color w:val="0066FF"/>
+        </w:rPr>
+        <w:t>:innen</w:t>
+      </w:r>
+      <w:proofErr w:type="spellEnd"/>
+      <w:r>
+        <w:rPr>
+          <w:color w:val="0066FF"/>
+        </w:rPr>
+        <w:t xml:space="preserve"> festzulegen.</w:t>
       </w:r>
     </w:p>
     <w:p>
       <w:pPr>
         <w:pStyle w:val="berschrift2"/>
       </w:pPr>
-      <w:bookmarkStart w:id="41" w:name="_Toc221019687"/>
+      <w:bookmarkStart w:id="41" w:name="_Toc221613878"/>
       <w:r>
         <w:lastRenderedPageBreak/>
         <w:t>Ergebnisse und Diskussion</w:t>
@@ -5319,7 +6054,7 @@
       <w:pPr>
         <w:pStyle w:val="berschrift2"/>
       </w:pPr>
-      <w:bookmarkStart w:id="42" w:name="_Toc221019688"/>
+      <w:bookmarkStart w:id="42" w:name="_Toc221613879"/>
       <w:r>
         <w:t>Zusammenfassung individueller Teil</w:t>
       </w:r>
@@ -5335,7 +6070,21 @@
         <w:rPr>
           <w:color w:val="0066FF"/>
         </w:rPr>
-        <w:t>(FV = Text) Hier werden die wichtigsten Fakten der individuellen Aufgabe des Schülers / der Schülerin kurz zusammengefasst werden.</w:t>
+        <w:t xml:space="preserve">(FV = Text) </w:t>
+      </w:r>
+      <w:proofErr w:type="gramStart"/>
+      <w:r>
+        <w:rPr>
+          <w:color w:val="0066FF"/>
+        </w:rPr>
+        <w:t>Hier</w:t>
+      </w:r>
+      <w:proofErr w:type="gramEnd"/>
+      <w:r>
+        <w:rPr>
+          <w:color w:val="0066FF"/>
+        </w:rPr>
+        <w:t xml:space="preserve"> werden die wichtigsten Fakten der individuellen Aufgabe des Schülers / der Schülerin kurz zusammengefasst werden.</w:t>
       </w:r>
     </w:p>
     <w:p>
@@ -5461,7 +6210,7 @@
         <w:pStyle w:val="berschrift1"/>
       </w:pPr>
       <w:bookmarkStart w:id="43" w:name="_Ref200465902"/>
-      <w:bookmarkStart w:id="44" w:name="_Toc221019689"/>
+      <w:bookmarkStart w:id="44" w:name="_Toc221613880"/>
       <w:r>
         <w:lastRenderedPageBreak/>
         <w:t xml:space="preserve">Dokumentation </w:t>
@@ -5479,7 +6228,7 @@
       <w:pPr>
         <w:pStyle w:val="berschrift2"/>
       </w:pPr>
-      <w:bookmarkStart w:id="45" w:name="_Toc221019690"/>
+      <w:bookmarkStart w:id="45" w:name="_Toc221613881"/>
       <w:r>
         <w:t>Einleitung</w:t>
       </w:r>
@@ -5574,7 +6323,21 @@
         <w:rPr>
           <w:lang w:val="de-AT" w:eastAsia="de-AT"/>
         </w:rPr>
-        <w:t>Als geplantes Ergebnis entsteht eine vollständig integrierte Softwarelösung, welche die Sensoransteuerung, Datenauswertung und Visualisierung vereint und den stabilen Betrieb des Prototyps sicherstellt.</w:t>
+        <w:t xml:space="preserve">Als geplantes Ergebnis entsteht eine vollständig integrierte Softwarelösung, welche die Sensoransteuerung, Datenauswertung und Visualisierung </w:t>
+      </w:r>
+      <w:proofErr w:type="gramStart"/>
+      <w:r>
+        <w:rPr>
+          <w:lang w:val="de-AT" w:eastAsia="de-AT"/>
+        </w:rPr>
+        <w:t>vereint</w:t>
+      </w:r>
+      <w:proofErr w:type="gramEnd"/>
+      <w:r>
+        <w:rPr>
+          <w:lang w:val="de-AT" w:eastAsia="de-AT"/>
+        </w:rPr>
+        <w:t xml:space="preserve"> und den stabilen Betrieb des Prototyps sicherstellt.</w:t>
       </w:r>
     </w:p>
     <w:p>
@@ -5588,14 +6351,42 @@
         <w:rPr>
           <w:color w:val="0066FF"/>
         </w:rPr>
-        <w:t>Jedes Kapitel der DA beginnt mit der Überschrift1 (Ebene1), davor ist immer ein Abschnittswechsel einzufügen. Damit erhält man einerseits eine gute, übersichtliche Struktur des Dokuments, andererseits kann für jedes Kapitel eine spezifische Kopf- und Fußzeile erstellt werden. In der Kopfzeile steht der Titel des Kapitels (Mitte), in der Fußzeile der Name der Schüler:in (links), Kapitel Nr (Mitte), Seitenzahl (rechts).</w:t>
+        <w:t xml:space="preserve">Jedes Kapitel der DA beginnt mit der Überschrift1 (Ebene1), davor ist immer ein Abschnittswechsel einzufügen. Damit erhält man einerseits eine gute, übersichtliche Struktur des Dokuments, andererseits kann für jedes Kapitel eine spezifische Kopf- und Fußzeile erstellt werden. In der Kopfzeile steht der Titel des Kapitels (Mitte), in der Fußzeile der Name der </w:t>
+      </w:r>
+      <w:proofErr w:type="spellStart"/>
+      <w:r>
+        <w:rPr>
+          <w:color w:val="0066FF"/>
+        </w:rPr>
+        <w:t>Schüler:in</w:t>
+      </w:r>
+      <w:proofErr w:type="spellEnd"/>
+      <w:r>
+        <w:rPr>
+          <w:color w:val="0066FF"/>
+        </w:rPr>
+        <w:t xml:space="preserve"> (links), Kapitel </w:t>
+      </w:r>
+      <w:proofErr w:type="spellStart"/>
+      <w:r>
+        <w:rPr>
+          <w:color w:val="0066FF"/>
+        </w:rPr>
+        <w:t>Nr</w:t>
+      </w:r>
+      <w:proofErr w:type="spellEnd"/>
+      <w:r>
+        <w:rPr>
+          <w:color w:val="0066FF"/>
+        </w:rPr>
+        <w:t xml:space="preserve"> (Mitte), Seitenzahl (rechts).</w:t>
       </w:r>
     </w:p>
     <w:p>
       <w:pPr>
         <w:pStyle w:val="berschrift2"/>
       </w:pPr>
-      <w:bookmarkStart w:id="46" w:name="_Toc221019691"/>
+      <w:bookmarkStart w:id="46" w:name="_Toc221613882"/>
       <w:r>
         <w:lastRenderedPageBreak/>
         <w:t>Theoretische Grundlagen</w:t>
@@ -5614,19 +6405,37 @@
       </w:r>
       <w:r>
         <w:noBreakHyphen/>
-        <w:t>Scannersystems zur automatisierten Erfassung von Artikeldaten im Lagerbetrieb. Behandelt werden insbesondere die Tiefenmessung mittels Stereo</w:t>
-      </w:r>
+        <w:t xml:space="preserve">Scannersystems zur automatisierten Erfassung von Artikeldaten im Lagerbetrieb. Behandelt werden insbesondere die Tiefenmessung </w:t>
+      </w:r>
+      <w:proofErr w:type="gramStart"/>
+      <w:r>
+        <w:t>mittels Stereo</w:t>
+      </w:r>
+      <w:proofErr w:type="gramEnd"/>
       <w:r>
         <w:noBreakHyphen/>
         <w:t>Vision</w:t>
       </w:r>
       <w:r>
         <w:noBreakHyphen/>
-        <w:t>Kameras, die Verarbeitung von Punktwolken zur Bestimmung geometrischer Abmessungen, Verfahren der Bildverarbeitung zur Code</w:t>
-      </w:r>
+        <w:t xml:space="preserve">Kameras, die Verarbeitung von Punktwolken zur Bestimmung geometrischer Abmessungen, Verfahren der Bildverarbeitung </w:t>
+      </w:r>
+      <w:proofErr w:type="gramStart"/>
+      <w:r>
+        <w:t>zur Code</w:t>
+      </w:r>
+      <w:proofErr w:type="gramEnd"/>
       <w:r>
         <w:noBreakHyphen/>
-        <w:t>Erkennung sowie die Gewichtserfassung über Wägezellen. Ziel ist es, die physikalischen und informationstechnischen Prinzipien zu erläutern, welche die spätere praktische Umsetzung des Systems ermöglichen.</w:t>
+        <w:t xml:space="preserve">Erkennung sowie die Gewichtserfassung über </w:t>
+      </w:r>
+      <w:proofErr w:type="spellStart"/>
+      <w:r>
+        <w:t>Wägezellen</w:t>
+      </w:r>
+      <w:proofErr w:type="spellEnd"/>
+      <w:r>
+        <w:t>. Ziel ist es, die physikalischen und informationstechnischen Prinzipien zu erläutern, welche die spätere praktische Umsetzung des Systems ermöglichen.</w:t>
       </w:r>
     </w:p>
     <w:p>
@@ -5638,6 +6447,7 @@
       <w:pPr>
         <w:pStyle w:val="berschrift3"/>
       </w:pPr>
+      <w:bookmarkStart w:id="47" w:name="_Toc221613883"/>
       <w:r>
         <w:t>Tiefenmessung mit Stereo</w:t>
       </w:r>
@@ -5645,6 +6455,7 @@
         <w:noBreakHyphen/>
         <w:t>Vision und Tiefenkameras</w:t>
       </w:r>
+      <w:bookmarkEnd w:id="47"/>
     </w:p>
     <w:p>
       <w:pPr>
@@ -5725,10 +6536,7 @@
       </w:pPr>
       <w:r>
         <w:lastRenderedPageBreak/>
-        <w:t xml:space="preserve">Zur Veranschaulichung </w:t>
-      </w:r>
-      <w:r>
-        <w:t>des beschriebenen Stereos</w:t>
+        <w:t>Zur Veranschaulichung des beschriebenen Stereos</w:t>
       </w:r>
       <w:r>
         <w:noBreakHyphen/>
@@ -5759,7 +6567,7 @@
           <w:lang w:val="de-AT"/>
         </w:rPr>
       </w:pPr>
-      <w:commentRangeStart w:id="47"/>
+      <w:commentRangeStart w:id="48"/>
       <w:r>
         <w:rPr>
           <w:noProof/>
@@ -5818,12 +6626,12 @@
           </wp:inline>
         </w:drawing>
       </w:r>
-      <w:commentRangeEnd w:id="47"/>
+      <w:commentRangeEnd w:id="48"/>
       <w:r>
         <w:rPr>
           <w:rStyle w:val="Kommentarzeichen"/>
         </w:rPr>
-        <w:commentReference w:id="47"/>
+        <w:commentReference w:id="48"/>
       </w:r>
     </w:p>
     <w:p>
@@ -5852,10 +6660,7 @@
         <w:fldChar w:fldCharType="end"/>
       </w:r>
       <w:r>
-        <w:t xml:space="preserve">: </w:t>
-      </w:r>
-      <w:r>
-        <w:t>OAK-D 2S</w:t>
+        <w:t>: OAK-D 2S</w:t>
       </w:r>
     </w:p>
     <w:p>
@@ -6004,9 +6809,11 @@
       <w:pPr>
         <w:pStyle w:val="berschrift3"/>
       </w:pPr>
+      <w:bookmarkStart w:id="49" w:name="_Toc221613884"/>
       <w:r>
         <w:t>Punktwolken und dreidimensionale Geometrie</w:t>
       </w:r>
+      <w:bookmarkEnd w:id="49"/>
     </w:p>
     <w:p>
       <w:pPr>
@@ -6073,12 +6880,14 @@
           <w:lang w:val="de-AT"/>
         </w:rPr>
       </w:pPr>
+      <w:proofErr w:type="spellStart"/>
       <w:r>
         <w:rPr>
           <w:lang w:val="de-AT"/>
         </w:rPr>
         <w:t>Bounding</w:t>
       </w:r>
+      <w:proofErr w:type="spellEnd"/>
       <w:r>
         <w:rPr>
           <w:lang w:val="de-AT"/>
@@ -6116,7 +6925,21 @@
         <w:rPr>
           <w:lang w:val="de-AT"/>
         </w:rPr>
-        <w:t>Typische Filtermethoden sind Mittelwertbildung, Medianfilter oder statistische Ausreißerentfernung. Diese Verfahren reduzieren Messrauschen und verbessern die Stabilität der geometrischen Bestimmung.</w:t>
+        <w:t xml:space="preserve">Typische Filtermethoden sind Mittelwertbildung, Medianfilter oder statistische </w:t>
+      </w:r>
+      <w:proofErr w:type="spellStart"/>
+      <w:r>
+        <w:rPr>
+          <w:lang w:val="de-AT"/>
+        </w:rPr>
+        <w:t>Ausreißerentfernung</w:t>
+      </w:r>
+      <w:proofErr w:type="spellEnd"/>
+      <w:r>
+        <w:rPr>
+          <w:lang w:val="de-AT"/>
+        </w:rPr>
+        <w:t>. Diese Verfahren reduzieren Messrauschen und verbessern die Stabilität der geometrischen Bestimmung.</w:t>
       </w:r>
     </w:p>
     <w:p>
@@ -6134,6 +6957,7 @@
           <w:lang w:val="de-AT"/>
         </w:rPr>
       </w:pPr>
+      <w:bookmarkStart w:id="50" w:name="_Toc221613885"/>
       <w:r>
         <w:rPr>
           <w:lang w:val="de-AT"/>
@@ -6147,6 +6971,7 @@
         <w:noBreakHyphen/>
         <w:t>Erkennung</w:t>
       </w:r>
+      <w:bookmarkEnd w:id="50"/>
     </w:p>
     <w:p>
       <w:pPr>
@@ -6175,6 +7000,7 @@
         <w:noBreakHyphen/>
         <w:t xml:space="preserve">Bibliothek </w:t>
       </w:r>
+      <w:proofErr w:type="spellStart"/>
       <w:r>
         <w:rPr>
           <w:i/>
@@ -6183,6 +7009,7 @@
         </w:rPr>
         <w:t>pyzbar</w:t>
       </w:r>
+      <w:proofErr w:type="spellEnd"/>
       <w:r>
         <w:rPr>
           <w:lang w:val="de-AT"/>
@@ -6217,19 +7044,19 @@
         </w:rPr>
         <w:noBreakHyphen/>
       </w:r>
-      <w:commentRangeStart w:id="48"/>
+      <w:commentRangeStart w:id="51"/>
       <w:r>
         <w:rPr>
           <w:lang w:val="de-AT"/>
         </w:rPr>
         <w:t>Objekterkennungsmodells</w:t>
       </w:r>
-      <w:commentRangeEnd w:id="48"/>
+      <w:commentRangeEnd w:id="51"/>
       <w:r>
         <w:rPr>
           <w:rStyle w:val="Kommentarzeichen"/>
         </w:rPr>
-        <w:commentReference w:id="48"/>
+        <w:commentReference w:id="51"/>
       </w:r>
       <w:r>
         <w:rPr>
@@ -6269,8 +7096,15 @@
           <w:lang w:val="de-AT"/>
         </w:rPr>
         <w:noBreakHyphen/>
+      </w:r>
+      <w:proofErr w:type="spellStart"/>
+      <w:r>
+        <w:rPr>
+          <w:lang w:val="de-AT"/>
+        </w:rPr>
         <w:t>of</w:t>
       </w:r>
+      <w:proofErr w:type="spellEnd"/>
       <w:r>
         <w:rPr>
           <w:lang w:val="de-AT"/>
@@ -6283,7 +7117,21 @@
           <w:lang w:val="de-AT"/>
         </w:rPr>
         <w:noBreakHyphen/>
-        <w:t>Fenster (ROI). Innerhalb dieses Bereichs erfolgt anschließend die eigentliche Decodierung mittels pyzbar, wodurch sowohl die Erkennungsrate erhöht als auch die Verarbeitung beschleunigt werden kann.</w:t>
+        <w:t xml:space="preserve">Fenster (ROI). Innerhalb dieses Bereichs erfolgt anschließend die eigentliche Decodierung mittels </w:t>
+      </w:r>
+      <w:proofErr w:type="spellStart"/>
+      <w:r>
+        <w:rPr>
+          <w:lang w:val="de-AT"/>
+        </w:rPr>
+        <w:t>pyzbar</w:t>
+      </w:r>
+      <w:proofErr w:type="spellEnd"/>
+      <w:r>
+        <w:rPr>
+          <w:lang w:val="de-AT"/>
+        </w:rPr>
+        <w:t>, wodurch sowohl die Erkennungsrate erhöht als auch die Verarbeitung beschleunigt werden kann.</w:t>
       </w:r>
     </w:p>
     <w:p>
@@ -6312,8 +7160,16 @@
           <w:lang w:val="de-AT"/>
         </w:rPr>
         <w:lastRenderedPageBreak/>
-        <w:t>Ergänzend stellen Bildverarbeitungsbibliotheken wie OpenCV</w:t>
-      </w:r>
+        <w:t xml:space="preserve">Ergänzend stellen Bildverarbeitungsbibliotheken wie </w:t>
+      </w:r>
+      <w:proofErr w:type="spellStart"/>
+      <w:r>
+        <w:rPr>
+          <w:lang w:val="de-AT"/>
+        </w:rPr>
+        <w:t>OpenCV</w:t>
+      </w:r>
+      <w:proofErr w:type="spellEnd"/>
       <w:r>
         <w:rPr>
           <w:lang w:val="de-AT"/>
@@ -6422,6 +7278,7 @@
           <w:lang w:val="de-AT"/>
         </w:rPr>
       </w:pPr>
+      <w:bookmarkStart w:id="52" w:name="_Toc221613886"/>
       <w:r>
         <w:rPr>
           <w:lang w:val="de-AT"/>
@@ -6434,6 +7291,7 @@
         </w:rPr>
         <w:t>- Systemübersicht</w:t>
       </w:r>
+      <w:bookmarkEnd w:id="52"/>
     </w:p>
     <w:p>
       <w:pPr>
@@ -6530,12 +7388,14 @@
           <w:lang w:val="de-AT"/>
         </w:rPr>
       </w:pPr>
+      <w:bookmarkStart w:id="53" w:name="_Toc221613887"/>
       <w:r>
         <w:rPr>
           <w:lang w:val="de-AT"/>
         </w:rPr>
         <w:t>Systemintegration und Datenverarbeitung</w:t>
       </w:r>
+      <w:bookmarkEnd w:id="53"/>
     </w:p>
     <w:p>
       <w:pPr>
@@ -6570,8 +7430,13 @@
         </w:numPr>
       </w:pPr>
       <w:r>
-        <w:t>Kamera bzw. Bildverarbeitung zur Code</w:t>
-      </w:r>
+        <w:t xml:space="preserve">Kamera bzw. Bildverarbeitung </w:t>
+      </w:r>
+      <w:proofErr w:type="gramStart"/>
+      <w:r>
+        <w:t>zur Code</w:t>
+      </w:r>
+      <w:proofErr w:type="gramEnd"/>
       <w:r>
         <w:noBreakHyphen/>
         <w:t>Erkennung</w:t>
@@ -6585,8 +7450,13 @@
           <w:numId w:val="24"/>
         </w:numPr>
       </w:pPr>
-      <w:r>
-        <w:t>Wägezelle zur Gewichtsmessung</w:t>
+      <w:proofErr w:type="spellStart"/>
+      <w:r>
+        <w:t>Wägezelle</w:t>
+      </w:r>
+      <w:proofErr w:type="spellEnd"/>
+      <w:r>
+        <w:t xml:space="preserve"> zur Gewichtsmessung</w:t>
       </w:r>
     </w:p>
     <w:p>
@@ -6635,6 +7505,678 @@
       </w:r>
       <w:r>
         <w:t>f)</w:t>
+      </w:r>
+    </w:p>
+    <w:tbl>
+      <w:tblPr>
+        <w:tblStyle w:val="Tabellenraster"/>
+        <w:tblW w:w="9421" w:type="dxa"/>
+        <w:tblLayout w:type="fixed"/>
+        <w:tblLook w:val="04A0" w:firstRow="1" w:lastRow="0" w:firstColumn="1" w:lastColumn="0" w:noHBand="0" w:noVBand="1"/>
+      </w:tblPr>
+      <w:tblGrid>
+        <w:gridCol w:w="2355"/>
+        <w:gridCol w:w="1110"/>
+        <w:gridCol w:w="1245"/>
+        <w:gridCol w:w="837"/>
+        <w:gridCol w:w="1140"/>
+        <w:gridCol w:w="720"/>
+        <w:gridCol w:w="1310"/>
+        <w:gridCol w:w="704"/>
+      </w:tblGrid>
+      <w:tr>
+        <w:trPr>
+          <w:trHeight w:val="244"/>
+        </w:trPr>
+        <w:tc>
+          <w:tcPr>
+            <w:tcW w:w="2355" w:type="dxa"/>
+          </w:tcPr>
+          <w:p>
+            <w:pPr>
+              <w:pStyle w:val="TextinTabelle"/>
+            </w:pPr>
+            <w:r>
+              <w:t>FV: Text in Tabelle</w:t>
+            </w:r>
+          </w:p>
+        </w:tc>
+        <w:tc>
+          <w:tcPr>
+            <w:tcW w:w="1110" w:type="dxa"/>
+          </w:tcPr>
+          <w:p>
+            <w:pPr>
+              <w:pStyle w:val="TextinTabelle"/>
+            </w:pPr>
+          </w:p>
+        </w:tc>
+        <w:tc>
+          <w:tcPr>
+            <w:tcW w:w="1245" w:type="dxa"/>
+          </w:tcPr>
+          <w:p>
+            <w:pPr>
+              <w:pStyle w:val="TextinTabelle"/>
+            </w:pPr>
+          </w:p>
+        </w:tc>
+        <w:tc>
+          <w:tcPr>
+            <w:tcW w:w="837" w:type="dxa"/>
+          </w:tcPr>
+          <w:p>
+            <w:pPr>
+              <w:pStyle w:val="TextinTabelle"/>
+            </w:pPr>
+          </w:p>
+        </w:tc>
+        <w:tc>
+          <w:tcPr>
+            <w:tcW w:w="1140" w:type="dxa"/>
+          </w:tcPr>
+          <w:p>
+            <w:pPr>
+              <w:pStyle w:val="TextinTabelle"/>
+            </w:pPr>
+          </w:p>
+        </w:tc>
+        <w:tc>
+          <w:tcPr>
+            <w:tcW w:w="720" w:type="dxa"/>
+          </w:tcPr>
+          <w:p>
+            <w:pPr>
+              <w:pStyle w:val="TextinTabelle"/>
+            </w:pPr>
+          </w:p>
+        </w:tc>
+        <w:tc>
+          <w:tcPr>
+            <w:tcW w:w="1310" w:type="dxa"/>
+          </w:tcPr>
+          <w:p>
+            <w:pPr>
+              <w:pStyle w:val="TextinTabelle"/>
+            </w:pPr>
+          </w:p>
+        </w:tc>
+        <w:tc>
+          <w:tcPr>
+            <w:tcW w:w="704" w:type="dxa"/>
+          </w:tcPr>
+          <w:p>
+            <w:pPr>
+              <w:pStyle w:val="TextinTabelle"/>
+            </w:pPr>
+          </w:p>
+        </w:tc>
+      </w:tr>
+      <w:tr>
+        <w:trPr>
+          <w:trHeight w:val="254"/>
+        </w:trPr>
+        <w:tc>
+          <w:tcPr>
+            <w:tcW w:w="2355" w:type="dxa"/>
+          </w:tcPr>
+          <w:p>
+            <w:pPr>
+              <w:pStyle w:val="TextinTabelle"/>
+            </w:pPr>
+          </w:p>
+        </w:tc>
+        <w:tc>
+          <w:tcPr>
+            <w:tcW w:w="1110" w:type="dxa"/>
+          </w:tcPr>
+          <w:p>
+            <w:pPr>
+              <w:pStyle w:val="TextinTabelle"/>
+            </w:pPr>
+          </w:p>
+        </w:tc>
+        <w:tc>
+          <w:tcPr>
+            <w:tcW w:w="1245" w:type="dxa"/>
+          </w:tcPr>
+          <w:p>
+            <w:pPr>
+              <w:pStyle w:val="TextinTabelle"/>
+            </w:pPr>
+          </w:p>
+        </w:tc>
+        <w:tc>
+          <w:tcPr>
+            <w:tcW w:w="837" w:type="dxa"/>
+          </w:tcPr>
+          <w:p>
+            <w:pPr>
+              <w:pStyle w:val="TextinTabelle"/>
+            </w:pPr>
+          </w:p>
+        </w:tc>
+        <w:tc>
+          <w:tcPr>
+            <w:tcW w:w="1140" w:type="dxa"/>
+          </w:tcPr>
+          <w:p>
+            <w:pPr>
+              <w:pStyle w:val="TextinTabelle"/>
+            </w:pPr>
+          </w:p>
+        </w:tc>
+        <w:tc>
+          <w:tcPr>
+            <w:tcW w:w="720" w:type="dxa"/>
+          </w:tcPr>
+          <w:p>
+            <w:pPr>
+              <w:pStyle w:val="TextinTabelle"/>
+            </w:pPr>
+          </w:p>
+        </w:tc>
+        <w:tc>
+          <w:tcPr>
+            <w:tcW w:w="1310" w:type="dxa"/>
+          </w:tcPr>
+          <w:p>
+            <w:pPr>
+              <w:pStyle w:val="TextinTabelle"/>
+            </w:pPr>
+          </w:p>
+        </w:tc>
+        <w:tc>
+          <w:tcPr>
+            <w:tcW w:w="704" w:type="dxa"/>
+          </w:tcPr>
+          <w:p>
+            <w:pPr>
+              <w:pStyle w:val="TextinTabelle"/>
+            </w:pPr>
+          </w:p>
+        </w:tc>
+      </w:tr>
+    </w:tbl>
+    <w:p>
+      <w:pPr>
+        <w:pStyle w:val="Beschriftung"/>
+      </w:pPr>
+      <w:r>
+        <w:t xml:space="preserve">Tabelle </w:t>
+      </w:r>
+      <w:r>
+        <w:fldChar w:fldCharType="begin"/>
+      </w:r>
+      <w:r>
+        <w:instrText xml:space="preserve"> SEQ Tabelle \* ARABIC </w:instrText>
+      </w:r>
+      <w:r>
+        <w:fldChar w:fldCharType="separate"/>
+      </w:r>
+      <w:r>
+        <w:t>1</w:t>
+      </w:r>
+      <w:r>
+        <w:fldChar w:fldCharType="end"/>
+      </w:r>
+      <w:r>
+        <w:t xml:space="preserve">: Vorgebe </w:t>
+      </w:r>
+      <w:r>
+        <w:t xml:space="preserve">Struktur </w:t>
+      </w:r>
+      <w:r>
+        <w:t>vom Leit</w:t>
+      </w:r>
+      <w:r>
+        <w:t>n</w:t>
+      </w:r>
+      <w:r>
+        <w:t xml:space="preserve">er für die Integration </w:t>
+      </w:r>
+      <w:r>
+        <w:t>des SAP-Systems</w:t>
+      </w:r>
+    </w:p>
+    <w:p>
+      <w:pPr>
+        <w:pStyle w:val="Text"/>
+      </w:pPr>
+    </w:p>
+    <w:p>
+      <w:pPr>
+        <w:jc w:val="left"/>
+      </w:pPr>
+      <w:r>
+        <w:br w:type="page"/>
+      </w:r>
+    </w:p>
+    <w:p>
+      <w:pPr>
+        <w:pStyle w:val="berschrift3"/>
+      </w:pPr>
+      <w:bookmarkStart w:id="54" w:name="_Toc221613888"/>
+      <w:r>
+        <w:lastRenderedPageBreak/>
+        <w:t>Verwendung von Literatur, Internetquellen und KI</w:t>
+      </w:r>
+      <w:bookmarkEnd w:id="54"/>
+    </w:p>
+    <w:p>
+      <w:pPr>
+        <w:pStyle w:val="Text"/>
+      </w:pPr>
+      <w:r>
+        <w:t>Die in diesem Kapitel dargestellten theoretischen Inhalte basieren auf Fachliteratur zu Stereo</w:t>
+      </w:r>
+      <w:r>
+        <w:noBreakHyphen/>
+        <w:t>Vision, Bildverarbeitung, Sensortechnik, Fachwissen aus dem Unterricht und elektronischer Messtechnik sowie auf technischen Datenblättern der eingesetzten Komponenten. Zusätzlich wurde ein KI</w:t>
+      </w:r>
+      <w:r>
+        <w:noBreakHyphen/>
+        <w:t>System unterstützend zur sprachlichen Strukturierung und zur Erklärung grundlegender Zusammenhänge verwendet. Sämtliche fachlichen Inhalte wurden eigenständig überprüft und mit geeigneten Quellen abgeglichen.</w:t>
+      </w:r>
+    </w:p>
+    <w:p>
+      <w:pPr>
+        <w:pStyle w:val="Text"/>
+        <w:rPr>
+          <w:color w:val="0066FF"/>
+        </w:rPr>
+      </w:pPr>
+    </w:p>
+    <w:p>
+      <w:pPr>
+        <w:pStyle w:val="Text"/>
+        <w:rPr>
+          <w:color w:val="0066FF"/>
+        </w:rPr>
+      </w:pPr>
+    </w:p>
+    <w:p>
+      <w:pPr>
+        <w:pStyle w:val="berschrift3"/>
+      </w:pPr>
+      <w:bookmarkStart w:id="55" w:name="_Toc221613889"/>
+      <w:r>
+        <w:rPr>
+          <w:color w:val="0066FF"/>
+        </w:rPr>
+        <w:t>Weitere Hinweise</w:t>
+      </w:r>
+      <w:bookmarkEnd w:id="55"/>
+      <w:r>
+        <w:t xml:space="preserve"> </w:t>
+      </w:r>
+    </w:p>
+    <w:p>
+      <w:pPr>
+        <w:pStyle w:val="Text"/>
+        <w:rPr>
+          <w:color w:val="0066FF"/>
+        </w:rPr>
+      </w:pPr>
+      <w:r>
+        <w:rPr>
+          <w:color w:val="0066FF"/>
+        </w:rPr>
+        <w:t xml:space="preserve">In </w:t>
+      </w:r>
+      <w:r>
+        <w:rPr>
+          <w:b/>
+          <w:color w:val="0066FF"/>
+        </w:rPr>
+        <w:t xml:space="preserve">blau </w:t>
+      </w:r>
+      <w:proofErr w:type="spellStart"/>
+      <w:r>
+        <w:rPr>
+          <w:b/>
+          <w:color w:val="0066FF"/>
+        </w:rPr>
+        <w:t>geschrieber</w:t>
+      </w:r>
+      <w:proofErr w:type="spellEnd"/>
+      <w:r>
+        <w:rPr>
+          <w:b/>
+          <w:color w:val="0066FF"/>
+        </w:rPr>
+        <w:t xml:space="preserve"> Text</w:t>
+      </w:r>
+      <w:r>
+        <w:rPr>
+          <w:color w:val="0066FF"/>
+        </w:rPr>
+        <w:t xml:space="preserve"> …</w:t>
+      </w:r>
+    </w:p>
+    <w:p>
+      <w:pPr>
+        <w:pStyle w:val="Text"/>
+        <w:numPr>
+          <w:ilvl w:val="0"/>
+          <w:numId w:val="13"/>
+        </w:numPr>
+        <w:rPr>
+          <w:color w:val="0066FF"/>
+        </w:rPr>
+      </w:pPr>
+      <w:r>
+        <w:rPr>
+          <w:color w:val="0066FF"/>
+        </w:rPr>
+        <w:t xml:space="preserve">dient einerseits als </w:t>
+      </w:r>
+      <w:r>
+        <w:rPr>
+          <w:b/>
+          <w:color w:val="0066FF"/>
+        </w:rPr>
+        <w:t>Platzhalter</w:t>
+      </w:r>
+      <w:r>
+        <w:rPr>
+          <w:color w:val="0066FF"/>
+        </w:rPr>
+        <w:t xml:space="preserve"> -&gt; muss durch die entsprechenden Informationen ersetzt und schwarz formatiert werden! </w:t>
+      </w:r>
+    </w:p>
+    <w:p>
+      <w:pPr>
+        <w:pStyle w:val="Text"/>
+        <w:numPr>
+          <w:ilvl w:val="0"/>
+          <w:numId w:val="13"/>
+        </w:numPr>
+        <w:rPr>
+          <w:color w:val="0066FF"/>
+        </w:rPr>
+      </w:pPr>
+      <w:r>
+        <w:rPr>
+          <w:color w:val="0066FF"/>
+        </w:rPr>
+        <w:t xml:space="preserve">Andererseits ist es reiner </w:t>
+      </w:r>
+      <w:r>
+        <w:rPr>
+          <w:b/>
+          <w:color w:val="0066FF"/>
+        </w:rPr>
+        <w:t>Informationstext</w:t>
+      </w:r>
+      <w:r>
+        <w:rPr>
+          <w:color w:val="0066FF"/>
+        </w:rPr>
+        <w:t>, welcher gänzlich gelöscht werden muss!</w:t>
+      </w:r>
+    </w:p>
+    <w:p>
+      <w:pPr>
+        <w:pStyle w:val="Text"/>
+        <w:rPr>
+          <w:color w:val="0066FF"/>
+        </w:rPr>
+      </w:pPr>
+    </w:p>
+    <w:p>
+      <w:pPr>
+        <w:pStyle w:val="Text"/>
+        <w:rPr>
+          <w:color w:val="0066FF"/>
+        </w:rPr>
+      </w:pPr>
+      <w:r>
+        <w:rPr>
+          <w:color w:val="0066FF"/>
+        </w:rPr>
+        <w:t xml:space="preserve">Es sollen </w:t>
+      </w:r>
+      <w:r>
+        <w:rPr>
+          <w:b/>
+          <w:color w:val="0066FF"/>
+          <w:sz w:val="22"/>
+          <w:szCs w:val="22"/>
+        </w:rPr>
+        <w:t>nicht mehr als 3 Überschriften-Ebenen</w:t>
+      </w:r>
+      <w:r>
+        <w:rPr>
+          <w:color w:val="0066FF"/>
+          <w:sz w:val="22"/>
+          <w:szCs w:val="22"/>
+        </w:rPr>
+        <w:t xml:space="preserve"> </w:t>
+      </w:r>
+      <w:r>
+        <w:rPr>
+          <w:color w:val="0066FF"/>
+        </w:rPr>
+        <w:t>verwendet werden, sonst werden Inhaltsverzeichnis und Abschnittsnummerierung zu unübersichtlich!</w:t>
+      </w:r>
+    </w:p>
+    <w:p>
+      <w:pPr>
+        <w:pStyle w:val="Text"/>
+        <w:rPr>
+          <w:b/>
+          <w:color w:val="0066FF"/>
+        </w:rPr>
+      </w:pPr>
+      <w:r>
+        <w:rPr>
+          <w:b/>
+          <w:color w:val="0066FF"/>
+        </w:rPr>
+        <w:t>Gliederung durch Blöcke innerhalb von Ebene3:</w:t>
+      </w:r>
+    </w:p>
+    <w:p>
+      <w:pPr>
+        <w:pStyle w:val="Text"/>
+        <w:rPr>
+          <w:color w:val="0066FF"/>
+        </w:rPr>
+      </w:pPr>
+      <w:r>
+        <w:rPr>
+          <w:color w:val="0066FF"/>
+        </w:rPr>
+        <w:t>Ist innerhalb der Ebene 3 eine weitere Gliederung notwendig, sollte diese in Form von Blöcken mit nicht-nummerierten Überschriften erfolgen. Diese Überschriften werden als Text formatiert und fett geschrieben.</w:t>
+      </w:r>
+    </w:p>
+    <w:p>
+      <w:pPr>
+        <w:pStyle w:val="Text"/>
+        <w:rPr>
+          <w:color w:val="0066FF"/>
+        </w:rPr>
+      </w:pPr>
+      <w:r>
+        <w:rPr>
+          <w:color w:val="0066FF"/>
+        </w:rPr>
+        <w:t xml:space="preserve">Innerhalb des „normalen“ Textes werden Wörter, Wortgruppen oder ähnliche Textteile </w:t>
+      </w:r>
+      <w:r>
+        <w:rPr>
+          <w:b/>
+          <w:color w:val="0066FF"/>
+        </w:rPr>
+        <w:t>hervorgehoben</w:t>
+      </w:r>
+      <w:r>
+        <w:rPr>
+          <w:color w:val="0066FF"/>
+        </w:rPr>
+        <w:t xml:space="preserve">, in dem sie </w:t>
+      </w:r>
+      <w:r>
+        <w:rPr>
+          <w:b/>
+          <w:color w:val="0066FF"/>
+        </w:rPr>
+        <w:t>fett</w:t>
+      </w:r>
+      <w:r>
+        <w:rPr>
+          <w:color w:val="0066FF"/>
+        </w:rPr>
+        <w:t xml:space="preserve"> geschrieben. </w:t>
+      </w:r>
+      <w:r>
+        <w:rPr>
+          <w:i/>
+          <w:color w:val="0066FF"/>
+        </w:rPr>
+        <w:t>Kursiv</w:t>
+      </w:r>
+      <w:r>
+        <w:rPr>
+          <w:color w:val="0066FF"/>
+        </w:rPr>
+        <w:t xml:space="preserve"> und </w:t>
+      </w:r>
+      <w:r>
+        <w:rPr>
+          <w:color w:val="0066FF"/>
+          <w:u w:val="single"/>
+        </w:rPr>
+        <w:t>unterstrichen</w:t>
+      </w:r>
+      <w:r>
+        <w:rPr>
+          <w:color w:val="0066FF"/>
+        </w:rPr>
+        <w:t xml:space="preserve"> sollten </w:t>
+      </w:r>
+      <w:r>
+        <w:rPr>
+          <w:b/>
+          <w:color w:val="0066FF"/>
+        </w:rPr>
+        <w:t>eher vermieden</w:t>
+      </w:r>
+      <w:r>
+        <w:rPr>
+          <w:color w:val="0066FF"/>
+        </w:rPr>
+        <w:t xml:space="preserve"> werden (einheitliches Design).</w:t>
+      </w:r>
+    </w:p>
+    <w:p>
+      <w:pPr>
+        <w:pStyle w:val="Text"/>
+        <w:rPr>
+          <w:b/>
+          <w:color w:val="0066FF"/>
+        </w:rPr>
+      </w:pPr>
+    </w:p>
+    <w:p>
+      <w:pPr>
+        <w:pStyle w:val="Text"/>
+        <w:rPr>
+          <w:color w:val="0066FF"/>
+        </w:rPr>
+      </w:pPr>
+      <w:r>
+        <w:rPr>
+          <w:b/>
+          <w:color w:val="0066FF"/>
+        </w:rPr>
+        <w:t>Beispiel für Listen</w:t>
+      </w:r>
+      <w:r>
+        <w:rPr>
+          <w:color w:val="0066FF"/>
+        </w:rPr>
+        <w:t xml:space="preserve"> (FV: Listenabsatz) </w:t>
+      </w:r>
+    </w:p>
+    <w:p>
+      <w:pPr>
+        <w:pStyle w:val="Text"/>
+        <w:numPr>
+          <w:ilvl w:val="0"/>
+          <w:numId w:val="11"/>
+        </w:numPr>
+        <w:rPr>
+          <w:color w:val="0066FF"/>
+        </w:rPr>
+      </w:pPr>
+      <w:r>
+        <w:rPr>
+          <w:color w:val="0066FF"/>
+        </w:rPr>
+        <w:t>Aufzählungspunkt 1</w:t>
+      </w:r>
+    </w:p>
+    <w:p>
+      <w:pPr>
+        <w:pStyle w:val="Text"/>
+        <w:numPr>
+          <w:ilvl w:val="0"/>
+          <w:numId w:val="11"/>
+        </w:numPr>
+        <w:rPr>
+          <w:color w:val="0066FF"/>
+        </w:rPr>
+      </w:pPr>
+      <w:r>
+        <w:rPr>
+          <w:color w:val="0066FF"/>
+        </w:rPr>
+        <w:t>Zweiter Punkt der Liste</w:t>
+      </w:r>
+    </w:p>
+    <w:p>
+      <w:pPr>
+        <w:pStyle w:val="Text"/>
+        <w:numPr>
+          <w:ilvl w:val="0"/>
+          <w:numId w:val="11"/>
+        </w:numPr>
+        <w:rPr>
+          <w:color w:val="0066FF"/>
+        </w:rPr>
+      </w:pPr>
+      <w:r>
+        <w:rPr>
+          <w:color w:val="0066FF"/>
+        </w:rPr>
+        <w:t>Und so weiter</w:t>
+      </w:r>
+    </w:p>
+    <w:p>
+      <w:pPr>
+        <w:pStyle w:val="Text"/>
+        <w:rPr>
+          <w:b/>
+          <w:color w:val="0066FF"/>
+        </w:rPr>
+      </w:pPr>
+    </w:p>
+    <w:p>
+      <w:pPr>
+        <w:pStyle w:val="Text"/>
+        <w:rPr>
+          <w:b/>
+          <w:color w:val="0066FF"/>
+        </w:rPr>
+      </w:pPr>
+      <w:r>
+        <w:rPr>
+          <w:b/>
+          <w:color w:val="0066FF"/>
+        </w:rPr>
+        <w:t>Beispiel für Tabellen inkl. Beschriftung</w:t>
       </w:r>
     </w:p>
     <w:tbl>
@@ -6725,84 +8267,80 @@
         <w:t xml:space="preserve">Tabelle </w:t>
       </w:r>
       <w:r>
-        <w:fldChar w:fldCharType="begin"/>
-      </w:r>
-      <w:r>
-        <w:instrText xml:space="preserve"> SEQ Tabelle \* ARABIC </w:instrText>
-      </w:r>
-      <w:r>
-        <w:fldChar w:fldCharType="separate"/>
-      </w:r>
-      <w:r>
-        <w:t>1</w:t>
-      </w:r>
-      <w:r>
-        <w:fldChar w:fldCharType="end"/>
-      </w:r>
-      <w:r>
-        <w:t xml:space="preserve">: </w:t>
-      </w:r>
-      <w:r>
-        <w:t xml:space="preserve">Vorgebe </w:t>
-      </w:r>
-      <w:r>
-        <w:t xml:space="preserve">Struktur </w:t>
-      </w:r>
-      <w:r>
-        <w:t>vom Leit</w:t>
-      </w:r>
-      <w:r>
-        <w:t>n</w:t>
-      </w:r>
-      <w:r>
-        <w:t xml:space="preserve">er für die Integration </w:t>
-      </w:r>
-      <w:r>
-        <w:t>des SAP-Systems</w:t>
+        <w:t>2</w:t>
+      </w:r>
+      <w:r>
+        <w:t>: Dies ist die Tabellenbeschriftung</w:t>
       </w:r>
     </w:p>
     <w:p>
       <w:pPr>
         <w:pStyle w:val="Text"/>
-      </w:pPr>
-    </w:p>
-    <w:p>
-      <w:pPr>
-        <w:jc w:val="left"/>
-      </w:pPr>
-      <w:r>
-        <w:br w:type="page"/>
-      </w:r>
-    </w:p>
-    <w:p>
-      <w:pPr>
-        <w:pStyle w:val="berschrift3"/>
-      </w:pPr>
-      <w:r>
-        <w:lastRenderedPageBreak/>
-        <w:t>Verwendung von Literatur, Internetquellen und KI</w:t>
+        <w:rPr>
+          <w:color w:val="0066FF"/>
+        </w:rPr>
+      </w:pPr>
+      <w:r>
+        <w:rPr>
+          <w:color w:val="0066FF"/>
+        </w:rPr>
+        <w:t>Vorgehensweise bei der Beschriftung:</w:t>
       </w:r>
     </w:p>
     <w:p>
       <w:pPr>
         <w:pStyle w:val="Text"/>
-      </w:pPr>
-      <w:r>
-        <w:t>Die in diesem Kapitel dargestellten theoretischen Inhalte basieren auf Fachliteratur zu Stereo</w:t>
-      </w:r>
-      <w:r>
-        <w:noBreakHyphen/>
-        <w:t>Vision, Bildverarbeitung, Sensortechnik</w:t>
-      </w:r>
-      <w:r>
-        <w:t>, Fachwissen aus dem Unterricht</w:t>
-      </w:r>
-      <w:r>
-        <w:t xml:space="preserve"> und elektronischer Messtechnik sowie auf technischen Datenblättern der eingesetzten Komponenten. Zusätzlich wurde ein KI</w:t>
-      </w:r>
-      <w:r>
-        <w:noBreakHyphen/>
-        <w:t>System unterstützend zur sprachlichen Strukturierung und zur Erklärung grundlegender Zusammenhänge verwendet. Sämtliche fachlichen Inhalte wurden eigenständig überprüft und mit geeigneten Quellen abgeglichen.</w:t>
+        <w:rPr>
+          <w:color w:val="0066FF"/>
+        </w:rPr>
+      </w:pPr>
+      <w:r>
+        <w:rPr>
+          <w:color w:val="0066FF"/>
+        </w:rPr>
+        <w:t xml:space="preserve">Tabelle markieren -&gt; </w:t>
+      </w:r>
+      <w:proofErr w:type="spellStart"/>
+      <w:r>
+        <w:rPr>
+          <w:color w:val="0066FF"/>
+        </w:rPr>
+        <w:t>Rechsklick</w:t>
+      </w:r>
+      <w:proofErr w:type="spellEnd"/>
+      <w:r>
+        <w:rPr>
+          <w:color w:val="0066FF"/>
+        </w:rPr>
+        <w:t xml:space="preserve"> -&gt; „Beschriftung einfügen“ -&gt; Text eingeben (in erster Zeile „Beschriftung“ neben „Tabelle </w:t>
+      </w:r>
+      <w:proofErr w:type="spellStart"/>
+      <w:r>
+        <w:rPr>
+          <w:color w:val="0066FF"/>
+        </w:rPr>
+        <w:t>Nr</w:t>
+      </w:r>
+      <w:proofErr w:type="spellEnd"/>
+      <w:r>
+        <w:rPr>
+          <w:color w:val="0066FF"/>
+        </w:rPr>
+        <w:t xml:space="preserve">“: … Die Nummer der Tabelle wird automatisch erstellt. Als „Position“ wird „Unter dem </w:t>
+      </w:r>
+      <w:proofErr w:type="spellStart"/>
+      <w:r>
+        <w:rPr>
+          <w:color w:val="0066FF"/>
+        </w:rPr>
+        <w:t>ausgewähten</w:t>
+      </w:r>
+      <w:proofErr w:type="spellEnd"/>
+      <w:r>
+        <w:rPr>
+          <w:color w:val="0066FF"/>
+        </w:rPr>
+        <w:t xml:space="preserve"> Element“ wählen. </w:t>
       </w:r>
     </w:p>
     <w:p>
@@ -6810,6 +8348,7 @@
         <w:pStyle w:val="Text"/>
         <w:rPr>
           <w:color w:val="0066FF"/>
+          <w:highlight w:val="yellow"/>
         </w:rPr>
       </w:pPr>
     </w:p>
@@ -6817,23 +8356,20 @@
       <w:pPr>
         <w:pStyle w:val="Text"/>
         <w:rPr>
-          <w:color w:val="0066FF"/>
-        </w:rPr>
-      </w:pPr>
-    </w:p>
-    <w:p>
-      <w:pPr>
-        <w:pStyle w:val="berschrift3"/>
-      </w:pPr>
-      <w:bookmarkStart w:id="49" w:name="_Toc221019693"/>
-      <w:r>
-        <w:rPr>
-          <w:color w:val="0066FF"/>
-        </w:rPr>
-        <w:t>Weitere Hinweise</w:t>
-      </w:r>
-      <w:bookmarkEnd w:id="49"/>
-      <w:r>
+          <w:b/>
+        </w:rPr>
+      </w:pPr>
+      <w:r>
+        <w:rPr>
+          <w:b/>
+          <w:color w:val="0066FF"/>
+        </w:rPr>
+        <w:t>Beispiel für Bilder/Grafiken inkl. Beschriftung</w:t>
+      </w:r>
+      <w:r>
+        <w:rPr>
+          <w:b/>
+        </w:rPr>
         <w:t xml:space="preserve"> </w:t>
       </w:r>
     </w:p>
@@ -6844,515 +8380,33 @@
           <w:color w:val="0066FF"/>
         </w:rPr>
       </w:pPr>
-      <w:r>
-        <w:rPr>
-          <w:color w:val="0066FF"/>
-        </w:rPr>
-        <w:t xml:space="preserve">In </w:t>
-      </w:r>
-      <w:r>
-        <w:rPr>
-          <w:b/>
-          <w:color w:val="0066FF"/>
-        </w:rPr>
-        <w:t>blau geschrieber Text</w:t>
-      </w:r>
-      <w:r>
-        <w:rPr>
-          <w:color w:val="0066FF"/>
-        </w:rPr>
-        <w:t xml:space="preserve"> …</w:t>
-      </w:r>
-    </w:p>
-    <w:p>
-      <w:pPr>
-        <w:pStyle w:val="Text"/>
-        <w:numPr>
-          <w:ilvl w:val="0"/>
-          <w:numId w:val="13"/>
-        </w:numPr>
-        <w:rPr>
-          <w:color w:val="0066FF"/>
-        </w:rPr>
-      </w:pPr>
-      <w:r>
-        <w:rPr>
-          <w:color w:val="0066FF"/>
-        </w:rPr>
-        <w:t xml:space="preserve">dient einerseits als </w:t>
-      </w:r>
-      <w:r>
-        <w:rPr>
-          <w:b/>
-          <w:color w:val="0066FF"/>
-        </w:rPr>
-        <w:t>Platzhalter</w:t>
-      </w:r>
-      <w:r>
-        <w:rPr>
-          <w:color w:val="0066FF"/>
-        </w:rPr>
-        <w:t xml:space="preserve"> -&gt; muss durch die entsprechenden Informationen ersetzt und schwarz formatiert werden! </w:t>
-      </w:r>
-    </w:p>
-    <w:p>
-      <w:pPr>
-        <w:pStyle w:val="Text"/>
-        <w:numPr>
-          <w:ilvl w:val="0"/>
-          <w:numId w:val="13"/>
-        </w:numPr>
-        <w:rPr>
-          <w:color w:val="0066FF"/>
-        </w:rPr>
-      </w:pPr>
-      <w:r>
-        <w:rPr>
-          <w:color w:val="0066FF"/>
-        </w:rPr>
-        <w:t xml:space="preserve">Andererseits ist es reiner </w:t>
-      </w:r>
-      <w:r>
-        <w:rPr>
-          <w:b/>
-          <w:color w:val="0066FF"/>
-        </w:rPr>
-        <w:t>Informationstext</w:t>
-      </w:r>
-      <w:r>
-        <w:rPr>
-          <w:color w:val="0066FF"/>
-        </w:rPr>
-        <w:t>, welcher gänzlich gelöscht werden muss!</w:t>
-      </w:r>
-    </w:p>
-    <w:p>
-      <w:pPr>
-        <w:pStyle w:val="Text"/>
-        <w:rPr>
-          <w:color w:val="0066FF"/>
-        </w:rPr>
-      </w:pPr>
-    </w:p>
-    <w:p>
-      <w:pPr>
-        <w:pStyle w:val="Text"/>
-        <w:rPr>
-          <w:color w:val="0066FF"/>
-        </w:rPr>
-      </w:pPr>
-      <w:r>
-        <w:rPr>
-          <w:color w:val="0066FF"/>
-        </w:rPr>
-        <w:t xml:space="preserve">Es sollen </w:t>
-      </w:r>
-      <w:r>
-        <w:rPr>
-          <w:b/>
-          <w:color w:val="0066FF"/>
-          <w:sz w:val="22"/>
-          <w:szCs w:val="22"/>
-        </w:rPr>
-        <w:t>nicht mehr als 3 Überschriften-Ebenen</w:t>
-      </w:r>
-      <w:r>
-        <w:rPr>
-          <w:color w:val="0066FF"/>
-          <w:sz w:val="22"/>
-          <w:szCs w:val="22"/>
-        </w:rPr>
-        <w:t xml:space="preserve"> </w:t>
-      </w:r>
-      <w:r>
-        <w:rPr>
-          <w:color w:val="0066FF"/>
-        </w:rPr>
-        <w:t>verwendet werden, sonst werden Inhaltsverzeichnis und Abschnittsnummerierung zu unübersichtlich!</w:t>
-      </w:r>
-    </w:p>
-    <w:p>
-      <w:pPr>
-        <w:pStyle w:val="Text"/>
-        <w:rPr>
-          <w:b/>
-          <w:color w:val="0066FF"/>
-        </w:rPr>
-      </w:pPr>
-      <w:r>
-        <w:rPr>
-          <w:b/>
-          <w:color w:val="0066FF"/>
-        </w:rPr>
-        <w:t>Gliederung durch Blöcke innerhalb von Ebene3:</w:t>
-      </w:r>
-    </w:p>
-    <w:p>
-      <w:pPr>
-        <w:pStyle w:val="Text"/>
-        <w:rPr>
-          <w:color w:val="0066FF"/>
-        </w:rPr>
-      </w:pPr>
-      <w:r>
-        <w:rPr>
-          <w:color w:val="0066FF"/>
-        </w:rPr>
-        <w:t>Ist innerhalb der Ebene 3 eine weitere Gliederung notwendig, sollte diese in Form von Blöcken mit nicht-nummerierten Überschriften erfolgen. Diese Überschriften werden als Text formatiert und fett geschrieben.</w:t>
-      </w:r>
-    </w:p>
-    <w:p>
-      <w:pPr>
-        <w:pStyle w:val="Text"/>
-        <w:rPr>
-          <w:color w:val="0066FF"/>
-        </w:rPr>
-      </w:pPr>
-      <w:r>
-        <w:rPr>
-          <w:color w:val="0066FF"/>
-        </w:rPr>
-        <w:t xml:space="preserve">Innerhalb des „normalen“ Textes werden Wörter, Wortgruppen oder ähnliche Textteile </w:t>
-      </w:r>
-      <w:r>
-        <w:rPr>
-          <w:b/>
-          <w:color w:val="0066FF"/>
-        </w:rPr>
-        <w:t>hervorgehoben</w:t>
-      </w:r>
-      <w:r>
-        <w:rPr>
-          <w:color w:val="0066FF"/>
-        </w:rPr>
-        <w:t xml:space="preserve">, in dem sie </w:t>
-      </w:r>
-      <w:r>
-        <w:rPr>
-          <w:b/>
-          <w:color w:val="0066FF"/>
-        </w:rPr>
-        <w:t>fett</w:t>
-      </w:r>
-      <w:r>
-        <w:rPr>
-          <w:color w:val="0066FF"/>
-        </w:rPr>
-        <w:t xml:space="preserve"> geschrieben. </w:t>
-      </w:r>
-      <w:r>
-        <w:rPr>
-          <w:i/>
-          <w:color w:val="0066FF"/>
-        </w:rPr>
-        <w:t>Kursiv</w:t>
-      </w:r>
-      <w:r>
-        <w:rPr>
-          <w:color w:val="0066FF"/>
-        </w:rPr>
-        <w:t xml:space="preserve"> und </w:t>
-      </w:r>
-      <w:r>
-        <w:rPr>
-          <w:color w:val="0066FF"/>
-          <w:u w:val="single"/>
-        </w:rPr>
-        <w:t>unterstrichen</w:t>
-      </w:r>
-      <w:r>
-        <w:rPr>
-          <w:color w:val="0066FF"/>
-        </w:rPr>
-        <w:t xml:space="preserve"> sollten </w:t>
-      </w:r>
-      <w:r>
-        <w:rPr>
-          <w:b/>
-          <w:color w:val="0066FF"/>
-        </w:rPr>
-        <w:t>eher vermieden</w:t>
-      </w:r>
-      <w:r>
-        <w:rPr>
-          <w:color w:val="0066FF"/>
-        </w:rPr>
-        <w:t xml:space="preserve"> werden (einheitliches Design).</w:t>
-      </w:r>
-    </w:p>
-    <w:p>
-      <w:pPr>
-        <w:pStyle w:val="Text"/>
-        <w:rPr>
-          <w:b/>
-          <w:color w:val="0066FF"/>
-        </w:rPr>
-      </w:pPr>
-    </w:p>
-    <w:p>
-      <w:pPr>
-        <w:pStyle w:val="Text"/>
-        <w:rPr>
-          <w:color w:val="0066FF"/>
-        </w:rPr>
-      </w:pPr>
-      <w:r>
-        <w:rPr>
-          <w:b/>
-          <w:color w:val="0066FF"/>
-        </w:rPr>
-        <w:t>Beispiel für Listen</w:t>
-      </w:r>
-      <w:r>
-        <w:rPr>
-          <w:color w:val="0066FF"/>
-        </w:rPr>
-        <w:t xml:space="preserve"> (FV: Listenabsatz) </w:t>
-      </w:r>
-    </w:p>
-    <w:p>
-      <w:pPr>
-        <w:pStyle w:val="Text"/>
-        <w:numPr>
-          <w:ilvl w:val="0"/>
-          <w:numId w:val="11"/>
-        </w:numPr>
-        <w:rPr>
-          <w:color w:val="0066FF"/>
-        </w:rPr>
-      </w:pPr>
-      <w:r>
-        <w:rPr>
-          <w:color w:val="0066FF"/>
-        </w:rPr>
-        <w:t>Aufzählungspunkt 1</w:t>
-      </w:r>
-    </w:p>
-    <w:p>
-      <w:pPr>
-        <w:pStyle w:val="Text"/>
-        <w:numPr>
-          <w:ilvl w:val="0"/>
-          <w:numId w:val="11"/>
-        </w:numPr>
-        <w:rPr>
-          <w:color w:val="0066FF"/>
-        </w:rPr>
-      </w:pPr>
-      <w:r>
-        <w:rPr>
-          <w:color w:val="0066FF"/>
-        </w:rPr>
-        <w:t>Zweiter Punkt der Liste</w:t>
-      </w:r>
-    </w:p>
-    <w:p>
-      <w:pPr>
-        <w:pStyle w:val="Text"/>
-        <w:numPr>
-          <w:ilvl w:val="0"/>
-          <w:numId w:val="11"/>
-        </w:numPr>
-        <w:rPr>
-          <w:color w:val="0066FF"/>
-        </w:rPr>
-      </w:pPr>
-      <w:r>
-        <w:rPr>
-          <w:color w:val="0066FF"/>
-        </w:rPr>
-        <w:t>Und so weiter</w:t>
-      </w:r>
-    </w:p>
-    <w:p>
-      <w:pPr>
-        <w:pStyle w:val="Text"/>
-        <w:rPr>
-          <w:b/>
-          <w:color w:val="0066FF"/>
-        </w:rPr>
-      </w:pPr>
-    </w:p>
-    <w:p>
-      <w:pPr>
-        <w:pStyle w:val="Text"/>
-        <w:rPr>
-          <w:b/>
-          <w:color w:val="0066FF"/>
-        </w:rPr>
-      </w:pPr>
-      <w:r>
-        <w:rPr>
-          <w:b/>
-          <w:color w:val="0066FF"/>
-        </w:rPr>
-        <w:t>Beispiel für Tabellen inkl. Beschriftung</w:t>
-      </w:r>
-    </w:p>
-    <w:tbl>
-      <w:tblPr>
-        <w:tblStyle w:val="Tabellenraster"/>
-        <w:tblW w:w="9166" w:type="dxa"/>
-        <w:tblLayout w:type="fixed"/>
-        <w:tblLook w:val="04A0" w:firstRow="1" w:lastRow="0" w:firstColumn="1" w:lastColumn="0" w:noHBand="0" w:noVBand="1"/>
-      </w:tblPr>
-      <w:tblGrid>
-        <w:gridCol w:w="3055"/>
-        <w:gridCol w:w="3055"/>
-        <w:gridCol w:w="3056"/>
-      </w:tblGrid>
-      <w:tr>
-        <w:tc>
-          <w:tcPr>
-            <w:tcW w:w="3055" w:type="dxa"/>
-          </w:tcPr>
-          <w:p>
-            <w:pPr>
-              <w:pStyle w:val="TextinTabelle"/>
-            </w:pPr>
-            <w:r>
-              <w:t>FV: Text in Tabelle</w:t>
-            </w:r>
-          </w:p>
-        </w:tc>
-        <w:tc>
-          <w:tcPr>
-            <w:tcW w:w="3055" w:type="dxa"/>
-          </w:tcPr>
-          <w:p>
-            <w:pPr>
-              <w:pStyle w:val="TextinTabelle"/>
-            </w:pPr>
-          </w:p>
-        </w:tc>
-        <w:tc>
-          <w:tcPr>
-            <w:tcW w:w="3056" w:type="dxa"/>
-          </w:tcPr>
-          <w:p>
-            <w:pPr>
-              <w:pStyle w:val="TextinTabelle"/>
-            </w:pPr>
-          </w:p>
-        </w:tc>
-      </w:tr>
-      <w:tr>
-        <w:tc>
-          <w:tcPr>
-            <w:tcW w:w="3055" w:type="dxa"/>
-          </w:tcPr>
-          <w:p>
-            <w:pPr>
-              <w:pStyle w:val="TextinTabelle"/>
-            </w:pPr>
-          </w:p>
-        </w:tc>
-        <w:tc>
-          <w:tcPr>
-            <w:tcW w:w="3055" w:type="dxa"/>
-          </w:tcPr>
-          <w:p>
-            <w:pPr>
-              <w:pStyle w:val="TextinTabelle"/>
-            </w:pPr>
-          </w:p>
-        </w:tc>
-        <w:tc>
-          <w:tcPr>
-            <w:tcW w:w="3056" w:type="dxa"/>
-          </w:tcPr>
-          <w:p>
-            <w:pPr>
-              <w:pStyle w:val="TextinTabelle"/>
-            </w:pPr>
-          </w:p>
-        </w:tc>
-      </w:tr>
-    </w:tbl>
-    <w:p>
-      <w:pPr>
-        <w:pStyle w:val="Beschriftung"/>
-      </w:pPr>
-      <w:r>
-        <w:t xml:space="preserve">Tabelle </w:t>
-      </w:r>
-      <w:r>
-        <w:t>2</w:t>
-      </w:r>
-      <w:r>
-        <w:t>: Dies ist die Tabellenbeschriftung</w:t>
-      </w:r>
-    </w:p>
-    <w:p>
-      <w:pPr>
-        <w:pStyle w:val="Text"/>
-        <w:rPr>
-          <w:color w:val="0066FF"/>
-        </w:rPr>
-      </w:pPr>
-      <w:r>
-        <w:rPr>
-          <w:color w:val="0066FF"/>
-        </w:rPr>
-        <w:t>Vorgehensweise bei der Beschriftung:</w:t>
-      </w:r>
-    </w:p>
-    <w:p>
-      <w:pPr>
-        <w:pStyle w:val="Text"/>
-        <w:rPr>
-          <w:color w:val="0066FF"/>
-        </w:rPr>
-      </w:pPr>
-      <w:r>
-        <w:rPr>
-          <w:color w:val="0066FF"/>
-        </w:rPr>
-        <w:t xml:space="preserve">Tabelle markieren -&gt; Rechsklick -&gt; „Beschriftung einfügen“ -&gt; Text eingeben (in erster Zeile „Beschriftung“ neben „Tabelle Nr“: … Die Nummer der Tabelle wird automatisch erstellt. Als „Position“ wird „Unter dem ausgewähten Element“ wählen. </w:t>
-      </w:r>
-    </w:p>
-    <w:p>
-      <w:pPr>
-        <w:pStyle w:val="Text"/>
-        <w:rPr>
-          <w:color w:val="0066FF"/>
-          <w:highlight w:val="yellow"/>
-        </w:rPr>
-      </w:pPr>
-    </w:p>
-    <w:p>
-      <w:pPr>
-        <w:pStyle w:val="Text"/>
-        <w:rPr>
-          <w:b/>
-        </w:rPr>
-      </w:pPr>
-      <w:r>
-        <w:rPr>
-          <w:b/>
-          <w:color w:val="0066FF"/>
-        </w:rPr>
-        <w:t>Beispiel für Bilder/Grafiken inkl. Beschriftung</w:t>
-      </w:r>
-      <w:r>
-        <w:rPr>
-          <w:b/>
-        </w:rPr>
-        <w:t xml:space="preserve"> </w:t>
-      </w:r>
-    </w:p>
-    <w:p>
-      <w:pPr>
-        <w:pStyle w:val="Text"/>
-        <w:rPr>
-          <w:color w:val="0066FF"/>
-        </w:rPr>
-      </w:pPr>
-      <w:r>
-        <w:rPr>
-          <w:color w:val="0066FF"/>
-        </w:rPr>
-        <w:t>jpg, png und ähnliche Bilddateien werden mit „Einfügen“ -&gt; „Bilder“ -&gt; „Dieses Gerät (oder passende Quelle wählen)“ eingefügt. Idealerweise sind Bilder „zentriert“ zu platzieren.</w:t>
+      <w:proofErr w:type="spellStart"/>
+      <w:r>
+        <w:rPr>
+          <w:color w:val="0066FF"/>
+        </w:rPr>
+        <w:t>jpg</w:t>
+      </w:r>
+      <w:proofErr w:type="spellEnd"/>
+      <w:r>
+        <w:rPr>
+          <w:color w:val="0066FF"/>
+        </w:rPr>
+        <w:t xml:space="preserve">, </w:t>
+      </w:r>
+      <w:proofErr w:type="spellStart"/>
+      <w:r>
+        <w:rPr>
+          <w:color w:val="0066FF"/>
+        </w:rPr>
+        <w:t>png</w:t>
+      </w:r>
+      <w:proofErr w:type="spellEnd"/>
+      <w:r>
+        <w:rPr>
+          <w:color w:val="0066FF"/>
+        </w:rPr>
+        <w:t xml:space="preserve"> und ähnliche Bilddateien werden mit „Einfügen“ -&gt; „Bilder“ -&gt; „Dieses Gerät (oder passende Quelle wählen)“ eingefügt. Idealerweise sind Bilder „zentriert“ zu platzieren.</w:t>
       </w:r>
     </w:p>
     <w:p>
@@ -7443,12 +8497,12 @@
       <w:pPr>
         <w:pStyle w:val="berschrift2"/>
       </w:pPr>
-      <w:bookmarkStart w:id="50" w:name="_Toc221019694"/>
+      <w:bookmarkStart w:id="56" w:name="_Toc221613890"/>
       <w:r>
         <w:lastRenderedPageBreak/>
         <w:t>Praktische Umsetzung</w:t>
       </w:r>
-      <w:bookmarkEnd w:id="50"/>
+      <w:bookmarkEnd w:id="56"/>
     </w:p>
     <w:p>
       <w:r>
@@ -7462,11 +8516,11 @@
       <w:pPr>
         <w:pStyle w:val="berschrift2"/>
       </w:pPr>
-      <w:bookmarkStart w:id="51" w:name="_Toc221019695"/>
+      <w:bookmarkStart w:id="57" w:name="_Toc221613891"/>
       <w:r>
         <w:t>Weitere individuelle Abschnitte</w:t>
       </w:r>
-      <w:bookmarkEnd w:id="51"/>
+      <w:bookmarkEnd w:id="57"/>
       <w:r>
         <w:t xml:space="preserve"> </w:t>
       </w:r>
@@ -7482,18 +8536,54 @@
         <w:rPr>
           <w:color w:val="0066FF"/>
         </w:rPr>
-        <w:t>(FV = Text) Diese Abschnitte sind individuell mit Ihren Betreuer:innen festzulegen.</w:t>
-      </w:r>
+        <w:t xml:space="preserve">(FV = Text) Diese Abschnitte sind individuell </w:t>
+      </w:r>
+      <w:proofErr w:type="gramStart"/>
+      <w:r>
+        <w:rPr>
+          <w:color w:val="0066FF"/>
+        </w:rPr>
+        <w:t xml:space="preserve">mit Ihren </w:t>
+      </w:r>
+      <w:proofErr w:type="spellStart"/>
+      <w:r>
+        <w:rPr>
+          <w:color w:val="0066FF"/>
+        </w:rPr>
+        <w:t>Betreuer</w:t>
+      </w:r>
+      <w:proofErr w:type="gramEnd"/>
+      <w:r>
+        <w:rPr>
+          <w:color w:val="0066FF"/>
+        </w:rPr>
+        <w:t>:innen</w:t>
+      </w:r>
+      <w:proofErr w:type="spellEnd"/>
+      <w:r>
+        <w:rPr>
+          <w:color w:val="0066FF"/>
+        </w:rPr>
+        <w:t xml:space="preserve"> festzulegen.</w:t>
+      </w:r>
+    </w:p>
+    <w:p>
+      <w:pPr>
+        <w:pStyle w:val="Text"/>
+        <w:rPr>
+          <w:color w:val="0066FF"/>
+        </w:rPr>
+      </w:pPr>
     </w:p>
     <w:p>
       <w:pPr>
         <w:pStyle w:val="berschrift2"/>
       </w:pPr>
-      <w:bookmarkStart w:id="52" w:name="_Toc221019696"/>
+      <w:bookmarkStart w:id="58" w:name="_Toc221613892"/>
       <w:r>
         <w:t>Ergebnisse und Diskussion</w:t>
       </w:r>
-      <w:bookmarkEnd w:id="52"/>
+      <w:bookmarkEnd w:id="58"/>
     </w:p>
     <w:p>
       <w:pPr>
@@ -7513,23 +8603,37 @@
       <w:pPr>
         <w:pStyle w:val="berschrift2"/>
       </w:pPr>
-      <w:bookmarkStart w:id="53" w:name="_Toc221019697"/>
+      <w:bookmarkStart w:id="59" w:name="_Toc221613893"/>
       <w:r>
         <w:t>Zusammenfassung individueller Teil</w:t>
       </w:r>
-      <w:bookmarkEnd w:id="53"/>
-    </w:p>
-    <w:p>
-      <w:pPr>
-        <w:rPr>
-          <w:color w:val="0066FF"/>
-        </w:rPr>
-      </w:pPr>
-      <w:r>
-        <w:rPr>
-          <w:color w:val="0066FF"/>
-        </w:rPr>
-        <w:t>(FV = Text) Hier werden die wichtigsten Fakten der individuellen Aufgabe des Schülers / der Schülerin kurz zusammengefasst werden.</w:t>
+      <w:bookmarkEnd w:id="59"/>
+    </w:p>
+    <w:p>
+      <w:pPr>
+        <w:rPr>
+          <w:color w:val="0066FF"/>
+        </w:rPr>
+      </w:pPr>
+      <w:r>
+        <w:rPr>
+          <w:color w:val="0066FF"/>
+        </w:rPr>
+        <w:t xml:space="preserve">(FV = Text) </w:t>
+      </w:r>
+      <w:proofErr w:type="gramStart"/>
+      <w:r>
+        <w:rPr>
+          <w:color w:val="0066FF"/>
+        </w:rPr>
+        <w:t>Hier</w:t>
+      </w:r>
+      <w:proofErr w:type="gramEnd"/>
+      <w:r>
+        <w:rPr>
+          <w:color w:val="0066FF"/>
+        </w:rPr>
+        <w:t xml:space="preserve"> werden die wichtigsten Fakten der individuellen Aufgabe des Schülers / der Schülerin kurz zusammengefasst werden.</w:t>
       </w:r>
     </w:p>
     <w:p>
@@ -7649,26 +8753,26 @@
       <w:pPr>
         <w:pStyle w:val="berschrift1"/>
       </w:pPr>
-      <w:bookmarkStart w:id="54" w:name="_Ref200468988"/>
-      <w:bookmarkStart w:id="55" w:name="_Ref200469530"/>
-      <w:bookmarkStart w:id="56" w:name="_Toc221019698"/>
+      <w:bookmarkStart w:id="60" w:name="_Ref200468988"/>
+      <w:bookmarkStart w:id="61" w:name="_Ref200469530"/>
+      <w:bookmarkStart w:id="62" w:name="_Toc221613894"/>
       <w:r>
         <w:lastRenderedPageBreak/>
         <w:t>Zusammenfassung und Ausblick</w:t>
       </w:r>
-      <w:bookmarkEnd w:id="54"/>
-      <w:bookmarkEnd w:id="55"/>
-      <w:bookmarkEnd w:id="56"/>
+      <w:bookmarkEnd w:id="60"/>
+      <w:bookmarkEnd w:id="61"/>
+      <w:bookmarkEnd w:id="62"/>
     </w:p>
     <w:p>
       <w:pPr>
         <w:pStyle w:val="berschrift2"/>
       </w:pPr>
-      <w:bookmarkStart w:id="57" w:name="_Toc221019699"/>
+      <w:bookmarkStart w:id="63" w:name="_Toc221613895"/>
       <w:r>
         <w:t>Zusammenfassung der gesamten Arbeit</w:t>
       </w:r>
-      <w:bookmarkEnd w:id="57"/>
+      <w:bookmarkEnd w:id="63"/>
     </w:p>
     <w:p>
       <w:pPr>
@@ -7702,11 +8806,11 @@
       <w:pPr>
         <w:pStyle w:val="berschrift2"/>
       </w:pPr>
-      <w:bookmarkStart w:id="58" w:name="_Toc221019700"/>
+      <w:bookmarkStart w:id="64" w:name="_Toc221613896"/>
       <w:r>
         <w:t>Ausblick</w:t>
       </w:r>
-      <w:bookmarkEnd w:id="58"/>
+      <w:bookmarkEnd w:id="64"/>
     </w:p>
     <w:p>
       <w:pPr>
@@ -7826,8 +8930,16 @@
         <w:rPr>
           <w:color w:val="0066FF"/>
         </w:rPr>
-        <w:t>Erweiterung der Funktionalität des vorliegendes Projekts</w:t>
-      </w:r>
+        <w:t xml:space="preserve">Erweiterung der Funktionalität </w:t>
+      </w:r>
+      <w:proofErr w:type="gramStart"/>
+      <w:r>
+        <w:rPr>
+          <w:color w:val="0066FF"/>
+        </w:rPr>
+        <w:t>des vorliegendes Projekts</w:t>
+      </w:r>
+      <w:proofErr w:type="gramEnd"/>
     </w:p>
     <w:p>
       <w:pPr>
@@ -7849,14 +8961,14 @@
       <w:pPr>
         <w:pStyle w:val="berschrift1"/>
       </w:pPr>
-      <w:bookmarkStart w:id="59" w:name="_Ref200468159"/>
-      <w:bookmarkStart w:id="60" w:name="_Toc221019701"/>
+      <w:bookmarkStart w:id="65" w:name="_Ref200468159"/>
+      <w:bookmarkStart w:id="66" w:name="_Toc221613897"/>
       <w:r>
         <w:lastRenderedPageBreak/>
         <w:t>Erklärung der Eigenständigkeit</w:t>
       </w:r>
-      <w:bookmarkEnd w:id="59"/>
-      <w:bookmarkEnd w:id="60"/>
+      <w:bookmarkEnd w:id="65"/>
+      <w:bookmarkEnd w:id="66"/>
     </w:p>
     <w:p>
       <w:pPr>
@@ -7930,8 +9042,13 @@
             <w:pPr>
               <w:pStyle w:val="TextinTabelle"/>
             </w:pPr>
-            <w:r>
-              <w:t>Schüler:in 1</w:t>
+            <w:proofErr w:type="spellStart"/>
+            <w:r>
+              <w:t>Schüler:in</w:t>
+            </w:r>
+            <w:proofErr w:type="spellEnd"/>
+            <w:r>
+              <w:t xml:space="preserve"> 1</w:t>
             </w:r>
           </w:p>
         </w:tc>
@@ -8014,206 +9131,262 @@
           <w:docGrid w:type="lines" w:linePitch="360"/>
         </w:sectPr>
       </w:pPr>
-      <w:bookmarkStart w:id="61" w:name="_Ref200469499"/>
-      <w:bookmarkStart w:id="62" w:name="_Toc221019702"/>
+      <w:bookmarkStart w:id="67" w:name="_Ref200469499"/>
+      <w:bookmarkStart w:id="68" w:name="_Toc221613898"/>
       <w:r>
         <w:lastRenderedPageBreak/>
         <w:t>Arbeitsnachweise</w:t>
       </w:r>
-      <w:bookmarkEnd w:id="61"/>
-      <w:bookmarkEnd w:id="62"/>
+      <w:bookmarkEnd w:id="67"/>
+      <w:bookmarkEnd w:id="68"/>
     </w:p>
     <w:p>
       <w:pPr>
         <w:pStyle w:val="berschrift1"/>
       </w:pPr>
-      <w:bookmarkStart w:id="63" w:name="_Toc84751256"/>
-      <w:bookmarkStart w:id="64" w:name="_Toc211138167"/>
-      <w:bookmarkStart w:id="65" w:name="_Toc211137922"/>
-      <w:bookmarkStart w:id="66" w:name="_Toc84757221"/>
-      <w:bookmarkStart w:id="67" w:name="_Toc210560305"/>
-      <w:bookmarkStart w:id="68" w:name="_Toc210560252"/>
-      <w:bookmarkStart w:id="69" w:name="_Ref210560064"/>
-      <w:bookmarkStart w:id="70" w:name="_Toc84751368"/>
-      <w:bookmarkStart w:id="71" w:name="_Ref200467937"/>
-      <w:bookmarkStart w:id="72" w:name="_Ref200469033"/>
-      <w:bookmarkStart w:id="73" w:name="_Toc221019703"/>
+      <w:bookmarkStart w:id="69" w:name="_Toc84751256"/>
+      <w:bookmarkStart w:id="70" w:name="_Toc211138167"/>
+      <w:bookmarkStart w:id="71" w:name="_Toc211137922"/>
+      <w:bookmarkStart w:id="72" w:name="_Toc84757221"/>
+      <w:bookmarkStart w:id="73" w:name="_Toc210560305"/>
+      <w:bookmarkStart w:id="74" w:name="_Toc210560252"/>
+      <w:bookmarkStart w:id="75" w:name="_Ref210560064"/>
+      <w:bookmarkStart w:id="76" w:name="_Toc84751368"/>
+      <w:bookmarkStart w:id="77" w:name="_Ref200467937"/>
+      <w:bookmarkStart w:id="78" w:name="_Ref200469033"/>
+      <w:bookmarkStart w:id="79" w:name="_Toc221613899"/>
       <w:r>
         <w:lastRenderedPageBreak/>
         <w:t>Verzeichnisse</w:t>
       </w:r>
-      <w:bookmarkEnd w:id="63"/>
-      <w:bookmarkEnd w:id="64"/>
-      <w:bookmarkEnd w:id="65"/>
-      <w:bookmarkEnd w:id="66"/>
-      <w:bookmarkEnd w:id="67"/>
-      <w:bookmarkEnd w:id="68"/>
       <w:bookmarkEnd w:id="69"/>
       <w:bookmarkEnd w:id="70"/>
       <w:bookmarkEnd w:id="71"/>
       <w:bookmarkEnd w:id="72"/>
       <w:bookmarkEnd w:id="73"/>
-      <w:r>
-        <w:t xml:space="preserve"> </w:t>
-      </w:r>
-    </w:p>
-    <w:p>
-      <w:pPr>
-        <w:pStyle w:val="berschrift2"/>
-      </w:pPr>
-      <w:bookmarkStart w:id="74" w:name="_Toc210560306"/>
-      <w:bookmarkStart w:id="75" w:name="_Toc211138168"/>
-      <w:bookmarkStart w:id="76" w:name="_Toc84757222"/>
-      <w:bookmarkStart w:id="77" w:name="_Toc84751369"/>
-      <w:bookmarkStart w:id="78" w:name="_Toc84751257"/>
-      <w:bookmarkStart w:id="79" w:name="_Toc210560253"/>
-      <w:bookmarkStart w:id="80" w:name="_Toc211137923"/>
-      <w:bookmarkStart w:id="81" w:name="_Toc221019704"/>
-      <w:r>
-        <w:t>Literatur</w:t>
-      </w:r>
       <w:bookmarkEnd w:id="74"/>
       <w:bookmarkEnd w:id="75"/>
       <w:bookmarkEnd w:id="76"/>
       <w:bookmarkEnd w:id="77"/>
       <w:bookmarkEnd w:id="78"/>
       <w:bookmarkEnd w:id="79"/>
+      <w:r>
+        <w:t xml:space="preserve"> </w:t>
+      </w:r>
+    </w:p>
+    <w:p>
+      <w:pPr>
+        <w:pStyle w:val="berschrift2"/>
+      </w:pPr>
+      <w:bookmarkStart w:id="80" w:name="_Toc210560306"/>
+      <w:bookmarkStart w:id="81" w:name="_Toc211138168"/>
+      <w:bookmarkStart w:id="82" w:name="_Toc84757222"/>
+      <w:bookmarkStart w:id="83" w:name="_Toc84751369"/>
+      <w:bookmarkStart w:id="84" w:name="_Toc84751257"/>
+      <w:bookmarkStart w:id="85" w:name="_Toc210560253"/>
+      <w:bookmarkStart w:id="86" w:name="_Toc211137923"/>
+      <w:bookmarkStart w:id="87" w:name="_Toc221613900"/>
+      <w:r>
+        <w:t>Literatur</w:t>
+      </w:r>
       <w:bookmarkEnd w:id="80"/>
-      <w:r>
-        <w:t>verzeichnis</w:t>
-      </w:r>
       <w:bookmarkEnd w:id="81"/>
-      <w:r>
-        <w:t xml:space="preserve"> </w:t>
-      </w:r>
-    </w:p>
-    <w:p>
-      <w:pPr>
-        <w:rPr>
-          <w:color w:val="0066FF"/>
-        </w:rPr>
-      </w:pPr>
-      <w:r>
-        <w:rPr>
-          <w:color w:val="0066FF"/>
-        </w:rPr>
-        <w:t>Wird mithilfe von Zotero erstellt…</w:t>
-      </w:r>
-    </w:p>
-    <w:p>
-      <w:pPr>
-        <w:pStyle w:val="berschrift2"/>
-      </w:pPr>
-      <w:bookmarkStart w:id="82" w:name="_Toc84757225"/>
-      <w:bookmarkStart w:id="83" w:name="_Toc211138171"/>
-      <w:bookmarkStart w:id="84" w:name="_Toc211137927"/>
-      <w:bookmarkStart w:id="85" w:name="_Toc84751260"/>
-      <w:bookmarkStart w:id="86" w:name="_Toc210560307"/>
-      <w:bookmarkStart w:id="87" w:name="_Toc210560254"/>
-      <w:bookmarkStart w:id="88" w:name="_Toc84751372"/>
-      <w:bookmarkStart w:id="89" w:name="_Toc221019705"/>
-      <w:r>
-        <w:t>Abkürzungsverzeichnis</w:t>
-      </w:r>
       <w:bookmarkEnd w:id="82"/>
       <w:bookmarkEnd w:id="83"/>
       <w:bookmarkEnd w:id="84"/>
       <w:bookmarkEnd w:id="85"/>
       <w:bookmarkEnd w:id="86"/>
+      <w:r>
+        <w:t>verzeichnis</w:t>
+      </w:r>
       <w:bookmarkEnd w:id="87"/>
+      <w:r>
+        <w:t xml:space="preserve"> </w:t>
+      </w:r>
+    </w:p>
+    <w:p>
+      <w:pPr>
+        <w:rPr>
+          <w:color w:val="0066FF"/>
+        </w:rPr>
+      </w:pPr>
+      <w:r>
+        <w:rPr>
+          <w:color w:val="0066FF"/>
+        </w:rPr>
+        <w:t xml:space="preserve">Wird mithilfe von </w:t>
+      </w:r>
+      <w:proofErr w:type="spellStart"/>
+      <w:r>
+        <w:rPr>
+          <w:color w:val="0066FF"/>
+        </w:rPr>
+        <w:t>Zotero</w:t>
+      </w:r>
+      <w:proofErr w:type="spellEnd"/>
+      <w:r>
+        <w:rPr>
+          <w:color w:val="0066FF"/>
+        </w:rPr>
+        <w:t xml:space="preserve"> erstellt…</w:t>
+      </w:r>
+    </w:p>
+    <w:p>
+      <w:pPr>
+        <w:pStyle w:val="berschrift2"/>
+      </w:pPr>
+      <w:bookmarkStart w:id="88" w:name="_Toc84757225"/>
+      <w:bookmarkStart w:id="89" w:name="_Toc211138171"/>
+      <w:bookmarkStart w:id="90" w:name="_Toc211137927"/>
+      <w:bookmarkStart w:id="91" w:name="_Toc84751260"/>
+      <w:bookmarkStart w:id="92" w:name="_Toc210560307"/>
+      <w:bookmarkStart w:id="93" w:name="_Toc210560254"/>
+      <w:bookmarkStart w:id="94" w:name="_Toc84751372"/>
+      <w:bookmarkStart w:id="95" w:name="_Toc221613901"/>
+      <w:r>
+        <w:t>Abkürzungsverzeichnis</w:t>
+      </w:r>
       <w:bookmarkEnd w:id="88"/>
       <w:bookmarkEnd w:id="89"/>
-    </w:p>
-    <w:p>
-      <w:pPr>
-        <w:pStyle w:val="Text"/>
-        <w:rPr>
-          <w:color w:val="0066FF"/>
-        </w:rPr>
-      </w:pPr>
-      <w:r>
-        <w:rPr>
-          <w:color w:val="0066FF"/>
-        </w:rPr>
-        <w:t>(FV Text)</w:t>
-      </w:r>
-      <w:bookmarkStart w:id="90" w:name="_Toc211138172"/>
-      <w:bookmarkStart w:id="91" w:name="_Toc211137928"/>
-      <w:bookmarkStart w:id="92" w:name="_Toc84757226"/>
-      <w:bookmarkStart w:id="93" w:name="_Toc84751373"/>
-      <w:bookmarkStart w:id="94" w:name="_Toc84751261"/>
-      <w:bookmarkStart w:id="95" w:name="_Toc210560308"/>
-      <w:bookmarkStart w:id="96" w:name="_Toc210560255"/>
-      <w:r>
-        <w:rPr>
-          <w:color w:val="0066FF"/>
-        </w:rPr>
-        <w:t xml:space="preserve"> Optionaler Abschnitt. Nur verwenden, wenn mehr als 10 verschiedene Abkürzungen im gesamten Dokument vorkommen.</w:t>
-      </w:r>
-    </w:p>
-    <w:p>
-      <w:pPr>
-        <w:pStyle w:val="berschrift2"/>
-      </w:pPr>
-      <w:bookmarkStart w:id="97" w:name="_Toc221019706"/>
-      <w:r>
-        <w:t>Tabellen</w:t>
-      </w:r>
       <w:bookmarkEnd w:id="90"/>
       <w:bookmarkEnd w:id="91"/>
       <w:bookmarkEnd w:id="92"/>
       <w:bookmarkEnd w:id="93"/>
       <w:bookmarkEnd w:id="94"/>
       <w:bookmarkEnd w:id="95"/>
+    </w:p>
+    <w:p>
+      <w:pPr>
+        <w:pStyle w:val="Text"/>
+        <w:rPr>
+          <w:color w:val="0066FF"/>
+        </w:rPr>
+      </w:pPr>
+      <w:r>
+        <w:rPr>
+          <w:color w:val="0066FF"/>
+        </w:rPr>
+        <w:t>(</w:t>
+      </w:r>
+      <w:proofErr w:type="gramStart"/>
+      <w:r>
+        <w:rPr>
+          <w:color w:val="0066FF"/>
+        </w:rPr>
+        <w:t>FV Text</w:t>
+      </w:r>
+      <w:proofErr w:type="gramEnd"/>
+      <w:r>
+        <w:rPr>
+          <w:color w:val="0066FF"/>
+        </w:rPr>
+        <w:t>)</w:t>
+      </w:r>
+      <w:bookmarkStart w:id="96" w:name="_Toc211138172"/>
+      <w:bookmarkStart w:id="97" w:name="_Toc211137928"/>
+      <w:bookmarkStart w:id="98" w:name="_Toc84757226"/>
+      <w:bookmarkStart w:id="99" w:name="_Toc84751373"/>
+      <w:bookmarkStart w:id="100" w:name="_Toc84751261"/>
+      <w:bookmarkStart w:id="101" w:name="_Toc210560308"/>
+      <w:bookmarkStart w:id="102" w:name="_Toc210560255"/>
+      <w:r>
+        <w:rPr>
+          <w:color w:val="0066FF"/>
+        </w:rPr>
+        <w:t xml:space="preserve"> Optionaler Abschnitt. Nur verwenden, wenn mehr als 10 verschiedene Abkürzungen im gesamten Dokument vorkommen.</w:t>
+      </w:r>
+    </w:p>
+    <w:p>
+      <w:pPr>
+        <w:pStyle w:val="berschrift2"/>
+      </w:pPr>
+      <w:bookmarkStart w:id="103" w:name="_Toc221613902"/>
+      <w:r>
+        <w:t>Tabellen</w:t>
+      </w:r>
       <w:bookmarkEnd w:id="96"/>
       <w:bookmarkEnd w:id="97"/>
-    </w:p>
-    <w:p>
-      <w:r>
-        <w:rPr>
-          <w:color w:val="0066FF"/>
-        </w:rPr>
-        <w:t>(FV Text) Optionaler Abschnitt. Nur verwenden, wenn mehr als 10 verschiedene Tabellen im gesamten Dokument vorkommen.</w:t>
-      </w:r>
-    </w:p>
-    <w:p>
-      <w:pPr>
-        <w:pStyle w:val="berschrift2"/>
-      </w:pPr>
-      <w:bookmarkStart w:id="98" w:name="_Toc210560256"/>
-      <w:bookmarkStart w:id="99" w:name="_Toc210560309"/>
-      <w:bookmarkStart w:id="100" w:name="_Toc211137929"/>
-      <w:bookmarkStart w:id="101" w:name="_Toc84757227"/>
-      <w:bookmarkStart w:id="102" w:name="_Toc84751374"/>
-      <w:bookmarkStart w:id="103" w:name="_Toc84751262"/>
-      <w:bookmarkStart w:id="104" w:name="_Toc211138173"/>
-      <w:bookmarkStart w:id="105" w:name="_Toc221019707"/>
-      <w:r>
-        <w:t>Abbildunge</w:t>
-      </w:r>
       <w:bookmarkEnd w:id="98"/>
       <w:bookmarkEnd w:id="99"/>
-      <w:r>
-        <w:t>n</w:t>
-      </w:r>
       <w:bookmarkEnd w:id="100"/>
       <w:bookmarkEnd w:id="101"/>
       <w:bookmarkEnd w:id="102"/>
       <w:bookmarkEnd w:id="103"/>
+    </w:p>
+    <w:p>
+      <w:r>
+        <w:rPr>
+          <w:color w:val="0066FF"/>
+        </w:rPr>
+        <w:t>(</w:t>
+      </w:r>
+      <w:proofErr w:type="gramStart"/>
+      <w:r>
+        <w:rPr>
+          <w:color w:val="0066FF"/>
+        </w:rPr>
+        <w:t>FV Text</w:t>
+      </w:r>
+      <w:proofErr w:type="gramEnd"/>
+      <w:r>
+        <w:rPr>
+          <w:color w:val="0066FF"/>
+        </w:rPr>
+        <w:t>) Optionaler Abschnitt. Nur verwenden, wenn mehr als 10 verschiedene Tabellen im gesamten Dokument vorkommen.</w:t>
+      </w:r>
+    </w:p>
+    <w:p>
+      <w:pPr>
+        <w:pStyle w:val="berschrift2"/>
+      </w:pPr>
+      <w:bookmarkStart w:id="104" w:name="_Toc210560256"/>
+      <w:bookmarkStart w:id="105" w:name="_Toc210560309"/>
+      <w:bookmarkStart w:id="106" w:name="_Toc211137929"/>
+      <w:bookmarkStart w:id="107" w:name="_Toc84757227"/>
+      <w:bookmarkStart w:id="108" w:name="_Toc84751374"/>
+      <w:bookmarkStart w:id="109" w:name="_Toc84751262"/>
+      <w:bookmarkStart w:id="110" w:name="_Toc211138173"/>
+      <w:bookmarkStart w:id="111" w:name="_Toc221613903"/>
+      <w:r>
+        <w:t>Abbildunge</w:t>
+      </w:r>
       <w:bookmarkEnd w:id="104"/>
       <w:bookmarkEnd w:id="105"/>
-    </w:p>
-    <w:p>
-      <w:pPr>
-        <w:rPr>
-          <w:color w:val="0066FF"/>
-        </w:rPr>
-      </w:pPr>
-      <w:r>
-        <w:rPr>
-          <w:color w:val="0066FF"/>
-        </w:rPr>
-        <w:t>(FV Text) Optionaler Abschnitt. Nur verwenden, wenn mehr als 10 verschiedene Bilder im gesamten Dokument vorkommen.</w:t>
+      <w:r>
+        <w:t>n</w:t>
+      </w:r>
+      <w:bookmarkEnd w:id="106"/>
+      <w:bookmarkEnd w:id="107"/>
+      <w:bookmarkEnd w:id="108"/>
+      <w:bookmarkEnd w:id="109"/>
+      <w:bookmarkEnd w:id="110"/>
+      <w:bookmarkEnd w:id="111"/>
+    </w:p>
+    <w:p>
+      <w:pPr>
+        <w:rPr>
+          <w:color w:val="0066FF"/>
+        </w:rPr>
+      </w:pPr>
+      <w:r>
+        <w:rPr>
+          <w:color w:val="0066FF"/>
+        </w:rPr>
+        <w:t>(</w:t>
+      </w:r>
+      <w:proofErr w:type="gramStart"/>
+      <w:r>
+        <w:rPr>
+          <w:color w:val="0066FF"/>
+        </w:rPr>
+        <w:t>FV Text</w:t>
+      </w:r>
+      <w:proofErr w:type="gramEnd"/>
+      <w:r>
+        <w:rPr>
+          <w:color w:val="0066FF"/>
+        </w:rPr>
+        <w:t>) Optionaler Abschnitt. Nur verwenden, wenn mehr als 10 verschiedene Bilder im gesamten Dokument vorkommen.</w:t>
       </w:r>
     </w:p>
     <w:p>
@@ -8238,37 +9411,51 @@
       <w:pPr>
         <w:pStyle w:val="berschrift1"/>
       </w:pPr>
-      <w:bookmarkStart w:id="106" w:name="_Toc211138174"/>
-      <w:bookmarkStart w:id="107" w:name="_Toc211137930"/>
-      <w:bookmarkStart w:id="108" w:name="_Toc84751375"/>
-      <w:bookmarkStart w:id="109" w:name="_Toc84751263"/>
-      <w:bookmarkStart w:id="110" w:name="_Ref84675439"/>
-      <w:bookmarkStart w:id="111" w:name="_Toc221019708"/>
+      <w:bookmarkStart w:id="112" w:name="_Toc211138174"/>
+      <w:bookmarkStart w:id="113" w:name="_Toc211137930"/>
+      <w:bookmarkStart w:id="114" w:name="_Toc84751375"/>
+      <w:bookmarkStart w:id="115" w:name="_Toc84751263"/>
+      <w:bookmarkStart w:id="116" w:name="_Ref84675439"/>
+      <w:bookmarkStart w:id="117" w:name="_Toc221613904"/>
       <w:r>
         <w:lastRenderedPageBreak/>
         <w:t>Anhang</w:t>
       </w:r>
-      <w:bookmarkEnd w:id="106"/>
-      <w:bookmarkEnd w:id="107"/>
-      <w:bookmarkEnd w:id="108"/>
-      <w:bookmarkEnd w:id="109"/>
-      <w:bookmarkEnd w:id="110"/>
-      <w:bookmarkEnd w:id="111"/>
-    </w:p>
-    <w:p>
-      <w:pPr>
-        <w:pStyle w:val="Text"/>
-      </w:pPr>
-      <w:bookmarkStart w:id="112" w:name="_Ref210468443"/>
-      <w:bookmarkStart w:id="113" w:name="_Ref210464602"/>
-      <w:r>
-        <w:rPr>
-          <w:color w:val="0066FF"/>
-        </w:rPr>
-        <w:t>(FV Text) Optionales Kapitel. Hier werden Datenblätter, große Zeichnungen, Skizzen, Bilder, etc. eingefügt, die im Fließtext der vorigen Kapitel nicht eingefügt werden, da sie dort die Übersichtlichkeit bzw. Struktur dieser Kapitel verschlechtern würden.</w:t>
-      </w:r>
       <w:bookmarkEnd w:id="112"/>
       <w:bookmarkEnd w:id="113"/>
+      <w:bookmarkEnd w:id="114"/>
+      <w:bookmarkEnd w:id="115"/>
+      <w:bookmarkEnd w:id="116"/>
+      <w:bookmarkEnd w:id="117"/>
+    </w:p>
+    <w:p>
+      <w:pPr>
+        <w:pStyle w:val="Text"/>
+      </w:pPr>
+      <w:bookmarkStart w:id="118" w:name="_Ref210468443"/>
+      <w:bookmarkStart w:id="119" w:name="_Ref210464602"/>
+      <w:r>
+        <w:rPr>
+          <w:color w:val="0066FF"/>
+        </w:rPr>
+        <w:t>(</w:t>
+      </w:r>
+      <w:proofErr w:type="gramStart"/>
+      <w:r>
+        <w:rPr>
+          <w:color w:val="0066FF"/>
+        </w:rPr>
+        <w:t>FV Text</w:t>
+      </w:r>
+      <w:proofErr w:type="gramEnd"/>
+      <w:r>
+        <w:rPr>
+          <w:color w:val="0066FF"/>
+        </w:rPr>
+        <w:t>) Optionales Kapitel. Hier werden Datenblätter, große Zeichnungen, Skizzen, Bilder, etc. eingefügt, die im Fließtext der vorigen Kapitel nicht eingefügt werden, da sie dort die Übersichtlichkeit bzw. Struktur dieser Kapitel verschlechtern würden.</w:t>
+      </w:r>
+      <w:bookmarkEnd w:id="118"/>
+      <w:bookmarkEnd w:id="119"/>
     </w:p>
     <w:sectPr>
       <w:headerReference w:type="default" r:id="rId66"/>
@@ -8287,7 +9474,7 @@
 
 <file path=word/comments.xml><?xml version="1.0" encoding="utf-8"?>
 <w:comments xmlns:wpc="http://schemas.microsoft.com/office/word/2010/wordprocessingCanvas" xmlns:cx="http://schemas.microsoft.com/office/drawing/2014/chartex" xmlns:cx1="http://schemas.microsoft.com/office/drawing/2015/9/8/chartex" xmlns:cx2="http://schemas.microsoft.com/office/drawing/2015/10/21/chartex" xmlns:cx3="http://schemas.microsoft.com/office/drawing/2016/5/9/chartex" xmlns:cx4="http://schemas.microsoft.com/office/drawing/2016/5/10/chartex" xmlns:cx5="http://schemas.microsoft.com/office/drawing/2016/5/11/chartex" xmlns:cx6="http://schemas.microsoft.com/office/drawing/2016/5/12/chartex" xmlns:cx7="http://schemas.microsoft.com/office/drawing/2016/5/13/chartex" xmlns:cx8="http://schemas.microsoft.com/office/drawing/2016/5/14/chartex" xmlns:mc="http://schemas.openxmlformats.org/markup-compatibility/2006" xmlns:aink="http://schemas.microsoft.com/office/drawing/2016/ink" xmlns:am3d="http://schemas.microsoft.com/office/drawing/2017/model3d" xmlns:o="urn:schemas-microsoft-com:office:office" xmlns:oel="http://schemas.microsoft.com/office/2019/extlst" xmlns:r="http://schemas.openxmlformats.org/officeDocument/2006/relationships" xmlns:m="http://schemas.openxmlformats.org/officeDocument/2006/math" xmlns:v="urn:schemas-microsoft-com:vml" xmlns:wp14="http://schemas.microsoft.com/office/word/2010/wordprocessingDrawing" xmlns:wp="http://schemas.openxmlformats.org/drawingml/2006/wordprocessingDrawing" xmlns:w10="urn:schemas-microsoft-com:office:word" xmlns:w="http://schemas.openxmlformats.org/wordprocessingml/2006/main" xmlns:w14="http://schemas.microsoft.com/office/word/2010/wordml" xmlns:w15="http://schemas.microsoft.com/office/word/2012/wordml" xmlns:w16cex="http://schemas.microsoft.com/office/word/2018/wordml/cex" xmlns:w16cid="http://schemas.microsoft.com/office/word/2016/wordml/cid" xmlns:w16="http://schemas.microsoft.com/office/word/2018/wordml" xmlns:w16du="http://schemas.microsoft.com/office/word/2023/wordml/word16du" xmlns:w16sdtdh="http://schemas.microsoft.com/office/word/2020/wordml/sdtdatahash" xmlns:w16sdtfl="http://schemas.microsoft.com/office/word/2024/wordml/sdtformatlock" xmlns:w16se="http://schemas.microsoft.com/office/word/2015/wordml/symex" xmlns:wpg="http://schemas.microsoft.com/office/word/2010/wordprocessingGroup" xmlns:wpi="http://schemas.microsoft.com/office/word/2010/wordprocessingInk" xmlns:wne="http://schemas.microsoft.com/office/word/2006/wordml" xmlns:wps="http://schemas.microsoft.com/office/word/2010/wordprocessingShape" mc:Ignorable="w14 w15 w16se w16cid w16 w16cex w16sdtdh w16sdtfl w16du wp14">
-  <w:comment w:id="47" w:author="GRANEGGER Felix, SchülerIn" w:date="2026-02-07T10:10:00Z" w:initials="FG">
+  <w:comment w:id="48" w:author="GRANEGGER Felix, SchülerIn" w:date="2026-02-07T10:10:00Z" w:initials="FG">
     <w:p>
       <w:pPr>
         <w:pStyle w:val="Kommentartext"/>
@@ -8352,7 +9539,7 @@
       </w:hyperlink>
     </w:p>
   </w:comment>
-  <w:comment w:id="48" w:author="GRANEGGER Felix, SchülerIn" w:date="2026-02-07T10:01:00Z" w:initials="FG">
+  <w:comment w:id="51" w:author="GRANEGGER Felix, SchülerIn" w:date="2026-02-07T10:01:00Z" w:initials="FG">
     <w:p>
       <w:pPr>
         <w:pStyle w:val="Kommentartext"/>
@@ -8576,8 +9763,13 @@
       </w:pBdr>
     </w:pPr>
     <w:r>
-      <w:t>Granegger Felix</w:t>
-    </w:r>
+      <w:t xml:space="preserve">Granegger </w:t>
+    </w:r>
+    <w:proofErr w:type="gramStart"/>
+    <w:r>
+      <w:t>Felix</w:t>
+    </w:r>
+    <w:proofErr w:type="gramEnd"/>
     <w:r>
       <w:tab/>
       <w:t xml:space="preserve">Kapitel </w:t>
@@ -9220,7 +10412,15 @@
       <w:fldChar w:fldCharType="separate"/>
     </w:r>
     <w:r>
-      <w:t xml:space="preserve">Dokumentation Schiechtl Alexander </w:t>
+      <w:t xml:space="preserve">Dokumentation </w:t>
+    </w:r>
+    <w:proofErr w:type="spellStart"/>
+    <w:r>
+      <w:t>Schiechtl</w:t>
+    </w:r>
+    <w:proofErr w:type="spellEnd"/>
+    <w:r>
+      <w:t xml:space="preserve"> Alexander </w:t>
     </w:r>
     <w:r>
       <w:fldChar w:fldCharType="end"/>
@@ -13710,6 +14910,7 @@
   <w:style w:type="character" w:default="1" w:styleId="Absatz-Standardschriftart">
     <w:name w:val="Default Paragraph Font"/>
     <w:uiPriority w:val="1"/>
+    <w:semiHidden/>
     <w:unhideWhenUsed/>
   </w:style>
   <w:style w:type="table" w:default="1" w:styleId="NormaleTabelle">
@@ -15551,37 +16752,7 @@
 </file>
 
 <file path=customXml/item1.xml><?xml version="1.0" encoding="utf-8"?>
-<inkml:ink xmlns:inkml="http://www.w3.org/2003/InkML">
-  <inkml:definitions>
-    <inkml:context xml:id="ctx0">
-      <inkml:inkSource xml:id="inkSrc0">
-        <inkml:traceFormat>
-          <inkml:channel name="X" type="integer" min="-2.14748E9" max="2.14748E9" units="cm"/>
-          <inkml:channel name="Y" type="integer" min="-2.14748E9" max="2.14748E9" units="cm"/>
-          <inkml:channel name="F" type="integer" max="32767" units="dev"/>
-          <inkml:channel name="OA" type="integer" max="360" units="deg"/>
-          <inkml:channel name="OE" type="integer" max="90" units="deg"/>
-        </inkml:traceFormat>
-        <inkml:channelProperties>
-          <inkml:channelProperty channel="X" name="resolution" value="1000" units="1/cm"/>
-          <inkml:channelProperty channel="Y" name="resolution" value="1000" units="1/cm"/>
-          <inkml:channelProperty channel="F" name="resolution" value="0" units="1/dev"/>
-          <inkml:channelProperty channel="OA" name="resolution" value="1000" units="1/deg"/>
-          <inkml:channelProperty channel="OE" name="resolution" value="1000" units="1/deg"/>
-        </inkml:channelProperties>
-      </inkml:inkSource>
-      <inkml:timestamp xml:id="ts0" timeString="2025-06-10T16:09:06.362"/>
-    </inkml:context>
-    <inkml:brush xml:id="br0">
-      <inkml:brushProperty name="width" value="0.05" units="cm"/>
-      <inkml:brushProperty name="height" value="0.05" units="cm"/>
-      <inkml:brushProperty name="color" value="#E71224"/>
-    </inkml:brush>
-  </inkml:definitions>
-  <inkml:trace contextRef="#ctx0" brushRef="#br0">3153 356 7202 0 0,'-44'-7'350'0'0,"0"-2"0"0"0,1-2 0 0 0,0-2 0 0 0,-57-25 1 0 0,-168-76 1481 0 0,190 86-1679 0 0,-122-28 1 0 0,156 47-169 0 0,-67-16 302 0 0,-1 5 0 0 0,-122-5-1 0 0,88 25-117 0 0,1 6-1 0 0,-1 6 0 0 0,-208 45 1 0 0,298-44-170 0 0,0 3 1 0 0,1 1 0 0 0,1 4 0 0 0,0 1 0 0 0,-95 56-1 0 0,75-31-102 0 0,-120 97-1 0 0,165-119 91 0 0,2 1 0 0 0,1 2 0 0 0,1 0 0 0 0,2 2 1 0 0,1 0-1 0 0,-32 58 0 0 0,30-39-7 0 0,1 2 0 0 0,3 0 1 0 0,2 1-1 0 0,3 1 0 0 0,-17 102 0 0 0,25-76 38 0 0,3-1 0 0 0,4 1 0 0 0,4-1 0 0 0,20 120 0 0 0,-13-124-5 0 0,-3-11 48 0 0,4-1 0 0 0,23 76-1 0 0,-28-119-47 0 0,0-1 0 0 0,1 0 0 0 0,0 0 0 0 0,2-1 0 0 0,0 0 0 0 0,1-1 0 0 0,0 0 0 0 0,2-1 0 0 0,-1 0 0 0 0,2-1-1 0 0,25 20 1 0 0,-15-17 28 0 0,0-1 0 0 0,1-2-1 0 0,1 0 1 0 0,0-2 0 0 0,1-1-1 0 0,0-1 1 0 0,0-1 0 0 0,1-2-1 0 0,1 0 1 0 0,-1-2-1 0 0,1-1 1 0 0,31-1 0 0 0,36-3 35 0 0,1-4 1 0 0,122-22 0 0 0,-40 5 38 0 0,-35 9-33 0 0,182-24 276 0 0,51-43 591 0 0,-309 60-804 0 0,-1-3-1 0 0,0-3 1 0 0,89-47 0 0 0,59-55 5 0 0,-176 101-72 0 0,-1-3 0 0 0,-1-1 1 0 0,41-43-1 0 0,-52 43-35 0 0,-2 0 1 0 0,-1-2-1 0 0,-1-1 0 0 0,23-47 1 0 0,-19 26 62 0 0,-3-2 1 0 0,19-65-1 0 0,-30 75 16 0 0,-2 1 0 0 0,5-70 0 0 0,-4-95-93 0 0,-11 199-21 0 0,1-9 55 0 0,-1 1 0 0 0,-1-1 0 0 0,-1 1 0 0 0,0-1 0 0 0,-1 1 0 0 0,-2 0 0 0 0,0 0 0 0 0,-1 0 0 0 0,0 1 0 0 0,-2-1 0 0 0,-12-21 0 0 0,-32-62 287 0 0,32 60-30 0 0,-28-42 0 0 0,39 70-276 0 0,0 2 1 0 0,-1-1-1 0 0,0 1 1 0 0,-1 1-1 0 0,-1 0 1 0 0,0 0-1 0 0,-14-9 1 0 0,-10-3-215 0 0,0 3 0 0 0,-1 0-1 0 0,-1 3 1 0 0,0 1 0 0 0,-1 2 0 0 0,-1 1 0 0 0,-1 2 0 0 0,1 2 0 0 0,-1 2 0 0 0,-1 2 0 0 0,1 1 0 0 0,-76 4 0 0 0,88 3-696 0 0,0 2-1 0 0,0 1 1 0 0,0 2 0 0 0,-39 15 0 0 0,23-4 15 0 0</inkml:trace>
-  <inkml:trace contextRef="#ctx0" brushRef="#br0" timeOffset="2304.57">3473 308 408 0 0,'25'-34'-131'0'0,"-12"9"9868"0"0,-14 35-9206 0 0,-2 1-494 0 0,2 1 1 0 0,-1-1 0 0 0,1 0-1 0 0,1 1 1 0 0,0-1-1 0 0,3 17 1 0 0,16 78-22 0 0,-1-5-4 0 0,-6 136 38 0 0,0-15 29 0 0,-4-164-14 0 0,-4-36 88 0 0,2 43 1333 0 0,-8-70-1392 0 0,0 1 0 0 0,0-1 0 0 0,0 0 0 0 0,0 0 0 0 0,1 0 0 0 0,-2-8 0 0 0,2 11-63 0 0,-50-289 287 0 0,50 262-342 0 0,1 0 0 0 0,1 0-1 0 0,2 1 1 0 0,1-1-1 0 0,10-38 1 0 0,6-41-152 0 0,-20 107 169 0 0,0 1 1 0 0,0 0-1 0 0,0-1 1 0 0,0 1-1 0 0,0 0 1 0 0,0-1 0 0 0,0 1-1 0 0,0 0 1 0 0,0-1-1 0 0,0 1 1 0 0,0-1 0 0 0,0 1-1 0 0,0 0 1 0 0,0-1-1 0 0,0 1 1 0 0,0 0-1 0 0,-1-1 1 0 0,1 1 0 0 0,0 0-1 0 0,0-1 1 0 0,0 1-1 0 0,-1 0 1 0 0,1 0 0 0 0,0-1-1 0 0,0 1 1 0 0,-1 0-1 0 0,1 0 1 0 0,0-1-1 0 0,0 1 1 0 0,-1 0 0 0 0,1 0-1 0 0,0 0 1 0 0,-1-1-1 0 0,1 1 1 0 0,0 0 0 0 0,-1 0-1 0 0,1 0 1 0 0,-1 0-1 0 0,1 0 1 0 0,0 0-1 0 0,-1 0 1 0 0,1 0 0 0 0,0 0-1 0 0,-1 0 1 0 0,1 0-1 0 0,-1 0 1 0 0,1 0 0 0 0,0 0-1 0 0,-1 0 1 0 0,1 0-1 0 0,0 0 1 0 0,-1 0-1 0 0,1 1 1 0 0,0-1 0 0 0,-1 0-1 0 0,1 0 1 0 0,0 0-1 0 0,-1 1 1 0 0,1-1 0 0 0,0 0-1 0 0,-1 1 1 0 0,-1 0 2 0 0,-1 1 0 0 0,1-1 1 0 0,-1 1-1 0 0,1-1 0 0 0,0 1 1 0 0,0 0-1 0 0,0 0 0 0 0,-3 3 1 0 0,-4 11-2 0 0,0 1 0 0 0,1 0 0 0 0,1 1 0 0 0,0-1 0 0 0,1 1 0 0 0,1 1 0 0 0,1-1 0 0 0,-2 21 1 0 0,0 19-138 0 0,2 75 1 0 0,4-118-445 0 0,1 1 0 0 0,0-1 0 0 0,2 1 0 0 0,-1-1 0 0 0,2 0 0 0 0,0 0 0 0 0,1-1 0 0 0,0 1 0 0 0,9 14 0 0 0,-8-17-549 0 0</inkml:trace>
-  <inkml:trace contextRef="#ctx0" brushRef="#br0" timeOffset="2956.45">3554 1583 3409 0 0,'0'0'4221'0'0,"-1"0"-4145"0"0,0 0 0 0 0,1 1 0 0 0,-1-1 1 0 0,0 0-1 0 0,1 0 0 0 0,-1 0 0 0 0,0 1 1 0 0,0-1-1 0 0,1 0 0 0 0,-1 1 0 0 0,0-1 1 0 0,1 0-1 0 0,-1 1 0 0 0,1-1 0 0 0,-1 1 1 0 0,1-1-1 0 0,-1 1 0 0 0,1-1 0 0 0,-1 1 1 0 0,1-1-1 0 0,-1 1 0 0 0,0 1 0 0 0,-2 5-46 0 0,1 1-1 0 0,-1 0 1 0 0,1-1-1 0 0,1 1 0 0 0,-1 0 1 0 0,1 0-1 0 0,1 0 1 0 0,0 12-1 0 0,0-4-34 0 0,1 0 0 0 0,1 0 1 0 0,7 26-1 0 0,-10-41 2 0 0,1-1 0 0 0,1 1 0 0 0,-1-1 0 0 0,0 1 0 0 0,0-1 0 0 0,0 1 0 0 0,0-1 0 0 0,0 1 0 0 0,0-1 0 0 0,0 1 0 0 0,1-1 0 0 0,-1 1 0 0 0,0-1 0 0 0,0 0 0 0 0,1 1 0 0 0,-1-1 0 0 0,0 1 0 0 0,1-1 0 0 0,-1 0 0 0 0,0 1 0 0 0,1-1 0 0 0,-1 0 0 0 0,0 1 0 0 0,1-1 0 0 0,-1 0 0 0 0,1 0 0 0 0,-1 0 0 0 0,1 1 0 0 0,-1-1 0 0 0,0 0 0 0 0,1 0 0 0 0,-1 0 0 0 0,1 0 0 0 0,-1 0 0 0 0,2 0 0 0 0,12-13-54 0 0,7-26 91 0 0,-19 31 14 0 0,0-1 0 0 0,-1 0 0 0 0,1 0 1 0 0,-2-1-1 0 0,1 1 0 0 0,-2 0 0 0 0,1 0 0 0 0,-2-10 0 0 0,1 14 3 0 0,0 1 0 0 0,0-1 0 0 0,-1 1 0 0 0,1-1 0 0 0,-1 1 0 0 0,0-1-1 0 0,-5-7 1 0 0,6 11-13 0 0,0-1 0 0 0,-1 0 0 0 0,1 1-1 0 0,-1-1 1 0 0,1 1 0 0 0,-1-1 0 0 0,1 1 0 0 0,-1 0-1 0 0,0-1 1 0 0,0 1 0 0 0,0 0 0 0 0,0 0-1 0 0,0 1 1 0 0,0-1 0 0 0,0 0 0 0 0,0 1 0 0 0,-4-2-1 0 0,4 3-23 0 0,1-1 0 0 0,-1 0 0 0 0,0 1 0 0 0,0 0 0 0 0,0-1 0 0 0,1 1-1 0 0,-1 0 1 0 0,0 0 0 0 0,1 0 0 0 0,-1 0 0 0 0,0 0 0 0 0,1 0 0 0 0,-1 0-1 0 0,1 0 1 0 0,0 1 0 0 0,-1-1 0 0 0,1 1 0 0 0,0-1 0 0 0,0 1 0 0 0,0-1-1 0 0,0 1 1 0 0,0 0 0 0 0,0-1 0 0 0,1 1 0 0 0,-1 0 0 0 0,0 0 0 0 0,1-1 0 0 0,0 1-1 0 0,-1 3 1 0 0,0-1-44 0 0,0-1-1 0 0,0 0 1 0 0,0 1-1 0 0,1-1 0 0 0,-1 1 1 0 0,1-1-1 0 0,0 1 1 0 0,0-1-1 0 0,0 1 0 0 0,1-1 1 0 0,-1 1-1 0 0,1-1 1 0 0,0 0-1 0 0,0 1 1 0 0,2 4-1 0 0,-3-7 18 0 0,1-1 0 0 0,-1 1 0 0 0,0-1 0 0 0,1 1 0 0 0,-1-1 0 0 0,0 0 0 0 0,1 1 0 0 0,-1-1 0 0 0,1 0 0 0 0,-1 1 0 0 0,0-1 0 0 0,1 0 0 0 0,-1 0 0 0 0,1 1 0 0 0,-1-1 0 0 0,1 0 0 0 0,-1 0 0 0 0,1 0 1 0 0,-1 0-1 0 0,1 1 0 0 0,-1-1 0 0 0,1 0 0 0 0,-1 0 0 0 0,1 0 0 0 0,-1 0 0 0 0,1 0 0 0 0,-1 0 0 0 0,1-1 0 0 0,0 1 0 0 0,-1 0 0 0 0,1 0 0 0 0,-1 0 0 0 0,1 0 0 0 0,0-1 0 0 0,15-16-99 0 0,-12 10 125 0 0,0 1 0 0 0,-1-1 0 0 0,0 1 0 0 0,4-13 0 0 0,-5-5 173 0 0,-3 24-177 0 0,1 0 0 0 0,0-1-1 0 0,0 1 1 0 0,0 0-1 0 0,0 0 1 0 0,0 0 0 0 0,0 0-1 0 0,0 0 1 0 0,0-1 0 0 0,0 1-1 0 0,-1 0 1 0 0,1 0-1 0 0,0 0 1 0 0,0 0 0 0 0,0 0-1 0 0,0 0 1 0 0,0 0-1 0 0,-1 0 1 0 0,1-1 0 0 0,0 1-1 0 0,0 0 1 0 0,0 0-1 0 0,0 0 1 0 0,-1 0 0 0 0,1 0-1 0 0,0 0 1 0 0,0 0 0 0 0,0 0-1 0 0,0 0 1 0 0,-1 0-1 0 0,1 0 1 0 0,0 0 0 0 0,0 0-1 0 0,0 0 1 0 0,0 0-1 0 0,0 1 1 0 0,-1-1 0 0 0,1 0-1 0 0,0 0 1 0 0,0 0-1 0 0,0 0 1 0 0,0 0 0 0 0,0 0-1 0 0,-1 0 1 0 0,1 0 0 0 0,0 0-1 0 0,0 1 1 0 0,0-1-1 0 0,0 0 1 0 0,0 0 0 0 0,0 0-1 0 0,0 0 1 0 0,-1 0-1 0 0,1 1 1 0 0,-2 2 12 0 0,0 0-1 0 0,0 0 1 0 0,0 0-1 0 0,0 0 1 0 0,1 0 0 0 0,-1 1-1 0 0,1-1 1 0 0,0 1-1 0 0,0-1 1 0 0,-1 5-1 0 0,0 5-669 0 0,0 1 1 0 0,0 0-1 0 0,2 0 0 0 0,1 24 0 0 0,0-28 77 0 0</inkml:trace>
-</inkml:ink>
+<b:Sources xmlns:b="http://schemas.openxmlformats.org/officeDocument/2006/bibliography" xmlns="http://schemas.openxmlformats.org/officeDocument/2006/bibliography" SelectedStyle="\APASixthEditionOfficeOnline.xsl" StyleName="APA" Version="6"/>
 </file>
 
 <file path=customXml/item2.xml><?xml version="1.0" encoding="utf-8"?>
@@ -15591,6 +16762,15 @@
 </file>
 
 <file path=customXml/item3.xml><?xml version="1.0" encoding="utf-8"?>
+<?mso-contentType ?>
+<FormTemplates xmlns="http://schemas.microsoft.com/sharepoint/v3/contenttype/forms">
+  <Display>DocumentLibraryForm</Display>
+  <Edit>DocumentLibraryForm</Edit>
+  <New>DocumentLibraryForm</New>
+</FormTemplates>
+</file>
+
+<file path=customXml/item4.xml><?xml version="1.0" encoding="utf-8"?>
 <inkml:ink xmlns:inkml="http://www.w3.org/2003/InkML">
   <inkml:definitions>
     <inkml:context xml:id="ctx0">
@@ -15634,7 +16814,7 @@
 </inkml:ink>
 </file>
 
-<file path=customXml/item4.xml><?xml version="1.0" encoding="utf-8"?>
+<file path=customXml/item5.xml><?xml version="1.0" encoding="utf-8"?>
 <inkml:ink xmlns:inkml="http://www.w3.org/2003/InkML">
   <inkml:definitions>
     <inkml:context xml:id="ctx0">
@@ -15654,7 +16834,7 @@
           <inkml:channelProperty channel="OE" name="resolution" value="1000" units="1/deg"/>
         </inkml:channelProperties>
       </inkml:inkSource>
-      <inkml:timestamp xml:id="ts0" timeString="2025-06-10T16:08:50.568"/>
+      <inkml:timestamp xml:id="ts0" timeString="2025-06-10T16:09:06.362"/>
     </inkml:context>
     <inkml:brush xml:id="br0">
       <inkml:brushProperty name="width" value="0.05" units="cm"/>
@@ -15662,17 +16842,10 @@
       <inkml:brushProperty name="color" value="#E71224"/>
     </inkml:brush>
   </inkml:definitions>
-  <inkml:trace contextRef="#ctx0" brushRef="#br0">1236 239 3217 0 0,'-18'-44'2449'0'0,"11"24"-2251"0"0,-2 1 0 0 0,-14-27 0 0 0,19 39-210 0 0,-1 0 0 0 0,0 1-1 0 0,0 0 1 0 0,-1-1 0 0 0,0 2 0 0 0,0-1-1 0 0,0 1 1 0 0,0 0 0 0 0,-14-8-1 0 0,8 6-57 0 0,-1 1 0 0 0,1 1 1 0 0,-1 0-1 0 0,0 0 0 0 0,0 1 0 0 0,0 1 0 0 0,0 0 0 0 0,-1 1 0 0 0,-22-1 0 0 0,19 4-190 0 0,0 0-1 0 0,0 1 1 0 0,0 1-1 0 0,1 0 1 0 0,-1 1-1 0 0,1 1 1 0 0,-21 9-1 0 0,-37 17-295 0 0,-131 76-1 0 0,173-87 985 0 0,0 2 0 0 0,2 1 0 0 0,1 2 0 0 0,1 0 0 0 0,1 2 0 0 0,-28 37 0 0 0,-16 22-328 0 0,-54 78 18 0 0,113-145-112 0 0,0 0 1 0 0,2 1-1 0 0,1 0 0 0 0,0 0 0 0 0,2 1 1 0 0,0 0-1 0 0,-5 27 0 0 0,4 3 6 0 0,3 0-1 0 0,1 0 0 0 0,3 0 1 0 0,2 1-1 0 0,2-1 1 0 0,13 62-1 0 0,-11-89 37 0 0,1-1 0 0 0,2 1 0 0 0,0-1 0 0 0,1-1 0 0 0,1 0 0 0 0,2 0-1 0 0,0-1 1 0 0,1-1 0 0 0,1 0 0 0 0,1 0 0 0 0,25 25 0 0 0,-31-38 8 0 0,1 0 0 0 0,0-1 0 0 0,0 0 0 0 0,1-1-1 0 0,0 0 1 0 0,0 0 0 0 0,0-1 0 0 0,0 0 0 0 0,1-1 0 0 0,-1-1 0 0 0,1 0 0 0 0,23 1 0 0 0,0-2-27 0 0,-1-1 0 0 0,0-2 0 0 0,43-8 0 0 0,15-10 179 0 0,-1-4 0 0 0,111-46 0 0 0,-162 55-168 0 0,0 1-21 0 0,5-1 26 0 0,-2-3-1 0 0,45-23 0 0 0,-67 26 22 0 0,-1 0 0 0 0,0-2-1 0 0,-2 0 1 0 0,0-1 0 0 0,-1-1 0 0 0,0-1 0 0 0,-2 0-1 0 0,22-37 1 0 0,-28 39-39 0 0,0 1 1 0 0,-1-1-1 0 0,-1-1 0 0 0,-1 0 1 0 0,-1 1-1 0 0,0-2 0 0 0,-2 1 0 0 0,0 0 1 0 0,0-25-1 0 0,-2-13 167 0 0,-14-108-1 0 0,10 143-149 0 0,-1 0-1 0 0,0 1 1 0 0,-2-1-1 0 0,-1 1 1 0 0,-1 0-1 0 0,0 1 1 0 0,-1 0-1 0 0,-23-35 0 0 0,22 41 15 0 0,-1 0 0 0 0,0 0-1 0 0,-1 1 1 0 0,-1 0 0 0 0,0 1-1 0 0,0 1 1 0 0,-1 0 0 0 0,-1 1-1 0 0,0 0 1 0 0,0 1 0 0 0,-25-10-1 0 0,15 9-505 0 0,-1 1-1 0 0,0 2 1 0 0,0 0 0 0 0,-49-5-1 0 0,41 10-389 0 0</inkml:trace>
+  <inkml:trace contextRef="#ctx0" brushRef="#br0">3153 356 7202 0 0,'-44'-7'350'0'0,"0"-2"0"0"0,1-2 0 0 0,0-2 0 0 0,-57-25 1 0 0,-168-76 1481 0 0,190 86-1679 0 0,-122-28 1 0 0,156 47-169 0 0,-67-16 302 0 0,-1 5 0 0 0,-122-5-1 0 0,88 25-117 0 0,1 6-1 0 0,-1 6 0 0 0,-208 45 1 0 0,298-44-170 0 0,0 3 1 0 0,1 1 0 0 0,1 4 0 0 0,0 1 0 0 0,-95 56-1 0 0,75-31-102 0 0,-120 97-1 0 0,165-119 91 0 0,2 1 0 0 0,1 2 0 0 0,1 0 0 0 0,2 2 1 0 0,1 0-1 0 0,-32 58 0 0 0,30-39-7 0 0,1 2 0 0 0,3 0 1 0 0,2 1-1 0 0,3 1 0 0 0,-17 102 0 0 0,25-76 38 0 0,3-1 0 0 0,4 1 0 0 0,4-1 0 0 0,20 120 0 0 0,-13-124-5 0 0,-3-11 48 0 0,4-1 0 0 0,23 76-1 0 0,-28-119-47 0 0,0-1 0 0 0,1 0 0 0 0,0 0 0 0 0,2-1 0 0 0,0 0 0 0 0,1-1 0 0 0,0 0 0 0 0,2-1 0 0 0,-1 0 0 0 0,2-1-1 0 0,25 20 1 0 0,-15-17 28 0 0,0-1 0 0 0,1-2-1 0 0,1 0 1 0 0,0-2 0 0 0,1-1-1 0 0,0-1 1 0 0,0-1 0 0 0,1-2-1 0 0,1 0 1 0 0,-1-2-1 0 0,1-1 1 0 0,31-1 0 0 0,36-3 35 0 0,1-4 1 0 0,122-22 0 0 0,-40 5 38 0 0,-35 9-33 0 0,182-24 276 0 0,51-43 591 0 0,-309 60-804 0 0,-1-3-1 0 0,0-3 1 0 0,89-47 0 0 0,59-55 5 0 0,-176 101-72 0 0,-1-3 0 0 0,-1-1 1 0 0,41-43-1 0 0,-52 43-35 0 0,-2 0 1 0 0,-1-2-1 0 0,-1-1 0 0 0,23-47 1 0 0,-19 26 62 0 0,-3-2 1 0 0,19-65-1 0 0,-30 75 16 0 0,-2 1 0 0 0,5-70 0 0 0,-4-95-93 0 0,-11 199-21 0 0,1-9 55 0 0,-1 1 0 0 0,-1-1 0 0 0,-1 1 0 0 0,0-1 0 0 0,-1 1 0 0 0,-2 0 0 0 0,0 0 0 0 0,-1 0 0 0 0,0 1 0 0 0,-2-1 0 0 0,-12-21 0 0 0,-32-62 287 0 0,32 60-30 0 0,-28-42 0 0 0,39 70-276 0 0,0 2 1 0 0,-1-1-1 0 0,0 1 1 0 0,-1 1-1 0 0,-1 0 1 0 0,0 0-1 0 0,-14-9 1 0 0,-10-3-215 0 0,0 3 0 0 0,-1 0-1 0 0,-1 3 1 0 0,0 1 0 0 0,-1 2 0 0 0,-1 1 0 0 0,-1 2 0 0 0,1 2 0 0 0,-1 2 0 0 0,-1 2 0 0 0,1 1 0 0 0,-76 4 0 0 0,88 3-696 0 0,0 2-1 0 0,0 1 1 0 0,0 2 0 0 0,-39 15 0 0 0,23-4 15 0 0</inkml:trace>
+  <inkml:trace contextRef="#ctx0" brushRef="#br0" timeOffset="2304.57">3473 308 408 0 0,'25'-34'-131'0'0,"-12"9"9868"0"0,-14 35-9206 0 0,-2 1-494 0 0,2 1 1 0 0,-1-1 0 0 0,1 0-1 0 0,1 1 1 0 0,0-1-1 0 0,3 17 1 0 0,16 78-22 0 0,-1-5-4 0 0,-6 136 38 0 0,0-15 29 0 0,-4-164-14 0 0,-4-36 88 0 0,2 43 1333 0 0,-8-70-1392 0 0,0 1 0 0 0,0-1 0 0 0,0 0 0 0 0,0 0 0 0 0,1 0 0 0 0,-2-8 0 0 0,2 11-63 0 0,-50-289 287 0 0,50 262-342 0 0,1 0 0 0 0,1 0-1 0 0,2 1 1 0 0,1-1-1 0 0,10-38 1 0 0,6-41-152 0 0,-20 107 169 0 0,0 1 1 0 0,0 0-1 0 0,0-1 1 0 0,0 1-1 0 0,0 0 1 0 0,0-1 0 0 0,0 1-1 0 0,0 0 1 0 0,0-1-1 0 0,0 1 1 0 0,0-1 0 0 0,0 1-1 0 0,0 0 1 0 0,0-1-1 0 0,0 1 1 0 0,0 0-1 0 0,-1-1 1 0 0,1 1 0 0 0,0 0-1 0 0,0-1 1 0 0,0 1-1 0 0,-1 0 1 0 0,1 0 0 0 0,0-1-1 0 0,0 1 1 0 0,-1 0-1 0 0,1 0 1 0 0,0-1-1 0 0,0 1 1 0 0,-1 0 0 0 0,1 0-1 0 0,0 0 1 0 0,-1-1-1 0 0,1 1 1 0 0,0 0 0 0 0,-1 0-1 0 0,1 0 1 0 0,-1 0-1 0 0,1 0 1 0 0,0 0-1 0 0,-1 0 1 0 0,1 0 0 0 0,0 0-1 0 0,-1 0 1 0 0,1 0-1 0 0,-1 0 1 0 0,1 0 0 0 0,0 0-1 0 0,-1 0 1 0 0,1 0-1 0 0,0 0 1 0 0,-1 0-1 0 0,1 1 1 0 0,0-1 0 0 0,-1 0-1 0 0,1 0 1 0 0,0 0-1 0 0,-1 1 1 0 0,1-1 0 0 0,0 0-1 0 0,-1 1 1 0 0,-1 0 2 0 0,-1 1 0 0 0,1-1 1 0 0,-1 1-1 0 0,1-1 0 0 0,0 1 1 0 0,0 0-1 0 0,0 0 0 0 0,-3 3 1 0 0,-4 11-2 0 0,0 1 0 0 0,1 0 0 0 0,1 1 0 0 0,0-1 0 0 0,1 1 0 0 0,1 1 0 0 0,1-1 0 0 0,-2 21 1 0 0,0 19-138 0 0,2 75 1 0 0,4-118-445 0 0,1 1 0 0 0,0-1 0 0 0,2 1 0 0 0,-1-1 0 0 0,2 0 0 0 0,0 0 0 0 0,1-1 0 0 0,0 1 0 0 0,9 14 0 0 0,-8-17-549 0 0</inkml:trace>
+  <inkml:trace contextRef="#ctx0" brushRef="#br0" timeOffset="2956.45">3554 1583 3409 0 0,'0'0'4221'0'0,"-1"0"-4145"0"0,0 0 0 0 0,1 1 0 0 0,-1-1 1 0 0,0 0-1 0 0,1 0 0 0 0,-1 0 0 0 0,0 1 1 0 0,0-1-1 0 0,1 0 0 0 0,-1 1 0 0 0,0-1 1 0 0,1 0-1 0 0,-1 1 0 0 0,1-1 0 0 0,-1 1 1 0 0,1-1-1 0 0,-1 1 0 0 0,1-1 0 0 0,-1 1 1 0 0,1-1-1 0 0,-1 1 0 0 0,0 1 0 0 0,-2 5-46 0 0,1 1-1 0 0,-1 0 1 0 0,1-1-1 0 0,1 1 0 0 0,-1 0 1 0 0,1 0-1 0 0,1 0 1 0 0,0 12-1 0 0,0-4-34 0 0,1 0 0 0 0,1 0 1 0 0,7 26-1 0 0,-10-41 2 0 0,1-1 0 0 0,1 1 0 0 0,-1-1 0 0 0,0 1 0 0 0,0-1 0 0 0,0 1 0 0 0,0-1 0 0 0,0 1 0 0 0,0-1 0 0 0,0 1 0 0 0,1-1 0 0 0,-1 1 0 0 0,0-1 0 0 0,0 0 0 0 0,1 1 0 0 0,-1-1 0 0 0,0 1 0 0 0,1-1 0 0 0,-1 0 0 0 0,0 1 0 0 0,1-1 0 0 0,-1 0 0 0 0,0 1 0 0 0,1-1 0 0 0,-1 0 0 0 0,1 0 0 0 0,-1 0 0 0 0,1 1 0 0 0,-1-1 0 0 0,0 0 0 0 0,1 0 0 0 0,-1 0 0 0 0,1 0 0 0 0,-1 0 0 0 0,2 0 0 0 0,12-13-54 0 0,7-26 91 0 0,-19 31 14 0 0,0-1 0 0 0,-1 0 0 0 0,1 0 1 0 0,-2-1-1 0 0,1 1 0 0 0,-2 0 0 0 0,1 0 0 0 0,-2-10 0 0 0,1 14 3 0 0,0 1 0 0 0,0-1 0 0 0,-1 1 0 0 0,1-1 0 0 0,-1 1 0 0 0,0-1-1 0 0,-5-7 1 0 0,6 11-13 0 0,0-1 0 0 0,-1 0 0 0 0,1 1-1 0 0,-1-1 1 0 0,1 1 0 0 0,-1-1 0 0 0,1 1 0 0 0,-1 0-1 0 0,0-1 1 0 0,0 1 0 0 0,0 0 0 0 0,0 0-1 0 0,0 1 1 0 0,0-1 0 0 0,0 0 0 0 0,0 1 0 0 0,-4-2-1 0 0,4 3-23 0 0,1-1 0 0 0,-1 0 0 0 0,0 1 0 0 0,0 0 0 0 0,0-1 0 0 0,1 1-1 0 0,-1 0 1 0 0,0 0 0 0 0,1 0 0 0 0,-1 0 0 0 0,0 0 0 0 0,1 0 0 0 0,-1 0-1 0 0,1 0 1 0 0,0 1 0 0 0,-1-1 0 0 0,1 1 0 0 0,0-1 0 0 0,0 1 0 0 0,0-1-1 0 0,0 1 1 0 0,0 0 0 0 0,0-1 0 0 0,1 1 0 0 0,-1 0 0 0 0,0 0 0 0 0,1-1 0 0 0,0 1-1 0 0,-1 3 1 0 0,0-1-44 0 0,0-1-1 0 0,0 0 1 0 0,0 1-1 0 0,1-1 0 0 0,-1 1 1 0 0,1-1-1 0 0,0 1 1 0 0,0-1-1 0 0,0 1 0 0 0,1-1 1 0 0,-1 1-1 0 0,1-1 1 0 0,0 0-1 0 0,0 1 1 0 0,2 4-1 0 0,-3-7 18 0 0,1-1 0 0 0,-1 1 0 0 0,0-1 0 0 0,1 1 0 0 0,-1-1 0 0 0,0 0 0 0 0,1 1 0 0 0,-1-1 0 0 0,1 0 0 0 0,-1 1 0 0 0,0-1 0 0 0,1 0 0 0 0,-1 0 0 0 0,1 1 0 0 0,-1-1 0 0 0,1 0 0 0 0,-1 0 0 0 0,1 0 1 0 0,-1 0-1 0 0,1 1 0 0 0,-1-1 0 0 0,1 0 0 0 0,-1 0 0 0 0,1 0 0 0 0,-1 0 0 0 0,1 0 0 0 0,-1 0 0 0 0,1-1 0 0 0,0 1 0 0 0,-1 0 0 0 0,1 0 0 0 0,-1 0 0 0 0,1 0 0 0 0,0-1 0 0 0,15-16-99 0 0,-12 10 125 0 0,0 1 0 0 0,-1-1 0 0 0,0 1 0 0 0,4-13 0 0 0,-5-5 173 0 0,-3 24-177 0 0,1 0 0 0 0,0-1-1 0 0,0 1 1 0 0,0 0-1 0 0,0 0 1 0 0,0 0 0 0 0,0 0-1 0 0,0 0 1 0 0,0-1 0 0 0,0 1-1 0 0,-1 0 1 0 0,1 0-1 0 0,0 0 1 0 0,0 0 0 0 0,0 0-1 0 0,0 0 1 0 0,0 0-1 0 0,-1 0 1 0 0,1-1 0 0 0,0 1-1 0 0,0 0 1 0 0,0 0-1 0 0,0 0 1 0 0,-1 0 0 0 0,1 0-1 0 0,0 0 1 0 0,0 0 0 0 0,0 0-1 0 0,0 0 1 0 0,-1 0-1 0 0,1 0 1 0 0,0 0 0 0 0,0 0-1 0 0,0 0 1 0 0,0 0-1 0 0,0 1 1 0 0,-1-1 0 0 0,1 0-1 0 0,0 0 1 0 0,0 0-1 0 0,0 0 1 0 0,0 0 0 0 0,0 0-1 0 0,-1 0 1 0 0,1 0 0 0 0,0 0-1 0 0,0 1 1 0 0,0-1-1 0 0,0 0 1 0 0,0 0 0 0 0,0 0-1 0 0,0 0 1 0 0,-1 0-1 0 0,1 1 1 0 0,-2 2 12 0 0,0 0-1 0 0,0 0 1 0 0,0 0-1 0 0,0 0 1 0 0,1 0 0 0 0,-1 1-1 0 0,1-1 1 0 0,0 1-1 0 0,0-1 1 0 0,-1 5-1 0 0,0 5-669 0 0,0 1 1 0 0,0 0-1 0 0,2 0 0 0 0,1 24 0 0 0,0-28 77 0 0</inkml:trace>
 </inkml:ink>
-</file>
-
-<file path=customXml/item5.xml><?xml version="1.0" encoding="utf-8"?>
-<?mso-contentType ?>
-<FormTemplates xmlns="http://schemas.microsoft.com/sharepoint/v3/contenttype/forms">
-  <Display>DocumentLibraryForm</Display>
-  <Edit>DocumentLibraryForm</Edit>
-  <New>DocumentLibraryForm</New>
-</FormTemplates>
 </file>
 
 <file path=customXml/item6.xml><?xml version="1.0" encoding="utf-8"?>
@@ -15814,13 +16987,41 @@
 </file>
 
 <file path=customXml/item7.xml><?xml version="1.0" encoding="utf-8"?>
-<b:Sources xmlns:b="http://schemas.openxmlformats.org/officeDocument/2006/bibliography" xmlns="http://schemas.openxmlformats.org/officeDocument/2006/bibliography" SelectedStyle="\APASixthEditionOfficeOnline.xsl" StyleName="APA" Version="6"/>
+<inkml:ink xmlns:inkml="http://www.w3.org/2003/InkML">
+  <inkml:definitions>
+    <inkml:context xml:id="ctx0">
+      <inkml:inkSource xml:id="inkSrc0">
+        <inkml:traceFormat>
+          <inkml:channel name="X" type="integer" min="-2.14748E9" max="2.14748E9" units="cm"/>
+          <inkml:channel name="Y" type="integer" min="-2.14748E9" max="2.14748E9" units="cm"/>
+          <inkml:channel name="F" type="integer" max="32767" units="dev"/>
+          <inkml:channel name="OA" type="integer" max="360" units="deg"/>
+          <inkml:channel name="OE" type="integer" max="90" units="deg"/>
+        </inkml:traceFormat>
+        <inkml:channelProperties>
+          <inkml:channelProperty channel="X" name="resolution" value="1000" units="1/cm"/>
+          <inkml:channelProperty channel="Y" name="resolution" value="1000" units="1/cm"/>
+          <inkml:channelProperty channel="F" name="resolution" value="0" units="1/dev"/>
+          <inkml:channelProperty channel="OA" name="resolution" value="1000" units="1/deg"/>
+          <inkml:channelProperty channel="OE" name="resolution" value="1000" units="1/deg"/>
+        </inkml:channelProperties>
+      </inkml:inkSource>
+      <inkml:timestamp xml:id="ts0" timeString="2025-06-10T16:08:50.568"/>
+    </inkml:context>
+    <inkml:brush xml:id="br0">
+      <inkml:brushProperty name="width" value="0.05" units="cm"/>
+      <inkml:brushProperty name="height" value="0.05" units="cm"/>
+      <inkml:brushProperty name="color" value="#E71224"/>
+    </inkml:brush>
+  </inkml:definitions>
+  <inkml:trace contextRef="#ctx0" brushRef="#br0">1236 239 3217 0 0,'-18'-44'2449'0'0,"11"24"-2251"0"0,-2 1 0 0 0,-14-27 0 0 0,19 39-210 0 0,-1 0 0 0 0,0 1-1 0 0,0 0 1 0 0,-1-1 0 0 0,0 2 0 0 0,0-1-1 0 0,0 1 1 0 0,0 0 0 0 0,-14-8-1 0 0,8 6-57 0 0,-1 1 0 0 0,1 1 1 0 0,-1 0-1 0 0,0 0 0 0 0,0 1 0 0 0,0 1 0 0 0,0 0 0 0 0,-1 1 0 0 0,-22-1 0 0 0,19 4-190 0 0,0 0-1 0 0,0 1 1 0 0,0 1-1 0 0,1 0 1 0 0,-1 1-1 0 0,1 1 1 0 0,-21 9-1 0 0,-37 17-295 0 0,-131 76-1 0 0,173-87 985 0 0,0 2 0 0 0,2 1 0 0 0,1 2 0 0 0,1 0 0 0 0,1 2 0 0 0,-28 37 0 0 0,-16 22-328 0 0,-54 78 18 0 0,113-145-112 0 0,0 0 1 0 0,2 1-1 0 0,1 0 0 0 0,0 0 0 0 0,2 1 1 0 0,0 0-1 0 0,-5 27 0 0 0,4 3 6 0 0,3 0-1 0 0,1 0 0 0 0,3 0 1 0 0,2 1-1 0 0,2-1 1 0 0,13 62-1 0 0,-11-89 37 0 0,1-1 0 0 0,2 1 0 0 0,0-1 0 0 0,1-1 0 0 0,1 0 0 0 0,2 0-1 0 0,0-1 1 0 0,1-1 0 0 0,1 0 0 0 0,1 0 0 0 0,25 25 0 0 0,-31-38 8 0 0,1 0 0 0 0,0-1 0 0 0,0 0 0 0 0,1-1-1 0 0,0 0 1 0 0,0 0 0 0 0,0-1 0 0 0,0 0 0 0 0,1-1 0 0 0,-1-1 0 0 0,1 0 0 0 0,23 1 0 0 0,0-2-27 0 0,-1-1 0 0 0,0-2 0 0 0,43-8 0 0 0,15-10 179 0 0,-1-4 0 0 0,111-46 0 0 0,-162 55-168 0 0,0 1-21 0 0,5-1 26 0 0,-2-3-1 0 0,45-23 0 0 0,-67 26 22 0 0,-1 0 0 0 0,0-2-1 0 0,-2 0 1 0 0,0-1 0 0 0,-1-1 0 0 0,0-1 0 0 0,-2 0-1 0 0,22-37 1 0 0,-28 39-39 0 0,0 1 1 0 0,-1-1-1 0 0,-1-1 0 0 0,-1 0 1 0 0,-1 1-1 0 0,0-2 0 0 0,-2 1 0 0 0,0 0 1 0 0,0-25-1 0 0,-2-13 167 0 0,-14-108-1 0 0,10 143-149 0 0,-1 0-1 0 0,0 1 1 0 0,-2-1-1 0 0,-1 1 1 0 0,-1 0-1 0 0,0 1 1 0 0,-1 0-1 0 0,-23-35 0 0 0,22 41 15 0 0,-1 0 0 0 0,0 0-1 0 0,-1 1 1 0 0,-1 0 0 0 0,0 1-1 0 0,0 1 1 0 0,-1 0 0 0 0,-1 1-1 0 0,0 0 1 0 0,0 1 0 0 0,-25-10-1 0 0,15 9-505 0 0,-1 1-1 0 0,0 2 1 0 0,0 0 0 0 0,-49-5-1 0 0,41 10-389 0 0</inkml:trace>
+</inkml:ink>
 </file>
 
 <file path=customXml/itemProps1.xml><?xml version="1.0" encoding="utf-8"?>
 <ds:datastoreItem xmlns:ds="http://schemas.openxmlformats.org/officeDocument/2006/customXml" ds:itemID="{01D51A4F-7BE7-46DF-A7D0-BDB91C1C49A3}">
   <ds:schemaRefs>
-    <ds:schemaRef ds:uri="http://www.w3.org/2003/InkML"/>
+    <ds:schemaRef ds:uri="http://schemas.openxmlformats.org/officeDocument/2006/bibliography"/>
   </ds:schemaRefs>
 </ds:datastoreItem>
 </file>
@@ -15835,9 +17036,9 @@
 </file>
 
 <file path=customXml/itemProps3.xml><?xml version="1.0" encoding="utf-8"?>
-<ds:datastoreItem xmlns:ds="http://schemas.openxmlformats.org/officeDocument/2006/customXml" ds:itemID="{4B023D59-82BC-4D0F-A651-C98E01C1F15C}">
+<ds:datastoreItem xmlns:ds="http://schemas.openxmlformats.org/officeDocument/2006/customXml" ds:itemID="{6A655C0C-F4A3-4931-9F7F-84CBD61DCE8F}">
   <ds:schemaRefs>
-    <ds:schemaRef ds:uri="http://www.w3.org/2003/InkML"/>
+    <ds:schemaRef ds:uri="http://schemas.microsoft.com/sharepoint/v3/contenttype/forms"/>
   </ds:schemaRefs>
 </ds:datastoreItem>
 </file>
@@ -15851,9 +17052,9 @@
 </file>
 
 <file path=customXml/itemProps5.xml><?xml version="1.0" encoding="utf-8"?>
-<ds:datastoreItem xmlns:ds="http://schemas.openxmlformats.org/officeDocument/2006/customXml" ds:itemID="{6A655C0C-F4A3-4931-9F7F-84CBD61DCE8F}">
+<ds:datastoreItem xmlns:ds="http://schemas.openxmlformats.org/officeDocument/2006/customXml" ds:itemID="{01D51A4F-7BE7-46DF-A7D0-BDB91C1C49A3}">
   <ds:schemaRefs>
-    <ds:schemaRef ds:uri="http://schemas.microsoft.com/sharepoint/v3/contenttype/forms"/>
+    <ds:schemaRef ds:uri="http://www.w3.org/2003/InkML"/>
   </ds:schemaRefs>
 </ds:datastoreItem>
 </file>
@@ -15877,9 +17078,9 @@
 </file>
 
 <file path=customXml/itemProps7.xml><?xml version="1.0" encoding="utf-8"?>
-<ds:datastoreItem xmlns:ds="http://schemas.openxmlformats.org/officeDocument/2006/customXml" ds:itemID="{01D51A4F-7BE7-46DF-A7D0-BDB91C1C49A3}">
+<ds:datastoreItem xmlns:ds="http://schemas.openxmlformats.org/officeDocument/2006/customXml" ds:itemID="{4B023D59-82BC-4D0F-A651-C98E01C1F15C}">
   <ds:schemaRefs>
-    <ds:schemaRef ds:uri="http://schemas.openxmlformats.org/officeDocument/2006/bibliography"/>
+    <ds:schemaRef ds:uri="http://www.w3.org/2003/InkML"/>
   </ds:schemaRefs>
 </ds:datastoreItem>
 </file>
</xml_diff>

<commit_message>
OAK Foto implementiert mit Barcode testung erfolgreich und ediable Abmessungeb wie weight
</commit_message>
<xml_diff>
--- a/Documentation/Doku-Felix.docx
+++ b/Documentation/Doku-Felix.docx
@@ -6093,31 +6093,67 @@
     <w:p>
       <w:pPr>
         <w:pStyle w:val="Text"/>
-      </w:pPr>
-      <w:r>
-        <w:t>Dieses Kapitel beschreibt die theoretischen Grundlagen zur Realisierung eines mobilen 3D</w:t>
+        <w:rPr>
+          <w:lang w:val="de-AT" w:eastAsia="de-AT"/>
+        </w:rPr>
+      </w:pPr>
+      <w:r>
+        <w:t>Um ein automatisches 3D</w:t>
       </w:r>
       <w:r>
         <w:noBreakHyphen/>
-        <w:t>Scannersystems zur automatisierten Erfassung von Artikeldaten im Lagerbetrieb. Behandelt werden insbesondere die Tiefenmessung mittels Stereo</w:t>
+        <w:t>Scanner</w:t>
       </w:r>
       <w:r>
         <w:noBreakHyphen/>
-        <w:t>Vision</w:t>
+        <w:t xml:space="preserve">System zu bauen, </w:t>
+      </w:r>
+      <w:r>
+        <w:t>dass</w:t>
+      </w:r>
+      <w:r>
+        <w:t xml:space="preserve"> Artikel im Lager vermisst, wiegt und deren Barcodes liest, müssen wir verstehen, wie die einzelnen Technologien funktionieren. In diesem Kapitel erkläre ich die wichtigsten theoretischen Grundlagen – immer mit Blick darauf, wie sie später in der Software umgesetzt werden.</w:t>
+      </w:r>
+    </w:p>
+    <w:p>
+      <w:pPr>
+        <w:pStyle w:val="Text"/>
+      </w:pPr>
+      <w:r>
+        <w:t xml:space="preserve">Zuerst schauen wir uns an, wie eine Kamera räumliche Tiefe messen kann </w:t>
+      </w:r>
+      <w:r>
+        <w:t>(Stereo-Vision</w:t>
+      </w:r>
+      <w:r>
+        <w:t>). Daraus entstehen sogenannte Punktwolken, aus denen wir die Größe eines Artikels berechnen. Danach geht es um Bildverarbeitung: Wie erkennt und liest ein Programm QR</w:t>
       </w:r>
       <w:r>
         <w:noBreakHyphen/>
-        <w:t>Kameras, die Verarbeitung von Punktwolken zur Bestimmung geometrischer Abmessungen, Verfahren der Bildverarbeitung zur Code</w:t>
-      </w:r>
-      <w:r>
-        <w:noBreakHyphen/>
-        <w:t>Erkennung sowie die Gewichtserfassung über Wägezellen. Ziel ist es, die physikalischen und informationstechnischen Prinzipien zu erläutern, welche die spätere praktische Umsetzung des Systems ermöglichen.</w:t>
+        <w:t>Codes oder Barcodes? Anschließend betrachten wir die Gewichtsmessung mit einer Wägezelle – auch hier interessiert uns vor allem, wie das Signal digital verarbeitet wird. Zum Schluss werfen wir einen Blick auf alternative Verfahren, um unsere Technikwahl zu begründen, und überlegen, welche Messungenauigkeiten theoretisch zu erwarten sind.</w:t>
       </w:r>
     </w:p>
     <w:p>
       <w:pPr>
         <w:pStyle w:val="Text"/>
-      </w:pPr>
+        <w:rPr>
+          <w:lang w:val="de-AT"/>
+        </w:rPr>
+      </w:pPr>
+    </w:p>
+    <w:p>
+      <w:pPr>
+        <w:jc w:val="left"/>
+        <w:rPr>
+          <w:lang w:val="de-AT"/>
+        </w:rPr>
+      </w:pPr>
+      <w:r>
+        <w:rPr>
+          <w:lang w:val="de-AT"/>
+        </w:rPr>
+        <w:br w:type="page"/>
+      </w:r>
     </w:p>
     <w:p>
       <w:pPr>
@@ -6125,6 +6161,7 @@
       </w:pPr>
       <w:bookmarkStart w:id="47" w:name="_Toc221613883"/>
       <w:r>
+        <w:lastRenderedPageBreak/>
         <w:t>Tiefenmessung mit Stereo</w:t>
       </w:r>
       <w:r>
@@ -6144,33 +6181,250 @@
         <w:rPr>
           <w:lang w:val="de-AT"/>
         </w:rPr>
-        <w:t>Die Bestimmung der räumlichen Entfernung eines Objekts erfolgt bei modernen 3D</w:t>
+        <w:t>Bei Stereo</w:t>
       </w:r>
       <w:r>
         <w:rPr>
           <w:lang w:val="de-AT"/>
         </w:rPr>
         <w:noBreakHyphen/>
-        <w:t xml:space="preserve">Kameras über das Prinzip </w:t>
-      </w:r>
-      <w:r>
-        <w:rPr>
-          <w:lang w:val="de-AT"/>
-        </w:rPr>
-        <w:t>von einem</w:t>
-      </w:r>
-      <w:r>
-        <w:rPr>
-          <w:lang w:val="de-AT"/>
-        </w:rPr>
-        <w:t xml:space="preserve"> Stereo</w:t>
-      </w:r>
-      <w:r>
-        <w:rPr>
-          <w:lang w:val="de-AT"/>
-        </w:rPr>
-        <w:noBreakHyphen/>
-        <w:t>Vision. Dabei werden zwei räumlich voneinander getrennte Kameras verwendet, welche dieselbe Szene aus leicht unterschiedlichen Blickwinkeln aufnehmen. Durch den Vergleich der Bildpunkte beider Kameras entsteht eine sogenannte Disparität, also eine horizontale Verschiebung der Bildpunkte.</w:t>
+        <w:t>Vision arbeiten zwei Kameras gleichzeitig – ähnlich wie unsere zwei Augen. Sie fotografieren dasselbe Objekt aus leicht unterschiedlichen Winkeln. Ein Punkt auf dem Objekt erscheint in den beiden Bildern an unterschiedlichen Stellen. Diese Verschiebung nennt man </w:t>
+      </w:r>
+      <w:r>
+        <w:rPr>
+          <w:bCs/>
+          <w:lang w:val="de-AT"/>
+        </w:rPr>
+        <w:t>Disparität</w:t>
+      </w:r>
+      <w:r>
+        <w:rPr>
+          <w:lang w:val="de-AT"/>
+        </w:rPr>
+        <w:t>.</w:t>
+      </w:r>
+    </w:p>
+    <w:p>
+      <w:pPr>
+        <w:pStyle w:val="Text"/>
+        <w:rPr>
+          <w:lang w:val="de-AT"/>
+        </w:rPr>
+      </w:pPr>
+    </w:p>
+    <w:p>
+      <w:pPr>
+        <w:pStyle w:val="Text"/>
+        <w:rPr>
+          <w:lang w:val="de-AT"/>
+        </w:rPr>
+      </w:pPr>
+      <w:r>
+        <w:rPr>
+          <w:lang w:val="de-AT"/>
+        </w:rPr>
+        <w:t>Je näher ein Gegenstand ist, desto größer ist die Verschiebung. Mit einer einfachen Formel kann man daraus die Entfernung berechnen:</w:t>
+      </w:r>
+    </w:p>
+    <w:p>
+      <w:pPr>
+        <w:pStyle w:val="Text"/>
+        <w:rPr>
+          <w:lang w:val="de-AT"/>
+        </w:rPr>
+      </w:pPr>
+    </w:p>
+    <w:p>
+      <w:pPr>
+        <w:pStyle w:val="Text"/>
+        <w:rPr>
+          <w:lang w:val="de-AT"/>
+        </w:rPr>
+      </w:pPr>
+      <m:oMathPara>
+        <m:oMath>
+          <m:r>
+            <m:rPr>
+              <m:nor/>
+            </m:rPr>
+            <w:rPr>
+              <w:lang w:val="de-AT"/>
+            </w:rPr>
+            <m:t>Tiefe</m:t>
+          </m:r>
+          <m:r>
+            <w:rPr>
+              <w:rFonts w:ascii="Cambria Math" w:hAnsi="Cambria Math"/>
+              <w:lang w:val="de-AT"/>
+            </w:rPr>
+            <m:t>=</m:t>
+          </m:r>
+          <m:f>
+            <m:fPr>
+              <m:ctrlPr>
+                <w:rPr>
+                  <w:rFonts w:ascii="Cambria Math" w:hAnsi="Cambria Math"/>
+                  <w:lang w:val="de-AT"/>
+                </w:rPr>
+              </m:ctrlPr>
+            </m:fPr>
+            <m:num>
+              <m:r>
+                <m:rPr>
+                  <m:nor/>
+                </m:rPr>
+                <w:rPr>
+                  <w:lang w:val="de-AT"/>
+                </w:rPr>
+                <m:t>Brennweite</m:t>
+              </m:r>
+              <m:r>
+                <w:rPr>
+                  <w:rFonts w:ascii="Cambria Math" w:hAnsi="Cambria Math"/>
+                  <w:lang w:val="de-AT"/>
+                </w:rPr>
+                <m:t>×</m:t>
+              </m:r>
+              <m:r>
+                <m:rPr>
+                  <m:nor/>
+                </m:rPr>
+                <w:rPr>
+                  <w:lang w:val="de-AT"/>
+                </w:rPr>
+                <m:t>Kameraabstand</m:t>
+              </m:r>
+            </m:num>
+            <m:den>
+              <m:r>
+                <m:rPr>
+                  <m:nor/>
+                </m:rPr>
+                <w:rPr>
+                  <w:lang w:val="de-AT"/>
+                </w:rPr>
+                <m:t>Disparität</m:t>
+              </m:r>
+            </m:den>
+          </m:f>
+          <m:r>
+            <w:rPr>
+              <w:lang w:val="de-AT"/>
+            </w:rPr>
+            <w:br/>
+          </m:r>
+        </m:oMath>
+      </m:oMathPara>
+    </w:p>
+    <w:p>
+      <w:pPr>
+        <w:pStyle w:val="Text"/>
+        <w:numPr>
+          <w:ilvl w:val="0"/>
+          <w:numId w:val="29"/>
+        </w:numPr>
+        <w:rPr>
+          <w:lang w:val="de-AT"/>
+        </w:rPr>
+      </w:pPr>
+      <w:r>
+        <w:rPr>
+          <w:bCs/>
+          <w:lang w:val="de-AT"/>
+        </w:rPr>
+        <w:t>Brennweite</w:t>
+      </w:r>
+      <w:r>
+        <w:rPr>
+          <w:lang w:val="de-AT"/>
+        </w:rPr>
+        <w:t>: Gibt an, wie stark die Linse das Licht bündelt (steht im Datenblatt der Kamera).</w:t>
+      </w:r>
+    </w:p>
+    <w:p>
+      <w:pPr>
+        <w:pStyle w:val="Text"/>
+        <w:numPr>
+          <w:ilvl w:val="0"/>
+          <w:numId w:val="29"/>
+        </w:numPr>
+        <w:rPr>
+          <w:lang w:val="de-AT"/>
+        </w:rPr>
+      </w:pPr>
+      <w:r>
+        <w:rPr>
+          <w:bCs/>
+          <w:lang w:val="de-AT"/>
+        </w:rPr>
+        <w:t>Kameraabstand (Baseline)</w:t>
+      </w:r>
+      <w:r>
+        <w:rPr>
+          <w:lang w:val="de-AT"/>
+        </w:rPr>
+        <w:t>: Der Abstand zwischen den beiden Kameralinsen.</w:t>
+      </w:r>
+    </w:p>
+    <w:p>
+      <w:pPr>
+        <w:pStyle w:val="Text"/>
+        <w:numPr>
+          <w:ilvl w:val="0"/>
+          <w:numId w:val="29"/>
+        </w:numPr>
+        <w:rPr>
+          <w:lang w:val="de-AT"/>
+        </w:rPr>
+      </w:pPr>
+      <w:r>
+        <w:rPr>
+          <w:bCs/>
+          <w:lang w:val="de-AT"/>
+        </w:rPr>
+        <w:t>Disparität</w:t>
+      </w:r>
+      <w:r>
+        <w:rPr>
+          <w:lang w:val="de-AT"/>
+        </w:rPr>
+        <w:t>: Die gemessene Pixelverschiebung.</w:t>
+      </w:r>
+    </w:p>
+    <w:p>
+      <w:pPr>
+        <w:pStyle w:val="Text"/>
+        <w:rPr>
+          <w:lang w:val="de-AT"/>
+        </w:rPr>
+      </w:pPr>
+    </w:p>
+    <w:p>
+      <w:pPr>
+        <w:pStyle w:val="Text"/>
+        <w:rPr>
+          <w:lang w:val="de-AT"/>
+        </w:rPr>
+      </w:pPr>
+      <w:commentRangeStart w:id="48"/>
+      <w:r>
+        <w:rPr>
+          <w:lang w:val="de-AT"/>
+        </w:rPr>
+        <w:t>Damit die Formel genau stimmt, müssen die Kameras vorher </w:t>
+      </w:r>
+      <w:r>
+        <w:rPr>
+          <w:bCs/>
+          <w:lang w:val="de-AT"/>
+        </w:rPr>
+        <w:t>kalibriert</w:t>
+      </w:r>
+      <w:r>
+        <w:rPr>
+          <w:lang w:val="de-AT"/>
+        </w:rPr>
+        <w:t> werden.</w:t>
       </w:r>
       <w:r>
         <w:rPr>
@@ -6178,6 +6432,31 @@
         </w:rPr>
         <w:t xml:space="preserve"> </w:t>
       </w:r>
+      <w:r>
+        <w:rPr>
+          <w:lang w:val="de-AT"/>
+        </w:rPr>
+        <w:t>Dabei werden kleine Unregelmäßigkeiten der Linsen (Verzerrungen) und die exakte</w:t>
+      </w:r>
+      <w:r>
+        <w:rPr>
+          <w:lang w:val="de-AT"/>
+        </w:rPr>
+        <w:t xml:space="preserve"> </w:t>
+      </w:r>
+      <w:r>
+        <w:rPr>
+          <w:lang w:val="de-AT"/>
+        </w:rPr>
+        <w:t>Position der Kameras zueinander berechnet. In der Software geschieht das mit Algorithmen, die ein Schachbrettmuster erkennen [Zhang, 2000].</w:t>
+      </w:r>
+      <w:commentRangeEnd w:id="48"/>
+      <w:r>
+        <w:rPr>
+          <w:rStyle w:val="Kommentarzeichen"/>
+        </w:rPr>
+        <w:commentReference w:id="48"/>
+      </w:r>
     </w:p>
     <w:p>
       <w:pPr>
@@ -6186,70 +6465,146 @@
           <w:lang w:val="de-AT"/>
         </w:rPr>
       </w:pPr>
+      <w:r>
+        <w:rPr>
+          <w:lang w:val="de-AT"/>
+        </w:rPr>
+        <w:t>Die </w:t>
+      </w:r>
+      <w:r>
+        <w:rPr>
+          <w:bCs/>
+          <w:lang w:val="de-AT"/>
+        </w:rPr>
+        <w:t>Genauigkeit</w:t>
+      </w:r>
+      <w:r>
+        <w:rPr>
+          <w:lang w:val="de-AT"/>
+        </w:rPr>
+        <w:t> der Tiefenmessung hängt von mehreren Dingen ab:</w:t>
+      </w:r>
     </w:p>
     <w:p>
       <w:pPr>
         <w:pStyle w:val="Text"/>
-      </w:pPr>
-      <w:r>
-        <w:t>Unter Berücksichtigung der bekannten Baseline (Abstand der Kameras) sowie der Brennweite der Optik lässt sich aus dieser Disparität die Entfernung zum Objekt mathematisch bestimmen. Dabei gilt: Je größer die Disparität, desto näher befindet sich das Objekt zur Kamera; die Beziehung zwischen Disparität und Entfernung ist somit umgekehrt proportional.</w:t>
-      </w:r>
-    </w:p>
-    <w:p>
-      <w:pPr>
-        <w:jc w:val="left"/>
-      </w:pPr>
-      <w:r>
-        <w:br w:type="page"/>
+        <w:numPr>
+          <w:ilvl w:val="0"/>
+          <w:numId w:val="30"/>
+        </w:numPr>
+        <w:rPr>
+          <w:lang w:val="de-AT"/>
+        </w:rPr>
+      </w:pPr>
+      <w:r>
+        <w:rPr>
+          <w:bCs/>
+          <w:lang w:val="de-AT"/>
+        </w:rPr>
+        <w:t>Kameraabstand</w:t>
+      </w:r>
+      <w:r>
+        <w:rPr>
+          <w:lang w:val="de-AT"/>
+        </w:rPr>
+        <w:t>: Ein größerer Abstand liefert genauere Tiefenwerte, aber die Kameras sehen dann weniger vom gemeinsamen Bereich.</w:t>
       </w:r>
     </w:p>
     <w:p>
       <w:pPr>
         <w:pStyle w:val="Text"/>
-        <w:rPr>
-          <w:lang w:val="de-AT"/>
-        </w:rPr>
-      </w:pPr>
-      <w:r>
+        <w:numPr>
+          <w:ilvl w:val="0"/>
+          <w:numId w:val="30"/>
+        </w:numPr>
+        <w:rPr>
+          <w:lang w:val="de-AT"/>
+        </w:rPr>
+      </w:pPr>
+      <w:r>
+        <w:rPr>
+          <w:bCs/>
+          <w:lang w:val="de-AT"/>
+        </w:rPr>
+        <w:t>Bildauflösung</w:t>
+      </w:r>
+      <w:r>
+        <w:rPr>
+          <w:lang w:val="de-AT"/>
+        </w:rPr>
+        <w:t>: Mehr Pixel bedeuten feinere Verschiebungen können erkannt werden – aber auch mehr Rechenaufwand.</w:t>
+      </w:r>
+    </w:p>
+    <w:p>
+      <w:pPr>
+        <w:pStyle w:val="Text"/>
+        <w:numPr>
+          <w:ilvl w:val="0"/>
+          <w:numId w:val="30"/>
+        </w:numPr>
+        <w:rPr>
+          <w:lang w:val="de-AT"/>
+        </w:rPr>
+      </w:pPr>
+      <w:r>
+        <w:rPr>
+          <w:bCs/>
+          <w:lang w:val="de-AT"/>
+        </w:rPr>
         <w:lastRenderedPageBreak/>
-        <w:t>Zur Veranschaulichung des beschriebenen Stereos</w:t>
-      </w:r>
-      <w:r>
-        <w:noBreakHyphen/>
-        <w:t>Vision</w:t>
-      </w:r>
-      <w:r>
-        <w:noBreakHyphen/>
-        <w:t>Prinzips ist in der folgenden Abbildung beispielhaft eine Tiefenkamera des Typs OAK</w:t>
-      </w:r>
-      <w:r>
-        <w:noBreakHyphen/>
-        <w:t>D2S dargestellt. Diese Kamera kombiniert mehrere Bildsensoren in einem kompakten Gehäuse und dient als typisches Beispiel für ein modernes Stereo</w:t>
-      </w:r>
-      <w:r>
-        <w:noBreakHyphen/>
-        <w:t>Vision</w:t>
-      </w:r>
-      <w:r>
-        <w:noBreakHyphen/>
-        <w:t>System.</w:t>
+        <w:t>Oberfläche des Objekts</w:t>
+      </w:r>
+      <w:r>
+        <w:rPr>
+          <w:lang w:val="de-AT"/>
+        </w:rPr>
+        <w:t>: Wenn die Oberfläche einfarbig oder glänzend ist, fällt es der Software schwer, denselben Punkt in beiden Bildern wiederzufinden.</w:t>
       </w:r>
     </w:p>
     <w:p>
       <w:pPr>
         <w:pStyle w:val="Text"/>
+        <w:numPr>
+          <w:ilvl w:val="0"/>
+          <w:numId w:val="30"/>
+        </w:numPr>
+        <w:rPr>
+          <w:lang w:val="de-AT"/>
+        </w:rPr>
+      </w:pPr>
+      <w:r>
+        <w:rPr>
+          <w:bCs/>
+          <w:lang w:val="de-AT"/>
+        </w:rPr>
+        <w:t>Lichtverhältnisse</w:t>
+      </w:r>
+      <w:r>
+        <w:rPr>
+          <w:lang w:val="de-AT"/>
+        </w:rPr>
+        <w:t>: Zu wenig Licht oder starke Schatten verschlechtern die Bildqualität.</w:t>
+      </w:r>
+    </w:p>
+    <w:p>
+      <w:pPr>
+        <w:pStyle w:val="Text"/>
+        <w:numPr>
+          <w:ilvl w:val="0"/>
+          <w:numId w:val="30"/>
+        </w:numPr>
         <w:jc w:val="center"/>
         <w:rPr>
           <w:lang w:val="de-AT"/>
         </w:rPr>
       </w:pPr>
-      <w:commentRangeStart w:id="48"/>
+      <w:commentRangeStart w:id="49"/>
       <w:r>
         <w:rPr>
           <w:noProof/>
         </w:rPr>
         <w:drawing>
-          <wp:inline distT="0" distB="0" distL="0" distR="0" wp14:anchorId="555A0B1B" wp14:editId="7C37CBEA">
+          <wp:inline distT="0" distB="0" distL="0" distR="0" wp14:anchorId="2CD1A854" wp14:editId="0233712A">
             <wp:extent cx="2952628" cy="920262"/>
             <wp:effectExtent l="0" t="0" r="0" b="0"/>
             <wp:docPr id="1739882055" name="Grafik 1" descr="Ein Bild, das Handy, Gerät, Elektronisches Gerät, tragbares Kommunikationsgerät enthält.&#10;&#10;KI-generierte Inhalte können fehlerhaft sein."/>
@@ -6266,7 +6621,7 @@
                     </pic:cNvPicPr>
                   </pic:nvPicPr>
                   <pic:blipFill rotWithShape="1">
-                    <a:blip r:embed="rId41" cstate="print">
+                    <a:blip r:embed="rId45" cstate="print">
                       <a:extLst>
                         <a:ext uri="{28A0092B-C50C-407E-A947-70E740481C1C}">
                           <a14:useLocalDpi xmlns:a14="http://schemas.microsoft.com/office/drawing/2010/main" val="0"/>
@@ -6302,194 +6657,170 @@
           </wp:inline>
         </w:drawing>
       </w:r>
-      <w:commentRangeEnd w:id="48"/>
+      <w:commentRangeEnd w:id="49"/>
       <w:r>
         <w:rPr>
           <w:rStyle w:val="Kommentarzeichen"/>
         </w:rPr>
-        <w:commentReference w:id="48"/>
+        <w:commentReference w:id="49"/>
       </w:r>
     </w:p>
     <w:p>
       <w:pPr>
         <w:pStyle w:val="Beschriftung"/>
-        <w:rPr>
-          <w:color w:val="0066FF"/>
-        </w:rPr>
-      </w:pPr>
-      <w:r>
-        <w:t xml:space="preserve">Abbildung </w:t>
-      </w:r>
-      <w:r>
-        <w:fldChar w:fldCharType="begin"/>
-      </w:r>
-      <w:r>
-        <w:instrText xml:space="preserve"> SEQ Abbildung \* ARABIC </w:instrText>
-      </w:r>
-      <w:r>
-        <w:fldChar w:fldCharType="separate"/>
-      </w:r>
-      <w:r>
-        <w:t>1</w:t>
-      </w:r>
-      <w:r>
-        <w:fldChar w:fldCharType="end"/>
-      </w:r>
-      <w:r>
-        <w:t>: OAK-D 2S</w:t>
-      </w:r>
-    </w:p>
-    <w:p>
-      <w:pPr>
-        <w:pStyle w:val="Text"/>
-        <w:rPr>
-          <w:lang w:val="de-AT"/>
-        </w:rPr>
-      </w:pPr>
-      <w:r>
-        <w:rPr>
-          <w:lang w:val="de-AT"/>
-        </w:rPr>
-        <w:t xml:space="preserve">Die Messgenauigkeit </w:t>
-      </w:r>
-      <w:r>
-        <w:rPr>
-          <w:lang w:val="de-AT"/>
-        </w:rPr>
-        <w:t>eines Stereos</w:t>
-      </w:r>
-      <w:r>
-        <w:rPr>
-          <w:lang w:val="de-AT"/>
-        </w:rPr>
-        <w:noBreakHyphen/>
-        <w:t>Systems hängt maßgeblich von folgenden Parametern ab:</w:t>
-      </w:r>
-    </w:p>
-    <w:p>
-      <w:pPr>
-        <w:pStyle w:val="Text"/>
         <w:numPr>
           <w:ilvl w:val="0"/>
-          <w:numId w:val="15"/>
+          <w:numId w:val="30"/>
         </w:numPr>
         <w:rPr>
-          <w:lang w:val="de-AT"/>
-        </w:rPr>
-      </w:pPr>
-      <w:r>
-        <w:rPr>
-          <w:lang w:val="de-AT"/>
-        </w:rPr>
-        <w:t>Abstand der Kameras (Baseline</w:t>
-      </w:r>
-      <w:r>
-        <w:rPr>
-          <w:lang w:val="de-AT"/>
-        </w:rPr>
-        <w:t>)</w:t>
+          <w:color w:val="0066FF"/>
+        </w:rPr>
+      </w:pPr>
+      <w:r>
+        <w:t xml:space="preserve">Abbildung </w:t>
+      </w:r>
+      <w:r>
+        <w:fldChar w:fldCharType="begin"/>
+      </w:r>
+      <w:r>
+        <w:instrText xml:space="preserve"> SEQ Abbildung \* ARABIC </w:instrText>
+      </w:r>
+      <w:r>
+        <w:fldChar w:fldCharType="separate"/>
+      </w:r>
+      <w:r>
+        <w:t>1</w:t>
+      </w:r>
+      <w:r>
+        <w:fldChar w:fldCharType="end"/>
+      </w:r>
+      <w:r>
+        <w:t>: OAK-D 2S</w:t>
       </w:r>
     </w:p>
     <w:p>
       <w:pPr>
         <w:pStyle w:val="Text"/>
-        <w:numPr>
-          <w:ilvl w:val="0"/>
-          <w:numId w:val="15"/>
-        </w:numPr>
-        <w:rPr>
-          <w:lang w:val="de-AT"/>
-        </w:rPr>
-      </w:pPr>
-      <w:r>
-        <w:rPr>
-          <w:lang w:val="de-AT"/>
-        </w:rPr>
-        <w:t>Auflösung der Bildsensoren</w:t>
-      </w:r>
+        <w:rPr>
+          <w:lang w:val="de-AT"/>
+        </w:rPr>
+      </w:pPr>
     </w:p>
     <w:p>
       <w:pPr>
         <w:pStyle w:val="Text"/>
-        <w:numPr>
-          <w:ilvl w:val="0"/>
-          <w:numId w:val="15"/>
-        </w:numPr>
-        <w:rPr>
-          <w:lang w:val="de-AT"/>
-        </w:rPr>
-      </w:pPr>
-      <w:r>
-        <w:rPr>
-          <w:lang w:val="de-AT"/>
-        </w:rPr>
-        <w:t>Qualität der Kalibrierung</w:t>
-      </w:r>
-    </w:p>
-    <w:p>
-      <w:pPr>
-        <w:pStyle w:val="Text"/>
-        <w:numPr>
-          <w:ilvl w:val="0"/>
-          <w:numId w:val="15"/>
-        </w:numPr>
-        <w:rPr>
-          <w:lang w:val="de-AT"/>
-        </w:rPr>
-      </w:pPr>
-      <w:r>
-        <w:rPr>
-          <w:lang w:val="de-AT"/>
-        </w:rPr>
-        <w:t>Beleuchtungssituation</w:t>
-      </w:r>
-    </w:p>
-    <w:p>
-      <w:pPr>
-        <w:pStyle w:val="Text"/>
-        <w:numPr>
-          <w:ilvl w:val="0"/>
-          <w:numId w:val="15"/>
-        </w:numPr>
-        <w:rPr>
-          <w:lang w:val="de-AT"/>
-        </w:rPr>
-      </w:pPr>
-      <w:r>
-        <w:rPr>
-          <w:lang w:val="de-AT"/>
-        </w:rPr>
-        <w:t>Oberflächeneigenschaften des Objekts</w:t>
-      </w:r>
-    </w:p>
-    <w:p>
-      <w:pPr>
-        <w:pStyle w:val="Text"/>
-        <w:rPr>
-          <w:lang w:val="de-AT"/>
-        </w:rPr>
-      </w:pPr>
-      <w:r>
-        <w:rPr>
-          <w:lang w:val="de-AT"/>
-        </w:rPr>
-        <w:t>Fehlerquellen entstehen insbesondere durch reflektierende oder sehr dunkle Oberflächen, unzureichende Textur im Bild sowie Messrauschen im Tiefensignal. Diese Effekte führen zu Ungenauigkeiten oder fehlenden Tiefenwerten.</w:t>
-      </w:r>
-    </w:p>
-    <w:p>
-      <w:pPr>
-        <w:pStyle w:val="Text"/>
-      </w:pPr>
+        <w:rPr>
+          <w:lang w:val="de-AT"/>
+        </w:rPr>
+      </w:pPr>
+      <w:r>
+        <w:rPr>
+          <w:lang w:val="de-AT"/>
+        </w:rPr>
+        <w:t>Für unser Projekt verwenden wir eine </w:t>
+      </w:r>
+      <w:r>
+        <w:rPr>
+          <w:bCs/>
+          <w:lang w:val="de-AT"/>
+        </w:rPr>
+        <w:t>OAK</w:t>
+      </w:r>
+      <w:r>
+        <w:rPr>
+          <w:bCs/>
+          <w:lang w:val="de-AT"/>
+        </w:rPr>
+        <w:noBreakHyphen/>
+        <w:t>D2S</w:t>
+      </w:r>
+      <w:r>
+        <w:rPr>
+          <w:bCs/>
+          <w:lang w:val="de-AT"/>
+        </w:rPr>
+        <w:noBreakHyphen/>
+        <w:t>Kamera</w:t>
+      </w:r>
+      <w:r>
+        <w:rPr>
+          <w:lang w:val="de-AT"/>
+        </w:rPr>
+        <w:t xml:space="preserve"> (siehe Abbildung 1). Sie hat zwei Kameras eingebaut und einen speziellen </w:t>
+      </w:r>
+      <w:r>
+        <w:rPr>
+          <w:lang w:val="de-AT"/>
+        </w:rPr>
+        <w:t xml:space="preserve">internen </w:t>
+      </w:r>
+      <w:r>
+        <w:rPr>
+          <w:lang w:val="de-AT"/>
+        </w:rPr>
+        <w:t>Chip, der die Tiefenberechnung dire</w:t>
+      </w:r>
+      <w:r>
+        <w:rPr>
+          <w:lang w:val="de-AT"/>
+        </w:rPr>
+        <w:t xml:space="preserve">kt erledigt – das entlastet den </w:t>
+      </w:r>
+      <w:r>
+        <w:rPr>
+          <w:lang w:val="de-AT"/>
+        </w:rPr>
+        <w:t>Raspberry</w:t>
+      </w:r>
+      <w:r>
+        <w:rPr>
+          <w:lang w:val="de-AT"/>
+        </w:rPr>
+        <w:t xml:space="preserve"> </w:t>
+      </w:r>
+      <w:r>
+        <w:rPr>
+          <w:lang w:val="de-AT"/>
+        </w:rPr>
+        <w:t>Pi</w:t>
+      </w:r>
+      <w:r>
+        <w:rPr>
+          <w:lang w:val="de-AT"/>
+        </w:rPr>
+        <w:t xml:space="preserve">. </w:t>
+      </w:r>
+      <w:r>
+        <w:rPr>
+          <w:lang w:val="de-AT"/>
+        </w:rPr>
+        <w:t>Die technischen Daten von der Tiefenkamera sind</w:t>
+      </w:r>
+      <w:r>
+        <w:rPr>
+          <w:lang w:val="de-AT"/>
+        </w:rPr>
+        <w:t>: Basislinie 7,5 cm, Auflösung bis 1920×1080 Pixel [Luxonis, 2023].</w:t>
+      </w:r>
+    </w:p>
+    <w:p>
+      <w:pPr>
+        <w:jc w:val="left"/>
+      </w:pPr>
+      <w:r>
+        <w:br w:type="page"/>
+      </w:r>
     </w:p>
     <w:p>
       <w:pPr>
         <w:pStyle w:val="berschrift3"/>
       </w:pPr>
-      <w:bookmarkStart w:id="49" w:name="_Toc221613884"/>
-      <w:r>
+      <w:bookmarkStart w:id="50" w:name="_Toc221613884"/>
+      <w:r>
+        <w:lastRenderedPageBreak/>
         <w:t>Punktwolken und dreidimensionale Geometrie</w:t>
       </w:r>
-      <w:bookmarkEnd w:id="49"/>
+      <w:bookmarkEnd w:id="50"/>
     </w:p>
     <w:p>
       <w:pPr>
@@ -6523,7 +6854,6 @@
         <w:rPr>
           <w:lang w:val="de-AT"/>
         </w:rPr>
-        <w:lastRenderedPageBreak/>
         <w:t>Zur Bestimmung der Artikelabmessungen werden aus der Punktwolke charakteristische Kenngrößen berechnet:</w:t>
       </w:r>
     </w:p>
@@ -6604,11 +6934,17 @@
     </w:p>
     <w:p>
       <w:pPr>
-        <w:pStyle w:val="Text"/>
-        <w:rPr>
-          <w:lang w:val="de-AT"/>
-        </w:rPr>
-      </w:pPr>
+        <w:jc w:val="left"/>
+        <w:rPr>
+          <w:lang w:val="de-AT"/>
+        </w:rPr>
+      </w:pPr>
+      <w:r>
+        <w:rPr>
+          <w:lang w:val="de-AT"/>
+        </w:rPr>
+        <w:br w:type="page"/>
+      </w:r>
     </w:p>
     <w:p>
       <w:pPr>
@@ -6617,11 +6953,12 @@
           <w:lang w:val="de-AT"/>
         </w:rPr>
       </w:pPr>
-      <w:bookmarkStart w:id="50" w:name="_Toc221613885"/>
-      <w:r>
-        <w:rPr>
-          <w:lang w:val="de-AT"/>
-        </w:rPr>
+      <w:bookmarkStart w:id="51" w:name="_Toc221613885"/>
+      <w:r>
+        <w:rPr>
+          <w:lang w:val="de-AT"/>
+        </w:rPr>
+        <w:lastRenderedPageBreak/>
         <w:t>Grundlagen der Bildverarbeitung und Code</w:t>
       </w:r>
       <w:r>
@@ -6631,7 +6968,7 @@
         <w:noBreakHyphen/>
         <w:t>Erkennung</w:t>
       </w:r>
-      <w:bookmarkEnd w:id="50"/>
+      <w:bookmarkEnd w:id="51"/>
     </w:p>
     <w:p>
       <w:pPr>
@@ -6644,35 +6981,78 @@
         <w:rPr>
           <w:lang w:val="de-AT"/>
         </w:rPr>
-        <w:t>Neben der räumlichen Vermessung ist auch die automatische Identifikation von Artikeln erforderlich. Diese erfolgt über optische Codes wie QR</w:t>
-      </w:r>
-      <w:r>
-        <w:rPr>
+        <w:t>Neben den Maßen wollen wir auch den </w:t>
+      </w:r>
+      <w:r>
+        <w:rPr>
+          <w:bCs/>
+          <w:lang w:val="de-AT"/>
+        </w:rPr>
+        <w:t>QR</w:t>
+      </w:r>
+      <w:r>
+        <w:rPr>
+          <w:bCs/>
           <w:lang w:val="de-AT"/>
         </w:rPr>
         <w:noBreakHyphen/>
-        <w:t>Codes oder Barcodes, die mithilfe von Kameras erfasst und softwareseitig, beispielsweise mit der Python</w:t>
-      </w:r>
-      <w:r>
-        <w:rPr>
-          <w:lang w:val="de-AT"/>
-        </w:rPr>
-        <w:noBreakHyphen/>
-        <w:t xml:space="preserve">Bibliothek </w:t>
-      </w:r>
-      <w:r>
-        <w:rPr>
-          <w:i/>
-          <w:iCs/>
-          <w:lang w:val="de-AT"/>
-        </w:rPr>
-        <w:t>pyzbar</w:t>
-      </w:r>
-      <w:r>
-        <w:rPr>
-          <w:lang w:val="de-AT"/>
-        </w:rPr>
-        <w:t>, decodiert werden.</w:t>
+        <w:t>Code oder Barcode</w:t>
+      </w:r>
+      <w:r>
+        <w:rPr>
+          <w:lang w:val="de-AT"/>
+        </w:rPr>
+        <w:t xml:space="preserve"> auf dem Artikel lesen. Dazu muss die Software </w:t>
+      </w:r>
+      <w:r>
+        <w:rPr>
+          <w:lang w:val="de-AT"/>
+        </w:rPr>
+        <w:t>drei</w:t>
+      </w:r>
+      <w:r>
+        <w:rPr>
+          <w:lang w:val="de-AT"/>
+        </w:rPr>
+        <w:t xml:space="preserve"> Dinge tun: </w:t>
+      </w:r>
+      <w:r>
+        <w:rPr>
+          <w:lang w:val="de-AT"/>
+        </w:rPr>
+        <w:t xml:space="preserve">das Bild aufarbeiten, dann </w:t>
+      </w:r>
+      <w:r>
+        <w:rPr>
+          <w:lang w:val="de-AT"/>
+        </w:rPr>
+        <w:t>den Code im Bild </w:t>
+      </w:r>
+      <w:r>
+        <w:rPr>
+          <w:bCs/>
+          <w:lang w:val="de-AT"/>
+        </w:rPr>
+        <w:t>finden</w:t>
+      </w:r>
+      <w:r>
+        <w:rPr>
+          <w:lang w:val="de-AT"/>
+        </w:rPr>
+        <w:t> und seinen </w:t>
+      </w:r>
+      <w:r>
+        <w:rPr>
+          <w:bCs/>
+          <w:lang w:val="de-AT"/>
+        </w:rPr>
+        <w:t>Inhalt entschlüsseln</w:t>
+      </w:r>
+      <w:r>
+        <w:rPr>
+          <w:lang w:val="de-AT"/>
+        </w:rPr>
+        <w:t>.</w:t>
       </w:r>
     </w:p>
     <w:p>
@@ -6687,102 +7067,16 @@
       <w:pPr>
         <w:pStyle w:val="Text"/>
         <w:rPr>
-          <w:lang w:val="de-AT"/>
-        </w:rPr>
-      </w:pPr>
-      <w:r>
-        <w:rPr>
-          <w:lang w:val="de-AT"/>
-        </w:rPr>
-        <w:t>Zur zuverlässigen Lokalisierung der Codes im Kamerabild können zusätzlich neuronale Netze eingesetzt werden. Ein verbreiteter Ansatz ist die Verwendung eines YOLO</w:t>
-      </w:r>
-      <w:r>
-        <w:rPr>
-          <w:lang w:val="de-AT"/>
-        </w:rPr>
-        <w:noBreakHyphen/>
-      </w:r>
-      <w:commentRangeStart w:id="51"/>
-      <w:r>
-        <w:rPr>
-          <w:lang w:val="de-AT"/>
-        </w:rPr>
-        <w:t>Objekterkennungsmodells</w:t>
-      </w:r>
-      <w:commentRangeEnd w:id="51"/>
-      <w:r>
-        <w:rPr>
-          <w:rStyle w:val="Kommentarzeichen"/>
-        </w:rPr>
-        <w:commentReference w:id="51"/>
-      </w:r>
-      <w:r>
-        <w:rPr>
-          <w:lang w:val="de-AT"/>
-        </w:rPr>
-        <w:t>, das aus öffentlich zugänglichen Datensätzen, etwa aus einem GitHub</w:t>
-      </w:r>
-      <w:r>
-        <w:rPr>
-          <w:lang w:val="de-AT"/>
-        </w:rPr>
-        <w:noBreakHyphen/>
-        <w:t>Repository, bezogen werden kann. Ein solches Modell erkennt die Position eines Bar</w:t>
-      </w:r>
-      <w:r>
-        <w:rPr>
-          <w:lang w:val="de-AT"/>
-        </w:rPr>
-        <w:noBreakHyphen/>
-        <w:t xml:space="preserve"> oder QR</w:t>
-      </w:r>
-      <w:r>
-        <w:rPr>
-          <w:lang w:val="de-AT"/>
-        </w:rPr>
-        <w:noBreakHyphen/>
-        <w:t xml:space="preserve">Codes im Bild und definiert </w:t>
-      </w:r>
-      <w:r>
-        <w:rPr>
-          <w:lang w:val="de-AT"/>
-        </w:rPr>
-        <w:t>eine sogenannte Region</w:t>
-      </w:r>
-      <w:r>
-        <w:rPr>
-          <w:lang w:val="de-AT"/>
-        </w:rPr>
-        <w:noBreakHyphen/>
-        <w:t>of</w:t>
-      </w:r>
-      <w:r>
-        <w:rPr>
-          <w:lang w:val="de-AT"/>
-        </w:rPr>
-        <w:noBreakHyphen/>
-        <w:t>Interest</w:t>
-      </w:r>
-      <w:r>
-        <w:rPr>
-          <w:lang w:val="de-AT"/>
-        </w:rPr>
-        <w:noBreakHyphen/>
-        <w:t>Fenster (ROI). Innerhalb dieses Bereichs erfolgt anschließend die eigentliche Decodierung mittels pyzbar, wodurch sowohl die Erkennungsrate erhöht als auch die Verarbeitung beschleunigt werden kann.</w:t>
-      </w:r>
-    </w:p>
-    <w:p>
-      <w:pPr>
-        <w:jc w:val="left"/>
-        <w:rPr>
-          <w:lang w:val="de-AT"/>
-        </w:rPr>
-      </w:pPr>
-      <w:r>
-        <w:rPr>
-          <w:lang w:val="de-AT"/>
-        </w:rPr>
-        <w:br w:type="page"/>
+          <w:b/>
+          <w:lang w:val="de-AT"/>
+        </w:rPr>
+      </w:pPr>
+      <w:r>
+        <w:rPr>
+          <w:b/>
+          <w:lang w:val="de-AT"/>
+        </w:rPr>
+        <w:t>Bildverarbeitung</w:t>
       </w:r>
     </w:p>
     <w:p>
@@ -6796,14 +7090,37 @@
         <w:rPr>
           <w:lang w:val="de-AT"/>
         </w:rPr>
-        <w:lastRenderedPageBreak/>
-        <w:t>Ergänzend stellen Bildverarbeitungsbibliotheken wie OpenCV</w:t>
-      </w:r>
-      <w:r>
-        <w:rPr>
-          <w:lang w:val="de-AT"/>
-        </w:rPr>
-        <w:t xml:space="preserve"> grundlegende Funktionen bereit, unter anderem:</w:t>
+        <w:t>Bildverarbeitungsbibliotheken wie OpenCV</w:t>
+      </w:r>
+      <w:r>
+        <w:rPr>
+          <w:lang w:val="de-AT"/>
+        </w:rPr>
+        <w:t xml:space="preserve"> </w:t>
+      </w:r>
+      <w:r>
+        <w:rPr>
+          <w:lang w:val="de-AT"/>
+        </w:rPr>
+        <w:t xml:space="preserve">bringen </w:t>
+      </w:r>
+      <w:r>
+        <w:rPr>
+          <w:lang w:val="de-AT"/>
+        </w:rPr>
+        <w:t xml:space="preserve">grundlegende Funktionen </w:t>
+      </w:r>
+      <w:r>
+        <w:rPr>
+          <w:lang w:val="de-AT"/>
+        </w:rPr>
+        <w:t>wie</w:t>
+      </w:r>
+      <w:r>
+        <w:rPr>
+          <w:lang w:val="de-AT"/>
+        </w:rPr>
+        <w:t>:</w:t>
       </w:r>
     </w:p>
     <w:p>
@@ -6877,19 +7194,25 @@
         <w:rPr>
           <w:lang w:val="de-AT"/>
         </w:rPr>
-        <w:t xml:space="preserve"> Auflösung wie die </w:t>
-      </w:r>
-      <w:r>
-        <w:rPr>
-          <w:lang w:val="de-AT"/>
-        </w:rPr>
-        <w:t>Kalibrierung</w:t>
-      </w:r>
-      <w:r>
-        <w:rPr>
-          <w:lang w:val="de-AT"/>
-        </w:rPr>
-        <w:t>. Dabei werden intrinsische Parameter wie Brennweite, Hauptpunkt und Verzerrungskoeffizienten bestimmt, um geometrische Bildverzerrungen rechnerisch zu korrigieren und eine möglichst genaue Auswertung zu ermöglichen.</w:t>
+        <w:t xml:space="preserve"> Auflösung</w:t>
+      </w:r>
+      <w:r>
+        <w:rPr>
+          <w:lang w:val="de-AT"/>
+        </w:rPr>
+        <w:t xml:space="preserve">. </w:t>
+      </w:r>
+      <w:r>
+        <w:rPr>
+          <w:lang w:val="de-AT"/>
+        </w:rPr>
+        <w:t>Bei der Kalibrierung</w:t>
+      </w:r>
+      <w:r>
+        <w:rPr>
+          <w:lang w:val="de-AT"/>
+        </w:rPr>
+        <w:t xml:space="preserve"> werden intrinsische Parameter wie Brennweite, Hauptpunkt und Verzerrungskoeffizienten bestimmt, um geometrische Bildverzerrungen rechnerisch zu korrigieren und eine möglichst genaue Auswertung zu ermöglichen.</w:t>
       </w:r>
     </w:p>
     <w:p>
@@ -6902,16 +7225,496 @@
     </w:p>
     <w:p>
       <w:pPr>
+        <w:pStyle w:val="Text"/>
+        <w:rPr>
+          <w:b/>
+          <w:bCs/>
+          <w:lang w:val="de-AT"/>
+        </w:rPr>
+      </w:pPr>
+      <w:r>
+        <w:rPr>
+          <w:b/>
+          <w:bCs/>
+          <w:lang w:val="de-AT"/>
+        </w:rPr>
+        <w:t>Code finden</w:t>
+      </w:r>
+    </w:p>
+    <w:p>
+      <w:pPr>
+        <w:pStyle w:val="Text"/>
+        <w:rPr>
+          <w:lang w:val="de-AT"/>
+        </w:rPr>
+      </w:pPr>
+      <w:r>
+        <w:rPr>
+          <w:lang w:val="de-AT"/>
+        </w:rPr>
+        <w:t xml:space="preserve">Mit </w:t>
+      </w:r>
+      <w:r>
+        <w:rPr>
+          <w:lang w:val="de-AT"/>
+        </w:rPr>
+        <w:t xml:space="preserve"> klassische Bildverarbeitung </w:t>
+      </w:r>
+      <w:r>
+        <w:rPr>
+          <w:lang w:val="de-AT"/>
+        </w:rPr>
+        <w:t>könnte m</w:t>
+      </w:r>
+      <w:r>
+        <w:rPr>
+          <w:lang w:val="de-AT"/>
+        </w:rPr>
+        <w:t>an nach kontrastreichen Stellen, rechteckigen Formen oder bestimmten Mustern</w:t>
+      </w:r>
+      <w:r>
+        <w:rPr>
+          <w:lang w:val="de-AT"/>
+        </w:rPr>
+        <w:t xml:space="preserve"> suchen</w:t>
+      </w:r>
+      <w:r>
+        <w:rPr>
+          <w:lang w:val="de-AT"/>
+        </w:rPr>
+        <w:t>. Das funktioniert oft gut, ist aber anfällig, wenn der Code schräg, teilweise verdeckt oder schlecht beleuchtet ist.</w:t>
+      </w:r>
+    </w:p>
+    <w:p>
+      <w:pPr>
+        <w:pStyle w:val="Text"/>
+        <w:rPr>
+          <w:lang w:val="de-AT"/>
+        </w:rPr>
+      </w:pPr>
+      <w:r>
+        <w:rPr>
+          <w:lang w:val="de-AT"/>
+        </w:rPr>
+        <w:t>Ein besseres moderneres</w:t>
+      </w:r>
+      <w:r>
+        <w:rPr>
+          <w:lang w:val="de-AT"/>
+        </w:rPr>
+        <w:t xml:space="preserve"> Verfahren setzen auf </w:t>
+      </w:r>
+      <w:r>
+        <w:rPr>
+          <w:bCs/>
+          <w:lang w:val="de-AT"/>
+        </w:rPr>
+        <w:t>künstliche Intelligenz</w:t>
+      </w:r>
+      <w:r>
+        <w:rPr>
+          <w:lang w:val="de-AT"/>
+        </w:rPr>
+        <w:t>, genauer gesagt auf ein neuronales Netz namens </w:t>
+      </w:r>
+      <w:r>
+        <w:rPr>
+          <w:bCs/>
+          <w:lang w:val="de-AT"/>
+        </w:rPr>
+        <w:t>YOLO (You Only Look Once)</w:t>
+      </w:r>
+      <w:r>
+        <w:rPr>
+          <w:lang w:val="de-AT"/>
+        </w:rPr>
+        <w:t> [Redmon et al., 2016]. YOLO wurde mit tausenden Bildern trainiert, in denen Barcodes und QR</w:t>
+      </w:r>
+      <w:r>
+        <w:rPr>
+          <w:lang w:val="de-AT"/>
+        </w:rPr>
+        <w:noBreakHyphen/>
+        <w:t xml:space="preserve">Codes markiert waren. Es kann in einem einzigen Durchlauf alle Codes </w:t>
+      </w:r>
+      <w:r>
+        <w:rPr>
+          <w:lang w:val="de-AT"/>
+        </w:rPr>
+        <w:t>im</w:t>
+      </w:r>
+      <w:r>
+        <w:rPr>
+          <w:lang w:val="de-AT"/>
+        </w:rPr>
+        <w:t xml:space="preserve"> Bild </w:t>
+      </w:r>
+      <w:r>
+        <w:rPr>
+          <w:lang w:val="de-AT"/>
+        </w:rPr>
+        <w:lastRenderedPageBreak/>
+        <w:t>lokalisieren – und das sehr robust gegen Drehung, Größenänderung und schlechte Lichtverhältnisse.</w:t>
+      </w:r>
+    </w:p>
+    <w:p>
+      <w:pPr>
+        <w:pStyle w:val="Text"/>
+        <w:rPr>
+          <w:lang w:val="de-AT"/>
+        </w:rPr>
+      </w:pPr>
+      <w:r>
+        <w:rPr>
+          <w:lang w:val="de-AT"/>
+        </w:rPr>
+        <w:t xml:space="preserve">In unserem Projekt werden wir </w:t>
+      </w:r>
+      <w:r>
+        <w:rPr>
+          <w:lang w:val="de-AT"/>
+        </w:rPr>
+        <w:t>YOLO-Version</w:t>
+      </w:r>
+      <w:r>
+        <w:rPr>
+          <w:lang w:val="de-AT"/>
+        </w:rPr>
+        <w:t xml:space="preserve"> 8 verwenden, um die Code</w:t>
+      </w:r>
+      <w:r>
+        <w:rPr>
+          <w:lang w:val="de-AT"/>
+        </w:rPr>
+        <w:noBreakHyphen/>
+        <w:t>Positionen zu finden.</w:t>
+      </w:r>
+    </w:p>
+    <w:p>
+      <w:pPr>
+        <w:pStyle w:val="Text"/>
+        <w:rPr>
+          <w:lang w:val="de-AT"/>
+        </w:rPr>
+      </w:pPr>
+      <w:r>
+        <w:rPr>
+          <w:lang w:val="de-AT"/>
+        </w:rPr>
+        <w:t>YOLO</w:t>
+      </w:r>
+      <w:r>
+        <w:rPr>
+          <w:lang w:val="de-AT"/>
+        </w:rPr>
+        <w:noBreakHyphen/>
+      </w:r>
+      <w:commentRangeStart w:id="52"/>
+      <w:r>
+        <w:rPr>
+          <w:lang w:val="de-AT"/>
+        </w:rPr>
+        <w:t>Objekterkennungsmodells</w:t>
+      </w:r>
+      <w:commentRangeEnd w:id="52"/>
+      <w:r>
+        <w:rPr>
+          <w:rStyle w:val="Kommentarzeichen"/>
+        </w:rPr>
+        <w:commentReference w:id="52"/>
+      </w:r>
+      <w:r>
+        <w:rPr>
+          <w:lang w:val="de-AT"/>
+        </w:rPr>
+        <w:t xml:space="preserve"> </w:t>
+      </w:r>
+    </w:p>
+    <w:p>
+      <w:pPr>
+        <w:pStyle w:val="Text"/>
+        <w:rPr>
+          <w:lang w:val="de-AT"/>
+        </w:rPr>
+      </w:pPr>
+    </w:p>
+    <w:p>
+      <w:pPr>
+        <w:pStyle w:val="Text"/>
+        <w:rPr>
+          <w:b/>
+          <w:bCs/>
+          <w:lang w:val="de-AT"/>
+        </w:rPr>
+      </w:pPr>
+      <w:r>
+        <w:rPr>
+          <w:b/>
+          <w:bCs/>
+          <w:lang w:val="de-AT"/>
+        </w:rPr>
+        <w:t>Code lesen</w:t>
+      </w:r>
+    </w:p>
+    <w:p>
+      <w:pPr>
+        <w:pStyle w:val="Text"/>
+        <w:rPr>
+          <w:lang w:val="de-AT"/>
+        </w:rPr>
+      </w:pPr>
+      <w:r>
+        <w:rPr>
+          <w:lang w:val="de-AT"/>
+        </w:rPr>
+        <w:t>Sobald wir wissen, wo der Code ist, schneiden wir diesen Bereich aus dem Bild aus. Dann kommt die Bibliothek </w:t>
+      </w:r>
+      <w:r>
+        <w:rPr>
+          <w:bCs/>
+          <w:lang w:val="de-AT"/>
+        </w:rPr>
+        <w:t>pyzbar</w:t>
+      </w:r>
+      <w:r>
+        <w:rPr>
+          <w:lang w:val="de-AT"/>
+        </w:rPr>
+        <w:t xml:space="preserve"> zum Einsatz. </w:t>
+      </w:r>
+      <w:r>
+        <w:rPr>
+          <w:lang w:val="de-AT"/>
+        </w:rPr>
+        <w:t>P</w:t>
+      </w:r>
+      <w:r>
+        <w:rPr>
+          <w:lang w:val="de-AT"/>
+        </w:rPr>
+        <w:t>yzbar ist ein Python</w:t>
+      </w:r>
+      <w:r>
+        <w:rPr>
+          <w:lang w:val="de-AT"/>
+        </w:rPr>
+        <w:noBreakHyphen/>
+        <w:t>Modul, das die bekannte C</w:t>
+      </w:r>
+      <w:r>
+        <w:rPr>
+          <w:lang w:val="de-AT"/>
+        </w:rPr>
+        <w:noBreakHyphen/>
+        <w:t>Bibliothek ZBar anspricht. Es analysiert die Hell</w:t>
+      </w:r>
+      <w:r>
+        <w:rPr>
+          <w:lang w:val="de-AT"/>
+        </w:rPr>
+        <w:noBreakHyphen/>
+        <w:t>Dunkel</w:t>
+      </w:r>
+      <w:r>
+        <w:rPr>
+          <w:lang w:val="de-AT"/>
+        </w:rPr>
+        <w:noBreakHyphen/>
+        <w:t>Muster und wandelt sie in Text oder Zahlen um – egal ob es sich um einen einfachen Strichcode (EAN, UPC) oder einen QR</w:t>
+      </w:r>
+      <w:r>
+        <w:rPr>
+          <w:lang w:val="de-AT"/>
+        </w:rPr>
+        <w:noBreakHyphen/>
+        <w:t>Code handelt.</w:t>
+      </w:r>
+    </w:p>
+    <w:p>
+      <w:pPr>
+        <w:pStyle w:val="Text"/>
+        <w:rPr>
+          <w:lang w:val="de-AT"/>
+        </w:rPr>
+      </w:pPr>
+      <w:r>
+        <w:rPr>
+          <w:lang w:val="de-AT"/>
+        </w:rPr>
+        <w:t xml:space="preserve">Damit das Lesen zuverlässig </w:t>
+      </w:r>
+      <w:r>
+        <w:rPr>
+          <w:lang w:val="de-AT"/>
+        </w:rPr>
+        <w:t>funktioniert</w:t>
+      </w:r>
+      <w:r>
+        <w:rPr>
+          <w:lang w:val="de-AT"/>
+        </w:rPr>
+        <w:t>, ist </w:t>
+      </w:r>
+      <w:r>
+        <w:rPr>
+          <w:bCs/>
+          <w:lang w:val="de-AT"/>
+        </w:rPr>
+        <w:t>gutes Licht</w:t>
+      </w:r>
+      <w:r>
+        <w:rPr>
+          <w:lang w:val="de-AT"/>
+        </w:rPr>
+        <w:t> wichtig. Im praktischen Aufbau werden wir daher eine LED</w:t>
+      </w:r>
+      <w:r>
+        <w:rPr>
+          <w:lang w:val="de-AT"/>
+        </w:rPr>
+        <w:noBreakHyphen/>
+        <w:t>Beleuchtung um die Kamera anbringen, damit der Code immer gut ausgeleuchtet ist.</w:t>
+      </w:r>
+    </w:p>
+    <w:p>
+      <w:pPr>
+        <w:pStyle w:val="Text"/>
+        <w:rPr>
+          <w:lang w:val="de-AT"/>
+        </w:rPr>
+      </w:pPr>
+    </w:p>
+    <w:p>
+      <w:pPr>
+        <w:pStyle w:val="Text"/>
+        <w:rPr>
+          <w:lang w:val="de-AT"/>
+        </w:rPr>
+      </w:pPr>
+    </w:p>
+    <w:p>
+      <w:pPr>
+        <w:pStyle w:val="Text"/>
+        <w:rPr>
+          <w:lang w:val="de-AT"/>
+        </w:rPr>
+      </w:pPr>
+      <w:commentRangeStart w:id="53"/>
+      <w:r>
+        <w:rPr>
+          <w:b/>
+          <w:bCs/>
+          <w:lang w:val="de-AT"/>
+        </w:rPr>
+        <w:t>Ablauf in der Software:</w:t>
+      </w:r>
+      <w:commentRangeEnd w:id="53"/>
+      <w:r>
+        <w:rPr>
+          <w:rStyle w:val="Kommentarzeichen"/>
+        </w:rPr>
+        <w:commentReference w:id="53"/>
+      </w:r>
+    </w:p>
+    <w:p>
+      <w:pPr>
+        <w:pStyle w:val="Text"/>
+        <w:numPr>
+          <w:ilvl w:val="0"/>
+          <w:numId w:val="32"/>
+        </w:numPr>
+        <w:rPr>
+          <w:lang w:val="de-AT"/>
+        </w:rPr>
+      </w:pPr>
+      <w:r>
+        <w:rPr>
+          <w:lang w:val="de-AT"/>
+        </w:rPr>
+        <w:t>Kamerabild aufnehmen.</w:t>
+      </w:r>
+    </w:p>
+    <w:p>
+      <w:pPr>
+        <w:pStyle w:val="Text"/>
+        <w:numPr>
+          <w:ilvl w:val="0"/>
+          <w:numId w:val="32"/>
+        </w:numPr>
+        <w:rPr>
+          <w:lang w:val="de-AT"/>
+        </w:rPr>
+      </w:pPr>
+      <w:r>
+        <w:rPr>
+          <w:lang w:val="de-AT"/>
+        </w:rPr>
+        <w:t>Mit YOLO die Positionen aller Codes ermitteln.</w:t>
+      </w:r>
+    </w:p>
+    <w:p>
+      <w:pPr>
+        <w:pStyle w:val="Text"/>
+        <w:numPr>
+          <w:ilvl w:val="0"/>
+          <w:numId w:val="32"/>
+        </w:numPr>
+        <w:rPr>
+          <w:lang w:val="de-AT"/>
+        </w:rPr>
+      </w:pPr>
+      <w:r>
+        <w:rPr>
+          <w:lang w:val="de-AT"/>
+        </w:rPr>
+        <w:t>Für jede gefundene Position: Bildausschnitt extrahieren, in Graustufen umwandeln, mit pyzbar decodieren.</w:t>
+      </w:r>
+    </w:p>
+    <w:p>
+      <w:pPr>
+        <w:pStyle w:val="Text"/>
+        <w:numPr>
+          <w:ilvl w:val="1"/>
+          <w:numId w:val="32"/>
+        </w:numPr>
+        <w:rPr>
+          <w:lang w:val="de-AT"/>
+        </w:rPr>
+      </w:pPr>
+      <w:r>
+        <w:rPr>
+          <w:lang w:val="de-AT"/>
+        </w:rPr>
+        <w:t>Falls YOLO nichts findet, probieren wir als Notlösung, pyzbar auf dem gesamten Bild laufen zu lassen.</w:t>
+      </w:r>
+    </w:p>
+    <w:p>
+      <w:pPr>
+        <w:jc w:val="left"/>
+        <w:rPr>
+          <w:lang w:val="de-AT"/>
+        </w:rPr>
+      </w:pPr>
+      <w:r>
+        <w:rPr>
+          <w:lang w:val="de-AT"/>
+        </w:rPr>
+        <w:br w:type="page"/>
+      </w:r>
+    </w:p>
+    <w:p>
+      <w:pPr>
         <w:pStyle w:val="berschrift3"/>
         <w:rPr>
           <w:lang w:val="de-AT"/>
         </w:rPr>
       </w:pPr>
-      <w:bookmarkStart w:id="52" w:name="_Toc221613886"/>
-      <w:r>
-        <w:rPr>
-          <w:lang w:val="de-AT"/>
-        </w:rPr>
+      <w:bookmarkStart w:id="54" w:name="_Toc221613886"/>
+      <w:r>
+        <w:rPr>
+          <w:lang w:val="de-AT"/>
+        </w:rPr>
+        <w:lastRenderedPageBreak/>
         <w:t xml:space="preserve">Gewichtserfassung </w:t>
       </w:r>
       <w:r>
@@ -6920,7 +7723,7 @@
         </w:rPr>
         <w:t>- Systemübersicht</w:t>
       </w:r>
-      <w:bookmarkEnd w:id="52"/>
+      <w:bookmarkEnd w:id="54"/>
     </w:p>
     <w:p>
       <w:pPr>
@@ -6975,56 +7778,56 @@
         <w:rPr>
           <w:lang w:val="de-AT" w:eastAsia="de-AT"/>
         </w:rPr>
+        <w:t xml:space="preserve">Da Messsignale von Gewichtssensoren häufig durch Rauschen, Vibrationen oder </w:t>
+      </w:r>
+      <w:r>
+        <w:rPr>
+          <w:lang w:val="de-AT" w:eastAsia="de-AT"/>
+        </w:rPr>
+        <w:t>kurzzeitige Belastungsänderungen beeinflusst werden, kann softwareseitig ein Tiefpassfilter implementiert</w:t>
+      </w:r>
+      <w:r>
+        <w:rPr>
+          <w:lang w:val="de-AT" w:eastAsia="de-AT"/>
+        </w:rPr>
+        <w:t xml:space="preserve"> werden. Ein solcher Filter reduziert schnelle Signaländerungen und glättet den Messwertverlauf, wodurch eine stabilere und reproduzierbare Gewichtsanzeige erreicht wird.</w:t>
+      </w:r>
+    </w:p>
+    <w:p>
+      <w:pPr>
+        <w:pStyle w:val="Text"/>
+        <w:rPr>
+          <w:lang w:val="de-AT" w:eastAsia="de-AT"/>
+        </w:rPr>
+      </w:pPr>
+      <w:r>
+        <w:rPr>
+          <w:lang w:val="de-AT" w:eastAsia="de-AT"/>
+        </w:rPr>
+        <w:t>Die erreichbare Messgenauigkeit hängt dabei allgemein von mechanischen, sensorischen und kalibrierungstechnischen Einflussgrößen ab. Die detaillierte hardwareseitige Realisierung sowie deren praktische Auslegung werden in den entsprechenden projektbezogenen Kapiteln behandelt.</w:t>
+      </w:r>
+    </w:p>
+    <w:p>
+      <w:pPr>
+        <w:jc w:val="left"/>
+      </w:pPr>
+    </w:p>
+    <w:p>
+      <w:pPr>
+        <w:pStyle w:val="berschrift3"/>
+        <w:rPr>
+          <w:lang w:val="de-AT"/>
+        </w:rPr>
+      </w:pPr>
+      <w:bookmarkStart w:id="55" w:name="_Toc221613887"/>
+      <w:r>
+        <w:rPr>
+          <w:lang w:val="de-AT"/>
+        </w:rPr>
         <w:lastRenderedPageBreak/>
-        <w:t xml:space="preserve">Da Messsignale von Gewichtssensoren häufig durch Rauschen, Vibrationen oder </w:t>
-      </w:r>
-      <w:r>
-        <w:rPr>
-          <w:lang w:val="de-AT" w:eastAsia="de-AT"/>
-        </w:rPr>
-        <w:t>kurzzeitige Belastungsänderungen beeinflusst werden, kann softwareseitig ein Tiefpassfilter implementiert</w:t>
-      </w:r>
-      <w:r>
-        <w:rPr>
-          <w:lang w:val="de-AT" w:eastAsia="de-AT"/>
-        </w:rPr>
-        <w:t xml:space="preserve"> werden. Ein solcher Filter reduziert schnelle Signaländerungen und glättet den Messwertverlauf, wodurch eine stabilere und reproduzierbare Gewichtsanzeige erreicht wird.</w:t>
-      </w:r>
-    </w:p>
-    <w:p>
-      <w:pPr>
-        <w:pStyle w:val="Text"/>
-        <w:rPr>
-          <w:lang w:val="de-AT" w:eastAsia="de-AT"/>
-        </w:rPr>
-      </w:pPr>
-      <w:r>
-        <w:rPr>
-          <w:lang w:val="de-AT" w:eastAsia="de-AT"/>
-        </w:rPr>
-        <w:t>Die erreichbare Messgenauigkeit hängt dabei allgemein von mechanischen, sensorischen und kalibrierungstechnischen Einflussgrößen ab. Die detaillierte hardwareseitige Realisierung sowie deren praktische Auslegung werden in den entsprechenden projektbezogenen Kapiteln behandelt.</w:t>
-      </w:r>
-    </w:p>
-    <w:p>
-      <w:pPr>
-        <w:jc w:val="left"/>
-      </w:pPr>
-    </w:p>
-    <w:p>
-      <w:pPr>
-        <w:pStyle w:val="berschrift3"/>
-        <w:rPr>
-          <w:lang w:val="de-AT"/>
-        </w:rPr>
-      </w:pPr>
-      <w:bookmarkStart w:id="53" w:name="_Toc221613887"/>
-      <w:r>
-        <w:rPr>
-          <w:lang w:val="de-AT"/>
-        </w:rPr>
         <w:t>Systemintegration und Datenverarbeitung</w:t>
       </w:r>
-      <w:bookmarkEnd w:id="53"/>
+      <w:bookmarkEnd w:id="55"/>
     </w:p>
     <w:p>
       <w:pPr>
@@ -7375,12 +8178,12 @@
       <w:pPr>
         <w:pStyle w:val="berschrift3"/>
       </w:pPr>
-      <w:bookmarkStart w:id="54" w:name="_Toc221613888"/>
+      <w:bookmarkStart w:id="56" w:name="_Toc221613888"/>
       <w:r>
         <w:lastRenderedPageBreak/>
         <w:t>Verwendung von Literatur, Internetquellen und KI</w:t>
       </w:r>
-      <w:bookmarkEnd w:id="54"/>
+      <w:bookmarkEnd w:id="56"/>
     </w:p>
     <w:p>
       <w:pPr>
@@ -7418,14 +8221,14 @@
       <w:pPr>
         <w:pStyle w:val="berschrift3"/>
       </w:pPr>
-      <w:bookmarkStart w:id="55" w:name="_Toc221613889"/>
+      <w:bookmarkStart w:id="57" w:name="_Toc221613889"/>
       <w:r>
         <w:rPr>
           <w:color w:val="0066FF"/>
         </w:rPr>
         <w:t>Weitere Hinweise</w:t>
       </w:r>
-      <w:bookmarkEnd w:id="55"/>
+      <w:bookmarkEnd w:id="57"/>
       <w:r>
         <w:t xml:space="preserve"> </w:t>
       </w:r>
@@ -8036,12 +8839,12 @@
       <w:pPr>
         <w:pStyle w:val="berschrift2"/>
       </w:pPr>
-      <w:bookmarkStart w:id="56" w:name="_Toc221613890"/>
+      <w:bookmarkStart w:id="58" w:name="_Toc221613890"/>
       <w:r>
         <w:lastRenderedPageBreak/>
         <w:t>Praktische Umsetzung</w:t>
       </w:r>
-      <w:bookmarkEnd w:id="56"/>
+      <w:bookmarkEnd w:id="58"/>
     </w:p>
     <w:p>
       <w:r>
@@ -8055,11 +8858,11 @@
       <w:pPr>
         <w:pStyle w:val="berschrift2"/>
       </w:pPr>
-      <w:bookmarkStart w:id="57" w:name="_Toc221613891"/>
+      <w:bookmarkStart w:id="59" w:name="_Toc221613891"/>
       <w:r>
         <w:t>Weitere individuelle Abschnitte</w:t>
       </w:r>
-      <w:bookmarkEnd w:id="57"/>
+      <w:bookmarkEnd w:id="59"/>
       <w:r>
         <w:t xml:space="preserve"> </w:t>
       </w:r>
@@ -8090,11 +8893,11 @@
       <w:pPr>
         <w:pStyle w:val="berschrift2"/>
       </w:pPr>
-      <w:bookmarkStart w:id="58" w:name="_Toc221613892"/>
+      <w:bookmarkStart w:id="60" w:name="_Toc221613892"/>
       <w:r>
         <w:t>Ergebnisse und Diskussion</w:t>
       </w:r>
-      <w:bookmarkEnd w:id="58"/>
+      <w:bookmarkEnd w:id="60"/>
     </w:p>
     <w:p>
       <w:pPr>
@@ -8114,11 +8917,11 @@
       <w:pPr>
         <w:pStyle w:val="berschrift2"/>
       </w:pPr>
-      <w:bookmarkStart w:id="59" w:name="_Toc221613893"/>
+      <w:bookmarkStart w:id="61" w:name="_Toc221613893"/>
       <w:r>
         <w:t>Zusammenfassung individueller Teil</w:t>
       </w:r>
-      <w:bookmarkEnd w:id="59"/>
+      <w:bookmarkEnd w:id="61"/>
     </w:p>
     <w:p>
       <w:pPr>
@@ -8250,26 +9053,26 @@
       <w:pPr>
         <w:pStyle w:val="berschrift1"/>
       </w:pPr>
-      <w:bookmarkStart w:id="60" w:name="_Ref200468988"/>
-      <w:bookmarkStart w:id="61" w:name="_Ref200469530"/>
-      <w:bookmarkStart w:id="62" w:name="_Toc221613894"/>
+      <w:bookmarkStart w:id="62" w:name="_Ref200468988"/>
+      <w:bookmarkStart w:id="63" w:name="_Ref200469530"/>
+      <w:bookmarkStart w:id="64" w:name="_Toc221613894"/>
       <w:r>
         <w:lastRenderedPageBreak/>
         <w:t>Zusammenfassung und Ausblick</w:t>
       </w:r>
-      <w:bookmarkEnd w:id="60"/>
-      <w:bookmarkEnd w:id="61"/>
       <w:bookmarkEnd w:id="62"/>
+      <w:bookmarkEnd w:id="63"/>
+      <w:bookmarkEnd w:id="64"/>
     </w:p>
     <w:p>
       <w:pPr>
         <w:pStyle w:val="berschrift2"/>
       </w:pPr>
-      <w:bookmarkStart w:id="63" w:name="_Toc221613895"/>
+      <w:bookmarkStart w:id="65" w:name="_Toc221613895"/>
       <w:r>
         <w:t>Zusammenfassung der gesamten Arbeit</w:t>
       </w:r>
-      <w:bookmarkEnd w:id="63"/>
+      <w:bookmarkEnd w:id="65"/>
     </w:p>
     <w:p>
       <w:pPr>
@@ -8303,11 +9106,11 @@
       <w:pPr>
         <w:pStyle w:val="berschrift2"/>
       </w:pPr>
-      <w:bookmarkStart w:id="64" w:name="_Toc221613896"/>
+      <w:bookmarkStart w:id="66" w:name="_Toc221613896"/>
       <w:r>
         <w:t>Ausblick</w:t>
       </w:r>
-      <w:bookmarkEnd w:id="64"/>
+      <w:bookmarkEnd w:id="66"/>
     </w:p>
     <w:p>
       <w:pPr>
@@ -8450,14 +9253,14 @@
       <w:pPr>
         <w:pStyle w:val="berschrift1"/>
       </w:pPr>
-      <w:bookmarkStart w:id="65" w:name="_Ref200468159"/>
-      <w:bookmarkStart w:id="66" w:name="_Toc221613897"/>
+      <w:bookmarkStart w:id="67" w:name="_Ref200468159"/>
+      <w:bookmarkStart w:id="68" w:name="_Toc221613897"/>
       <w:r>
         <w:lastRenderedPageBreak/>
         <w:t>Erklärung der Eigenständigkeit</w:t>
       </w:r>
-      <w:bookmarkEnd w:id="65"/>
-      <w:bookmarkEnd w:id="66"/>
+      <w:bookmarkEnd w:id="67"/>
+      <w:bookmarkEnd w:id="68"/>
     </w:p>
     <w:p>
       <w:pPr>
@@ -8615,36 +9418,34 @@
           <w:docGrid w:type="lines" w:linePitch="360"/>
         </w:sectPr>
       </w:pPr>
-      <w:bookmarkStart w:id="67" w:name="_Ref200469499"/>
-      <w:bookmarkStart w:id="68" w:name="_Toc221613898"/>
+      <w:bookmarkStart w:id="69" w:name="_Ref200469499"/>
+      <w:bookmarkStart w:id="70" w:name="_Toc221613898"/>
       <w:r>
         <w:lastRenderedPageBreak/>
         <w:t>Arbeitsnachweise</w:t>
       </w:r>
-      <w:bookmarkEnd w:id="67"/>
-      <w:bookmarkEnd w:id="68"/>
+      <w:bookmarkEnd w:id="69"/>
+      <w:bookmarkEnd w:id="70"/>
     </w:p>
     <w:p>
       <w:pPr>
         <w:pStyle w:val="berschrift1"/>
       </w:pPr>
-      <w:bookmarkStart w:id="69" w:name="_Toc84751256"/>
-      <w:bookmarkStart w:id="70" w:name="_Toc211138167"/>
-      <w:bookmarkStart w:id="71" w:name="_Toc211137922"/>
-      <w:bookmarkStart w:id="72" w:name="_Toc84757221"/>
-      <w:bookmarkStart w:id="73" w:name="_Toc210560305"/>
-      <w:bookmarkStart w:id="74" w:name="_Toc210560252"/>
-      <w:bookmarkStart w:id="75" w:name="_Ref210560064"/>
-      <w:bookmarkStart w:id="76" w:name="_Toc84751368"/>
-      <w:bookmarkStart w:id="77" w:name="_Ref200467937"/>
-      <w:bookmarkStart w:id="78" w:name="_Ref200469033"/>
-      <w:bookmarkStart w:id="79" w:name="_Toc221613899"/>
+      <w:bookmarkStart w:id="71" w:name="_Toc84751256"/>
+      <w:bookmarkStart w:id="72" w:name="_Toc211138167"/>
+      <w:bookmarkStart w:id="73" w:name="_Toc211137922"/>
+      <w:bookmarkStart w:id="74" w:name="_Toc84757221"/>
+      <w:bookmarkStart w:id="75" w:name="_Toc210560305"/>
+      <w:bookmarkStart w:id="76" w:name="_Toc210560252"/>
+      <w:bookmarkStart w:id="77" w:name="_Ref210560064"/>
+      <w:bookmarkStart w:id="78" w:name="_Toc84751368"/>
+      <w:bookmarkStart w:id="79" w:name="_Ref200467937"/>
+      <w:bookmarkStart w:id="80" w:name="_Ref200469033"/>
+      <w:bookmarkStart w:id="81" w:name="_Toc221613899"/>
       <w:r>
         <w:lastRenderedPageBreak/>
         <w:t>Verzeichnisse</w:t>
       </w:r>
-      <w:bookmarkEnd w:id="69"/>
-      <w:bookmarkEnd w:id="70"/>
       <w:bookmarkEnd w:id="71"/>
       <w:bookmarkEnd w:id="72"/>
       <w:bookmarkEnd w:id="73"/>
@@ -8654,36 +9455,38 @@
       <w:bookmarkEnd w:id="77"/>
       <w:bookmarkEnd w:id="78"/>
       <w:bookmarkEnd w:id="79"/>
-      <w:r>
-        <w:t xml:space="preserve"> </w:t>
-      </w:r>
-    </w:p>
-    <w:p>
-      <w:pPr>
-        <w:pStyle w:val="berschrift2"/>
-      </w:pPr>
-      <w:bookmarkStart w:id="80" w:name="_Toc210560306"/>
-      <w:bookmarkStart w:id="81" w:name="_Toc211138168"/>
-      <w:bookmarkStart w:id="82" w:name="_Toc84757222"/>
-      <w:bookmarkStart w:id="83" w:name="_Toc84751369"/>
-      <w:bookmarkStart w:id="84" w:name="_Toc84751257"/>
-      <w:bookmarkStart w:id="85" w:name="_Toc210560253"/>
-      <w:bookmarkStart w:id="86" w:name="_Toc211137923"/>
-      <w:bookmarkStart w:id="87" w:name="_Toc221613900"/>
-      <w:r>
-        <w:t>Literatur</w:t>
-      </w:r>
       <w:bookmarkEnd w:id="80"/>
       <w:bookmarkEnd w:id="81"/>
+      <w:r>
+        <w:t xml:space="preserve"> </w:t>
+      </w:r>
+    </w:p>
+    <w:p>
+      <w:pPr>
+        <w:pStyle w:val="berschrift2"/>
+      </w:pPr>
+      <w:bookmarkStart w:id="82" w:name="_Toc210560306"/>
+      <w:bookmarkStart w:id="83" w:name="_Toc211138168"/>
+      <w:bookmarkStart w:id="84" w:name="_Toc84757222"/>
+      <w:bookmarkStart w:id="85" w:name="_Toc84751369"/>
+      <w:bookmarkStart w:id="86" w:name="_Toc84751257"/>
+      <w:bookmarkStart w:id="87" w:name="_Toc210560253"/>
+      <w:bookmarkStart w:id="88" w:name="_Toc211137923"/>
+      <w:bookmarkStart w:id="89" w:name="_Toc221613900"/>
+      <w:r>
+        <w:t>Literatur</w:t>
+      </w:r>
       <w:bookmarkEnd w:id="82"/>
       <w:bookmarkEnd w:id="83"/>
       <w:bookmarkEnd w:id="84"/>
       <w:bookmarkEnd w:id="85"/>
       <w:bookmarkEnd w:id="86"/>
+      <w:bookmarkEnd w:id="87"/>
+      <w:bookmarkEnd w:id="88"/>
       <w:r>
         <w:t>verzeichnis</w:t>
       </w:r>
-      <w:bookmarkEnd w:id="87"/>
+      <w:bookmarkEnd w:id="89"/>
       <w:r>
         <w:t xml:space="preserve"> </w:t>
       </w:r>
@@ -8705,104 +9508,104 @@
       <w:pPr>
         <w:pStyle w:val="berschrift2"/>
       </w:pPr>
-      <w:bookmarkStart w:id="88" w:name="_Toc84757225"/>
-      <w:bookmarkStart w:id="89" w:name="_Toc211138171"/>
-      <w:bookmarkStart w:id="90" w:name="_Toc211137927"/>
-      <w:bookmarkStart w:id="91" w:name="_Toc84751260"/>
-      <w:bookmarkStart w:id="92" w:name="_Toc210560307"/>
-      <w:bookmarkStart w:id="93" w:name="_Toc210560254"/>
-      <w:bookmarkStart w:id="94" w:name="_Toc84751372"/>
-      <w:bookmarkStart w:id="95" w:name="_Toc221613901"/>
+      <w:bookmarkStart w:id="90" w:name="_Toc84757225"/>
+      <w:bookmarkStart w:id="91" w:name="_Toc211138171"/>
+      <w:bookmarkStart w:id="92" w:name="_Toc211137927"/>
+      <w:bookmarkStart w:id="93" w:name="_Toc84751260"/>
+      <w:bookmarkStart w:id="94" w:name="_Toc210560307"/>
+      <w:bookmarkStart w:id="95" w:name="_Toc210560254"/>
+      <w:bookmarkStart w:id="96" w:name="_Toc84751372"/>
+      <w:bookmarkStart w:id="97" w:name="_Toc221613901"/>
       <w:r>
         <w:t>Abkürzungsverzeichnis</w:t>
       </w:r>
-      <w:bookmarkEnd w:id="88"/>
-      <w:bookmarkEnd w:id="89"/>
       <w:bookmarkEnd w:id="90"/>
       <w:bookmarkEnd w:id="91"/>
       <w:bookmarkEnd w:id="92"/>
       <w:bookmarkEnd w:id="93"/>
       <w:bookmarkEnd w:id="94"/>
       <w:bookmarkEnd w:id="95"/>
-    </w:p>
-    <w:p>
-      <w:pPr>
-        <w:pStyle w:val="Text"/>
-        <w:rPr>
-          <w:color w:val="0066FF"/>
-        </w:rPr>
-      </w:pPr>
-      <w:r>
-        <w:rPr>
-          <w:color w:val="0066FF"/>
-        </w:rPr>
-        <w:t>(FV Text)</w:t>
-      </w:r>
-      <w:bookmarkStart w:id="96" w:name="_Toc211138172"/>
-      <w:bookmarkStart w:id="97" w:name="_Toc211137928"/>
-      <w:bookmarkStart w:id="98" w:name="_Toc84757226"/>
-      <w:bookmarkStart w:id="99" w:name="_Toc84751373"/>
-      <w:bookmarkStart w:id="100" w:name="_Toc84751261"/>
-      <w:bookmarkStart w:id="101" w:name="_Toc210560308"/>
-      <w:bookmarkStart w:id="102" w:name="_Toc210560255"/>
-      <w:r>
-        <w:rPr>
-          <w:color w:val="0066FF"/>
-        </w:rPr>
-        <w:t xml:space="preserve"> Optionaler Abschnitt. Nur verwenden, wenn mehr als 10 verschiedene Abkürzungen im gesamten Dokument vorkommen.</w:t>
-      </w:r>
-    </w:p>
-    <w:p>
-      <w:pPr>
-        <w:pStyle w:val="berschrift2"/>
-      </w:pPr>
-      <w:bookmarkStart w:id="103" w:name="_Toc221613902"/>
-      <w:r>
-        <w:t>Tabellen</w:t>
-      </w:r>
       <w:bookmarkEnd w:id="96"/>
       <w:bookmarkEnd w:id="97"/>
+    </w:p>
+    <w:p>
+      <w:pPr>
+        <w:pStyle w:val="Text"/>
+        <w:rPr>
+          <w:color w:val="0066FF"/>
+        </w:rPr>
+      </w:pPr>
+      <w:r>
+        <w:rPr>
+          <w:color w:val="0066FF"/>
+        </w:rPr>
+        <w:t>(FV Text)</w:t>
+      </w:r>
+      <w:bookmarkStart w:id="98" w:name="_Toc211138172"/>
+      <w:bookmarkStart w:id="99" w:name="_Toc211137928"/>
+      <w:bookmarkStart w:id="100" w:name="_Toc84757226"/>
+      <w:bookmarkStart w:id="101" w:name="_Toc84751373"/>
+      <w:bookmarkStart w:id="102" w:name="_Toc84751261"/>
+      <w:bookmarkStart w:id="103" w:name="_Toc210560308"/>
+      <w:bookmarkStart w:id="104" w:name="_Toc210560255"/>
+      <w:r>
+        <w:rPr>
+          <w:color w:val="0066FF"/>
+        </w:rPr>
+        <w:t xml:space="preserve"> Optionaler Abschnitt. Nur verwenden, wenn mehr als 10 verschiedene Abkürzungen im gesamten Dokument vorkommen.</w:t>
+      </w:r>
+    </w:p>
+    <w:p>
+      <w:pPr>
+        <w:pStyle w:val="berschrift2"/>
+      </w:pPr>
+      <w:bookmarkStart w:id="105" w:name="_Toc221613902"/>
+      <w:r>
+        <w:t>Tabellen</w:t>
+      </w:r>
       <w:bookmarkEnd w:id="98"/>
       <w:bookmarkEnd w:id="99"/>
       <w:bookmarkEnd w:id="100"/>
       <w:bookmarkEnd w:id="101"/>
       <w:bookmarkEnd w:id="102"/>
       <w:bookmarkEnd w:id="103"/>
-    </w:p>
-    <w:p>
-      <w:r>
-        <w:rPr>
-          <w:color w:val="0066FF"/>
-        </w:rPr>
-        <w:t>(FV Text) Optionaler Abschnitt. Nur verwenden, wenn mehr als 10 verschiedene Tabellen im gesamten Dokument vorkommen.</w:t>
-      </w:r>
-    </w:p>
-    <w:p>
-      <w:pPr>
-        <w:pStyle w:val="berschrift2"/>
-      </w:pPr>
-      <w:bookmarkStart w:id="104" w:name="_Toc210560256"/>
-      <w:bookmarkStart w:id="105" w:name="_Toc210560309"/>
-      <w:bookmarkStart w:id="106" w:name="_Toc211137929"/>
-      <w:bookmarkStart w:id="107" w:name="_Toc84757227"/>
-      <w:bookmarkStart w:id="108" w:name="_Toc84751374"/>
-      <w:bookmarkStart w:id="109" w:name="_Toc84751262"/>
-      <w:bookmarkStart w:id="110" w:name="_Toc211138173"/>
-      <w:bookmarkStart w:id="111" w:name="_Toc221613903"/>
-      <w:r>
-        <w:t>Abbildunge</w:t>
-      </w:r>
       <w:bookmarkEnd w:id="104"/>
       <w:bookmarkEnd w:id="105"/>
-      <w:r>
-        <w:t>n</w:t>
+    </w:p>
+    <w:p>
+      <w:r>
+        <w:rPr>
+          <w:color w:val="0066FF"/>
+        </w:rPr>
+        <w:t>(FV Text) Optionaler Abschnitt. Nur verwenden, wenn mehr als 10 verschiedene Tabellen im gesamten Dokument vorkommen.</w:t>
+      </w:r>
+    </w:p>
+    <w:p>
+      <w:pPr>
+        <w:pStyle w:val="berschrift2"/>
+      </w:pPr>
+      <w:bookmarkStart w:id="106" w:name="_Toc210560256"/>
+      <w:bookmarkStart w:id="107" w:name="_Toc210560309"/>
+      <w:bookmarkStart w:id="108" w:name="_Toc211137929"/>
+      <w:bookmarkStart w:id="109" w:name="_Toc84757227"/>
+      <w:bookmarkStart w:id="110" w:name="_Toc84751374"/>
+      <w:bookmarkStart w:id="111" w:name="_Toc84751262"/>
+      <w:bookmarkStart w:id="112" w:name="_Toc211138173"/>
+      <w:bookmarkStart w:id="113" w:name="_Toc221613903"/>
+      <w:r>
+        <w:t>Abbildunge</w:t>
       </w:r>
       <w:bookmarkEnd w:id="106"/>
       <w:bookmarkEnd w:id="107"/>
+      <w:r>
+        <w:t>n</w:t>
+      </w:r>
       <w:bookmarkEnd w:id="108"/>
       <w:bookmarkEnd w:id="109"/>
       <w:bookmarkEnd w:id="110"/>
       <w:bookmarkEnd w:id="111"/>
+      <w:bookmarkEnd w:id="112"/>
+      <w:bookmarkEnd w:id="113"/>
     </w:p>
     <w:p>
       <w:pPr>
@@ -8839,37 +9642,37 @@
       <w:pPr>
         <w:pStyle w:val="berschrift1"/>
       </w:pPr>
-      <w:bookmarkStart w:id="112" w:name="_Toc211138174"/>
-      <w:bookmarkStart w:id="113" w:name="_Toc211137930"/>
-      <w:bookmarkStart w:id="114" w:name="_Toc84751375"/>
-      <w:bookmarkStart w:id="115" w:name="_Toc84751263"/>
-      <w:bookmarkStart w:id="116" w:name="_Ref84675439"/>
-      <w:bookmarkStart w:id="117" w:name="_Toc221613904"/>
+      <w:bookmarkStart w:id="114" w:name="_Toc211138174"/>
+      <w:bookmarkStart w:id="115" w:name="_Toc211137930"/>
+      <w:bookmarkStart w:id="116" w:name="_Toc84751375"/>
+      <w:bookmarkStart w:id="117" w:name="_Toc84751263"/>
+      <w:bookmarkStart w:id="118" w:name="_Ref84675439"/>
+      <w:bookmarkStart w:id="119" w:name="_Toc221613904"/>
       <w:r>
         <w:lastRenderedPageBreak/>
         <w:t>Anhang</w:t>
       </w:r>
-      <w:bookmarkEnd w:id="112"/>
-      <w:bookmarkEnd w:id="113"/>
       <w:bookmarkEnd w:id="114"/>
       <w:bookmarkEnd w:id="115"/>
       <w:bookmarkEnd w:id="116"/>
       <w:bookmarkEnd w:id="117"/>
-    </w:p>
-    <w:p>
-      <w:pPr>
-        <w:pStyle w:val="Text"/>
-      </w:pPr>
-      <w:bookmarkStart w:id="118" w:name="_Ref210468443"/>
-      <w:bookmarkStart w:id="119" w:name="_Ref210464602"/>
-      <w:r>
-        <w:rPr>
-          <w:color w:val="0066FF"/>
-        </w:rPr>
-        <w:t>(FV Text) Optionales Kapitel. Hier werden Datenblätter, große Zeichnungen, Skizzen, Bilder, etc. eingefügt, die im Fließtext der vorigen Kapitel nicht eingefügt werden, da sie dort die Übersichtlichkeit bzw. Struktur dieser Kapitel verschlechtern würden.</w:t>
-      </w:r>
       <w:bookmarkEnd w:id="118"/>
       <w:bookmarkEnd w:id="119"/>
+    </w:p>
+    <w:p>
+      <w:pPr>
+        <w:pStyle w:val="Text"/>
+      </w:pPr>
+      <w:bookmarkStart w:id="120" w:name="_Ref210468443"/>
+      <w:bookmarkStart w:id="121" w:name="_Ref210464602"/>
+      <w:r>
+        <w:rPr>
+          <w:color w:val="0066FF"/>
+        </w:rPr>
+        <w:t>(FV Text) Optionales Kapitel. Hier werden Datenblätter, große Zeichnungen, Skizzen, Bilder, etc. eingefügt, die im Fließtext der vorigen Kapitel nicht eingefügt werden, da sie dort die Übersichtlichkeit bzw. Struktur dieser Kapitel verschlechtern würden.</w:t>
+      </w:r>
+      <w:bookmarkEnd w:id="120"/>
+      <w:bookmarkEnd w:id="121"/>
     </w:p>
     <w:sectPr>
       <w:headerReference w:type="default" r:id="rId66"/>
@@ -8888,7 +9691,27 @@
 
 <file path=word/comments.xml><?xml version="1.0" encoding="utf-8"?>
 <w:comments xmlns:wpc="http://schemas.microsoft.com/office/word/2010/wordprocessingCanvas" xmlns:cx="http://schemas.microsoft.com/office/drawing/2014/chartex" xmlns:cx1="http://schemas.microsoft.com/office/drawing/2015/9/8/chartex" xmlns:cx2="http://schemas.microsoft.com/office/drawing/2015/10/21/chartex" xmlns:cx3="http://schemas.microsoft.com/office/drawing/2016/5/9/chartex" xmlns:cx4="http://schemas.microsoft.com/office/drawing/2016/5/10/chartex" xmlns:cx5="http://schemas.microsoft.com/office/drawing/2016/5/11/chartex" xmlns:cx6="http://schemas.microsoft.com/office/drawing/2016/5/12/chartex" xmlns:cx7="http://schemas.microsoft.com/office/drawing/2016/5/13/chartex" xmlns:cx8="http://schemas.microsoft.com/office/drawing/2016/5/14/chartex" xmlns:mc="http://schemas.openxmlformats.org/markup-compatibility/2006" xmlns:aink="http://schemas.microsoft.com/office/drawing/2016/ink" xmlns:am3d="http://schemas.microsoft.com/office/drawing/2017/model3d" xmlns:o="urn:schemas-microsoft-com:office:office" xmlns:oel="http://schemas.microsoft.com/office/2019/extlst" xmlns:r="http://schemas.openxmlformats.org/officeDocument/2006/relationships" xmlns:m="http://schemas.openxmlformats.org/officeDocument/2006/math" xmlns:v="urn:schemas-microsoft-com:vml" xmlns:wp14="http://schemas.microsoft.com/office/word/2010/wordprocessingDrawing" xmlns:wp="http://schemas.openxmlformats.org/drawingml/2006/wordprocessingDrawing" xmlns:w10="urn:schemas-microsoft-com:office:word" xmlns:w="http://schemas.openxmlformats.org/wordprocessingml/2006/main" xmlns:w14="http://schemas.microsoft.com/office/word/2010/wordml" xmlns:w15="http://schemas.microsoft.com/office/word/2012/wordml" xmlns:w16cex="http://schemas.microsoft.com/office/word/2018/wordml/cex" xmlns:w16cid="http://schemas.microsoft.com/office/word/2016/wordml/cid" xmlns:w16="http://schemas.microsoft.com/office/word/2018/wordml" xmlns:w16du="http://schemas.microsoft.com/office/word/2023/wordml/word16du" xmlns:w16sdtdh="http://schemas.microsoft.com/office/word/2020/wordml/sdtdatahash" xmlns:w16sdtfl="http://schemas.microsoft.com/office/word/2024/wordml/sdtformatlock" xmlns:w16se="http://schemas.microsoft.com/office/word/2015/wordml/symex" xmlns:wpg="http://schemas.microsoft.com/office/word/2010/wordprocessingGroup" xmlns:wpi="http://schemas.microsoft.com/office/word/2010/wordprocessingInk" xmlns:wne="http://schemas.microsoft.com/office/word/2006/wordml" xmlns:wps="http://schemas.microsoft.com/office/word/2010/wordprocessingShape" mc:Ignorable="w14 w15 w16se w16cid w16 w16cex w16sdtdh w16sdtfl w16du wp14">
-  <w:comment w:id="48" w:author="GRANEGGER Felix, SchülerIn" w:date="2026-02-07T10:10:00Z" w:initials="FG">
+  <w:comment w:id="48" w:author="GRANEGGER Felix, SchülerIn" w:date="2026-02-18T20:29:00Z" w:initials="FG">
+    <w:p>
+      <w:pPr>
+        <w:pStyle w:val="Kommentartext"/>
+        <w:jc w:val="left"/>
+      </w:pPr>
+      <w:r>
+        <w:rPr>
+          <w:rStyle w:val="Kommentarzeichen"/>
+        </w:rPr>
+        <w:annotationRef/>
+      </w:r>
+      <w:r>
+        <w:rPr>
+          <w:lang w:val="de-AT"/>
+        </w:rPr>
+        <w:t>Vielleicht unnötig</w:t>
+      </w:r>
+    </w:p>
+  </w:comment>
+  <w:comment w:id="49" w:author="GRANEGGER Felix, SchülerIn" w:date="2026-02-07T10:10:00Z" w:initials="FG">
     <w:p>
       <w:pPr>
         <w:pStyle w:val="Kommentartext"/>
@@ -8953,7 +9776,7 @@
       </w:hyperlink>
     </w:p>
   </w:comment>
-  <w:comment w:id="51" w:author="GRANEGGER Felix, SchülerIn" w:date="2026-02-07T10:01:00Z" w:initials="FG">
+  <w:comment w:id="52" w:author="GRANEGGER Felix, SchülerIn" w:date="2026-02-07T10:01:00Z" w:initials="FG">
     <w:p>
       <w:pPr>
         <w:pStyle w:val="Kommentartext"/>
@@ -8975,27 +9798,55 @@
       </w:hyperlink>
     </w:p>
   </w:comment>
+  <w:comment w:id="53" w:author="GRANEGGER Felix, SchülerIn" w:date="2026-02-18T20:44:00Z" w:initials="FG">
+    <w:p>
+      <w:pPr>
+        <w:pStyle w:val="Kommentartext"/>
+        <w:jc w:val="left"/>
+      </w:pPr>
+      <w:r>
+        <w:rPr>
+          <w:rStyle w:val="Kommentarzeichen"/>
+        </w:rPr>
+        <w:annotationRef/>
+      </w:r>
+      <w:r>
+        <w:rPr>
+          <w:b/>
+          <w:bCs/>
+          <w:lang w:val="de-AT"/>
+        </w:rPr>
+        <w:t>Barcodev02.py</w:t>
+      </w:r>
+    </w:p>
+  </w:comment>
 </w:comments>
 </file>
 
 <file path=word/commentsExtended.xml><?xml version="1.0" encoding="utf-8"?>
 <w15:commentsEx xmlns:wpc="http://schemas.microsoft.com/office/word/2010/wordprocessingCanvas" xmlns:cx="http://schemas.microsoft.com/office/drawing/2014/chartex" xmlns:cx1="http://schemas.microsoft.com/office/drawing/2015/9/8/chartex" xmlns:cx2="http://schemas.microsoft.com/office/drawing/2015/10/21/chartex" xmlns:cx3="http://schemas.microsoft.com/office/drawing/2016/5/9/chartex" xmlns:cx4="http://schemas.microsoft.com/office/drawing/2016/5/10/chartex" xmlns:cx5="http://schemas.microsoft.com/office/drawing/2016/5/11/chartex" xmlns:cx6="http://schemas.microsoft.com/office/drawing/2016/5/12/chartex" xmlns:cx7="http://schemas.microsoft.com/office/drawing/2016/5/13/chartex" xmlns:cx8="http://schemas.microsoft.com/office/drawing/2016/5/14/chartex" xmlns:mc="http://schemas.openxmlformats.org/markup-compatibility/2006" xmlns:aink="http://schemas.microsoft.com/office/drawing/2016/ink" xmlns:am3d="http://schemas.microsoft.com/office/drawing/2017/model3d" xmlns:o="urn:schemas-microsoft-com:office:office" xmlns:oel="http://schemas.microsoft.com/office/2019/extlst" xmlns:r="http://schemas.openxmlformats.org/officeDocument/2006/relationships" xmlns:m="http://schemas.openxmlformats.org/officeDocument/2006/math" xmlns:v="urn:schemas-microsoft-com:vml" xmlns:wp14="http://schemas.microsoft.com/office/word/2010/wordprocessingDrawing" xmlns:wp="http://schemas.openxmlformats.org/drawingml/2006/wordprocessingDrawing" xmlns:w10="urn:schemas-microsoft-com:office:word" xmlns:w="http://schemas.openxmlformats.org/wordprocessingml/2006/main" xmlns:w14="http://schemas.microsoft.com/office/word/2010/wordml" xmlns:w15="http://schemas.microsoft.com/office/word/2012/wordml" xmlns:w16cex="http://schemas.microsoft.com/office/word/2018/wordml/cex" xmlns:w16cid="http://schemas.microsoft.com/office/word/2016/wordml/cid" xmlns:w16="http://schemas.microsoft.com/office/word/2018/wordml" xmlns:w16du="http://schemas.microsoft.com/office/word/2023/wordml/word16du" xmlns:w16sdtdh="http://schemas.microsoft.com/office/word/2020/wordml/sdtdatahash" xmlns:w16sdtfl="http://schemas.microsoft.com/office/word/2024/wordml/sdtformatlock" xmlns:w16se="http://schemas.microsoft.com/office/word/2015/wordml/symex" xmlns:wpg="http://schemas.microsoft.com/office/word/2010/wordprocessingGroup" xmlns:wpi="http://schemas.microsoft.com/office/word/2010/wordprocessingInk" xmlns:wne="http://schemas.microsoft.com/office/word/2006/wordml" xmlns:wps="http://schemas.microsoft.com/office/word/2010/wordprocessingShape" mc:Ignorable="w14 w15 w16se w16cid w16 w16cex w16sdtdh w16sdtfl w16du wp14">
-  <w15:commentEx w15:paraId="6A749A05" w15:done="0"/>
-  <w15:commentEx w15:paraId="3A33789D" w15:done="0"/>
+  <w15:commentEx w15:paraId="27BE2ACC" w15:done="0"/>
+  <w15:commentEx w15:paraId="69C786DA" w15:done="0"/>
+  <w15:commentEx w15:paraId="4BEC553D" w15:done="0"/>
+  <w15:commentEx w15:paraId="063CF687" w15:done="0"/>
 </w15:commentsEx>
 </file>
 
 <file path=word/commentsExtensible.xml><?xml version="1.0" encoding="utf-8"?>
 <w16cex:commentsExtensible xmlns:wpc="http://schemas.microsoft.com/office/word/2010/wordprocessingCanvas" xmlns:cx="http://schemas.microsoft.com/office/drawing/2014/chartex" xmlns:cx1="http://schemas.microsoft.com/office/drawing/2015/9/8/chartex" xmlns:cx2="http://schemas.microsoft.com/office/drawing/2015/10/21/chartex" xmlns:cx3="http://schemas.microsoft.com/office/drawing/2016/5/9/chartex" xmlns:cx4="http://schemas.microsoft.com/office/drawing/2016/5/10/chartex" xmlns:cx5="http://schemas.microsoft.com/office/drawing/2016/5/11/chartex" xmlns:cx6="http://schemas.microsoft.com/office/drawing/2016/5/12/chartex" xmlns:cx7="http://schemas.microsoft.com/office/drawing/2016/5/13/chartex" xmlns:cx8="http://schemas.microsoft.com/office/drawing/2016/5/14/chartex" xmlns:cr="http://schemas.microsoft.com/office/comments/2020/reactions" xmlns:mc="http://schemas.openxmlformats.org/markup-compatibility/2006" xmlns:aink="http://schemas.microsoft.com/office/drawing/2016/ink" xmlns:am3d="http://schemas.microsoft.com/office/drawing/2017/model3d" xmlns:o="urn:schemas-microsoft-com:office:office" xmlns:oel="http://schemas.microsoft.com/office/2019/extlst" xmlns:r="http://schemas.openxmlformats.org/officeDocument/2006/relationships" xmlns:m="http://schemas.openxmlformats.org/officeDocument/2006/math" xmlns:v="urn:schemas-microsoft-com:vml" xmlns:wp14="http://schemas.microsoft.com/office/word/2010/wordprocessingDrawing" xmlns:wp="http://schemas.openxmlformats.org/drawingml/2006/wordprocessingDrawing" xmlns:w10="urn:schemas-microsoft-com:office:word" xmlns:w="http://schemas.openxmlformats.org/wordprocessingml/2006/main" xmlns:w14="http://schemas.microsoft.com/office/word/2010/wordml" xmlns:w15="http://schemas.microsoft.com/office/word/2012/wordml" xmlns:w16cex="http://schemas.microsoft.com/office/word/2018/wordml/cex" xmlns:w16cid="http://schemas.microsoft.com/office/word/2016/wordml/cid" xmlns:w16="http://schemas.microsoft.com/office/word/2018/wordml" xmlns:w16du="http://schemas.microsoft.com/office/word/2023/wordml/word16du" xmlns:w16sdtdh="http://schemas.microsoft.com/office/word/2020/wordml/sdtdatahash" xmlns:w16sdtfl="http://schemas.microsoft.com/office/word/2024/wordml/sdtformatlock" xmlns:w16se="http://schemas.microsoft.com/office/word/2015/wordml/symex" xmlns:wpg="http://schemas.microsoft.com/office/word/2010/wordprocessingGroup" xmlns:wpi="http://schemas.microsoft.com/office/word/2010/wordprocessingInk" xmlns:wne="http://schemas.microsoft.com/office/word/2006/wordml" xmlns:wps="http://schemas.microsoft.com/office/word/2010/wordprocessingShape" mc:Ignorable="w14 w15 w16se w16cid w16 w16cex w16sdtdh w16sdtfl cr w16du wp14">
+  <w16cex:commentExtensible w16cex:durableId="522987CD" w16cex:dateUtc="2026-02-18T19:29:00Z"/>
   <w16cex:commentExtensible w16cex:durableId="693A552F" w16cex:dateUtc="2026-02-07T09:10:00Z"/>
   <w16cex:commentExtensible w16cex:durableId="3487A857" w16cex:dateUtc="2026-02-07T09:01:00Z"/>
+  <w16cex:commentExtensible w16cex:durableId="0B36FA17" w16cex:dateUtc="2026-02-18T19:44:00Z"/>
 </w16cex:commentsExtensible>
 </file>
 
 <file path=word/commentsIds.xml><?xml version="1.0" encoding="utf-8"?>
 <w16cid:commentsIds xmlns:wpc="http://schemas.microsoft.com/office/word/2010/wordprocessingCanvas" xmlns:cx="http://schemas.microsoft.com/office/drawing/2014/chartex" xmlns:cx1="http://schemas.microsoft.com/office/drawing/2015/9/8/chartex" xmlns:cx2="http://schemas.microsoft.com/office/drawing/2015/10/21/chartex" xmlns:cx3="http://schemas.microsoft.com/office/drawing/2016/5/9/chartex" xmlns:cx4="http://schemas.microsoft.com/office/drawing/2016/5/10/chartex" xmlns:cx5="http://schemas.microsoft.com/office/drawing/2016/5/11/chartex" xmlns:cx6="http://schemas.microsoft.com/office/drawing/2016/5/12/chartex" xmlns:cx7="http://schemas.microsoft.com/office/drawing/2016/5/13/chartex" xmlns:cx8="http://schemas.microsoft.com/office/drawing/2016/5/14/chartex" xmlns:mc="http://schemas.openxmlformats.org/markup-compatibility/2006" xmlns:aink="http://schemas.microsoft.com/office/drawing/2016/ink" xmlns:am3d="http://schemas.microsoft.com/office/drawing/2017/model3d" xmlns:o="urn:schemas-microsoft-com:office:office" xmlns:oel="http://schemas.microsoft.com/office/2019/extlst" xmlns:r="http://schemas.openxmlformats.org/officeDocument/2006/relationships" xmlns:m="http://schemas.openxmlformats.org/officeDocument/2006/math" xmlns:v="urn:schemas-microsoft-com:vml" xmlns:wp14="http://schemas.microsoft.com/office/word/2010/wordprocessingDrawing" xmlns:wp="http://schemas.openxmlformats.org/drawingml/2006/wordprocessingDrawing" xmlns:w10="urn:schemas-microsoft-com:office:word" xmlns:w="http://schemas.openxmlformats.org/wordprocessingml/2006/main" xmlns:w14="http://schemas.microsoft.com/office/word/2010/wordml" xmlns:w15="http://schemas.microsoft.com/office/word/2012/wordml" xmlns:w16cex="http://schemas.microsoft.com/office/word/2018/wordml/cex" xmlns:w16cid="http://schemas.microsoft.com/office/word/2016/wordml/cid" xmlns:w16="http://schemas.microsoft.com/office/word/2018/wordml" xmlns:w16du="http://schemas.microsoft.com/office/word/2023/wordml/word16du" xmlns:w16sdtdh="http://schemas.microsoft.com/office/word/2020/wordml/sdtdatahash" xmlns:w16sdtfl="http://schemas.microsoft.com/office/word/2024/wordml/sdtformatlock" xmlns:w16se="http://schemas.microsoft.com/office/word/2015/wordml/symex" xmlns:wpg="http://schemas.microsoft.com/office/word/2010/wordprocessingGroup" xmlns:wpi="http://schemas.microsoft.com/office/word/2010/wordprocessingInk" xmlns:wne="http://schemas.microsoft.com/office/word/2006/wordml" xmlns:wps="http://schemas.microsoft.com/office/word/2010/wordprocessingShape" mc:Ignorable="w14 w15 w16se w16cid w16 w16cex w16sdtdh w16sdtfl w16du wp14">
-  <w16cid:commentId w16cid:paraId="6A749A05" w16cid:durableId="693A552F"/>
-  <w16cid:commentId w16cid:paraId="3A33789D" w16cid:durableId="3487A857"/>
+  <w16cid:commentId w16cid:paraId="27BE2ACC" w16cid:durableId="522987CD"/>
+  <w16cid:commentId w16cid:paraId="69C786DA" w16cid:durableId="693A552F"/>
+  <w16cid:commentId w16cid:paraId="4BEC553D" w16cid:durableId="3487A857"/>
+  <w16cid:commentId w16cid:paraId="063CF687" w16cid:durableId="0B36FA17"/>
 </w16cid:commentsIds>
 </file>
 
@@ -10757,6 +11608,122 @@
     </w:lvl>
   </w:abstractNum>
   <w:abstractNum w:abstractNumId="4" w15:restartNumberingAfterBreak="0">
+    <w:nsid w:val="1F5B0C4D"/>
+    <w:multiLevelType w:val="multilevel"/>
+    <w:tmpl w:val="46406A3E"/>
+    <w:lvl w:ilvl="0">
+      <w:start w:val="1"/>
+      <w:numFmt w:val="bullet"/>
+      <w:lvlText w:val=""/>
+      <w:lvlJc w:val="left"/>
+      <w:pPr>
+        <w:tabs>
+          <w:tab w:val="num" w:pos="360"/>
+        </w:tabs>
+        <w:ind w:left="360" w:hanging="360"/>
+      </w:pPr>
+      <w:rPr>
+        <w:rFonts w:ascii="Symbol" w:hAnsi="Symbol" w:hint="default"/>
+      </w:rPr>
+    </w:lvl>
+    <w:lvl w:ilvl="1">
+      <w:start w:val="1"/>
+      <w:numFmt w:val="bullet"/>
+      <w:lvlText w:val="o"/>
+      <w:lvlJc w:val="left"/>
+      <w:pPr>
+        <w:ind w:left="360" w:hanging="360"/>
+      </w:pPr>
+      <w:rPr>
+        <w:rFonts w:ascii="Courier New" w:hAnsi="Courier New" w:cs="Courier New" w:hint="default"/>
+      </w:rPr>
+    </w:lvl>
+    <w:lvl w:ilvl="2" w:tentative="1">
+      <w:start w:val="1"/>
+      <w:numFmt w:val="decimal"/>
+      <w:lvlText w:val="%3."/>
+      <w:lvlJc w:val="left"/>
+      <w:pPr>
+        <w:tabs>
+          <w:tab w:val="num" w:pos="1800"/>
+        </w:tabs>
+        <w:ind w:left="1800" w:hanging="360"/>
+      </w:pPr>
+    </w:lvl>
+    <w:lvl w:ilvl="3" w:tentative="1">
+      <w:start w:val="1"/>
+      <w:numFmt w:val="decimal"/>
+      <w:lvlText w:val="%4."/>
+      <w:lvlJc w:val="left"/>
+      <w:pPr>
+        <w:tabs>
+          <w:tab w:val="num" w:pos="2520"/>
+        </w:tabs>
+        <w:ind w:left="2520" w:hanging="360"/>
+      </w:pPr>
+    </w:lvl>
+    <w:lvl w:ilvl="4" w:tentative="1">
+      <w:start w:val="1"/>
+      <w:numFmt w:val="decimal"/>
+      <w:lvlText w:val="%5."/>
+      <w:lvlJc w:val="left"/>
+      <w:pPr>
+        <w:tabs>
+          <w:tab w:val="num" w:pos="3240"/>
+        </w:tabs>
+        <w:ind w:left="3240" w:hanging="360"/>
+      </w:pPr>
+    </w:lvl>
+    <w:lvl w:ilvl="5" w:tentative="1">
+      <w:start w:val="1"/>
+      <w:numFmt w:val="decimal"/>
+      <w:lvlText w:val="%6."/>
+      <w:lvlJc w:val="left"/>
+      <w:pPr>
+        <w:tabs>
+          <w:tab w:val="num" w:pos="3960"/>
+        </w:tabs>
+        <w:ind w:left="3960" w:hanging="360"/>
+      </w:pPr>
+    </w:lvl>
+    <w:lvl w:ilvl="6" w:tentative="1">
+      <w:start w:val="1"/>
+      <w:numFmt w:val="decimal"/>
+      <w:lvlText w:val="%7."/>
+      <w:lvlJc w:val="left"/>
+      <w:pPr>
+        <w:tabs>
+          <w:tab w:val="num" w:pos="4680"/>
+        </w:tabs>
+        <w:ind w:left="4680" w:hanging="360"/>
+      </w:pPr>
+    </w:lvl>
+    <w:lvl w:ilvl="7" w:tentative="1">
+      <w:start w:val="1"/>
+      <w:numFmt w:val="decimal"/>
+      <w:lvlText w:val="%8."/>
+      <w:lvlJc w:val="left"/>
+      <w:pPr>
+        <w:tabs>
+          <w:tab w:val="num" w:pos="5400"/>
+        </w:tabs>
+        <w:ind w:left="5400" w:hanging="360"/>
+      </w:pPr>
+    </w:lvl>
+    <w:lvl w:ilvl="8" w:tentative="1">
+      <w:start w:val="1"/>
+      <w:numFmt w:val="decimal"/>
+      <w:lvlText w:val="%9."/>
+      <w:lvlJc w:val="left"/>
+      <w:pPr>
+        <w:tabs>
+          <w:tab w:val="num" w:pos="6120"/>
+        </w:tabs>
+        <w:ind w:left="6120" w:hanging="360"/>
+      </w:pPr>
+    </w:lvl>
+  </w:abstractNum>
+  <w:abstractNum w:abstractNumId="5" w15:restartNumberingAfterBreak="0">
     <w:nsid w:val="1FB92E25"/>
     <w:multiLevelType w:val="multilevel"/>
     <w:tmpl w:val="EF925F62"/>
@@ -10870,7 +11837,7 @@
       </w:pPr>
     </w:lvl>
   </w:abstractNum>
-  <w:abstractNum w:abstractNumId="5" w15:restartNumberingAfterBreak="0">
+  <w:abstractNum w:abstractNumId="6" w15:restartNumberingAfterBreak="0">
     <w:nsid w:val="211F54D0"/>
     <w:multiLevelType w:val="multilevel"/>
     <w:tmpl w:val="FC50420A"/>
@@ -11010,7 +11977,7 @@
       </w:rPr>
     </w:lvl>
   </w:abstractNum>
-  <w:abstractNum w:abstractNumId="6" w15:restartNumberingAfterBreak="0">
+  <w:abstractNum w:abstractNumId="7" w15:restartNumberingAfterBreak="0">
     <w:nsid w:val="24C56478"/>
     <w:multiLevelType w:val="multilevel"/>
     <w:tmpl w:val="30327A96"/>
@@ -11124,7 +12091,382 @@
       </w:pPr>
     </w:lvl>
   </w:abstractNum>
-  <w:abstractNum w:abstractNumId="7" w15:restartNumberingAfterBreak="0">
+  <w:abstractNum w:abstractNumId="8" w15:restartNumberingAfterBreak="0">
+    <w:nsid w:val="25E87F22"/>
+    <w:multiLevelType w:val="hybridMultilevel"/>
+    <w:tmpl w:val="FE4AF340"/>
+    <w:lvl w:ilvl="0" w:tplc="0C070001">
+      <w:start w:val="1"/>
+      <w:numFmt w:val="bullet"/>
+      <w:lvlText w:val=""/>
+      <w:lvlJc w:val="left"/>
+      <w:pPr>
+        <w:ind w:left="360" w:hanging="360"/>
+      </w:pPr>
+      <w:rPr>
+        <w:rFonts w:ascii="Symbol" w:hAnsi="Symbol" w:hint="default"/>
+      </w:rPr>
+    </w:lvl>
+    <w:lvl w:ilvl="1" w:tplc="0C070003" w:tentative="1">
+      <w:start w:val="1"/>
+      <w:numFmt w:val="bullet"/>
+      <w:lvlText w:val="o"/>
+      <w:lvlJc w:val="left"/>
+      <w:pPr>
+        <w:ind w:left="1080" w:hanging="360"/>
+      </w:pPr>
+      <w:rPr>
+        <w:rFonts w:ascii="Courier New" w:hAnsi="Courier New" w:cs="Courier New" w:hint="default"/>
+      </w:rPr>
+    </w:lvl>
+    <w:lvl w:ilvl="2" w:tplc="0C070005" w:tentative="1">
+      <w:start w:val="1"/>
+      <w:numFmt w:val="bullet"/>
+      <w:lvlText w:val=""/>
+      <w:lvlJc w:val="left"/>
+      <w:pPr>
+        <w:ind w:left="1800" w:hanging="360"/>
+      </w:pPr>
+      <w:rPr>
+        <w:rFonts w:ascii="Wingdings" w:hAnsi="Wingdings" w:hint="default"/>
+      </w:rPr>
+    </w:lvl>
+    <w:lvl w:ilvl="3" w:tplc="0C070001" w:tentative="1">
+      <w:start w:val="1"/>
+      <w:numFmt w:val="bullet"/>
+      <w:lvlText w:val=""/>
+      <w:lvlJc w:val="left"/>
+      <w:pPr>
+        <w:ind w:left="2520" w:hanging="360"/>
+      </w:pPr>
+      <w:rPr>
+        <w:rFonts w:ascii="Symbol" w:hAnsi="Symbol" w:hint="default"/>
+      </w:rPr>
+    </w:lvl>
+    <w:lvl w:ilvl="4" w:tplc="0C070003" w:tentative="1">
+      <w:start w:val="1"/>
+      <w:numFmt w:val="bullet"/>
+      <w:lvlText w:val="o"/>
+      <w:lvlJc w:val="left"/>
+      <w:pPr>
+        <w:ind w:left="3240" w:hanging="360"/>
+      </w:pPr>
+      <w:rPr>
+        <w:rFonts w:ascii="Courier New" w:hAnsi="Courier New" w:cs="Courier New" w:hint="default"/>
+      </w:rPr>
+    </w:lvl>
+    <w:lvl w:ilvl="5" w:tplc="0C070005" w:tentative="1">
+      <w:start w:val="1"/>
+      <w:numFmt w:val="bullet"/>
+      <w:lvlText w:val=""/>
+      <w:lvlJc w:val="left"/>
+      <w:pPr>
+        <w:ind w:left="3960" w:hanging="360"/>
+      </w:pPr>
+      <w:rPr>
+        <w:rFonts w:ascii="Wingdings" w:hAnsi="Wingdings" w:hint="default"/>
+      </w:rPr>
+    </w:lvl>
+    <w:lvl w:ilvl="6" w:tplc="0C070001" w:tentative="1">
+      <w:start w:val="1"/>
+      <w:numFmt w:val="bullet"/>
+      <w:lvlText w:val=""/>
+      <w:lvlJc w:val="left"/>
+      <w:pPr>
+        <w:ind w:left="4680" w:hanging="360"/>
+      </w:pPr>
+      <w:rPr>
+        <w:rFonts w:ascii="Symbol" w:hAnsi="Symbol" w:hint="default"/>
+      </w:rPr>
+    </w:lvl>
+    <w:lvl w:ilvl="7" w:tplc="0C070003" w:tentative="1">
+      <w:start w:val="1"/>
+      <w:numFmt w:val="bullet"/>
+      <w:lvlText w:val="o"/>
+      <w:lvlJc w:val="left"/>
+      <w:pPr>
+        <w:ind w:left="5400" w:hanging="360"/>
+      </w:pPr>
+      <w:rPr>
+        <w:rFonts w:ascii="Courier New" w:hAnsi="Courier New" w:cs="Courier New" w:hint="default"/>
+      </w:rPr>
+    </w:lvl>
+    <w:lvl w:ilvl="8" w:tplc="0C070005" w:tentative="1">
+      <w:start w:val="1"/>
+      <w:numFmt w:val="bullet"/>
+      <w:lvlText w:val=""/>
+      <w:lvlJc w:val="left"/>
+      <w:pPr>
+        <w:ind w:left="6120" w:hanging="360"/>
+      </w:pPr>
+      <w:rPr>
+        <w:rFonts w:ascii="Wingdings" w:hAnsi="Wingdings" w:hint="default"/>
+      </w:rPr>
+    </w:lvl>
+  </w:abstractNum>
+  <w:abstractNum w:abstractNumId="9" w15:restartNumberingAfterBreak="0">
+    <w:nsid w:val="26D02D09"/>
+    <w:multiLevelType w:val="hybridMultilevel"/>
+    <w:tmpl w:val="B5C4B2BC"/>
+    <w:lvl w:ilvl="0" w:tplc="0C070001">
+      <w:start w:val="1"/>
+      <w:numFmt w:val="bullet"/>
+      <w:lvlText w:val=""/>
+      <w:lvlJc w:val="left"/>
+      <w:pPr>
+        <w:ind w:left="360" w:hanging="360"/>
+      </w:pPr>
+      <w:rPr>
+        <w:rFonts w:ascii="Symbol" w:hAnsi="Symbol" w:hint="default"/>
+      </w:rPr>
+    </w:lvl>
+    <w:lvl w:ilvl="1" w:tplc="0C070003" w:tentative="1">
+      <w:start w:val="1"/>
+      <w:numFmt w:val="bullet"/>
+      <w:lvlText w:val="o"/>
+      <w:lvlJc w:val="left"/>
+      <w:pPr>
+        <w:ind w:left="1080" w:hanging="360"/>
+      </w:pPr>
+      <w:rPr>
+        <w:rFonts w:ascii="Courier New" w:hAnsi="Courier New" w:cs="Courier New" w:hint="default"/>
+      </w:rPr>
+    </w:lvl>
+    <w:lvl w:ilvl="2" w:tplc="0C070005" w:tentative="1">
+      <w:start w:val="1"/>
+      <w:numFmt w:val="bullet"/>
+      <w:lvlText w:val=""/>
+      <w:lvlJc w:val="left"/>
+      <w:pPr>
+        <w:ind w:left="1800" w:hanging="360"/>
+      </w:pPr>
+      <w:rPr>
+        <w:rFonts w:ascii="Wingdings" w:hAnsi="Wingdings" w:hint="default"/>
+      </w:rPr>
+    </w:lvl>
+    <w:lvl w:ilvl="3" w:tplc="0C070001" w:tentative="1">
+      <w:start w:val="1"/>
+      <w:numFmt w:val="bullet"/>
+      <w:lvlText w:val=""/>
+      <w:lvlJc w:val="left"/>
+      <w:pPr>
+        <w:ind w:left="2520" w:hanging="360"/>
+      </w:pPr>
+      <w:rPr>
+        <w:rFonts w:ascii="Symbol" w:hAnsi="Symbol" w:hint="default"/>
+      </w:rPr>
+    </w:lvl>
+    <w:lvl w:ilvl="4" w:tplc="0C070003" w:tentative="1">
+      <w:start w:val="1"/>
+      <w:numFmt w:val="bullet"/>
+      <w:lvlText w:val="o"/>
+      <w:lvlJc w:val="left"/>
+      <w:pPr>
+        <w:ind w:left="3240" w:hanging="360"/>
+      </w:pPr>
+      <w:rPr>
+        <w:rFonts w:ascii="Courier New" w:hAnsi="Courier New" w:cs="Courier New" w:hint="default"/>
+      </w:rPr>
+    </w:lvl>
+    <w:lvl w:ilvl="5" w:tplc="0C070005" w:tentative="1">
+      <w:start w:val="1"/>
+      <w:numFmt w:val="bullet"/>
+      <w:lvlText w:val=""/>
+      <w:lvlJc w:val="left"/>
+      <w:pPr>
+        <w:ind w:left="3960" w:hanging="360"/>
+      </w:pPr>
+      <w:rPr>
+        <w:rFonts w:ascii="Wingdings" w:hAnsi="Wingdings" w:hint="default"/>
+      </w:rPr>
+    </w:lvl>
+    <w:lvl w:ilvl="6" w:tplc="0C070001" w:tentative="1">
+      <w:start w:val="1"/>
+      <w:numFmt w:val="bullet"/>
+      <w:lvlText w:val=""/>
+      <w:lvlJc w:val="left"/>
+      <w:pPr>
+        <w:ind w:left="4680" w:hanging="360"/>
+      </w:pPr>
+      <w:rPr>
+        <w:rFonts w:ascii="Symbol" w:hAnsi="Symbol" w:hint="default"/>
+      </w:rPr>
+    </w:lvl>
+    <w:lvl w:ilvl="7" w:tplc="0C070003" w:tentative="1">
+      <w:start w:val="1"/>
+      <w:numFmt w:val="bullet"/>
+      <w:lvlText w:val="o"/>
+      <w:lvlJc w:val="left"/>
+      <w:pPr>
+        <w:ind w:left="5400" w:hanging="360"/>
+      </w:pPr>
+      <w:rPr>
+        <w:rFonts w:ascii="Courier New" w:hAnsi="Courier New" w:cs="Courier New" w:hint="default"/>
+      </w:rPr>
+    </w:lvl>
+    <w:lvl w:ilvl="8" w:tplc="0C070005" w:tentative="1">
+      <w:start w:val="1"/>
+      <w:numFmt w:val="bullet"/>
+      <w:lvlText w:val=""/>
+      <w:lvlJc w:val="left"/>
+      <w:pPr>
+        <w:ind w:left="6120" w:hanging="360"/>
+      </w:pPr>
+      <w:rPr>
+        <w:rFonts w:ascii="Wingdings" w:hAnsi="Wingdings" w:hint="default"/>
+      </w:rPr>
+    </w:lvl>
+  </w:abstractNum>
+  <w:abstractNum w:abstractNumId="10" w15:restartNumberingAfterBreak="0">
+    <w:nsid w:val="29F5684E"/>
+    <w:multiLevelType w:val="multilevel"/>
+    <w:tmpl w:val="ADBEDCB6"/>
+    <w:lvl w:ilvl="0">
+      <w:start w:val="1"/>
+      <w:numFmt w:val="bullet"/>
+      <w:lvlText w:val=""/>
+      <w:lvlJc w:val="left"/>
+      <w:pPr>
+        <w:tabs>
+          <w:tab w:val="num" w:pos="720"/>
+        </w:tabs>
+        <w:ind w:left="720" w:hanging="360"/>
+      </w:pPr>
+      <w:rPr>
+        <w:rFonts w:ascii="Symbol" w:hAnsi="Symbol" w:hint="default"/>
+        <w:sz w:val="20"/>
+      </w:rPr>
+    </w:lvl>
+    <w:lvl w:ilvl="1" w:tentative="1">
+      <w:start w:val="1"/>
+      <w:numFmt w:val="bullet"/>
+      <w:lvlText w:val="o"/>
+      <w:lvlJc w:val="left"/>
+      <w:pPr>
+        <w:tabs>
+          <w:tab w:val="num" w:pos="1440"/>
+        </w:tabs>
+        <w:ind w:left="1440" w:hanging="360"/>
+      </w:pPr>
+      <w:rPr>
+        <w:rFonts w:ascii="Courier New" w:hAnsi="Courier New" w:hint="default"/>
+        <w:sz w:val="20"/>
+      </w:rPr>
+    </w:lvl>
+    <w:lvl w:ilvl="2" w:tentative="1">
+      <w:start w:val="1"/>
+      <w:numFmt w:val="bullet"/>
+      <w:lvlText w:val=""/>
+      <w:lvlJc w:val="left"/>
+      <w:pPr>
+        <w:tabs>
+          <w:tab w:val="num" w:pos="2160"/>
+        </w:tabs>
+        <w:ind w:left="2160" w:hanging="360"/>
+      </w:pPr>
+      <w:rPr>
+        <w:rFonts w:ascii="Wingdings" w:hAnsi="Wingdings" w:hint="default"/>
+        <w:sz w:val="20"/>
+      </w:rPr>
+    </w:lvl>
+    <w:lvl w:ilvl="3" w:tentative="1">
+      <w:start w:val="1"/>
+      <w:numFmt w:val="bullet"/>
+      <w:lvlText w:val=""/>
+      <w:lvlJc w:val="left"/>
+      <w:pPr>
+        <w:tabs>
+          <w:tab w:val="num" w:pos="2880"/>
+        </w:tabs>
+        <w:ind w:left="2880" w:hanging="360"/>
+      </w:pPr>
+      <w:rPr>
+        <w:rFonts w:ascii="Wingdings" w:hAnsi="Wingdings" w:hint="default"/>
+        <w:sz w:val="20"/>
+      </w:rPr>
+    </w:lvl>
+    <w:lvl w:ilvl="4" w:tentative="1">
+      <w:start w:val="1"/>
+      <w:numFmt w:val="bullet"/>
+      <w:lvlText w:val=""/>
+      <w:lvlJc w:val="left"/>
+      <w:pPr>
+        <w:tabs>
+          <w:tab w:val="num" w:pos="3600"/>
+        </w:tabs>
+        <w:ind w:left="3600" w:hanging="360"/>
+      </w:pPr>
+      <w:rPr>
+        <w:rFonts w:ascii="Wingdings" w:hAnsi="Wingdings" w:hint="default"/>
+        <w:sz w:val="20"/>
+      </w:rPr>
+    </w:lvl>
+    <w:lvl w:ilvl="5" w:tentative="1">
+      <w:start w:val="1"/>
+      <w:numFmt w:val="bullet"/>
+      <w:lvlText w:val=""/>
+      <w:lvlJc w:val="left"/>
+      <w:pPr>
+        <w:tabs>
+          <w:tab w:val="num" w:pos="4320"/>
+        </w:tabs>
+        <w:ind w:left="4320" w:hanging="360"/>
+      </w:pPr>
+      <w:rPr>
+        <w:rFonts w:ascii="Wingdings" w:hAnsi="Wingdings" w:hint="default"/>
+        <w:sz w:val="20"/>
+      </w:rPr>
+    </w:lvl>
+    <w:lvl w:ilvl="6" w:tentative="1">
+      <w:start w:val="1"/>
+      <w:numFmt w:val="bullet"/>
+      <w:lvlText w:val=""/>
+      <w:lvlJc w:val="left"/>
+      <w:pPr>
+        <w:tabs>
+          <w:tab w:val="num" w:pos="5040"/>
+        </w:tabs>
+        <w:ind w:left="5040" w:hanging="360"/>
+      </w:pPr>
+      <w:rPr>
+        <w:rFonts w:ascii="Wingdings" w:hAnsi="Wingdings" w:hint="default"/>
+        <w:sz w:val="20"/>
+      </w:rPr>
+    </w:lvl>
+    <w:lvl w:ilvl="7" w:tentative="1">
+      <w:start w:val="1"/>
+      <w:numFmt w:val="bullet"/>
+      <w:lvlText w:val=""/>
+      <w:lvlJc w:val="left"/>
+      <w:pPr>
+        <w:tabs>
+          <w:tab w:val="num" w:pos="5760"/>
+        </w:tabs>
+        <w:ind w:left="5760" w:hanging="360"/>
+      </w:pPr>
+      <w:rPr>
+        <w:rFonts w:ascii="Wingdings" w:hAnsi="Wingdings" w:hint="default"/>
+        <w:sz w:val="20"/>
+      </w:rPr>
+    </w:lvl>
+    <w:lvl w:ilvl="8" w:tentative="1">
+      <w:start w:val="1"/>
+      <w:numFmt w:val="bullet"/>
+      <w:lvlText w:val=""/>
+      <w:lvlJc w:val="left"/>
+      <w:pPr>
+        <w:tabs>
+          <w:tab w:val="num" w:pos="6480"/>
+        </w:tabs>
+        <w:ind w:left="6480" w:hanging="360"/>
+      </w:pPr>
+      <w:rPr>
+        <w:rFonts w:ascii="Wingdings" w:hAnsi="Wingdings" w:hint="default"/>
+        <w:sz w:val="20"/>
+      </w:rPr>
+    </w:lvl>
+  </w:abstractNum>
+  <w:abstractNum w:abstractNumId="11" w15:restartNumberingAfterBreak="0">
     <w:nsid w:val="29FF513E"/>
     <w:multiLevelType w:val="hybridMultilevel"/>
     <w:tmpl w:val="005AEBF2"/>
@@ -11237,7 +12579,7 @@
       </w:rPr>
     </w:lvl>
   </w:abstractNum>
-  <w:abstractNum w:abstractNumId="8" w15:restartNumberingAfterBreak="0">
+  <w:abstractNum w:abstractNumId="12" w15:restartNumberingAfterBreak="0">
     <w:nsid w:val="30C22CBE"/>
     <w:multiLevelType w:val="multilevel"/>
     <w:tmpl w:val="4094D450"/>
@@ -11386,7 +12728,7 @@
       </w:rPr>
     </w:lvl>
   </w:abstractNum>
-  <w:abstractNum w:abstractNumId="9" w15:restartNumberingAfterBreak="0">
+  <w:abstractNum w:abstractNumId="13" w15:restartNumberingAfterBreak="0">
     <w:nsid w:val="30EA4759"/>
     <w:multiLevelType w:val="multilevel"/>
     <w:tmpl w:val="D31E9D38"/>
@@ -11535,7 +12877,7 @@
       </w:rPr>
     </w:lvl>
   </w:abstractNum>
-  <w:abstractNum w:abstractNumId="10" w15:restartNumberingAfterBreak="0">
+  <w:abstractNum w:abstractNumId="14" w15:restartNumberingAfterBreak="0">
     <w:nsid w:val="323964BC"/>
     <w:multiLevelType w:val="multilevel"/>
     <w:tmpl w:val="75E682C0"/>
@@ -11649,7 +12991,7 @@
       </w:pPr>
     </w:lvl>
   </w:abstractNum>
-  <w:abstractNum w:abstractNumId="11" w15:restartNumberingAfterBreak="0">
+  <w:abstractNum w:abstractNumId="15" w15:restartNumberingAfterBreak="0">
     <w:nsid w:val="39025347"/>
     <w:multiLevelType w:val="multilevel"/>
     <w:tmpl w:val="31F83E7A"/>
@@ -11798,7 +13140,7 @@
       </w:rPr>
     </w:lvl>
   </w:abstractNum>
-  <w:abstractNum w:abstractNumId="12" w15:restartNumberingAfterBreak="0">
+  <w:abstractNum w:abstractNumId="16" w15:restartNumberingAfterBreak="0">
     <w:nsid w:val="3AA758A0"/>
     <w:multiLevelType w:val="hybridMultilevel"/>
     <w:tmpl w:val="70085ABA"/>
@@ -11911,7 +13253,7 @@
       </w:rPr>
     </w:lvl>
   </w:abstractNum>
-  <w:abstractNum w:abstractNumId="13" w15:restartNumberingAfterBreak="0">
+  <w:abstractNum w:abstractNumId="17" w15:restartNumberingAfterBreak="0">
     <w:nsid w:val="3E963E16"/>
     <w:multiLevelType w:val="multilevel"/>
     <w:tmpl w:val="3B685D2C"/>
@@ -12060,7 +13402,7 @@
       </w:rPr>
     </w:lvl>
   </w:abstractNum>
-  <w:abstractNum w:abstractNumId="14" w15:restartNumberingAfterBreak="0">
+  <w:abstractNum w:abstractNumId="18" w15:restartNumberingAfterBreak="0">
     <w:nsid w:val="436E0DC6"/>
     <w:multiLevelType w:val="multilevel"/>
     <w:tmpl w:val="461873D8"/>
@@ -12209,7 +13551,7 @@
       </w:rPr>
     </w:lvl>
   </w:abstractNum>
-  <w:abstractNum w:abstractNumId="15" w15:restartNumberingAfterBreak="0">
+  <w:abstractNum w:abstractNumId="19" w15:restartNumberingAfterBreak="0">
     <w:nsid w:val="509E0DC7"/>
     <w:multiLevelType w:val="hybridMultilevel"/>
     <w:tmpl w:val="5E0EC66E"/>
@@ -12322,7 +13664,7 @@
       </w:rPr>
     </w:lvl>
   </w:abstractNum>
-  <w:abstractNum w:abstractNumId="16" w15:restartNumberingAfterBreak="0">
+  <w:abstractNum w:abstractNumId="20" w15:restartNumberingAfterBreak="0">
     <w:nsid w:val="55A0278F"/>
     <w:multiLevelType w:val="multilevel"/>
     <w:tmpl w:val="AB9C1A34"/>
@@ -12436,7 +13778,7 @@
       </w:pPr>
     </w:lvl>
   </w:abstractNum>
-  <w:abstractNum w:abstractNumId="17" w15:restartNumberingAfterBreak="0">
+  <w:abstractNum w:abstractNumId="21" w15:restartNumberingAfterBreak="0">
     <w:nsid w:val="5D903A8D"/>
     <w:multiLevelType w:val="multilevel"/>
     <w:tmpl w:val="CC102D3C"/>
@@ -12550,7 +13892,7 @@
       </w:pPr>
     </w:lvl>
   </w:abstractNum>
-  <w:abstractNum w:abstractNumId="18" w15:restartNumberingAfterBreak="0">
+  <w:abstractNum w:abstractNumId="22" w15:restartNumberingAfterBreak="0">
     <w:nsid w:val="5EC5797E"/>
     <w:multiLevelType w:val="multilevel"/>
     <w:tmpl w:val="49023F0A"/>
@@ -12676,7 +14018,156 @@
       </w:pPr>
     </w:lvl>
   </w:abstractNum>
-  <w:abstractNum w:abstractNumId="19" w15:restartNumberingAfterBreak="0">
+  <w:abstractNum w:abstractNumId="23" w15:restartNumberingAfterBreak="0">
+    <w:nsid w:val="5F69081C"/>
+    <w:multiLevelType w:val="multilevel"/>
+    <w:tmpl w:val="7DF49EFA"/>
+    <w:lvl w:ilvl="0">
+      <w:start w:val="1"/>
+      <w:numFmt w:val="bullet"/>
+      <w:lvlText w:val=""/>
+      <w:lvlJc w:val="left"/>
+      <w:pPr>
+        <w:tabs>
+          <w:tab w:val="num" w:pos="720"/>
+        </w:tabs>
+        <w:ind w:left="720" w:hanging="360"/>
+      </w:pPr>
+      <w:rPr>
+        <w:rFonts w:ascii="Symbol" w:hAnsi="Symbol" w:hint="default"/>
+        <w:sz w:val="20"/>
+      </w:rPr>
+    </w:lvl>
+    <w:lvl w:ilvl="1" w:tentative="1">
+      <w:start w:val="1"/>
+      <w:numFmt w:val="bullet"/>
+      <w:lvlText w:val="o"/>
+      <w:lvlJc w:val="left"/>
+      <w:pPr>
+        <w:tabs>
+          <w:tab w:val="num" w:pos="1440"/>
+        </w:tabs>
+        <w:ind w:left="1440" w:hanging="360"/>
+      </w:pPr>
+      <w:rPr>
+        <w:rFonts w:ascii="Courier New" w:hAnsi="Courier New" w:hint="default"/>
+        <w:sz w:val="20"/>
+      </w:rPr>
+    </w:lvl>
+    <w:lvl w:ilvl="2" w:tentative="1">
+      <w:start w:val="1"/>
+      <w:numFmt w:val="bullet"/>
+      <w:lvlText w:val=""/>
+      <w:lvlJc w:val="left"/>
+      <w:pPr>
+        <w:tabs>
+          <w:tab w:val="num" w:pos="2160"/>
+        </w:tabs>
+        <w:ind w:left="2160" w:hanging="360"/>
+      </w:pPr>
+      <w:rPr>
+        <w:rFonts w:ascii="Wingdings" w:hAnsi="Wingdings" w:hint="default"/>
+        <w:sz w:val="20"/>
+      </w:rPr>
+    </w:lvl>
+    <w:lvl w:ilvl="3" w:tentative="1">
+      <w:start w:val="1"/>
+      <w:numFmt w:val="bullet"/>
+      <w:lvlText w:val=""/>
+      <w:lvlJc w:val="left"/>
+      <w:pPr>
+        <w:tabs>
+          <w:tab w:val="num" w:pos="2880"/>
+        </w:tabs>
+        <w:ind w:left="2880" w:hanging="360"/>
+      </w:pPr>
+      <w:rPr>
+        <w:rFonts w:ascii="Wingdings" w:hAnsi="Wingdings" w:hint="default"/>
+        <w:sz w:val="20"/>
+      </w:rPr>
+    </w:lvl>
+    <w:lvl w:ilvl="4" w:tentative="1">
+      <w:start w:val="1"/>
+      <w:numFmt w:val="bullet"/>
+      <w:lvlText w:val=""/>
+      <w:lvlJc w:val="left"/>
+      <w:pPr>
+        <w:tabs>
+          <w:tab w:val="num" w:pos="3600"/>
+        </w:tabs>
+        <w:ind w:left="3600" w:hanging="360"/>
+      </w:pPr>
+      <w:rPr>
+        <w:rFonts w:ascii="Wingdings" w:hAnsi="Wingdings" w:hint="default"/>
+        <w:sz w:val="20"/>
+      </w:rPr>
+    </w:lvl>
+    <w:lvl w:ilvl="5" w:tentative="1">
+      <w:start w:val="1"/>
+      <w:numFmt w:val="bullet"/>
+      <w:lvlText w:val=""/>
+      <w:lvlJc w:val="left"/>
+      <w:pPr>
+        <w:tabs>
+          <w:tab w:val="num" w:pos="4320"/>
+        </w:tabs>
+        <w:ind w:left="4320" w:hanging="360"/>
+      </w:pPr>
+      <w:rPr>
+        <w:rFonts w:ascii="Wingdings" w:hAnsi="Wingdings" w:hint="default"/>
+        <w:sz w:val="20"/>
+      </w:rPr>
+    </w:lvl>
+    <w:lvl w:ilvl="6" w:tentative="1">
+      <w:start w:val="1"/>
+      <w:numFmt w:val="bullet"/>
+      <w:lvlText w:val=""/>
+      <w:lvlJc w:val="left"/>
+      <w:pPr>
+        <w:tabs>
+          <w:tab w:val="num" w:pos="5040"/>
+        </w:tabs>
+        <w:ind w:left="5040" w:hanging="360"/>
+      </w:pPr>
+      <w:rPr>
+        <w:rFonts w:ascii="Wingdings" w:hAnsi="Wingdings" w:hint="default"/>
+        <w:sz w:val="20"/>
+      </w:rPr>
+    </w:lvl>
+    <w:lvl w:ilvl="7" w:tentative="1">
+      <w:start w:val="1"/>
+      <w:numFmt w:val="bullet"/>
+      <w:lvlText w:val=""/>
+      <w:lvlJc w:val="left"/>
+      <w:pPr>
+        <w:tabs>
+          <w:tab w:val="num" w:pos="5760"/>
+        </w:tabs>
+        <w:ind w:left="5760" w:hanging="360"/>
+      </w:pPr>
+      <w:rPr>
+        <w:rFonts w:ascii="Wingdings" w:hAnsi="Wingdings" w:hint="default"/>
+        <w:sz w:val="20"/>
+      </w:rPr>
+    </w:lvl>
+    <w:lvl w:ilvl="8" w:tentative="1">
+      <w:start w:val="1"/>
+      <w:numFmt w:val="bullet"/>
+      <w:lvlText w:val=""/>
+      <w:lvlJc w:val="left"/>
+      <w:pPr>
+        <w:tabs>
+          <w:tab w:val="num" w:pos="6480"/>
+        </w:tabs>
+        <w:ind w:left="6480" w:hanging="360"/>
+      </w:pPr>
+      <w:rPr>
+        <w:rFonts w:ascii="Wingdings" w:hAnsi="Wingdings" w:hint="default"/>
+        <w:sz w:val="20"/>
+      </w:rPr>
+    </w:lvl>
+  </w:abstractNum>
+  <w:abstractNum w:abstractNumId="24" w15:restartNumberingAfterBreak="0">
     <w:nsid w:val="665D4CBB"/>
     <w:multiLevelType w:val="multilevel"/>
     <w:tmpl w:val="E60CE398"/>
@@ -12793,7 +14284,7 @@
       </w:pPr>
     </w:lvl>
   </w:abstractNum>
-  <w:abstractNum w:abstractNumId="20" w15:restartNumberingAfterBreak="0">
+  <w:abstractNum w:abstractNumId="25" w15:restartNumberingAfterBreak="0">
     <w:nsid w:val="69DA26B3"/>
     <w:multiLevelType w:val="hybridMultilevel"/>
     <w:tmpl w:val="C6FA130E"/>
@@ -12906,7 +14397,7 @@
       </w:rPr>
     </w:lvl>
   </w:abstractNum>
-  <w:abstractNum w:abstractNumId="21" w15:restartNumberingAfterBreak="0">
+  <w:abstractNum w:abstractNumId="26" w15:restartNumberingAfterBreak="0">
     <w:nsid w:val="719B250E"/>
     <w:multiLevelType w:val="multilevel"/>
     <w:tmpl w:val="8334D66A"/>
@@ -13046,7 +14537,7 @@
       </w:rPr>
     </w:lvl>
   </w:abstractNum>
-  <w:abstractNum w:abstractNumId="22" w15:restartNumberingAfterBreak="0">
+  <w:abstractNum w:abstractNumId="27" w15:restartNumberingAfterBreak="0">
     <w:nsid w:val="75A17E70"/>
     <w:multiLevelType w:val="multilevel"/>
     <w:tmpl w:val="C534194C"/>
@@ -13195,7 +14686,7 @@
       </w:rPr>
     </w:lvl>
   </w:abstractNum>
-  <w:abstractNum w:abstractNumId="23" w15:restartNumberingAfterBreak="0">
+  <w:abstractNum w:abstractNumId="28" w15:restartNumberingAfterBreak="0">
     <w:nsid w:val="78117A9A"/>
     <w:multiLevelType w:val="multilevel"/>
     <w:tmpl w:val="5B706B8C"/>
@@ -13344,7 +14835,7 @@
       </w:rPr>
     </w:lvl>
   </w:abstractNum>
-  <w:abstractNum w:abstractNumId="24" w15:restartNumberingAfterBreak="0">
+  <w:abstractNum w:abstractNumId="29" w15:restartNumberingAfterBreak="0">
     <w:nsid w:val="7BD31CC0"/>
     <w:multiLevelType w:val="multilevel"/>
     <w:tmpl w:val="67BC28FC"/>
@@ -13484,7 +14975,123 @@
       </w:rPr>
     </w:lvl>
   </w:abstractNum>
-  <w:abstractNum w:abstractNumId="25" w15:restartNumberingAfterBreak="0">
+  <w:abstractNum w:abstractNumId="30" w15:restartNumberingAfterBreak="0">
+    <w:nsid w:val="7DAB64FA"/>
+    <w:multiLevelType w:val="multilevel"/>
+    <w:tmpl w:val="90AEDF7E"/>
+    <w:lvl w:ilvl="0">
+      <w:start w:val="1"/>
+      <w:numFmt w:val="bullet"/>
+      <w:lvlText w:val=""/>
+      <w:lvlJc w:val="left"/>
+      <w:pPr>
+        <w:tabs>
+          <w:tab w:val="num" w:pos="360"/>
+        </w:tabs>
+        <w:ind w:left="360" w:hanging="360"/>
+      </w:pPr>
+      <w:rPr>
+        <w:rFonts w:ascii="Symbol" w:hAnsi="Symbol" w:hint="default"/>
+      </w:rPr>
+    </w:lvl>
+    <w:lvl w:ilvl="1">
+      <w:start w:val="1"/>
+      <w:numFmt w:val="decimal"/>
+      <w:lvlText w:val="%2."/>
+      <w:lvlJc w:val="left"/>
+      <w:pPr>
+        <w:tabs>
+          <w:tab w:val="num" w:pos="1080"/>
+        </w:tabs>
+        <w:ind w:left="1080" w:hanging="360"/>
+      </w:pPr>
+    </w:lvl>
+    <w:lvl w:ilvl="2" w:tentative="1">
+      <w:start w:val="1"/>
+      <w:numFmt w:val="decimal"/>
+      <w:lvlText w:val="%3."/>
+      <w:lvlJc w:val="left"/>
+      <w:pPr>
+        <w:tabs>
+          <w:tab w:val="num" w:pos="1800"/>
+        </w:tabs>
+        <w:ind w:left="1800" w:hanging="360"/>
+      </w:pPr>
+    </w:lvl>
+    <w:lvl w:ilvl="3" w:tentative="1">
+      <w:start w:val="1"/>
+      <w:numFmt w:val="decimal"/>
+      <w:lvlText w:val="%4."/>
+      <w:lvlJc w:val="left"/>
+      <w:pPr>
+        <w:tabs>
+          <w:tab w:val="num" w:pos="2520"/>
+        </w:tabs>
+        <w:ind w:left="2520" w:hanging="360"/>
+      </w:pPr>
+    </w:lvl>
+    <w:lvl w:ilvl="4" w:tentative="1">
+      <w:start w:val="1"/>
+      <w:numFmt w:val="decimal"/>
+      <w:lvlText w:val="%5."/>
+      <w:lvlJc w:val="left"/>
+      <w:pPr>
+        <w:tabs>
+          <w:tab w:val="num" w:pos="3240"/>
+        </w:tabs>
+        <w:ind w:left="3240" w:hanging="360"/>
+      </w:pPr>
+    </w:lvl>
+    <w:lvl w:ilvl="5" w:tentative="1">
+      <w:start w:val="1"/>
+      <w:numFmt w:val="decimal"/>
+      <w:lvlText w:val="%6."/>
+      <w:lvlJc w:val="left"/>
+      <w:pPr>
+        <w:tabs>
+          <w:tab w:val="num" w:pos="3960"/>
+        </w:tabs>
+        <w:ind w:left="3960" w:hanging="360"/>
+      </w:pPr>
+    </w:lvl>
+    <w:lvl w:ilvl="6" w:tentative="1">
+      <w:start w:val="1"/>
+      <w:numFmt w:val="decimal"/>
+      <w:lvlText w:val="%7."/>
+      <w:lvlJc w:val="left"/>
+      <w:pPr>
+        <w:tabs>
+          <w:tab w:val="num" w:pos="4680"/>
+        </w:tabs>
+        <w:ind w:left="4680" w:hanging="360"/>
+      </w:pPr>
+    </w:lvl>
+    <w:lvl w:ilvl="7" w:tentative="1">
+      <w:start w:val="1"/>
+      <w:numFmt w:val="decimal"/>
+      <w:lvlText w:val="%8."/>
+      <w:lvlJc w:val="left"/>
+      <w:pPr>
+        <w:tabs>
+          <w:tab w:val="num" w:pos="5400"/>
+        </w:tabs>
+        <w:ind w:left="5400" w:hanging="360"/>
+      </w:pPr>
+    </w:lvl>
+    <w:lvl w:ilvl="8" w:tentative="1">
+      <w:start w:val="1"/>
+      <w:numFmt w:val="decimal"/>
+      <w:lvlText w:val="%9."/>
+      <w:lvlJc w:val="left"/>
+      <w:pPr>
+        <w:tabs>
+          <w:tab w:val="num" w:pos="6120"/>
+        </w:tabs>
+        <w:ind w:left="6120" w:hanging="360"/>
+      </w:pPr>
+    </w:lvl>
+  </w:abstractNum>
+  <w:abstractNum w:abstractNumId="31" w15:restartNumberingAfterBreak="0">
     <w:nsid w:val="7E18221F"/>
     <w:multiLevelType w:val="hybridMultilevel"/>
     <w:tmpl w:val="94EA5AF2"/>
@@ -13601,79 +15208,97 @@
     <w:abstractNumId w:val="2"/>
   </w:num>
   <w:num w:numId="2" w16cid:durableId="151064096">
-    <w:abstractNumId w:val="17"/>
+    <w:abstractNumId w:val="21"/>
   </w:num>
   <w:num w:numId="3" w16cid:durableId="696661172">
-    <w:abstractNumId w:val="8"/>
+    <w:abstractNumId w:val="12"/>
   </w:num>
   <w:num w:numId="4" w16cid:durableId="1915779622">
-    <w:abstractNumId w:val="18"/>
+    <w:abstractNumId w:val="22"/>
   </w:num>
   <w:num w:numId="5" w16cid:durableId="1858688818">
-    <w:abstractNumId w:val="6"/>
+    <w:abstractNumId w:val="7"/>
   </w:num>
   <w:num w:numId="6" w16cid:durableId="807819139">
-    <w:abstractNumId w:val="16"/>
+    <w:abstractNumId w:val="20"/>
   </w:num>
   <w:num w:numId="7" w16cid:durableId="1496384867">
-    <w:abstractNumId w:val="10"/>
+    <w:abstractNumId w:val="14"/>
   </w:num>
   <w:num w:numId="8" w16cid:durableId="911082857">
-    <w:abstractNumId w:val="4"/>
+    <w:abstractNumId w:val="5"/>
   </w:num>
   <w:num w:numId="9" w16cid:durableId="1090587333">
     <w:abstractNumId w:val="1"/>
   </w:num>
   <w:num w:numId="10" w16cid:durableId="260797068">
-    <w:abstractNumId w:val="24"/>
+    <w:abstractNumId w:val="29"/>
   </w:num>
   <w:num w:numId="11" w16cid:durableId="1712150709">
-    <w:abstractNumId w:val="21"/>
+    <w:abstractNumId w:val="26"/>
   </w:num>
   <w:num w:numId="12" w16cid:durableId="801771444">
-    <w:abstractNumId w:val="5"/>
+    <w:abstractNumId w:val="6"/>
   </w:num>
   <w:num w:numId="13" w16cid:durableId="739180959">
     <w:abstractNumId w:val="3"/>
   </w:num>
   <w:num w:numId="14" w16cid:durableId="164512757">
-    <w:abstractNumId w:val="19"/>
+    <w:abstractNumId w:val="24"/>
   </w:num>
   <w:num w:numId="15" w16cid:durableId="1745376944">
+    <w:abstractNumId w:val="17"/>
+  </w:num>
+  <w:num w:numId="16" w16cid:durableId="2112626617">
+    <w:abstractNumId w:val="27"/>
+  </w:num>
+  <w:num w:numId="17" w16cid:durableId="2069179764">
+    <w:abstractNumId w:val="31"/>
+  </w:num>
+  <w:num w:numId="18" w16cid:durableId="756824728">
+    <w:abstractNumId w:val="15"/>
+  </w:num>
+  <w:num w:numId="19" w16cid:durableId="1680959368">
+    <w:abstractNumId w:val="11"/>
+  </w:num>
+  <w:num w:numId="20" w16cid:durableId="1083529391">
+    <w:abstractNumId w:val="18"/>
+  </w:num>
+  <w:num w:numId="21" w16cid:durableId="670303952">
+    <w:abstractNumId w:val="28"/>
+  </w:num>
+  <w:num w:numId="22" w16cid:durableId="401293004">
+    <w:abstractNumId w:val="25"/>
+  </w:num>
+  <w:num w:numId="23" w16cid:durableId="114830308">
     <w:abstractNumId w:val="13"/>
   </w:num>
-  <w:num w:numId="16" w16cid:durableId="2112626617">
-    <w:abstractNumId w:val="22"/>
-  </w:num>
-  <w:num w:numId="17" w16cid:durableId="2069179764">
-    <w:abstractNumId w:val="25"/>
-  </w:num>
-  <w:num w:numId="18" w16cid:durableId="756824728">
-    <w:abstractNumId w:val="11"/>
-  </w:num>
-  <w:num w:numId="19" w16cid:durableId="1680959368">
-    <w:abstractNumId w:val="7"/>
-  </w:num>
-  <w:num w:numId="20" w16cid:durableId="1083529391">
-    <w:abstractNumId w:val="14"/>
-  </w:num>
-  <w:num w:numId="21" w16cid:durableId="670303952">
-    <w:abstractNumId w:val="23"/>
-  </w:num>
-  <w:num w:numId="22" w16cid:durableId="401293004">
-    <w:abstractNumId w:val="20"/>
-  </w:num>
-  <w:num w:numId="23" w16cid:durableId="114830308">
-    <w:abstractNumId w:val="9"/>
-  </w:num>
   <w:num w:numId="24" w16cid:durableId="2038774065">
-    <w:abstractNumId w:val="15"/>
+    <w:abstractNumId w:val="19"/>
   </w:num>
   <w:num w:numId="25" w16cid:durableId="1202596245">
     <w:abstractNumId w:val="0"/>
   </w:num>
   <w:num w:numId="26" w16cid:durableId="1466119662">
-    <w:abstractNumId w:val="12"/>
+    <w:abstractNumId w:val="16"/>
+  </w:num>
+  <w:num w:numId="27" w16cid:durableId="834607322">
+    <w:abstractNumId w:val="23"/>
+  </w:num>
+  <w:num w:numId="28" w16cid:durableId="1784765877">
+    <w:abstractNumId w:val="10"/>
+  </w:num>
+  <w:num w:numId="29" w16cid:durableId="1156458065">
+    <w:abstractNumId w:val="9"/>
+  </w:num>
+  <w:num w:numId="30" w16cid:durableId="1027759014">
+    <w:abstractNumId w:val="8"/>
+  </w:num>
+  <w:num w:numId="31" w16cid:durableId="1931963899">
+    <w:abstractNumId w:val="30"/>
+  </w:num>
+  <w:num w:numId="32" w16cid:durableId="1638340900">
+    <w:abstractNumId w:val="4"/>
   </w:num>
 </w:numbering>
 </file>
@@ -14311,7 +15936,6 @@
   <w:style w:type="character" w:default="1" w:styleId="Absatz-Standardschriftart">
     <w:name w:val="Default Paragraph Font"/>
     <w:uiPriority w:val="1"/>
-    <w:semiHidden/>
     <w:unhideWhenUsed/>
   </w:style>
   <w:style w:type="table" w:default="1" w:styleId="NormaleTabelle">
@@ -15972,6 +17596,20 @@
       <w:shd w:val="clear" w:color="auto" w:fill="E1DFDD"/>
     </w:rPr>
   </w:style>
+  <w:style w:type="paragraph" w:customStyle="1" w:styleId="ds-markdown-paragraph">
+    <w:name w:val="ds-markdown-paragraph"/>
+    <w:basedOn w:val="Standard"/>
+    <w:rsid w:val="00BA36B0"/>
+    <w:pPr>
+      <w:suppressAutoHyphens w:val="0"/>
+      <w:spacing w:before="100" w:beforeAutospacing="1" w:after="100" w:afterAutospacing="1"/>
+      <w:jc w:val="left"/>
+    </w:pPr>
+    <w:rPr>
+      <w:rFonts w:ascii="Times New Roman" w:hAnsi="Times New Roman"/>
+      <w:lang w:val="de-AT" w:eastAsia="de-AT"/>
+    </w:rPr>
+  </w:style>
 </w:styles>
 </file>
 
@@ -16172,7 +17810,7 @@
           <inkml:channelProperty channel="OE" name="resolution" value="1000" units="1/deg"/>
         </inkml:channelProperties>
       </inkml:inkSource>
-      <inkml:timestamp xml:id="ts0" timeString="2025-06-10T16:08:50.568"/>
+      <inkml:timestamp xml:id="ts0" timeString="2025-06-10T16:08:54.030"/>
     </inkml:context>
     <inkml:brush xml:id="br0">
       <inkml:brushProperty name="width" value="0.05" units="cm"/>
@@ -16180,7 +17818,19 @@
       <inkml:brushProperty name="color" value="#E71224"/>
     </inkml:brush>
   </inkml:definitions>
-  <inkml:trace contextRef="#ctx0" brushRef="#br0">1236 239 3217 0 0,'-18'-44'2449'0'0,"11"24"-2251"0"0,-2 1 0 0 0,-14-27 0 0 0,19 39-210 0 0,-1 0 0 0 0,0 1-1 0 0,0 0 1 0 0,-1-1 0 0 0,0 2 0 0 0,0-1-1 0 0,0 1 1 0 0,0 0 0 0 0,-14-8-1 0 0,8 6-57 0 0,-1 1 0 0 0,1 1 1 0 0,-1 0-1 0 0,0 0 0 0 0,0 1 0 0 0,0 1 0 0 0,0 0 0 0 0,-1 1 0 0 0,-22-1 0 0 0,19 4-190 0 0,0 0-1 0 0,0 1 1 0 0,0 1-1 0 0,1 0 1 0 0,-1 1-1 0 0,1 1 1 0 0,-21 9-1 0 0,-37 17-295 0 0,-131 76-1 0 0,173-87 985 0 0,0 2 0 0 0,2 1 0 0 0,1 2 0 0 0,1 0 0 0 0,1 2 0 0 0,-28 37 0 0 0,-16 22-328 0 0,-54 78 18 0 0,113-145-112 0 0,0 0 1 0 0,2 1-1 0 0,1 0 0 0 0,0 0 0 0 0,2 1 1 0 0,0 0-1 0 0,-5 27 0 0 0,4 3 6 0 0,3 0-1 0 0,1 0 0 0 0,3 0 1 0 0,2 1-1 0 0,2-1 1 0 0,13 62-1 0 0,-11-89 37 0 0,1-1 0 0 0,2 1 0 0 0,0-1 0 0 0,1-1 0 0 0,1 0 0 0 0,2 0-1 0 0,0-1 1 0 0,1-1 0 0 0,1 0 0 0 0,1 0 0 0 0,25 25 0 0 0,-31-38 8 0 0,1 0 0 0 0,0-1 0 0 0,0 0 0 0 0,1-1-1 0 0,0 0 1 0 0,0 0 0 0 0,0-1 0 0 0,0 0 0 0 0,1-1 0 0 0,-1-1 0 0 0,1 0 0 0 0,23 1 0 0 0,0-2-27 0 0,-1-1 0 0 0,0-2 0 0 0,43-8 0 0 0,15-10 179 0 0,-1-4 0 0 0,111-46 0 0 0,-162 55-168 0 0,0 1-21 0 0,5-1 26 0 0,-2-3-1 0 0,45-23 0 0 0,-67 26 22 0 0,-1 0 0 0 0,0-2-1 0 0,-2 0 1 0 0,0-1 0 0 0,-1-1 0 0 0,0-1 0 0 0,-2 0-1 0 0,22-37 1 0 0,-28 39-39 0 0,0 1 1 0 0,-1-1-1 0 0,-1-1 0 0 0,-1 0 1 0 0,-1 1-1 0 0,0-2 0 0 0,-2 1 0 0 0,0 0 1 0 0,0-25-1 0 0,-2-13 167 0 0,-14-108-1 0 0,10 143-149 0 0,-1 0-1 0 0,0 1 1 0 0,-2-1-1 0 0,-1 1 1 0 0,-1 0-1 0 0,0 1 1 0 0,-1 0-1 0 0,-23-35 0 0 0,22 41 15 0 0,-1 0 0 0 0,0 0-1 0 0,-1 1 1 0 0,-1 0 0 0 0,0 1-1 0 0,0 1 1 0 0,-1 0 0 0 0,-1 1-1 0 0,0 0 1 0 0,0 1 0 0 0,-25-10-1 0 0,15 9-505 0 0,-1 1-1 0 0,0 2 1 0 0,0 0 0 0 0,-49-5-1 0 0,41 10-389 0 0</inkml:trace>
+  <inkml:trace contextRef="#ctx0" brushRef="#br0">5 208 2425 0 0,'0'0'5878'0'0,"24"0"-3468"0"0,-17 1-2405 0 0,0 0 1 0 0,0 0-1 0 0,0 0 0 0 0,0 1 1 0 0,0 0-1 0 0,11 5 0 0 0,-9-5 40 0 0,0 0-1 0 0,0 0 0 0 0,0-1 0 0 0,1 0 1 0 0,-1 0-1 0 0,0-1 0 0 0,17-3 1 0 0,4 2 74 0 0,-22 1-105 0 0,1-1 1 0 0,0 2-1 0 0,-1-1 0 0 0,1 1 1 0 0,-1 0-1 0 0,1 1 1 0 0,-1 0-1 0 0,1 0 1 0 0,-1 1-1 0 0,14 7 0 0 0,-22-10-10 0 0,1 0 1 0 0,0 1-1 0 0,-1-1 0 0 0,1 1 0 0 0,0-1 0 0 0,-1 1 0 0 0,1-1 0 0 0,0 1 0 0 0,-1 0 0 0 0,1-1 0 0 0,-1 1 0 0 0,1 0 0 0 0,-1-1 0 0 0,0 1 0 0 0,1 0 0 0 0,-1 0 0 0 0,0-1 0 0 0,1 1 0 0 0,-1 0 0 0 0,0 0 0 0 0,0 0 0 0 0,0-1 0 0 0,0 1 0 0 0,0 0 1 0 0,0 0-1 0 0,0 0 0 0 0,0 0 0 0 0,0-1 0 0 0,0 1 0 0 0,0 0 0 0 0,0 0 0 0 0,-1 0 0 0 0,1-1 0 0 0,0 1 0 0 0,-1 0 0 0 0,1 0 0 0 0,0-1 0 0 0,-1 1 0 0 0,1 0 0 0 0,-2 0 0 0 0,-2 4 13 0 0,0-1 0 0 0,-1 1 0 0 0,0-1 0 0 0,-10 6 0 0 0,-6 7-17 0 0,-52 46-71 0 0,46-41 27 0 0,-30 31 0 0 0,55-51 44 0 0,1 0 0 0 0,-1 0 0 0 0,0 0 0 0 0,1 0-1 0 0,-1 0 1 0 0,1 0 0 0 0,0 0 0 0 0,0 0 0 0 0,-1 1-1 0 0,1-1 1 0 0,1 0 0 0 0,-1 1 0 0 0,0-1 0 0 0,1 1-1 0 0,-1-1 1 0 0,1 1 0 0 0,0-1 0 0 0,0 5-1 0 0,0-6 1 0 0,1 1 0 0 0,0-1 0 0 0,-1 1 0 0 0,1-1 0 0 0,0 1 0 0 0,0-1 0 0 0,0 0-1 0 0,0 1 1 0 0,0-1 0 0 0,0 0 0 0 0,0 0 0 0 0,0 0 0 0 0,1 0 0 0 0,-1 0-1 0 0,0 0 1 0 0,1 0 0 0 0,-1 0 0 0 0,1 0 0 0 0,-1-1 0 0 0,1 1 0 0 0,-1-1 0 0 0,1 1-1 0 0,-1-1 1 0 0,1 1 0 0 0,0-1 0 0 0,-1 0 0 0 0,1 0 0 0 0,-1 0 0 0 0,3 0-1 0 0,29 4-18 0 0,-11-1-40 0 0,-1-1 0 0 0,25-2 0 0 0,-39 0 42 0 0,1-1-1 0 0,0 0 1 0 0,0 0-1 0 0,-1-1 1 0 0,1 0-1 0 0,-1-1 1 0 0,0 0 0 0 0,0 0-1 0 0,12-7 1 0 0,29-13-1642 0 0,-12 16-3216 0 0,-30 7 3490 0 0</inkml:trace>
+  <inkml:trace contextRef="#ctx0" brushRef="#br0" timeOffset="537.36">1 353 3761 0 0,'14'-4'313'0'0,"1"1"1"0"0,0 1 0 0 0,0 0-1 0 0,0 1 1 0 0,1 1 0 0 0,-1 0-1 0 0,0 1 1 0 0,0 0 0 0 0,0 2-1 0 0,0-1 1 0 0,-1 2 0 0 0,1 0-1 0 0,-1 1 1 0 0,1 0 0 0 0,13 8-1 0 0,-21-9-404 0 0,1-2 0 0 0,0 1 0 0 0,0-1 0 0 0,0 0-1 0 0,0-1 1 0 0,0 0 0 0 0,0 0 0 0 0,1 0 0 0 0,-1-1 0 0 0,0-1-1 0 0,0 1 1 0 0,1-2 0 0 0,-1 1 0 0 0,0-1 0 0 0,0 0 0 0 0,9-4 0 0 0,-11 5-498 0 0</inkml:trace>
+  <inkml:trace contextRef="#ctx0" brushRef="#br0" timeOffset="1907.49">580 318 4417 0 0,'0'0'535'0'0,"25"18"674"0"0,-15-14-1066 0 0,1 0-1 0 0,0-1 0 0 0,-1 0 0 0 0,1-1 1 0 0,17 2-1 0 0,-15-3-53 0 0,0-1 1 0 0,0 0-1 0 0,19-4 1 0 0,-28 4-78 0 0,0-1 0 0 0,-1 1 0 0 0,1-1 1 0 0,-1 0-1 0 0,1-1 0 0 0,-1 1 0 0 0,1 0 1 0 0,-1-1-1 0 0,0 0 0 0 0,0 0 1 0 0,0 0-1 0 0,0 0 0 0 0,0 0 0 0 0,0-1 1 0 0,-1 1-1 0 0,1-1 0 0 0,2-4 1 0 0,-4 5-7 0 0,0 0 0 0 0,0 0 0 0 0,-1 0 0 0 0,1 0 0 0 0,-1 0 1 0 0,0 0-1 0 0,1 0 0 0 0,-1 0 0 0 0,0 0 0 0 0,0 0 1 0 0,0 0-1 0 0,-1 0 0 0 0,1 0 0 0 0,0 0 0 0 0,-1 0 0 0 0,1 0 1 0 0,-1 0-1 0 0,0 0 0 0 0,-1-3 0 0 0,2 4-6 0 0,-1 0-1 0 0,0-1 1 0 0,0 1-1 0 0,0 0 1 0 0,1 0 0 0 0,-1 0-1 0 0,0 0 1 0 0,-1 0-1 0 0,1 0 1 0 0,0 0 0 0 0,0 0-1 0 0,0 0 1 0 0,0 1-1 0 0,-1-1 1 0 0,1 0-1 0 0,0 1 1 0 0,-1-1 0 0 0,1 1-1 0 0,0-1 1 0 0,-1 1-1 0 0,1 0 1 0 0,-1 0 0 0 0,1-1-1 0 0,0 1 1 0 0,-1 0-1 0 0,1 0 1 0 0,-1 0-1 0 0,1 1 1 0 0,-1-1 0 0 0,1 0-1 0 0,-1 0 1 0 0,1 1-1 0 0,-2 0 1 0 0,-13 4-18 0 0,0 1 0 0 0,0 1 1 0 0,0 0-1 0 0,1 1 0 0 0,-16 12 0 0 0,26-16 81 0 0,-1 0 0 0 0,2 0 0 0 0,-1 0 0 0 0,0 1 0 0 0,1 0 1 0 0,0 0-1 0 0,0 0 0 0 0,1 0 0 0 0,-1 0 0 0 0,1 1 0 0 0,0 0 0 0 0,1 0 0 0 0,-1 0 0 0 0,1 0 0 0 0,0 0 0 0 0,1 0 0 0 0,-2 9 0 0 0,3-10-43 0 0,-1-1 0 0 0,2 1 0 0 0,-1-1 0 0 0,0 1 0 0 0,1-1 0 0 0,0 1-1 0 0,0-1 1 0 0,0 0 0 0 0,1 1 0 0 0,-1-1 0 0 0,1 0 0 0 0,0 0 0 0 0,0 0 0 0 0,4 5 0 0 0,-1-3-13 0 0,0 1-1 0 0,0-1 1 0 0,1 0 0 0 0,0 0 0 0 0,0-1 0 0 0,1 0 0 0 0,11 8 0 0 0,-10-9 30 0 0,-1 1 0 0 0,0-1 0 0 0,1-1 0 0 0,0 0 0 0 0,-1 0 1 0 0,1 0-1 0 0,1-1 0 0 0,-1 0 0 0 0,0-1 0 0 0,0 1 0 0 0,1-2 0 0 0,-1 1 0 0 0,1-1 0 0 0,-1-1 0 0 0,0 1 0 0 0,14-4 0 0 0,-13 1 19 0 0,0 0 0 0 0,0 0-1 0 0,-1-1 1 0 0,1-1 0 0 0,-1 1-1 0 0,0-1 1 0 0,0-1 0 0 0,0 0-1 0 0,-1 0 1 0 0,0 0 0 0 0,0-1-1 0 0,-1 0 1 0 0,1 0-1 0 0,-1-1 1 0 0,-1 1 0 0 0,0-1-1 0 0,0-1 1 0 0,0 1 0 0 0,-1-1-1 0 0,-1 1 1 0 0,6-18 0 0 0,3-2 566 0 0,-23 48-322 0 0,9-18-301 0 0,1 1 0 0 0,0 0 1 0 0,-1 0-1 0 0,1-1 0 0 0,0 1 0 0 0,0 0 1 0 0,1 0-1 0 0,-1 0 0 0 0,1 0 0 0 0,-1 0 1 0 0,1 0-1 0 0,0 0 0 0 0,0 0 0 0 0,1 5 1 0 0,-1-8 0 0 0,0-1 0 0 0,0 1 0 0 0,0 0 0 0 0,0 0 0 0 0,0 0 0 0 0,0 0 0 0 0,-1 0 0 0 0,1 0 0 0 0,0 0 0 0 0,0 0 0 0 0,0 0-1 0 0,0 0 1 0 0,0 0 0 0 0,0 0 0 0 0,0 0 0 0 0,0 0 0 0 0,0 0 0 0 0,0 0 0 0 0,0 0 0 0 0,0 0 0 0 0,0 0 0 0 0,0 0 0 0 0,0 0 0 0 0,0 0 0 0 0,0 0 0 0 0,0 0 0 0 0,-1 0 0 0 0,1 0 0 0 0,0 0 0 0 0,0 0 0 0 0,0 0 0 0 0,0 0 0 0 0,0 0 0 0 0,0 0 0 0 0,9 36 2 0 0,-9-36 0 0 0,0 1 0 0 0,0 0 0 0 0,0-1-1 0 0,0 1 1 0 0,0-1 0 0 0,1 1 0 0 0,-1 0 0 0 0,0-1 0 0 0,0 1 0 0 0,0-1 0 0 0,1 1-1 0 0,-1-1 1 0 0,0 1 0 0 0,0-1 0 0 0,1 1 0 0 0,-1-1 0 0 0,0 1 0 0 0,1-1 0 0 0,-1 1-1 0 0,1-1 1 0 0,-1 1 0 0 0,1-1 0 0 0,-1 0 0 0 0,1 1 0 0 0,-1-1 0 0 0,1 0 0 0 0,-1 0-1 0 0,1 1 1 0 0,-1-1 0 0 0,1 0 0 0 0,-1 0 0 0 0,2 1 0 0 0,5 1 24 0 0,-1 1-15 0 0,-4-1-3 0 0,0-1 0 0 0,0 0-1 0 0,0 0 1 0 0,0 0-1 0 0,0 0 1 0 0,0-1 0 0 0,0 1-1 0 0,0 0 1 0 0,0-1-1 0 0,0 0 1 0 0,4 1 0 0 0,-2-1 6 0 0,-1-1 1 0 0,1 0 0 0 0,-1 1 0 0 0,1-1 0 0 0,-1-1-1 0 0,0 1 1 0 0,1 0 0 0 0,-1-1 0 0 0,0 0 0 0 0,0 0 0 0 0,0 1-1 0 0,0-2 1 0 0,0 1 0 0 0,0 0 0 0 0,-1-1 0 0 0,1 1-1 0 0,3-6 1 0 0,2-3 48 0 0,0 0 0 0 0,-1 0-1 0 0,9-18 1 0 0,-15 28-59 0 0,-1 1 0 0 0,0 0 0 0 0,1 0 0 0 0,-1 0 0 0 0,0-1 0 0 0,1 1 0 0 0,-1 0-1 0 0,0 0 1 0 0,1 0 0 0 0,-1 0 0 0 0,1 0 0 0 0,-1 0 0 0 0,0 0 0 0 0,1 0 0 0 0,-1 0 0 0 0,1 0 0 0 0,-1 0 0 0 0,0 0 0 0 0,1 0 0 0 0,-1 0 0 0 0,0 0 0 0 0,1 0-1 0 0,-1 0 1 0 0,1 0 0 0 0,-1 1 0 0 0,0-1 0 0 0,1 0 0 0 0,-1 0 0 0 0,0 0 0 0 0,1 1 0 0 0,-1-1 0 0 0,1 1 0 0 0,15 10 220 0 0,-11-8-150 0 0,16 12 108 0 0,-20-14-176 0 0,1 0 0 0 0,-1 0 0 0 0,1 1 0 0 0,0-1 0 0 0,-1 0 0 0 0,1 0 0 0 0,0-1 0 0 0,0 1 1 0 0,-1 0-1 0 0,1 0 0 0 0,3 0 0 0 0,14 9 241 0 0,-16-8-777 0 0,0 1 0 0 0,0-1 1 0 0,0 0-1 0 0,1-1 1 0 0,-1 1-1 0 0,0-1 0 0 0,7 3 1 0 0,16 2-598 0 0,-20-4-110 0 0</inkml:trace>
+  <inkml:trace contextRef="#ctx0" brushRef="#br0" timeOffset="2280.99">1565 26 4089 0 0,'0'0'1209'0'0,"0"0"-1132"0"0,0 0-1 0 0,0 0 1 0 0,0-1-1 0 0,0 1 1 0 0,0 0 0 0 0,0 0-1 0 0,0 0 1 0 0,0 0-1 0 0,0-1 1 0 0,0 1-1 0 0,0 0 1 0 0,0 0-1 0 0,0 0 1 0 0,0 0-1 0 0,0 0 1 0 0,0-1-1 0 0,0 1 1 0 0,-1 0-1 0 0,1 0 1 0 0,0 0-1 0 0,0 0 1 0 0,0 0-1 0 0,0 0 1 0 0,0 0-1 0 0,0-1 1 0 0,0 1-1 0 0,0 0 1 0 0,-1 0-1 0 0,1 0 1 0 0,0 0-1 0 0,0 0 1 0 0,0 0-1 0 0,0 0 1 0 0,0 0-1 0 0,-1 0 1 0 0,1 0-1 0 0,0 0 1 0 0,0 0-1 0 0,0 0 1 0 0,0 0-1 0 0,0 0 1 0 0,-1 0-1 0 0,1 0 1 0 0,0 0-1 0 0,0 0 1 0 0,0 0-1 0 0,0 0 1 0 0,0 0-1 0 0,-1 0 1 0 0,1 0-1 0 0,0 0 1 0 0,0 0-1 0 0,0 0 1 0 0,0 0-1 0 0,0 0 1 0 0,-1 0-1 0 0,-1 5-10 0 0,-1 0-1 0 0,1 1 0 0 0,0-1 1 0 0,1 0-1 0 0,-1 0 1 0 0,1 1-1 0 0,0-1 0 0 0,1 1 1 0 0,-1-1-1 0 0,1 7 0 0 0,3 67 129 0 0,-2-49-157 0 0,4 73-83 0 0,21 127 0 0 0,-23-221-74 0 0,0 3-3773 0 0</inkml:trace>
+  <inkml:trace contextRef="#ctx0" brushRef="#br0" timeOffset="2798.33">1444 424 2192 0 0,'0'0'112'0'0,"-1"0"0"0"0,1 0 0 0 0,0-1-1 0 0,-1 1 1 0 0,1 0 0 0 0,0 0 0 0 0,0-1-1 0 0,-1 1 1 0 0,1 0 0 0 0,0-1 0 0 0,0 1-1 0 0,-1 0 1 0 0,1-1 0 0 0,0 1-1 0 0,0 0 1 0 0,0-1 0 0 0,0 1 0 0 0,-1-1-1 0 0,1 1 1 0 0,0 0 0 0 0,0-1 0 0 0,0 1-1 0 0,0-1 1 0 0,0 1 0 0 0,0-1 0 0 0,0 1-1 0 0,0 0 1 0 0,0-1 0 0 0,0 1-1 0 0,0-1 1 0 0,1 1 0 0 0,-1 0 0 0 0,0-1-1 0 0,0 1 1 0 0,0-1 0 0 0,0 1 0 0 0,1 0-1 0 0,-1-1 1 0 0,0 1 0 0 0,0 0 0 0 0,1-1-1 0 0,-1 1 1 0 0,0 0 0 0 0,1 0-1 0 0,-1-1 1 0 0,12-18 1969 0 0,25-6-1791 0 0,-37 24-276 0 0,0 1-1 0 0,0 0 0 0 0,1-1 0 0 0,-1 1 0 0 0,0 0 0 0 0,1-1 0 0 0,-1 1 0 0 0,0 0 1 0 0,1-1-1 0 0,-1 1 0 0 0,1 0 0 0 0,-1 0 0 0 0,1-1 0 0 0,-1 1 0 0 0,0 0 0 0 0,1 0 1 0 0,-1 0-1 0 0,1 0 0 0 0,-1 0 0 0 0,1-1 0 0 0,-1 1 0 0 0,1 0 0 0 0,-1 0 0 0 0,1 0 1 0 0,-1 0-1 0 0,1 0 0 0 0,-1 1 0 0 0,1-1 0 0 0,-1 0 0 0 0,1 0 0 0 0,-1 0 0 0 0,1 0 1 0 0,-1 0-1 0 0,0 1 0 0 0,1-1 0 0 0,-1 0 0 0 0,1 0 0 0 0,-1 1 0 0 0,0-1 0 0 0,1 0 1 0 0,-1 1-1 0 0,0-1 0 0 0,1 1 0 0 0,6 5 43 0 0,3 2-14 0 0,1-1 0 0 0,-1 0 1 0 0,1-1-1 0 0,19 8 0 0 0,-26-13-198 0 0,0 0 1 0 0,0 1-1 0 0,0-2 1 0 0,0 1-1 0 0,0 0 0 0 0,0-1 1 0 0,0 0-1 0 0,0 0 1 0 0,0 0-1 0 0,1 0 1 0 0,-1-1-1 0 0,0 1 0 0 0,0-1 1 0 0,0 0-1 0 0,0-1 1 0 0,0 1-1 0 0,0-1 0 0 0,-1 1 1 0 0,8-5-1 0 0,5-6-909 0 0,-7 6 943 0 0</inkml:trace>
+  <inkml:trace contextRef="#ctx0" brushRef="#br0" timeOffset="3356.09">1840 346 3401 0 0,'0'0'3806'0'0,"-2"3"-3743"0"0,-1 3-50 0 0,0 1 0 0 0,0-1 0 0 0,0 1 0 0 0,0 0 0 0 0,1 0 0 0 0,1 0 0 0 0,-1 0 0 0 0,1 0 0 0 0,-1 12 1 0 0,2-14-7 0 0,-1 0 0 0 0,1 0 0 0 0,0 0 0 0 0,0 1 0 0 0,1-1 0 0 0,-1 0 0 0 0,1 0 0 0 0,1 0 0 0 0,-1 0 0 0 0,1 0 0 0 0,-1 0 0 0 0,1 0 0 0 0,1-1 0 0 0,4 9 0 0 0,-6-11 12 0 0,1 0 0 0 0,0-1 0 0 0,-1 1 0 0 0,1-1 0 0 0,0 1 0 0 0,0-1 1 0 0,0 0-1 0 0,-1 0 0 0 0,1 0 0 0 0,0 0 0 0 0,1 0 0 0 0,-1 0 0 0 0,0 0 1 0 0,0-1-1 0 0,0 1 0 0 0,0-1 0 0 0,1 0 0 0 0,-1 0 0 0 0,5 0 642 0 0,-10-26 1203 0 0,4 24-1851 0 0,-1 0-1 0 0,0 0 0 0 0,-1 0 1 0 0,1 0-1 0 0,0 0 1 0 0,0 0-1 0 0,-1 0 1 0 0,1 0-1 0 0,-1 0 0 0 0,0 1 1 0 0,0-1-1 0 0,-1-3 1 0 0,-2 0 71 0 0,0 0 1 0 0,-1 0 0 0 0,1 0 0 0 0,-1 1 0 0 0,0 0 0 0 0,0 0 0 0 0,-7-5 0 0 0,6 6-43 0 0,0-3 62 0 0,7 2-115 0 0,1 1 0 0 0,0-1 0 0 0,0 1 0 0 0,0 0 0 0 0,0-1 0 0 0,0 1 0 0 0,1 0-1 0 0,0 1 1 0 0,-1-1 0 0 0,1 0 0 0 0,0 1 0 0 0,0-1 0 0 0,1 1 0 0 0,-1 0 0 0 0,4-2 0 0 0,7-2-23 0 0,0 0 1 0 0,0 1-1 0 0,1 0 1 0 0,-1 2 0 0 0,1-1-1 0 0,18 0 1 0 0,41-12-3622 0 0,-67 15 2699 0 0,-1 1-138 0 0</inkml:trace>
+  <inkml:trace contextRef="#ctx0" brushRef="#br0" timeOffset="3740.67">2229 335 4217 0 0,'0'0'95'0'0,"0"-1"-1"0"0,0 1 1 0 0,0 0 0 0 0,0-1 0 0 0,1 1-1 0 0,-1 0 1 0 0,0 0 0 0 0,0-1-1 0 0,0 1 1 0 0,0 0 0 0 0,1-1 0 0 0,-1 1-1 0 0,0 0 1 0 0,0 0 0 0 0,1-1 0 0 0,-1 1-1 0 0,0 0 1 0 0,0 0 0 0 0,1 0-1 0 0,-1 0 1 0 0,0-1 0 0 0,1 1 0 0 0,-1 0-1 0 0,0 0 1 0 0,1 0 0 0 0,-1 0 0 0 0,0 0-1 0 0,1 0 1 0 0,-1 0 0 0 0,0 0-1 0 0,1 0 1 0 0,-1 0 0 0 0,0 0 0 0 0,1 0-1 0 0,0 0 1 0 0,8 10 1419 0 0,2 19-612 0 0,-8 20-538 0 0,-3-42-416 0 0,0 0 0 0 0,0 0 0 0 0,0-1 0 0 0,1 1 0 0 0,0 0 0 0 0,0 0 0 0 0,1-1 0 0 0,0 1 0 0 0,0-1 0 0 0,0 0 0 0 0,1 1 0 0 0,0-1 0 0 0,0 0 0 0 0,5 7 0 0 0,-6-10-558 0 0,1 1-319 0 0</inkml:trace>
+  <inkml:trace contextRef="#ctx0" brushRef="#br0" timeOffset="3921.31">2292 212 3929 0 0,'-1'-2'370'0'0,"0"0"1"0"0,0 0-1 0 0,0 0 0 0 0,0 0 1 0 0,0 0-1 0 0,1 0 1 0 0,-1 0-1 0 0,1 0 1 0 0,0-1-1 0 0,-1 1 0 0 0,1-4 1 0 0,0 6-415 0 0</inkml:trace>
+  <inkml:trace contextRef="#ctx0" brushRef="#br0" timeOffset="5174.93">2503 367 1624 0 0,'0'0'4464'0'0,"2"2"-4200"0"0,1 0-1 0 0,-1 0 1 0 0,0 0-1 0 0,1 0 1 0 0,-1-1 0 0 0,1 1-1 0 0,0-1 1 0 0,5 2-1 0 0,-3-1-237 0 0,1-1-1 0 0,0 1 0 0 0,0-2 0 0 0,0 1 0 0 0,0-1 0 0 0,0 0 0 0 0,1 0 0 0 0,-1 0 0 0 0,0-1 0 0 0,0 0 0 0 0,0 0 0 0 0,9-4 0 0 0,-9 2-2 0 0,1 0-1 0 0,-1-1 1 0 0,0 0 0 0 0,0 0 0 0 0,9-9-1 0 0,-14 12-17 0 0,0-1 0 0 0,1 1-1 0 0,-1 0 1 0 0,0-1-1 0 0,0 1 1 0 0,0 0-1 0 0,-1-1 1 0 0,1 0-1 0 0,0 1 1 0 0,0-1 0 0 0,-1 1-1 0 0,1-1 1 0 0,-1 0-1 0 0,1 1 1 0 0,-1-1-1 0 0,0 0 1 0 0,0 1 0 0 0,0-1-1 0 0,0 0 1 0 0,0 0-1 0 0,0 1 1 0 0,0-1-1 0 0,-1 0 1 0 0,1 1-1 0 0,0-1 1 0 0,-1 0 0 0 0,1 1-1 0 0,-1-1 1 0 0,-1-2-1 0 0,1 2-3 0 0,-1 1 0 0 0,1-1 0 0 0,0 1 0 0 0,0 0 0 0 0,-1 0 0 0 0,1-1 0 0 0,-1 1 0 0 0,1 0 0 0 0,-1 0 0 0 0,0 0 0 0 0,1 1 0 0 0,-1-1 0 0 0,0 0 0 0 0,1 1-1 0 0,-1-1 1 0 0,0 1 0 0 0,0-1 0 0 0,0 1 0 0 0,1 0 0 0 0,-1 0 0 0 0,0 0 0 0 0,0 0 0 0 0,0 0 0 0 0,0 0 0 0 0,1 0 0 0 0,-1 1 0 0 0,0-1 0 0 0,0 1 0 0 0,0-1 0 0 0,1 1 0 0 0,-4 1 0 0 0,0 0 3 0 0,0 0 1 0 0,0 1 0 0 0,0 0-1 0 0,0-1 1 0 0,0 1 0 0 0,0 1-1 0 0,1-1 1 0 0,0 1 0 0 0,-5 5 0 0 0,-11 12 13 0 0,18-19 18 0 0,0 0-1 0 0,0 0 0 0 0,0-1 1 0 0,0 2-1 0 0,0-1 1 0 0,1 0-1 0 0,-1 0 1 0 0,1 1-1 0 0,-1-1 1 0 0,1 0-1 0 0,0 1 1 0 0,0-1-1 0 0,0 1 1 0 0,0 0-1 0 0,0-1 0 0 0,1 1 1 0 0,-1 0-1 0 0,1 0 1 0 0,0-1-1 0 0,0 1 1 0 0,0 0-1 0 0,0 0 1 0 0,1 4-1 0 0,-1-3-8 0 0,0 0-1 0 0,1 0 1 0 0,0 0 0 0 0,0 0-1 0 0,0 0 1 0 0,0 0-1 0 0,1 0 1 0 0,-1 0 0 0 0,1-1-1 0 0,0 1 1 0 0,0-1 0 0 0,1 1-1 0 0,-1-1 1 0 0,0 0-1 0 0,1 0 1 0 0,0 0 0 0 0,0 0-1 0 0,0 0 1 0 0,0-1 0 0 0,0 1-1 0 0,1-1 1 0 0,-1 0-1 0 0,1 0 1 0 0,0 0 0 0 0,4 1-1 0 0,1 2-24 0 0,0-1 1 0 0,0 0-1 0 0,1 0 0 0 0,-1-1 0 0 0,1 0 0 0 0,0-1 0 0 0,0 0 0 0 0,0-1 1 0 0,0 0-1 0 0,0 0 0 0 0,0-1 0 0 0,0-1 0 0 0,0 1 0 0 0,0-2 1 0 0,0 1-1 0 0,0-2 0 0 0,14-4 0 0 0,-22 7 6 0 0,-1-1 1 0 0,1 0-1 0 0,-1 1 1 0 0,1-1-1 0 0,-1 0 1 0 0,0 0-1 0 0,1 0 1 0 0,-1 0-1 0 0,0 0 0 0 0,1-1 1 0 0,-1 1-1 0 0,0 0 1 0 0,0-1-1 0 0,0 1 1 0 0,0 0-1 0 0,-1-1 1 0 0,1 1-1 0 0,0-1 0 0 0,0 0 1 0 0,-1 1-1 0 0,1-1 1 0 0,-1 1-1 0 0,0-1 1 0 0,1 0-1 0 0,-1 0 1 0 0,0 1-1 0 0,0-1 0 0 0,0 0 1 0 0,0 1-1 0 0,0-1 1 0 0,-1 0-1 0 0,1 1 1 0 0,0-1-1 0 0,-1 0 1 0 0,1 1-1 0 0,-1-1 0 0 0,0 1 1 0 0,1-1-1 0 0,-1 1 1 0 0,0-1-1 0 0,0 1 1 0 0,0-1-1 0 0,0 1 1 0 0,0 0-1 0 0,0-1 0 0 0,0 1 1 0 0,-1 0-1 0 0,1 0 1 0 0,0 0-1 0 0,-2-1 1 0 0,2 1 18 0 0,0 0 0 0 0,0 0 0 0 0,1 0 0 0 0,-1 0 0 0 0,0-1 0 0 0,1 1 0 0 0,-1 0-1 0 0,1 0 1 0 0,0 0 0 0 0,-1-1 0 0 0,1 1 0 0 0,0 0 0 0 0,0-1 0 0 0,0 1 0 0 0,0 0 0 0 0,0 0 0 0 0,0-1 0 0 0,0 1 0 0 0,0 0 0 0 0,1-1 0 0 0,-1 1 0 0 0,0 0 0 0 0,1 0 0 0 0,-1-1 0 0 0,1 1 0 0 0,-1 0 0 0 0,1 0 0 0 0,0 0 0 0 0,-1 0 0 0 0,1 0 0 0 0,0 0 0 0 0,0 0 0 0 0,0 0 0 0 0,0 0 0 0 0,2-1 0 0 0,-1 0-47 0 0,1 1 0 0 0,-1 1 0 0 0,1-1 1 0 0,-1 0-1 0 0,1 0 0 0 0,-1 1 1 0 0,1 0-1 0 0,0-1 0 0 0,-1 1 0 0 0,1 0 1 0 0,0 0-1 0 0,-1 1 0 0 0,1-1 1 0 0,-1 0-1 0 0,1 1 0 0 0,0-1 0 0 0,-1 1 1 0 0,1 0-1 0 0,-1 0 0 0 0,0 0 1 0 0,1 0-1 0 0,3 3 0 0 0,-2-2-109 0 0,1 0 0 0 0,0 0 0 0 0,-1-1 0 0 0,1 1 0 0 0,0-1-1 0 0,0 0 1 0 0,0-1 0 0 0,0 1 0 0 0,0-1 0 0 0,0 0 0 0 0,5-1 0 0 0,33-9-4310 0 0,-35 8 3159 0 0</inkml:trace>
+  <inkml:trace contextRef="#ctx0" brushRef="#br0" timeOffset="5981.97">3170 36 5377 0 0,'-8'-3'4857'0'0,"-2"11"-3287"0"0,1 14-1849 0 0,7 12 244 0 0,1 0 0 0 0,2-1 0 0 0,1 1 0 0 0,1 0 0 0 0,2-1 0 0 0,2 0 0 0 0,0 0 0 0 0,3 0-1 0 0,15 36 1 0 0,-23-57-192 0 0,-11-19-139 0 0,-8-7 219 0 0,-11-8 149 0 0,22 18 3 0 0,3 2-2 0 0,-4 2 7 0 0,-2-3 1 0 0,0 1 0 0 0,1 0 0 0 0,-1 1 0 0 0,0 0 0 0 0,0 0 0 0 0,0 1 0 0 0,0 0 0 0 0,0 1 0 0 0,-10 1 0 0 0,19-1 402 0 0,7-2 74 0 0,26 0-139 0 0,33-7 1 0 0,-56 6-838 0 0,-1 0 0 0 0,1 0 0 0 0,0-1 0 0 0,-1-1 0 0 0,1 0-1 0 0,-1 0 1 0 0,0 0 0 0 0,9-7 0 0 0,-11 6 249 0 0,0 0-326 0 0</inkml:trace>
+  <inkml:trace contextRef="#ctx0" brushRef="#br0" timeOffset="6556.61">3575 1 1816 0 0,'0'0'7770'0'0,"0"11"-6007"0"0,1 12-1488 0 0,0 0 0 0 0,-5 38 0 0 0,1-35-254 0 0,2 0-1 0 0,2 36 1 0 0,3 13-82 0 0,-5-56 3 0 0,2 0 0 0 0,0-1 1 0 0,1 1-1 0 0,1 0 0 0 0,1-1 1 0 0,0 1-1 0 0,9 19 0 0 0,-8-28-191 0 0,3 5-356 0 0,-6-8-3797 0 0</inkml:trace>
+  <inkml:trace contextRef="#ctx0" brushRef="#br0" timeOffset="7116.94">3726 736 1048 0 0,'0'0'150'0'0,"-18"-13"6504"0"0,-10 9-6188 0 0,21 2-374 0 0,0 0 173 0 0,-6 8 1065 0 0,3-1-1239 0 0,0 1 0 0 0,1 0 0 0 0,0 1 0 0 0,0 0 0 0 0,0 0 0 0 0,1 1-1 0 0,0 0 1 0 0,0 0 0 0 0,-10 16 0 0 0,18-23-89 0 0,-1-1 0 0 0,1 1 0 0 0,0-1 0 0 0,0 0 0 0 0,-1 1 0 0 0,1-1-1 0 0,0 1 1 0 0,0 0 0 0 0,0-1 0 0 0,-1 1 0 0 0,1-1 0 0 0,0 1 0 0 0,0-1 0 0 0,0 1 0 0 0,0-1-1 0 0,0 1 1 0 0,0-1 0 0 0,0 1 0 0 0,0 0 0 0 0,0-1 0 0 0,0 1 0 0 0,1-1 0 0 0,-1 1-1 0 0,0-1 1 0 0,0 1 0 0 0,0-1 0 0 0,1 1 0 0 0,-1-1 0 0 0,0 1 0 0 0,1 0 0 0 0,16 2 129 0 0,20-11 87 0 0,-36 8-216 0 0,5-3 27 0 0,0 1 1 0 0,0-1-1 0 0,0 0 1 0 0,-1-1-1 0 0,1 1 0 0 0,8-8 1 0 0,-12 9-11 0 0,0 1 1 0 0,0-1-1 0 0,0 0 1 0 0,-1 1-1 0 0,1-1 1 0 0,0 0 0 0 0,-1 0-1 0 0,0 0 1 0 0,1 0-1 0 0,-1 0 1 0 0,0-1-1 0 0,0 1 1 0 0,0 0-1 0 0,0-1 1 0 0,0 1-1 0 0,-1 0 1 0 0,1-1-1 0 0,-1 1 1 0 0,1-1-1 0 0,-1-3 1 0 0,0 6-11 0 0,0 0 0 0 0,0-1 0 0 0,-1 1 1 0 0,1 0-1 0 0,0-1 0 0 0,0 1 0 0 0,0 0 0 0 0,0-1 0 0 0,0 1 1 0 0,-1 0-1 0 0,1-1 0 0 0,0 1 0 0 0,0 0 0 0 0,-1 0 1 0 0,1-1-1 0 0,0 1 0 0 0,0 0 0 0 0,-1 0 0 0 0,1 0 0 0 0,0-1 1 0 0,-1 1-1 0 0,1 0 0 0 0,0 0 0 0 0,-1 0 0 0 0,1 0 0 0 0,0 0 1 0 0,-1 0-1 0 0,1 0 0 0 0,0 0 0 0 0,-1-1 0 0 0,1 1 1 0 0,0 0-1 0 0,-1 0 0 0 0,1 1 0 0 0,0-1 0 0 0,-1 0 0 0 0,1 0 1 0 0,0 0-1 0 0,-1 0 0 0 0,1 0 0 0 0,-23 9 22 0 0,-11 6-42 0 0,33-14 7 0 0,3-1-1 0 0,-4 4-43 0 0,1-4 48 0 0,1 1 0 0 0,0-1 1 0 0,-1 0-1 0 0,1 0 0 0 0,0 1 0 0 0,0-1 0 0 0,-1 0 1 0 0,1 1-1 0 0,0-1 0 0 0,0 0 0 0 0,-1 1 0 0 0,1-1 1 0 0,0 0-1 0 0,0 1 0 0 0,0-1 0 0 0,0 0 0 0 0,-1 1 0 0 0,1-1 1 0 0,0 1-1 0 0,0-1 0 0 0,0 0 0 0 0,0 1 0 0 0,0-1 1 0 0,0 1-1 0 0,0-1 0 0 0,0 1 0 0 0,0-1 0 0 0,0 0 0 0 0,0 1 1 0 0,0-1-1 0 0,1 1 0 0 0,-1-1 0 0 0,0 0 0 0 0,0 1 1 0 0,0-1-1 0 0,1 0 0 0 0,-1 1 0 0 0,0-1 0 0 0,0 0 1 0 0,1 1-1 0 0,-1-1 0 0 0,0 0 0 0 0,0 1 0 0 0,1-1 0 0 0,-1 0 1 0 0,0 0-1 0 0,1 1 0 0 0,-1-1 0 0 0,0 0 0 0 0,1 0 1 0 0,-1 0-1 0 0,1 0 0 0 0,-1 0 0 0 0,0 1 0 0 0,1-1 1 0 0,-1 0-1 0 0,1 0 0 0 0,-1 0 0 0 0,0 0 0 0 0,1 0 0 0 0,0 0 1 0 0,2 0 3 0 0,0 0 1 0 0,-1 0-1 0 0,1 0 1 0 0,0 0-1 0 0,0-1 1 0 0,-1 1-1 0 0,1-1 1 0 0,0 0-1 0 0,-1 1 1 0 0,1-1-1 0 0,-1-1 1 0 0,1 1-1 0 0,-1 0 1 0 0,1 0-1 0 0,-1-1 1 0 0,0 1-1 0 0,0-1 1 0 0,1 0-1 0 0,-1 0 1 0 0,0 0-1 0 0,-1 0 1 0 0,1 0-1 0 0,0 0 1 0 0,-1 0-1 0 0,1-1 1 0 0,-1 1-1 0 0,0-1 1 0 0,1 1-1 0 0,-1-1 1 0 0,0 1-1 0 0,-1-1 1 0 0,1 0-1 0 0,0-4 1 0 0,-1 7-16 0 0,0-1 0 0 0,0 1 1 0 0,0-1-1 0 0,0 1 0 0 0,0-1 0 0 0,0 1 0 0 0,0-1 1 0 0,0 1-1 0 0,0-1 0 0 0,0 1 0 0 0,0-1 0 0 0,0 1 1 0 0,-1-1-1 0 0,1 1 0 0 0,0-1 0 0 0,0 1 0 0 0,-1 0 1 0 0,1-1-1 0 0,0 1 0 0 0,-1-1 0 0 0,1 1 1 0 0,0 0-1 0 0,-1-1 0 0 0,1 1 0 0 0,-1 0 0 0 0,1-1 1 0 0,0 1-1 0 0,-1 0 0 0 0,1 0 0 0 0,-1-1 0 0 0,-17 3-1171 0 0,-17 17-3193 0 0,27-12 2680 0 0</inkml:trace>
+  <inkml:trace contextRef="#ctx0" brushRef="#br0" timeOffset="8040.3">3146 323 288 0 0,'0'0'1288'0'0,"-9"-7"3628"0"0,8 14-4679 0 0,-1-1 0 0 0,1 0 0 0 0,0 0 0 0 0,1 0 0 0 0,0 10 0 0 0,0-9-159 0 0,-2 3 18 0 0,0 5 19 0 0,0-1-1 0 0,1 0 0 0 0,1 20 0 0 0,1-29-91 0 0,-1 0 0 0 0,2 0 1 0 0,-1 0-1 0 0,0 0 0 0 0,1 0 0 0 0,0 0 0 0 0,0 0 1 0 0,1 0-1 0 0,-1-1 0 0 0,1 1 0 0 0,6 7 0 0 0,-4-6 0 0 0,-1 0 0 0 0,0 1 0 0 0,-1-1 0 0 0,0 1 0 0 0,0 0 0 0 0,0 0 0 0 0,2 10 0 0 0,-4-13-14 0 0,0 0 0 0 0,0 0 1 0 0,-1 0-1 0 0,1 0 0 0 0,-1 0 0 0 0,0 0 0 0 0,0 0 0 0 0,0 0 1 0 0,0 0-1 0 0,-1 0 0 0 0,0 0 0 0 0,0 0 0 0 0,0 0 1 0 0,0 0-1 0 0,-3 5 0 0 0,-9-6 270 0 0</inkml:trace>
 </inkml:ink>
 </file>
 
@@ -16191,6 +17841,10 @@
 </file>
 
 <file path=customXml/item3.xml><?xml version="1.0" encoding="utf-8"?>
+<b:Sources xmlns:b="http://schemas.openxmlformats.org/officeDocument/2006/bibliography" xmlns="http://schemas.openxmlformats.org/officeDocument/2006/bibliography" SelectedStyle="\APASixthEditionOfficeOnline.xsl" StyleName="APA" Version="6"/>
+</file>
+
+<file path=customXml/item4.xml><?xml version="1.0" encoding="utf-8"?>
 <inkml:ink xmlns:inkml="http://www.w3.org/2003/InkML">
   <inkml:definitions>
     <inkml:context xml:id="ctx0">
@@ -16224,17 +17878,36 @@
 </inkml:ink>
 </file>
 
-<file path=customXml/item4.xml><?xml version="1.0" encoding="utf-8"?>
-<?mso-contentType ?>
-<FormTemplates xmlns="http://schemas.microsoft.com/sharepoint/v3/contenttype/forms">
-  <Display>DocumentLibraryForm</Display>
-  <Edit>DocumentLibraryForm</Edit>
-  <New>DocumentLibraryForm</New>
-</FormTemplates>
-</file>
-
 <file path=customXml/item5.xml><?xml version="1.0" encoding="utf-8"?>
-<b:Sources xmlns:b="http://schemas.openxmlformats.org/officeDocument/2006/bibliography" xmlns="http://schemas.openxmlformats.org/officeDocument/2006/bibliography" SelectedStyle="\APASixthEditionOfficeOnline.xsl" StyleName="APA" Version="6"/>
+<inkml:ink xmlns:inkml="http://www.w3.org/2003/InkML">
+  <inkml:definitions>
+    <inkml:context xml:id="ctx0">
+      <inkml:inkSource xml:id="inkSrc0">
+        <inkml:traceFormat>
+          <inkml:channel name="X" type="integer" min="-2.14748E9" max="2.14748E9" units="cm"/>
+          <inkml:channel name="Y" type="integer" min="-2.14748E9" max="2.14748E9" units="cm"/>
+          <inkml:channel name="F" type="integer" max="32767" units="dev"/>
+          <inkml:channel name="OA" type="integer" max="360" units="deg"/>
+          <inkml:channel name="OE" type="integer" max="90" units="deg"/>
+        </inkml:traceFormat>
+        <inkml:channelProperties>
+          <inkml:channelProperty channel="X" name="resolution" value="1000" units="1/cm"/>
+          <inkml:channelProperty channel="Y" name="resolution" value="1000" units="1/cm"/>
+          <inkml:channelProperty channel="F" name="resolution" value="0" units="1/dev"/>
+          <inkml:channelProperty channel="OA" name="resolution" value="1000" units="1/deg"/>
+          <inkml:channelProperty channel="OE" name="resolution" value="1000" units="1/deg"/>
+        </inkml:channelProperties>
+      </inkml:inkSource>
+      <inkml:timestamp xml:id="ts0" timeString="2025-06-10T16:08:50.568"/>
+    </inkml:context>
+    <inkml:brush xml:id="br0">
+      <inkml:brushProperty name="width" value="0.05" units="cm"/>
+      <inkml:brushProperty name="height" value="0.05" units="cm"/>
+      <inkml:brushProperty name="color" value="#E71224"/>
+    </inkml:brush>
+  </inkml:definitions>
+  <inkml:trace contextRef="#ctx0" brushRef="#br0">1236 239 3217 0 0,'-18'-44'2449'0'0,"11"24"-2251"0"0,-2 1 0 0 0,-14-27 0 0 0,19 39-210 0 0,-1 0 0 0 0,0 1-1 0 0,0 0 1 0 0,-1-1 0 0 0,0 2 0 0 0,0-1-1 0 0,0 1 1 0 0,0 0 0 0 0,-14-8-1 0 0,8 6-57 0 0,-1 1 0 0 0,1 1 1 0 0,-1 0-1 0 0,0 0 0 0 0,0 1 0 0 0,0 1 0 0 0,0 0 0 0 0,-1 1 0 0 0,-22-1 0 0 0,19 4-190 0 0,0 0-1 0 0,0 1 1 0 0,0 1-1 0 0,1 0 1 0 0,-1 1-1 0 0,1 1 1 0 0,-21 9-1 0 0,-37 17-295 0 0,-131 76-1 0 0,173-87 985 0 0,0 2 0 0 0,2 1 0 0 0,1 2 0 0 0,1 0 0 0 0,1 2 0 0 0,-28 37 0 0 0,-16 22-328 0 0,-54 78 18 0 0,113-145-112 0 0,0 0 1 0 0,2 1-1 0 0,1 0 0 0 0,0 0 0 0 0,2 1 1 0 0,0 0-1 0 0,-5 27 0 0 0,4 3 6 0 0,3 0-1 0 0,1 0 0 0 0,3 0 1 0 0,2 1-1 0 0,2-1 1 0 0,13 62-1 0 0,-11-89 37 0 0,1-1 0 0 0,2 1 0 0 0,0-1 0 0 0,1-1 0 0 0,1 0 0 0 0,2 0-1 0 0,0-1 1 0 0,1-1 0 0 0,1 0 0 0 0,1 0 0 0 0,25 25 0 0 0,-31-38 8 0 0,1 0 0 0 0,0-1 0 0 0,0 0 0 0 0,1-1-1 0 0,0 0 1 0 0,0 0 0 0 0,0-1 0 0 0,0 0 0 0 0,1-1 0 0 0,-1-1 0 0 0,1 0 0 0 0,23 1 0 0 0,0-2-27 0 0,-1-1 0 0 0,0-2 0 0 0,43-8 0 0 0,15-10 179 0 0,-1-4 0 0 0,111-46 0 0 0,-162 55-168 0 0,0 1-21 0 0,5-1 26 0 0,-2-3-1 0 0,45-23 0 0 0,-67 26 22 0 0,-1 0 0 0 0,0-2-1 0 0,-2 0 1 0 0,0-1 0 0 0,-1-1 0 0 0,0-1 0 0 0,-2 0-1 0 0,22-37 1 0 0,-28 39-39 0 0,0 1 1 0 0,-1-1-1 0 0,-1-1 0 0 0,-1 0 1 0 0,-1 1-1 0 0,0-2 0 0 0,-2 1 0 0 0,0 0 1 0 0,0-25-1 0 0,-2-13 167 0 0,-14-108-1 0 0,10 143-149 0 0,-1 0-1 0 0,0 1 1 0 0,-2-1-1 0 0,-1 1 1 0 0,-1 0-1 0 0,0 1 1 0 0,-1 0-1 0 0,-23-35 0 0 0,22 41 15 0 0,-1 0 0 0 0,0 0-1 0 0,-1 1 1 0 0,-1 0 0 0 0,0 1-1 0 0,0 1 1 0 0,-1 0 0 0 0,-1 1-1 0 0,0 0 1 0 0,0 1 0 0 0,-25-10-1 0 0,15 9-505 0 0,-1 1-1 0 0,0 2 1 0 0,0 0 0 0 0,-49-5-1 0 0,41 10-389 0 0</inkml:trace>
+</inkml:ink>
 </file>
 
 <file path=customXml/item6.xml><?xml version="1.0" encoding="utf-8"?>
@@ -16376,47 +18049,12 @@
 </file>
 
 <file path=customXml/item7.xml><?xml version="1.0" encoding="utf-8"?>
-<inkml:ink xmlns:inkml="http://www.w3.org/2003/InkML">
-  <inkml:definitions>
-    <inkml:context xml:id="ctx0">
-      <inkml:inkSource xml:id="inkSrc0">
-        <inkml:traceFormat>
-          <inkml:channel name="X" type="integer" min="-2.14748E9" max="2.14748E9" units="cm"/>
-          <inkml:channel name="Y" type="integer" min="-2.14748E9" max="2.14748E9" units="cm"/>
-          <inkml:channel name="F" type="integer" max="32767" units="dev"/>
-          <inkml:channel name="OA" type="integer" max="360" units="deg"/>
-          <inkml:channel name="OE" type="integer" max="90" units="deg"/>
-        </inkml:traceFormat>
-        <inkml:channelProperties>
-          <inkml:channelProperty channel="X" name="resolution" value="1000" units="1/cm"/>
-          <inkml:channelProperty channel="Y" name="resolution" value="1000" units="1/cm"/>
-          <inkml:channelProperty channel="F" name="resolution" value="0" units="1/dev"/>
-          <inkml:channelProperty channel="OA" name="resolution" value="1000" units="1/deg"/>
-          <inkml:channelProperty channel="OE" name="resolution" value="1000" units="1/deg"/>
-        </inkml:channelProperties>
-      </inkml:inkSource>
-      <inkml:timestamp xml:id="ts0" timeString="2025-06-10T16:08:54.030"/>
-    </inkml:context>
-    <inkml:brush xml:id="br0">
-      <inkml:brushProperty name="width" value="0.05" units="cm"/>
-      <inkml:brushProperty name="height" value="0.05" units="cm"/>
-      <inkml:brushProperty name="color" value="#E71224"/>
-    </inkml:brush>
-  </inkml:definitions>
-  <inkml:trace contextRef="#ctx0" brushRef="#br0">5 208 2425 0 0,'0'0'5878'0'0,"24"0"-3468"0"0,-17 1-2405 0 0,0 0 1 0 0,0 0-1 0 0,0 0 0 0 0,0 1 1 0 0,0 0-1 0 0,11 5 0 0 0,-9-5 40 0 0,0 0-1 0 0,0 0 0 0 0,0-1 0 0 0,1 0 1 0 0,-1 0-1 0 0,0-1 0 0 0,17-3 1 0 0,4 2 74 0 0,-22 1-105 0 0,1-1 1 0 0,0 2-1 0 0,-1-1 0 0 0,1 1 1 0 0,-1 0-1 0 0,1 1 1 0 0,-1 0-1 0 0,1 0 1 0 0,-1 1-1 0 0,14 7 0 0 0,-22-10-10 0 0,1 0 1 0 0,0 1-1 0 0,-1-1 0 0 0,1 1 0 0 0,0-1 0 0 0,-1 1 0 0 0,1-1 0 0 0,0 1 0 0 0,-1 0 0 0 0,1-1 0 0 0,-1 1 0 0 0,1 0 0 0 0,-1-1 0 0 0,0 1 0 0 0,1 0 0 0 0,-1 0 0 0 0,0-1 0 0 0,1 1 0 0 0,-1 0 0 0 0,0 0 0 0 0,0 0 0 0 0,0-1 0 0 0,0 1 0 0 0,0 0 1 0 0,0 0-1 0 0,0 0 0 0 0,0 0 0 0 0,0-1 0 0 0,0 1 0 0 0,0 0 0 0 0,0 0 0 0 0,-1 0 0 0 0,1-1 0 0 0,0 1 0 0 0,-1 0 0 0 0,1 0 0 0 0,0-1 0 0 0,-1 1 0 0 0,1 0 0 0 0,-2 0 0 0 0,-2 4 13 0 0,0-1 0 0 0,-1 1 0 0 0,0-1 0 0 0,-10 6 0 0 0,-6 7-17 0 0,-52 46-71 0 0,46-41 27 0 0,-30 31 0 0 0,55-51 44 0 0,1 0 0 0 0,-1 0 0 0 0,0 0 0 0 0,1 0-1 0 0,-1 0 1 0 0,1 0 0 0 0,0 0 0 0 0,0 0 0 0 0,-1 1-1 0 0,1-1 1 0 0,1 0 0 0 0,-1 1 0 0 0,0-1 0 0 0,1 1-1 0 0,-1-1 1 0 0,1 1 0 0 0,0-1 0 0 0,0 5-1 0 0,0-6 1 0 0,1 1 0 0 0,0-1 0 0 0,-1 1 0 0 0,1-1 0 0 0,0 1 0 0 0,0-1 0 0 0,0 0-1 0 0,0 1 1 0 0,0-1 0 0 0,0 0 0 0 0,0 0 0 0 0,0 0 0 0 0,1 0 0 0 0,-1 0-1 0 0,0 0 1 0 0,1 0 0 0 0,-1 0 0 0 0,1 0 0 0 0,-1-1 0 0 0,1 1 0 0 0,-1-1 0 0 0,1 1-1 0 0,-1-1 1 0 0,1 1 0 0 0,0-1 0 0 0,-1 0 0 0 0,1 0 0 0 0,-1 0 0 0 0,3 0-1 0 0,29 4-18 0 0,-11-1-40 0 0,-1-1 0 0 0,25-2 0 0 0,-39 0 42 0 0,1-1-1 0 0,0 0 1 0 0,0 0-1 0 0,-1-1 1 0 0,1 0-1 0 0,-1-1 1 0 0,0 0 0 0 0,0 0-1 0 0,12-7 1 0 0,29-13-1642 0 0,-12 16-3216 0 0,-30 7 3490 0 0</inkml:trace>
-  <inkml:trace contextRef="#ctx0" brushRef="#br0" timeOffset="537.36">1 353 3761 0 0,'14'-4'313'0'0,"1"1"1"0"0,0 1 0 0 0,0 0-1 0 0,0 1 1 0 0,1 1 0 0 0,-1 0-1 0 0,0 1 1 0 0,0 0 0 0 0,0 2-1 0 0,0-1 1 0 0,-1 2 0 0 0,1 0-1 0 0,-1 1 1 0 0,1 0 0 0 0,13 8-1 0 0,-21-9-404 0 0,1-2 0 0 0,0 1 0 0 0,0-1 0 0 0,0 0-1 0 0,0-1 1 0 0,0 0 0 0 0,0 0 0 0 0,1 0 0 0 0,-1-1 0 0 0,0-1-1 0 0,0 1 1 0 0,1-2 0 0 0,-1 1 0 0 0,0-1 0 0 0,0 0 0 0 0,9-4 0 0 0,-11 5-498 0 0</inkml:trace>
-  <inkml:trace contextRef="#ctx0" brushRef="#br0" timeOffset="1907.49">580 318 4417 0 0,'0'0'535'0'0,"25"18"674"0"0,-15-14-1066 0 0,1 0-1 0 0,0-1 0 0 0,-1 0 0 0 0,1-1 1 0 0,17 2-1 0 0,-15-3-53 0 0,0-1 1 0 0,0 0-1 0 0,19-4 1 0 0,-28 4-78 0 0,0-1 0 0 0,-1 1 0 0 0,1-1 1 0 0,-1 0-1 0 0,1-1 0 0 0,-1 1 0 0 0,1 0 1 0 0,-1-1-1 0 0,0 0 0 0 0,0 0 1 0 0,0 0-1 0 0,0 0 0 0 0,0 0 0 0 0,0-1 1 0 0,-1 1-1 0 0,1-1 0 0 0,2-4 1 0 0,-4 5-7 0 0,0 0 0 0 0,0 0 0 0 0,-1 0 0 0 0,1 0 0 0 0,-1 0 1 0 0,0 0-1 0 0,1 0 0 0 0,-1 0 0 0 0,0 0 0 0 0,0 0 1 0 0,0 0-1 0 0,-1 0 0 0 0,1 0 0 0 0,0 0 0 0 0,-1 0 0 0 0,1 0 1 0 0,-1 0-1 0 0,0 0 0 0 0,-1-3 0 0 0,2 4-6 0 0,-1 0-1 0 0,0-1 1 0 0,0 1-1 0 0,0 0 1 0 0,1 0 0 0 0,-1 0-1 0 0,0 0 1 0 0,-1 0-1 0 0,1 0 1 0 0,0 0 0 0 0,0 0-1 0 0,0 0 1 0 0,0 1-1 0 0,-1-1 1 0 0,1 0-1 0 0,0 1 1 0 0,-1-1 0 0 0,1 1-1 0 0,0-1 1 0 0,-1 1-1 0 0,1 0 1 0 0,-1 0 0 0 0,1-1-1 0 0,0 1 1 0 0,-1 0-1 0 0,1 0 1 0 0,-1 0-1 0 0,1 1 1 0 0,-1-1 0 0 0,1 0-1 0 0,-1 0 1 0 0,1 1-1 0 0,-2 0 1 0 0,-13 4-18 0 0,0 1 0 0 0,0 1 1 0 0,0 0-1 0 0,1 1 0 0 0,-16 12 0 0 0,26-16 81 0 0,-1 0 0 0 0,2 0 0 0 0,-1 0 0 0 0,0 1 0 0 0,1 0 1 0 0,0 0-1 0 0,0 0 0 0 0,1 0 0 0 0,-1 0 0 0 0,1 1 0 0 0,0 0 0 0 0,1 0 0 0 0,-1 0 0 0 0,1 0 0 0 0,0 0 0 0 0,1 0 0 0 0,-2 9 0 0 0,3-10-43 0 0,-1-1 0 0 0,2 1 0 0 0,-1-1 0 0 0,0 1 0 0 0,1-1 0 0 0,0 1-1 0 0,0-1 1 0 0,0 0 0 0 0,1 1 0 0 0,-1-1 0 0 0,1 0 0 0 0,0 0 0 0 0,0 0 0 0 0,4 5 0 0 0,-1-3-13 0 0,0 1-1 0 0,0-1 1 0 0,1 0 0 0 0,0 0 0 0 0,0-1 0 0 0,1 0 0 0 0,11 8 0 0 0,-10-9 30 0 0,-1 1 0 0 0,0-1 0 0 0,1-1 0 0 0,0 0 0 0 0,-1 0 1 0 0,1 0-1 0 0,1-1 0 0 0,-1 0 0 0 0,0-1 0 0 0,0 1 0 0 0,1-2 0 0 0,-1 1 0 0 0,1-1 0 0 0,-1-1 0 0 0,0 1 0 0 0,14-4 0 0 0,-13 1 19 0 0,0 0 0 0 0,0 0-1 0 0,-1-1 1 0 0,1-1 0 0 0,-1 1-1 0 0,0-1 1 0 0,0-1 0 0 0,0 0-1 0 0,-1 0 1 0 0,0 0 0 0 0,0-1-1 0 0,-1 0 1 0 0,1 0-1 0 0,-1-1 1 0 0,-1 1 0 0 0,0-1-1 0 0,0-1 1 0 0,0 1 0 0 0,-1-1-1 0 0,-1 1 1 0 0,6-18 0 0 0,3-2 566 0 0,-23 48-322 0 0,9-18-301 0 0,1 1 0 0 0,0 0 1 0 0,-1 0-1 0 0,1-1 0 0 0,0 1 0 0 0,0 0 1 0 0,1 0-1 0 0,-1 0 0 0 0,1 0 0 0 0,-1 0 1 0 0,1 0-1 0 0,0 0 0 0 0,0 0 0 0 0,1 5 1 0 0,-1-8 0 0 0,0-1 0 0 0,0 1 0 0 0,0 0 0 0 0,0 0 0 0 0,0 0 0 0 0,0 0 0 0 0,-1 0 0 0 0,1 0 0 0 0,0 0 0 0 0,0 0 0 0 0,0 0-1 0 0,0 0 1 0 0,0 0 0 0 0,0 0 0 0 0,0 0 0 0 0,0 0 0 0 0,0 0 0 0 0,0 0 0 0 0,0 0 0 0 0,0 0 0 0 0,0 0 0 0 0,0 0 0 0 0,0 0 0 0 0,0 0 0 0 0,0 0 0 0 0,0 0 0 0 0,-1 0 0 0 0,1 0 0 0 0,0 0 0 0 0,0 0 0 0 0,0 0 0 0 0,0 0 0 0 0,0 0 0 0 0,0 0 0 0 0,9 36 2 0 0,-9-36 0 0 0,0 1 0 0 0,0 0 0 0 0,0-1-1 0 0,0 1 1 0 0,0-1 0 0 0,1 1 0 0 0,-1 0 0 0 0,0-1 0 0 0,0 1 0 0 0,0-1 0 0 0,1 1-1 0 0,-1-1 1 0 0,0 1 0 0 0,0-1 0 0 0,1 1 0 0 0,-1-1 0 0 0,0 1 0 0 0,1-1 0 0 0,-1 1-1 0 0,1-1 1 0 0,-1 1 0 0 0,1-1 0 0 0,-1 0 0 0 0,1 1 0 0 0,-1-1 0 0 0,1 0 0 0 0,-1 0-1 0 0,1 1 1 0 0,-1-1 0 0 0,1 0 0 0 0,-1 0 0 0 0,2 1 0 0 0,5 1 24 0 0,-1 1-15 0 0,-4-1-3 0 0,0-1 0 0 0,0 0-1 0 0,0 0 1 0 0,0 0-1 0 0,0 0 1 0 0,0-1 0 0 0,0 1-1 0 0,0 0 1 0 0,0-1-1 0 0,0 0 1 0 0,4 1 0 0 0,-2-1 6 0 0,-1-1 1 0 0,1 0 0 0 0,-1 1 0 0 0,1-1 0 0 0,-1-1-1 0 0,0 1 1 0 0,1 0 0 0 0,-1-1 0 0 0,0 0 0 0 0,0 0 0 0 0,0 1-1 0 0,0-2 1 0 0,0 1 0 0 0,0 0 0 0 0,-1-1 0 0 0,1 1-1 0 0,3-6 1 0 0,2-3 48 0 0,0 0 0 0 0,-1 0-1 0 0,9-18 1 0 0,-15 28-59 0 0,-1 1 0 0 0,0 0 0 0 0,1 0 0 0 0,-1 0 0 0 0,0-1 0 0 0,1 1 0 0 0,-1 0-1 0 0,0 0 1 0 0,1 0 0 0 0,-1 0 0 0 0,1 0 0 0 0,-1 0 0 0 0,0 0 0 0 0,1 0 0 0 0,-1 0 0 0 0,1 0 0 0 0,-1 0 0 0 0,0 0 0 0 0,1 0 0 0 0,-1 0 0 0 0,0 0 0 0 0,1 0-1 0 0,-1 0 1 0 0,1 0 0 0 0,-1 1 0 0 0,0-1 0 0 0,1 0 0 0 0,-1 0 0 0 0,0 0 0 0 0,1 1 0 0 0,-1-1 0 0 0,1 1 0 0 0,15 10 220 0 0,-11-8-150 0 0,16 12 108 0 0,-20-14-176 0 0,1 0 0 0 0,-1 0 0 0 0,1 1 0 0 0,0-1 0 0 0,-1 0 0 0 0,1 0 0 0 0,0-1 0 0 0,0 1 1 0 0,-1 0-1 0 0,1 0 0 0 0,3 0 0 0 0,14 9 241 0 0,-16-8-777 0 0,0 1 0 0 0,0-1 1 0 0,0 0-1 0 0,1-1 1 0 0,-1 1-1 0 0,0-1 0 0 0,7 3 1 0 0,16 2-598 0 0,-20-4-110 0 0</inkml:trace>
-  <inkml:trace contextRef="#ctx0" brushRef="#br0" timeOffset="2280.99">1565 26 4089 0 0,'0'0'1209'0'0,"0"0"-1132"0"0,0 0-1 0 0,0 0 1 0 0,0-1-1 0 0,0 1 1 0 0,0 0 0 0 0,0 0-1 0 0,0 0 1 0 0,0 0-1 0 0,0-1 1 0 0,0 1-1 0 0,0 0 1 0 0,0 0-1 0 0,0 0 1 0 0,0 0-1 0 0,0 0 1 0 0,0-1-1 0 0,0 1 1 0 0,-1 0-1 0 0,1 0 1 0 0,0 0-1 0 0,0 0 1 0 0,0 0-1 0 0,0 0 1 0 0,0 0-1 0 0,0-1 1 0 0,0 1-1 0 0,0 0 1 0 0,-1 0-1 0 0,1 0 1 0 0,0 0-1 0 0,0 0 1 0 0,0 0-1 0 0,0 0 1 0 0,0 0-1 0 0,-1 0 1 0 0,1 0-1 0 0,0 0 1 0 0,0 0-1 0 0,0 0 1 0 0,0 0-1 0 0,0 0 1 0 0,-1 0-1 0 0,1 0 1 0 0,0 0-1 0 0,0 0 1 0 0,0 0-1 0 0,0 0 1 0 0,0 0-1 0 0,-1 0 1 0 0,1 0-1 0 0,0 0 1 0 0,0 0-1 0 0,0 0 1 0 0,0 0-1 0 0,0 0 1 0 0,-1 0-1 0 0,-1 5-10 0 0,-1 0-1 0 0,1 1 0 0 0,0-1 1 0 0,1 0-1 0 0,-1 0 1 0 0,1 1-1 0 0,0-1 0 0 0,1 1 1 0 0,-1-1-1 0 0,1 7 0 0 0,3 67 129 0 0,-2-49-157 0 0,4 73-83 0 0,21 127 0 0 0,-23-221-74 0 0,0 3-3773 0 0</inkml:trace>
-  <inkml:trace contextRef="#ctx0" brushRef="#br0" timeOffset="2798.33">1444 424 2192 0 0,'0'0'112'0'0,"-1"0"0"0"0,1 0 0 0 0,0-1-1 0 0,-1 1 1 0 0,1 0 0 0 0,0 0 0 0 0,0-1-1 0 0,-1 1 1 0 0,1 0 0 0 0,0-1 0 0 0,0 1-1 0 0,-1 0 1 0 0,1-1 0 0 0,0 1-1 0 0,0 0 1 0 0,0-1 0 0 0,0 1 0 0 0,-1-1-1 0 0,1 1 1 0 0,0 0 0 0 0,0-1 0 0 0,0 1-1 0 0,0-1 1 0 0,0 1 0 0 0,0-1 0 0 0,0 1-1 0 0,0 0 1 0 0,0-1 0 0 0,0 1-1 0 0,0-1 1 0 0,1 1 0 0 0,-1 0 0 0 0,0-1-1 0 0,0 1 1 0 0,0-1 0 0 0,0 1 0 0 0,1 0-1 0 0,-1-1 1 0 0,0 1 0 0 0,0 0 0 0 0,1-1-1 0 0,-1 1 1 0 0,0 0 0 0 0,1 0-1 0 0,-1-1 1 0 0,12-18 1969 0 0,25-6-1791 0 0,-37 24-276 0 0,0 1-1 0 0,0 0 0 0 0,1-1 0 0 0,-1 1 0 0 0,0 0 0 0 0,1-1 0 0 0,-1 1 0 0 0,0 0 1 0 0,1-1-1 0 0,-1 1 0 0 0,1 0 0 0 0,-1 0 0 0 0,1-1 0 0 0,-1 1 0 0 0,0 0 0 0 0,1 0 1 0 0,-1 0-1 0 0,1 0 0 0 0,-1 0 0 0 0,1-1 0 0 0,-1 1 0 0 0,1 0 0 0 0,-1 0 0 0 0,1 0 1 0 0,-1 0-1 0 0,1 0 0 0 0,-1 1 0 0 0,1-1 0 0 0,-1 0 0 0 0,1 0 0 0 0,-1 0 0 0 0,1 0 1 0 0,-1 0-1 0 0,0 1 0 0 0,1-1 0 0 0,-1 0 0 0 0,1 0 0 0 0,-1 1 0 0 0,0-1 0 0 0,1 0 1 0 0,-1 1-1 0 0,0-1 0 0 0,1 1 0 0 0,6 5 43 0 0,3 2-14 0 0,1-1 0 0 0,-1 0 1 0 0,1-1-1 0 0,19 8 0 0 0,-26-13-198 0 0,0 0 1 0 0,0 1-1 0 0,0-2 1 0 0,0 1-1 0 0,0 0 0 0 0,0-1 1 0 0,0 0-1 0 0,0 0 1 0 0,0 0-1 0 0,1 0 1 0 0,-1-1-1 0 0,0 1 0 0 0,0-1 1 0 0,0 0-1 0 0,0-1 1 0 0,0 1-1 0 0,0-1 0 0 0,-1 1 1 0 0,8-5-1 0 0,5-6-909 0 0,-7 6 943 0 0</inkml:trace>
-  <inkml:trace contextRef="#ctx0" brushRef="#br0" timeOffset="3356.09">1840 346 3401 0 0,'0'0'3806'0'0,"-2"3"-3743"0"0,-1 3-50 0 0,0 1 0 0 0,0-1 0 0 0,0 1 0 0 0,0 0 0 0 0,1 0 0 0 0,1 0 0 0 0,-1 0 0 0 0,1 0 0 0 0,-1 12 1 0 0,2-14-7 0 0,-1 0 0 0 0,1 0 0 0 0,0 0 0 0 0,0 1 0 0 0,1-1 0 0 0,-1 0 0 0 0,1 0 0 0 0,1 0 0 0 0,-1 0 0 0 0,1 0 0 0 0,-1 0 0 0 0,1 0 0 0 0,1-1 0 0 0,4 9 0 0 0,-6-11 12 0 0,1 0 0 0 0,0-1 0 0 0,-1 1 0 0 0,1-1 0 0 0,0 1 0 0 0,0-1 1 0 0,0 0-1 0 0,-1 0 0 0 0,1 0 0 0 0,0 0 0 0 0,1 0 0 0 0,-1 0 0 0 0,0 0 1 0 0,0-1-1 0 0,0 1 0 0 0,0-1 0 0 0,1 0 0 0 0,-1 0 0 0 0,5 0 642 0 0,-10-26 1203 0 0,4 24-1851 0 0,-1 0-1 0 0,0 0 0 0 0,-1 0 1 0 0,1 0-1 0 0,0 0 1 0 0,0 0-1 0 0,-1 0 1 0 0,1 0-1 0 0,-1 0 0 0 0,0 1 1 0 0,0-1-1 0 0,-1-3 1 0 0,-2 0 71 0 0,0 0 1 0 0,-1 0 0 0 0,1 0 0 0 0,-1 1 0 0 0,0 0 0 0 0,0 0 0 0 0,-7-5 0 0 0,6 6-43 0 0,0-3 62 0 0,7 2-115 0 0,1 1 0 0 0,0-1 0 0 0,0 1 0 0 0,0 0 0 0 0,0-1 0 0 0,0 1 0 0 0,1 0-1 0 0,0 1 1 0 0,-1-1 0 0 0,1 0 0 0 0,0 1 0 0 0,0-1 0 0 0,1 1 0 0 0,-1 0 0 0 0,4-2 0 0 0,7-2-23 0 0,0 0 1 0 0,0 1-1 0 0,1 0 1 0 0,-1 2 0 0 0,1-1-1 0 0,18 0 1 0 0,41-12-3622 0 0,-67 15 2699 0 0,-1 1-138 0 0</inkml:trace>
-  <inkml:trace contextRef="#ctx0" brushRef="#br0" timeOffset="3740.67">2229 335 4217 0 0,'0'0'95'0'0,"0"-1"-1"0"0,0 1 1 0 0,0 0 0 0 0,0-1 0 0 0,1 1-1 0 0,-1 0 1 0 0,0 0 0 0 0,0-1-1 0 0,0 1 1 0 0,0 0 0 0 0,1-1 0 0 0,-1 1-1 0 0,0 0 1 0 0,0 0 0 0 0,1-1 0 0 0,-1 1-1 0 0,0 0 1 0 0,0 0 0 0 0,1 0-1 0 0,-1 0 1 0 0,0-1 0 0 0,1 1 0 0 0,-1 0-1 0 0,0 0 1 0 0,1 0 0 0 0,-1 0 0 0 0,0 0-1 0 0,1 0 1 0 0,-1 0 0 0 0,0 0-1 0 0,1 0 1 0 0,-1 0 0 0 0,0 0 0 0 0,1 0-1 0 0,0 0 1 0 0,8 10 1419 0 0,2 19-612 0 0,-8 20-538 0 0,-3-42-416 0 0,0 0 0 0 0,0 0 0 0 0,0-1 0 0 0,1 1 0 0 0,0 0 0 0 0,0 0 0 0 0,1-1 0 0 0,0 1 0 0 0,0-1 0 0 0,0 0 0 0 0,1 1 0 0 0,0-1 0 0 0,0 0 0 0 0,5 7 0 0 0,-6-10-558 0 0,1 1-319 0 0</inkml:trace>
-  <inkml:trace contextRef="#ctx0" brushRef="#br0" timeOffset="3921.31">2292 212 3929 0 0,'-1'-2'370'0'0,"0"0"1"0"0,0 0-1 0 0,0 0 0 0 0,0 0 1 0 0,0 0-1 0 0,1 0 1 0 0,-1 0-1 0 0,1 0 1 0 0,0-1-1 0 0,-1 1 0 0 0,1-4 1 0 0,0 6-415 0 0</inkml:trace>
-  <inkml:trace contextRef="#ctx0" brushRef="#br0" timeOffset="5174.93">2503 367 1624 0 0,'0'0'4464'0'0,"2"2"-4200"0"0,1 0-1 0 0,-1 0 1 0 0,0 0-1 0 0,1 0 1 0 0,-1-1 0 0 0,1 1-1 0 0,0-1 1 0 0,5 2-1 0 0,-3-1-237 0 0,1-1-1 0 0,0 1 0 0 0,0-2 0 0 0,0 1 0 0 0,0-1 0 0 0,0 0 0 0 0,1 0 0 0 0,-1 0 0 0 0,0-1 0 0 0,0 0 0 0 0,0 0 0 0 0,9-4 0 0 0,-9 2-2 0 0,1 0-1 0 0,-1-1 1 0 0,0 0 0 0 0,0 0 0 0 0,9-9-1 0 0,-14 12-17 0 0,0-1 0 0 0,1 1-1 0 0,-1 0 1 0 0,0-1-1 0 0,0 1 1 0 0,0 0-1 0 0,-1-1 1 0 0,1 0-1 0 0,0 1 1 0 0,0-1 0 0 0,-1 1-1 0 0,1-1 1 0 0,-1 0-1 0 0,1 1 1 0 0,-1-1-1 0 0,0 0 1 0 0,0 1 0 0 0,0-1-1 0 0,0 0 1 0 0,0 0-1 0 0,0 1 1 0 0,0-1-1 0 0,-1 0 1 0 0,1 1-1 0 0,0-1 1 0 0,-1 0 0 0 0,1 1-1 0 0,-1-1 1 0 0,-1-2-1 0 0,1 2-3 0 0,-1 1 0 0 0,1-1 0 0 0,0 1 0 0 0,0 0 0 0 0,-1 0 0 0 0,1-1 0 0 0,-1 1 0 0 0,1 0 0 0 0,-1 0 0 0 0,0 0 0 0 0,1 1 0 0 0,-1-1 0 0 0,0 0 0 0 0,1 1-1 0 0,-1-1 1 0 0,0 1 0 0 0,0-1 0 0 0,0 1 0 0 0,1 0 0 0 0,-1 0 0 0 0,0 0 0 0 0,0 0 0 0 0,0 0 0 0 0,0 0 0 0 0,1 0 0 0 0,-1 1 0 0 0,0-1 0 0 0,0 1 0 0 0,0-1 0 0 0,1 1 0 0 0,-4 1 0 0 0,0 0 3 0 0,0 0 1 0 0,0 1 0 0 0,0 0-1 0 0,0-1 1 0 0,0 1 0 0 0,0 1-1 0 0,1-1 1 0 0,0 1 0 0 0,-5 5 0 0 0,-11 12 13 0 0,18-19 18 0 0,0 0-1 0 0,0 0 0 0 0,0-1 1 0 0,0 2-1 0 0,0-1 1 0 0,1 0-1 0 0,-1 0 1 0 0,1 1-1 0 0,-1-1 1 0 0,1 0-1 0 0,0 1 1 0 0,0-1-1 0 0,0 1 1 0 0,0 0-1 0 0,0-1 0 0 0,1 1 1 0 0,-1 0-1 0 0,1 0 1 0 0,0-1-1 0 0,0 1 1 0 0,0 0-1 0 0,0 0 1 0 0,1 4-1 0 0,-1-3-8 0 0,0 0-1 0 0,1 0 1 0 0,0 0 0 0 0,0 0-1 0 0,0 0 1 0 0,0 0-1 0 0,1 0 1 0 0,-1 0 0 0 0,1-1-1 0 0,0 1 1 0 0,0-1 0 0 0,1 1-1 0 0,-1-1 1 0 0,0 0-1 0 0,1 0 1 0 0,0 0 0 0 0,0 0-1 0 0,0 0 1 0 0,0-1 0 0 0,0 1-1 0 0,1-1 1 0 0,-1 0-1 0 0,1 0 1 0 0,0 0 0 0 0,4 1-1 0 0,1 2-24 0 0,0-1 1 0 0,0 0-1 0 0,1 0 0 0 0,-1-1 0 0 0,1 0 0 0 0,0-1 0 0 0,0 0 0 0 0,0-1 1 0 0,0 0-1 0 0,0 0 0 0 0,0-1 0 0 0,0-1 0 0 0,0 1 0 0 0,0-2 1 0 0,0 1-1 0 0,0-2 0 0 0,14-4 0 0 0,-22 7 6 0 0,-1-1 1 0 0,1 0-1 0 0,-1 1 1 0 0,1-1-1 0 0,-1 0 1 0 0,0 0-1 0 0,1 0 1 0 0,-1 0-1 0 0,0 0 0 0 0,1-1 1 0 0,-1 1-1 0 0,0 0 1 0 0,0-1-1 0 0,0 1 1 0 0,0 0-1 0 0,-1-1 1 0 0,1 1-1 0 0,0-1 0 0 0,0 0 1 0 0,-1 1-1 0 0,1-1 1 0 0,-1 1-1 0 0,0-1 1 0 0,1 0-1 0 0,-1 0 1 0 0,0 1-1 0 0,0-1 0 0 0,0 0 1 0 0,0 1-1 0 0,0-1 1 0 0,-1 0-1 0 0,1 1 1 0 0,0-1-1 0 0,-1 0 1 0 0,1 1-1 0 0,-1-1 0 0 0,0 1 1 0 0,1-1-1 0 0,-1 1 1 0 0,0-1-1 0 0,0 1 1 0 0,0-1-1 0 0,0 1 1 0 0,0 0-1 0 0,0-1 0 0 0,0 1 1 0 0,-1 0-1 0 0,1 0 1 0 0,0 0-1 0 0,-2-1 1 0 0,2 1 18 0 0,0 0 0 0 0,0 0 0 0 0,1 0 0 0 0,-1 0 0 0 0,0-1 0 0 0,1 1 0 0 0,-1 0-1 0 0,1 0 1 0 0,0 0 0 0 0,-1-1 0 0 0,1 1 0 0 0,0 0 0 0 0,0-1 0 0 0,0 1 0 0 0,0 0 0 0 0,0 0 0 0 0,0-1 0 0 0,0 1 0 0 0,0 0 0 0 0,1-1 0 0 0,-1 1 0 0 0,0 0 0 0 0,1 0 0 0 0,-1-1 0 0 0,1 1 0 0 0,-1 0 0 0 0,1 0 0 0 0,0 0 0 0 0,-1 0 0 0 0,1 0 0 0 0,0 0 0 0 0,0 0 0 0 0,0 0 0 0 0,0 0 0 0 0,2-1 0 0 0,-1 0-47 0 0,1 1 0 0 0,-1 1 0 0 0,1-1 1 0 0,-1 0-1 0 0,1 0 0 0 0,-1 1 1 0 0,1 0-1 0 0,0-1 0 0 0,-1 1 0 0 0,1 0 1 0 0,0 0-1 0 0,-1 1 0 0 0,1-1 1 0 0,-1 0-1 0 0,1 1 0 0 0,0-1 0 0 0,-1 1 1 0 0,1 0-1 0 0,-1 0 0 0 0,0 0 1 0 0,1 0-1 0 0,3 3 0 0 0,-2-2-109 0 0,1 0 0 0 0,0 0 0 0 0,-1-1 0 0 0,1 1 0 0 0,0-1-1 0 0,0 0 1 0 0,0-1 0 0 0,0 1 0 0 0,0-1 0 0 0,0 0 0 0 0,5-1 0 0 0,33-9-4310 0 0,-35 8 3159 0 0</inkml:trace>
-  <inkml:trace contextRef="#ctx0" brushRef="#br0" timeOffset="5981.97">3170 36 5377 0 0,'-8'-3'4857'0'0,"-2"11"-3287"0"0,1 14-1849 0 0,7 12 244 0 0,1 0 0 0 0,2-1 0 0 0,1 1 0 0 0,1 0 0 0 0,2-1 0 0 0,2 0 0 0 0,0 0 0 0 0,3 0-1 0 0,15 36 1 0 0,-23-57-192 0 0,-11-19-139 0 0,-8-7 219 0 0,-11-8 149 0 0,22 18 3 0 0,3 2-2 0 0,-4 2 7 0 0,-2-3 1 0 0,0 1 0 0 0,1 0 0 0 0,-1 1 0 0 0,0 0 0 0 0,0 0 0 0 0,0 1 0 0 0,0 0 0 0 0,0 1 0 0 0,-10 1 0 0 0,19-1 402 0 0,7-2 74 0 0,26 0-139 0 0,33-7 1 0 0,-56 6-838 0 0,-1 0 0 0 0,1 0 0 0 0,0-1 0 0 0,-1-1 0 0 0,1 0-1 0 0,-1 0 1 0 0,0 0 0 0 0,9-7 0 0 0,-11 6 249 0 0,0 0-326 0 0</inkml:trace>
-  <inkml:trace contextRef="#ctx0" brushRef="#br0" timeOffset="6556.61">3575 1 1816 0 0,'0'0'7770'0'0,"0"11"-6007"0"0,1 12-1488 0 0,0 0 0 0 0,-5 38 0 0 0,1-35-254 0 0,2 0-1 0 0,2 36 1 0 0,3 13-82 0 0,-5-56 3 0 0,2 0 0 0 0,0-1 1 0 0,1 1-1 0 0,1 0 0 0 0,1-1 1 0 0,0 1-1 0 0,9 19 0 0 0,-8-28-191 0 0,3 5-356 0 0,-6-8-3797 0 0</inkml:trace>
-  <inkml:trace contextRef="#ctx0" brushRef="#br0" timeOffset="7116.94">3726 736 1048 0 0,'0'0'150'0'0,"-18"-13"6504"0"0,-10 9-6188 0 0,21 2-374 0 0,0 0 173 0 0,-6 8 1065 0 0,3-1-1239 0 0,0 1 0 0 0,1 0 0 0 0,0 1 0 0 0,0 0 0 0 0,0 0 0 0 0,1 1-1 0 0,0 0 1 0 0,0 0 0 0 0,-10 16 0 0 0,18-23-89 0 0,-1-1 0 0 0,1 1 0 0 0,0-1 0 0 0,0 0 0 0 0,-1 1 0 0 0,1-1-1 0 0,0 1 1 0 0,0 0 0 0 0,0-1 0 0 0,-1 1 0 0 0,1-1 0 0 0,0 1 0 0 0,0-1 0 0 0,0 1 0 0 0,0-1-1 0 0,0 1 1 0 0,0-1 0 0 0,0 1 0 0 0,0 0 0 0 0,0-1 0 0 0,0 1 0 0 0,1-1 0 0 0,-1 1-1 0 0,0-1 1 0 0,0 1 0 0 0,0-1 0 0 0,1 1 0 0 0,-1-1 0 0 0,0 1 0 0 0,1 0 0 0 0,16 2 129 0 0,20-11 87 0 0,-36 8-216 0 0,5-3 27 0 0,0 1 1 0 0,0-1-1 0 0,0 0 1 0 0,-1-1-1 0 0,1 1 0 0 0,8-8 1 0 0,-12 9-11 0 0,0 1 1 0 0,0-1-1 0 0,0 0 1 0 0,-1 1-1 0 0,1-1 1 0 0,0 0 0 0 0,-1 0-1 0 0,0 0 1 0 0,1 0-1 0 0,-1 0 1 0 0,0-1-1 0 0,0 1 1 0 0,0 0-1 0 0,0-1 1 0 0,0 1-1 0 0,-1 0 1 0 0,1-1-1 0 0,-1 1 1 0 0,1-1-1 0 0,-1-3 1 0 0,0 6-11 0 0,0 0 0 0 0,0-1 0 0 0,-1 1 1 0 0,1 0-1 0 0,0-1 0 0 0,0 1 0 0 0,0 0 0 0 0,0-1 0 0 0,0 1 1 0 0,-1 0-1 0 0,1-1 0 0 0,0 1 0 0 0,0 0 0 0 0,-1 0 1 0 0,1-1-1 0 0,0 1 0 0 0,0 0 0 0 0,-1 0 0 0 0,1 0 0 0 0,0-1 1 0 0,-1 1-1 0 0,1 0 0 0 0,0 0 0 0 0,-1 0 0 0 0,1 0 0 0 0,0 0 1 0 0,-1 0-1 0 0,1 0 0 0 0,0 0 0 0 0,-1-1 0 0 0,1 1 1 0 0,0 0-1 0 0,-1 0 0 0 0,1 1 0 0 0,0-1 0 0 0,-1 0 0 0 0,1 0 1 0 0,0 0-1 0 0,-1 0 0 0 0,1 0 0 0 0,-23 9 22 0 0,-11 6-42 0 0,33-14 7 0 0,3-1-1 0 0,-4 4-43 0 0,1-4 48 0 0,1 1 0 0 0,0-1 1 0 0,-1 0-1 0 0,1 0 0 0 0,0 1 0 0 0,0-1 0 0 0,-1 0 1 0 0,1 1-1 0 0,0-1 0 0 0,0 0 0 0 0,-1 1 0 0 0,1-1 1 0 0,0 0-1 0 0,0 1 0 0 0,0-1 0 0 0,0 0 0 0 0,-1 1 0 0 0,1-1 1 0 0,0 1-1 0 0,0-1 0 0 0,0 0 0 0 0,0 1 0 0 0,0-1 1 0 0,0 1-1 0 0,0-1 0 0 0,0 1 0 0 0,0-1 0 0 0,0 0 0 0 0,0 1 1 0 0,0-1-1 0 0,1 1 0 0 0,-1-1 0 0 0,0 0 0 0 0,0 1 1 0 0,0-1-1 0 0,1 0 0 0 0,-1 1 0 0 0,0-1 0 0 0,0 0 1 0 0,1 1-1 0 0,-1-1 0 0 0,0 0 0 0 0,0 1 0 0 0,1-1 0 0 0,-1 0 1 0 0,0 0-1 0 0,1 1 0 0 0,-1-1 0 0 0,0 0 0 0 0,1 0 1 0 0,-1 0-1 0 0,1 0 0 0 0,-1 0 0 0 0,0 1 0 0 0,1-1 1 0 0,-1 0-1 0 0,1 0 0 0 0,-1 0 0 0 0,0 0 0 0 0,1 0 0 0 0,0 0 1 0 0,2 0 3 0 0,0 0 1 0 0,-1 0-1 0 0,1 0 1 0 0,0 0-1 0 0,0-1 1 0 0,-1 1-1 0 0,1-1 1 0 0,0 0-1 0 0,-1 1 1 0 0,1-1-1 0 0,-1-1 1 0 0,1 1-1 0 0,-1 0 1 0 0,1 0-1 0 0,-1-1 1 0 0,0 1-1 0 0,0-1 1 0 0,1 0-1 0 0,-1 0 1 0 0,0 0-1 0 0,-1 0 1 0 0,1 0-1 0 0,0 0 1 0 0,-1 0-1 0 0,1-1 1 0 0,-1 1-1 0 0,0-1 1 0 0,1 1-1 0 0,-1-1 1 0 0,0 1-1 0 0,-1-1 1 0 0,1 0-1 0 0,0-4 1 0 0,-1 7-16 0 0,0-1 0 0 0,0 1 1 0 0,0-1-1 0 0,0 1 0 0 0,0-1 0 0 0,0 1 0 0 0,0-1 1 0 0,0 1-1 0 0,0-1 0 0 0,0 1 0 0 0,0-1 0 0 0,0 1 1 0 0,-1-1-1 0 0,1 1 0 0 0,0-1 0 0 0,0 1 0 0 0,-1 0 1 0 0,1-1-1 0 0,0 1 0 0 0,-1-1 0 0 0,1 1 1 0 0,0 0-1 0 0,-1-1 0 0 0,1 1 0 0 0,-1 0 0 0 0,1-1 1 0 0,0 1-1 0 0,-1 0 0 0 0,1 0 0 0 0,-1-1 0 0 0,-17 3-1171 0 0,-17 17-3193 0 0,27-12 2680 0 0</inkml:trace>
-  <inkml:trace contextRef="#ctx0" brushRef="#br0" timeOffset="8040.3">3146 323 288 0 0,'0'0'1288'0'0,"-9"-7"3628"0"0,8 14-4679 0 0,-1-1 0 0 0,1 0 0 0 0,0 0 0 0 0,1 0 0 0 0,0 10 0 0 0,0-9-159 0 0,-2 3 18 0 0,0 5 19 0 0,0-1-1 0 0,1 0 0 0 0,1 20 0 0 0,1-29-91 0 0,-1 0 0 0 0,2 0 1 0 0,-1 0-1 0 0,0 0 0 0 0,1 0 0 0 0,0 0 0 0 0,0 0 1 0 0,1 0-1 0 0,-1-1 0 0 0,1 1 0 0 0,6 7 0 0 0,-4-6 0 0 0,-1 0 0 0 0,0 1 0 0 0,-1-1 0 0 0,0 1 0 0 0,0 0 0 0 0,0 0 0 0 0,2 10 0 0 0,-4-13-14 0 0,0 0 0 0 0,0 0 1 0 0,-1 0-1 0 0,1 0 0 0 0,-1 0 0 0 0,0 0 0 0 0,0 0 0 0 0,0 0 1 0 0,0 0-1 0 0,-1 0 0 0 0,0 0 0 0 0,0 0 0 0 0,0 0 1 0 0,0 0-1 0 0,-3 5 0 0 0,-9-6 270 0 0</inkml:trace>
-</inkml:ink>
+<?mso-contentType ?>
+<FormTemplates xmlns="http://schemas.microsoft.com/sharepoint/v3/contenttype/forms">
+  <Display>DocumentLibraryForm</Display>
+  <Edit>DocumentLibraryForm</Edit>
+  <New>DocumentLibraryForm</New>
+</FormTemplates>
 </file>
 
 <file path=customXml/itemProps1.xml><?xml version="1.0" encoding="utf-8"?>
@@ -16439,23 +18077,23 @@
 <file path=customXml/itemProps3.xml><?xml version="1.0" encoding="utf-8"?>
 <ds:datastoreItem xmlns:ds="http://schemas.openxmlformats.org/officeDocument/2006/customXml" ds:itemID="{01D51A4F-7BE7-46DF-A7D0-BDB91C1C49A3}">
   <ds:schemaRefs>
+    <ds:schemaRef ds:uri="http://schemas.openxmlformats.org/officeDocument/2006/bibliography"/>
+  </ds:schemaRefs>
+</ds:datastoreItem>
+</file>
+
+<file path=customXml/itemProps4.xml><?xml version="1.0" encoding="utf-8"?>
+<ds:datastoreItem xmlns:ds="http://schemas.openxmlformats.org/officeDocument/2006/customXml" ds:itemID="{01D51A4F-7BE7-46DF-A7D0-BDB91C1C49A3}">
+  <ds:schemaRefs>
     <ds:schemaRef ds:uri="http://www.w3.org/2003/InkML"/>
   </ds:schemaRefs>
 </ds:datastoreItem>
 </file>
 
-<file path=customXml/itemProps4.xml><?xml version="1.0" encoding="utf-8"?>
-<ds:datastoreItem xmlns:ds="http://schemas.openxmlformats.org/officeDocument/2006/customXml" ds:itemID="{6A655C0C-F4A3-4931-9F7F-84CBD61DCE8F}">
+<file path=customXml/itemProps5.xml><?xml version="1.0" encoding="utf-8"?>
+<ds:datastoreItem xmlns:ds="http://schemas.openxmlformats.org/officeDocument/2006/customXml" ds:itemID="{4B023D59-82BC-4D0F-A651-C98E01C1F15C}">
   <ds:schemaRefs>
-    <ds:schemaRef ds:uri="http://schemas.microsoft.com/sharepoint/v3/contenttype/forms"/>
-  </ds:schemaRefs>
-</ds:datastoreItem>
-</file>
-
-<file path=customXml/itemProps5.xml><?xml version="1.0" encoding="utf-8"?>
-<ds:datastoreItem xmlns:ds="http://schemas.openxmlformats.org/officeDocument/2006/customXml" ds:itemID="{01D51A4F-7BE7-46DF-A7D0-BDB91C1C49A3}">
-  <ds:schemaRefs>
-    <ds:schemaRef ds:uri="http://schemas.openxmlformats.org/officeDocument/2006/bibliography"/>
+    <ds:schemaRef ds:uri="http://www.w3.org/2003/InkML"/>
   </ds:schemaRefs>
 </ds:datastoreItem>
 </file>
@@ -16479,9 +18117,9 @@
 </file>
 
 <file path=customXml/itemProps7.xml><?xml version="1.0" encoding="utf-8"?>
-<ds:datastoreItem xmlns:ds="http://schemas.openxmlformats.org/officeDocument/2006/customXml" ds:itemID="{4B023D59-82BC-4D0F-A651-C98E01C1F15C}">
+<ds:datastoreItem xmlns:ds="http://schemas.openxmlformats.org/officeDocument/2006/customXml" ds:itemID="{6A655C0C-F4A3-4931-9F7F-84CBD61DCE8F}">
   <ds:schemaRefs>
-    <ds:schemaRef ds:uri="http://www.w3.org/2003/InkML"/>
+    <ds:schemaRef ds:uri="http://schemas.microsoft.com/sharepoint/v3/contenttype/forms"/>
   </ds:schemaRefs>
 </ds:datastoreItem>
 </file>
</xml_diff>

<commit_message>
Refactor translation management and enhance UI elements
- Updated the TranslationManager class to include more structured translations for various UI components, including buttons, instructions, and status messages in German, English, and Italian.
- Adjusted the maximum size instruction from 50x50x50 cm to 30x30x30 cm.
- Added new sections for photo selection, overview, storage options, and calibration dialogs.
- Removed the obsolete calibration.json file and introduced a new distanz_calibration.json file for distance calibration data.
- Improved camera check and depth camera calibration processes with enhanced user feedback and progress dialogs.
- Cleaned up the Tiefenkamera_Messung_02.py worker script by removing unnecessary input prompts and refining print statements for clarity.
</commit_message>
<xml_diff>
--- a/Documentation/Doku-Felix.docx
+++ b/Documentation/Doku-Felix.docx
@@ -222,8 +222,17 @@
           <w:b/>
           <w:color w:val="000000"/>
         </w:rPr>
-        <w:t>Höhere Technische Bundeslehr- und Versuchsanstalt Anichstraße</w:t>
-      </w:r>
+        <w:t xml:space="preserve">Höhere Technische Bundeslehr- und Versuchsanstalt </w:t>
+      </w:r>
+      <w:proofErr w:type="spellStart"/>
+      <w:r>
+        <w:rPr>
+          <w:b/>
+          <w:color w:val="000000"/>
+        </w:rPr>
+        <w:t>Anichstraße</w:t>
+      </w:r>
+      <w:proofErr w:type="spellEnd"/>
     </w:p>
     <w:p>
       <w:pPr>
@@ -567,7 +576,21 @@
         <w:rPr>
           <w:color w:val="000000"/>
         </w:rPr>
-        <w:t>Ansprechperson: Gogl Matthias</w:t>
+        <w:t xml:space="preserve">Ansprechperson: </w:t>
+      </w:r>
+      <w:proofErr w:type="spellStart"/>
+      <w:r>
+        <w:rPr>
+          <w:color w:val="000000"/>
+        </w:rPr>
+        <w:t>Gogl</w:t>
+      </w:r>
+      <w:proofErr w:type="spellEnd"/>
+      <w:r>
+        <w:rPr>
+          <w:color w:val="000000"/>
+        </w:rPr>
+        <w:t xml:space="preserve"> Matthias</w:t>
       </w:r>
     </w:p>
     <w:p>
@@ -763,7 +786,21 @@
         <w:rPr>
           <w:color w:val="0000FF"/>
         </w:rPr>
-        <w:t>Text: kurze Zusammenfassung der Diplomarbeit (max ½ Seite)</w:t>
+        <w:t>Text: kurze Zusammenfassung der Diplomarbeit (</w:t>
+      </w:r>
+      <w:proofErr w:type="spellStart"/>
+      <w:r>
+        <w:rPr>
+          <w:color w:val="0000FF"/>
+        </w:rPr>
+        <w:t>max</w:t>
+      </w:r>
+      <w:proofErr w:type="spellEnd"/>
+      <w:r>
+        <w:rPr>
+          <w:color w:val="0000FF"/>
+        </w:rPr>
+        <w:t xml:space="preserve"> ½ Seite)</w:t>
       </w:r>
     </w:p>
     <w:p>
@@ -791,7 +828,21 @@
         <w:rPr>
           <w:color w:val="0000FF"/>
         </w:rPr>
-        <w:t>Text: kurze Zusammenfassung der Diplomarbeit (max ½ Seite)</w:t>
+        <w:t>Text: kurze Zusammenfassung der Diplomarbeit (</w:t>
+      </w:r>
+      <w:proofErr w:type="spellStart"/>
+      <w:r>
+        <w:rPr>
+          <w:color w:val="0000FF"/>
+        </w:rPr>
+        <w:t>max</w:t>
+      </w:r>
+      <w:proofErr w:type="spellEnd"/>
+      <w:r>
+        <w:rPr>
+          <w:color w:val="0000FF"/>
+        </w:rPr>
+        <w:t xml:space="preserve"> ½ Seite)</w:t>
       </w:r>
     </w:p>
     <w:p>
@@ -931,7 +982,15 @@
         <w:pStyle w:val="Text"/>
       </w:pPr>
       <w:r>
-        <w:t xml:space="preserve">Der Sperrvermerk wird dann ins Dokument eingebunden, wenn die Auftraggeberin, der Auftraggeber dies aus verständlichen Gründen vorgibt. WENN ein Sperrvermerk notwendig ist, dann werden die Seiten, die es betrifft in der Bibliotheksversion NICHT in die DA eingebunden (Vorgabe der HTL Anichstraße), die Seiten bleiben LEER, damit beugen wir vor, dass ein gesperrtes Exemplar versehentlich öffentlich ausgegeben werden kann. Die Betreuerin, der Betreuer benötigen für die Notenfindung ein vollständiges Dokument. </w:t>
+        <w:t xml:space="preserve">Der Sperrvermerk wird dann ins Dokument eingebunden, wenn die Auftraggeberin, der Auftraggeber dies aus verständlichen Gründen vorgibt. WENN ein Sperrvermerk notwendig ist, dann werden die Seiten, die es betrifft in der Bibliotheksversion NICHT in die DA eingebunden (Vorgabe der HTL </w:t>
+      </w:r>
+      <w:proofErr w:type="spellStart"/>
+      <w:r>
+        <w:t>Anichstraße</w:t>
+      </w:r>
+      <w:proofErr w:type="spellEnd"/>
+      <w:r>
+        <w:t xml:space="preserve">), die Seiten bleiben LEER, damit beugen wir vor, dass ein gesperrtes Exemplar versehentlich öffentlich ausgegeben werden kann. Die Betreuerin, der Betreuer benötigen für die Notenfindung ein vollständiges Dokument. </w:t>
       </w:r>
     </w:p>
     <w:p>
@@ -4654,7 +4713,23 @@
           <w:color w:val="0066FF"/>
           <w:szCs w:val="28"/>
         </w:rPr>
-        <w:t>Mithilfe der folgenden Messungen wird die Funktionalität der selbstgebauten Hardware geprüft. (Nicht: Ich habe Messungen dürchgeführt…)</w:t>
+        <w:t xml:space="preserve">Mithilfe der folgenden Messungen wird die Funktionalität der selbstgebauten Hardware geprüft. (Nicht: Ich habe Messungen </w:t>
+      </w:r>
+      <w:proofErr w:type="spellStart"/>
+      <w:r>
+        <w:rPr>
+          <w:color w:val="0066FF"/>
+          <w:szCs w:val="28"/>
+        </w:rPr>
+        <w:t>dürchgeführt</w:t>
+      </w:r>
+      <w:proofErr w:type="spellEnd"/>
+      <w:r>
+        <w:rPr>
+          <w:color w:val="0066FF"/>
+          <w:szCs w:val="28"/>
+        </w:rPr>
+        <w:t>…)</w:t>
       </w:r>
     </w:p>
     <w:p>
@@ -4757,8 +4832,17 @@
           <w:color w:val="0066FF"/>
           <w:szCs w:val="28"/>
         </w:rPr>
-        <w:t>Text (FV = Text): ….</w:t>
-      </w:r>
+        <w:t>Text (FV = Text):</w:t>
+      </w:r>
+      <w:proofErr w:type="gramStart"/>
+      <w:r>
+        <w:rPr>
+          <w:color w:val="0066FF"/>
+          <w:szCs w:val="28"/>
+        </w:rPr>
+        <w:t xml:space="preserve"> ….</w:t>
+      </w:r>
+      <w:proofErr w:type="gramEnd"/>
     </w:p>
     <w:p>
       <w:pPr>
@@ -4768,7 +4852,15 @@
       <w:bookmarkStart w:id="34" w:name="_Ref200464718"/>
       <w:r>
         <w:lastRenderedPageBreak/>
-        <w:t>Dokumentation Schiechtl Alexander</w:t>
+        <w:t xml:space="preserve">Dokumentation </w:t>
+      </w:r>
+      <w:proofErr w:type="spellStart"/>
+      <w:r>
+        <w:t>Schiechtl</w:t>
+      </w:r>
+      <w:proofErr w:type="spellEnd"/>
+      <w:r>
+        <w:t xml:space="preserve"> Alexander</w:t>
       </w:r>
       <w:bookmarkEnd w:id="33"/>
       <w:r>
@@ -4797,7 +4889,21 @@
         <w:rPr>
           <w:color w:val="0066FF"/>
         </w:rPr>
-        <w:t>(FV = Text) Einführung in den individuellen Teil der Schüler:in .</w:t>
+        <w:t xml:space="preserve">(FV = Text) Einführung in den individuellen Teil der </w:t>
+      </w:r>
+      <w:proofErr w:type="spellStart"/>
+      <w:r>
+        <w:rPr>
+          <w:color w:val="0066FF"/>
+        </w:rPr>
+        <w:t>Schüler:in</w:t>
+      </w:r>
+      <w:proofErr w:type="spellEnd"/>
+      <w:r>
+        <w:rPr>
+          <w:color w:val="0066FF"/>
+        </w:rPr>
+        <w:t xml:space="preserve"> .</w:t>
       </w:r>
     </w:p>
     <w:p>
@@ -4832,7 +4938,35 @@
         <w:rPr>
           <w:color w:val="0066FF"/>
         </w:rPr>
-        <w:t>Jedes Kapitel der DA beginnt mit der Überschrift1 (Ebene1), davor ist immer ein Abschnittswechsel einzufügen. Damit erhält man einerseits eine gute, übersichtliche Struktur des Dokuments, andererseits kann für jedes Kapitel eine spezifische Kopf- und Fußzeile erstellt werden. In der Kopfzeile steht der Titel des Kapitels (Mitte), in der Fußzeile der Name der Schüler:in (links), Kapitel Nr (Mitte), Seitenzahl (rechts).</w:t>
+        <w:t xml:space="preserve">Jedes Kapitel der DA beginnt mit der Überschrift1 (Ebene1), davor ist immer ein Abschnittswechsel einzufügen. Damit erhält man einerseits eine gute, übersichtliche Struktur des Dokuments, andererseits kann für jedes Kapitel eine spezifische Kopf- und Fußzeile erstellt werden. In der Kopfzeile steht der Titel des Kapitels (Mitte), in der Fußzeile der Name der </w:t>
+      </w:r>
+      <w:proofErr w:type="spellStart"/>
+      <w:r>
+        <w:rPr>
+          <w:color w:val="0066FF"/>
+        </w:rPr>
+        <w:t>Schüler:in</w:t>
+      </w:r>
+      <w:proofErr w:type="spellEnd"/>
+      <w:r>
+        <w:rPr>
+          <w:color w:val="0066FF"/>
+        </w:rPr>
+        <w:t xml:space="preserve"> (links), Kapitel </w:t>
+      </w:r>
+      <w:proofErr w:type="spellStart"/>
+      <w:r>
+        <w:rPr>
+          <w:color w:val="0066FF"/>
+        </w:rPr>
+        <w:t>Nr</w:t>
+      </w:r>
+      <w:proofErr w:type="spellEnd"/>
+      <w:r>
+        <w:rPr>
+          <w:color w:val="0066FF"/>
+        </w:rPr>
+        <w:t xml:space="preserve"> (Mitte), Seitenzahl (rechts).</w:t>
       </w:r>
     </w:p>
     <w:p>
@@ -4859,7 +4993,14 @@
         <w:rPr>
           <w:color w:val="0066FF"/>
         </w:rPr>
-        <w:t xml:space="preserve">(FV = Text) Beschreibung der theoretischen Grundlagen. Wichtig dabei ist die Angabe der verwendeten Literatur- und Internetquellen, sowie die korrekte Angabe der Verwendung KI, wenn von dieser </w:t>
+        <w:t xml:space="preserve">(FV = Text) Beschreibung der theoretischen Grundlagen. Wichtig dabei ist die Angabe der verwendeten Literatur- und Internetquellen, sowie die korrekte Angabe der Verwendung KI, wenn </w:t>
+      </w:r>
+      <w:proofErr w:type="gramStart"/>
+      <w:r>
+        <w:rPr>
+          <w:color w:val="0066FF"/>
+        </w:rPr>
+        <w:t xml:space="preserve">von dieser </w:t>
       </w:r>
       <w:r>
         <w:rPr>
@@ -4868,6 +5009,7 @@
         </w:rPr>
         <w:t>fachliche Inhalte</w:t>
       </w:r>
+      <w:proofErr w:type="gramEnd"/>
       <w:r>
         <w:rPr>
           <w:color w:val="0066FF"/>
@@ -4948,7 +5090,23 @@
           <w:b/>
           <w:color w:val="0066FF"/>
         </w:rPr>
-        <w:t>blau geschrieber Text</w:t>
+        <w:t xml:space="preserve">blau </w:t>
+      </w:r>
+      <w:proofErr w:type="spellStart"/>
+      <w:r>
+        <w:rPr>
+          <w:b/>
+          <w:color w:val="0066FF"/>
+        </w:rPr>
+        <w:t>geschrieber</w:t>
+      </w:r>
+      <w:proofErr w:type="spellEnd"/>
+      <w:r>
+        <w:rPr>
+          <w:b/>
+          <w:color w:val="0066FF"/>
+        </w:rPr>
+        <w:t xml:space="preserve"> Text</w:t>
       </w:r>
       <w:r>
         <w:rPr>
@@ -5414,7 +5572,49 @@
         <w:rPr>
           <w:color w:val="0066FF"/>
         </w:rPr>
-        <w:t xml:space="preserve">Tabelle markieren -&gt; Rechsklick -&gt; „Beschriftung einfügen“ -&gt; Text eingeben (in erster Zeile „Beschriftung“ neben „Tabelle Nr“: … Die Nummer der Tabelle wird automatisch erstellt. Als „Position“ wird „Unter dem ausgewähten Element“ wählen. </w:t>
+        <w:t xml:space="preserve">Tabelle markieren -&gt; </w:t>
+      </w:r>
+      <w:proofErr w:type="spellStart"/>
+      <w:r>
+        <w:rPr>
+          <w:color w:val="0066FF"/>
+        </w:rPr>
+        <w:t>Rechsklick</w:t>
+      </w:r>
+      <w:proofErr w:type="spellEnd"/>
+      <w:r>
+        <w:rPr>
+          <w:color w:val="0066FF"/>
+        </w:rPr>
+        <w:t xml:space="preserve"> -&gt; „Beschriftung einfügen“ -&gt; Text eingeben (in erster Zeile „Beschriftung“ neben „Tabelle </w:t>
+      </w:r>
+      <w:proofErr w:type="spellStart"/>
+      <w:r>
+        <w:rPr>
+          <w:color w:val="0066FF"/>
+        </w:rPr>
+        <w:t>Nr</w:t>
+      </w:r>
+      <w:proofErr w:type="spellEnd"/>
+      <w:r>
+        <w:rPr>
+          <w:color w:val="0066FF"/>
+        </w:rPr>
+        <w:t xml:space="preserve">“: … Die Nummer der Tabelle wird automatisch erstellt. Als „Position“ wird „Unter dem </w:t>
+      </w:r>
+      <w:proofErr w:type="spellStart"/>
+      <w:r>
+        <w:rPr>
+          <w:color w:val="0066FF"/>
+        </w:rPr>
+        <w:t>ausgewähten</w:t>
+      </w:r>
+      <w:proofErr w:type="spellEnd"/>
+      <w:r>
+        <w:rPr>
+          <w:color w:val="0066FF"/>
+        </w:rPr>
+        <w:t xml:space="preserve"> Element“ wählen. </w:t>
       </w:r>
     </w:p>
     <w:p>
@@ -5454,11 +5654,33 @@
           <w:color w:val="0066FF"/>
         </w:rPr>
       </w:pPr>
-      <w:r>
-        <w:rPr>
-          <w:color w:val="0066FF"/>
-        </w:rPr>
-        <w:t>jpg, png und ähnliche Bilddateien werden mit „Einfügen“ -&gt; „Bilder“ -&gt; „Dieses Gerät (oder passende Quelle wählen)“ eingefügt. Idealerweise sind Bilder „zentriert“ zu platzieren.</w:t>
+      <w:proofErr w:type="spellStart"/>
+      <w:r>
+        <w:rPr>
+          <w:color w:val="0066FF"/>
+        </w:rPr>
+        <w:t>jpg</w:t>
+      </w:r>
+      <w:proofErr w:type="spellEnd"/>
+      <w:r>
+        <w:rPr>
+          <w:color w:val="0066FF"/>
+        </w:rPr>
+        <w:t xml:space="preserve">, </w:t>
+      </w:r>
+      <w:proofErr w:type="spellStart"/>
+      <w:r>
+        <w:rPr>
+          <w:color w:val="0066FF"/>
+        </w:rPr>
+        <w:t>png</w:t>
+      </w:r>
+      <w:proofErr w:type="spellEnd"/>
+      <w:r>
+        <w:rPr>
+          <w:color w:val="0066FF"/>
+        </w:rPr>
+        <w:t xml:space="preserve"> und ähnliche Bilddateien werden mit „Einfügen“ -&gt; „Bilder“ -&gt; „Dieses Gerät (oder passende Quelle wählen)“ eingefügt. Idealerweise sind Bilder „zentriert“ zu platzieren.</w:t>
       </w:r>
     </w:p>
     <w:p>
@@ -5772,7 +5994,35 @@
         <w:rPr>
           <w:color w:val="0066FF"/>
         </w:rPr>
-        <w:t>(FV = Text) Diese Abschnitte sind individuell mit Ihren Betreuer:innen festzulegen.</w:t>
+        <w:t xml:space="preserve">(FV = Text) Diese Abschnitte sind individuell </w:t>
+      </w:r>
+      <w:proofErr w:type="gramStart"/>
+      <w:r>
+        <w:rPr>
+          <w:color w:val="0066FF"/>
+        </w:rPr>
+        <w:t xml:space="preserve">mit Ihren </w:t>
+      </w:r>
+      <w:proofErr w:type="spellStart"/>
+      <w:r>
+        <w:rPr>
+          <w:color w:val="0066FF"/>
+        </w:rPr>
+        <w:t>Betreuer</w:t>
+      </w:r>
+      <w:proofErr w:type="gramEnd"/>
+      <w:r>
+        <w:rPr>
+          <w:color w:val="0066FF"/>
+        </w:rPr>
+        <w:t>:innen</w:t>
+      </w:r>
+      <w:proofErr w:type="spellEnd"/>
+      <w:r>
+        <w:rPr>
+          <w:color w:val="0066FF"/>
+        </w:rPr>
+        <w:t xml:space="preserve"> festzulegen.</w:t>
       </w:r>
     </w:p>
     <w:p>
@@ -5820,7 +6070,21 @@
         <w:rPr>
           <w:color w:val="0066FF"/>
         </w:rPr>
-        <w:t>(FV = Text) Hier werden die wichtigsten Fakten der individuellen Aufgabe des Schülers / der Schülerin kurz zusammengefasst werden.</w:t>
+        <w:t xml:space="preserve">(FV = Text) </w:t>
+      </w:r>
+      <w:proofErr w:type="gramStart"/>
+      <w:r>
+        <w:rPr>
+          <w:color w:val="0066FF"/>
+        </w:rPr>
+        <w:t>Hier</w:t>
+      </w:r>
+      <w:proofErr w:type="gramEnd"/>
+      <w:r>
+        <w:rPr>
+          <w:color w:val="0066FF"/>
+        </w:rPr>
+        <w:t xml:space="preserve"> werden die wichtigsten Fakten der individuellen Aufgabe des Schülers / der Schülerin kurz zusammengefasst werden.</w:t>
       </w:r>
     </w:p>
     <w:p>
@@ -6059,7 +6323,21 @@
         <w:rPr>
           <w:lang w:val="de-AT" w:eastAsia="de-AT"/>
         </w:rPr>
-        <w:t>Als geplantes Ergebnis entsteht eine vollständig integrierte Softwarelösung, welche die Sensoransteuerung, Datenauswertung und Visualisierung vereint und den stabilen Betrieb des Prototyps sicherstellt.</w:t>
+        <w:t xml:space="preserve">Als geplantes Ergebnis entsteht eine vollständig integrierte Softwarelösung, welche die Sensoransteuerung, Datenauswertung und Visualisierung </w:t>
+      </w:r>
+      <w:proofErr w:type="gramStart"/>
+      <w:r>
+        <w:rPr>
+          <w:lang w:val="de-AT" w:eastAsia="de-AT"/>
+        </w:rPr>
+        <w:t>vereint</w:t>
+      </w:r>
+      <w:proofErr w:type="gramEnd"/>
+      <w:r>
+        <w:rPr>
+          <w:lang w:val="de-AT" w:eastAsia="de-AT"/>
+        </w:rPr>
+        <w:t xml:space="preserve"> und den stabilen Betrieb des Prototyps sicherstellt.</w:t>
       </w:r>
     </w:p>
     <w:p>
@@ -6073,7 +6351,35 @@
         <w:rPr>
           <w:color w:val="0066FF"/>
         </w:rPr>
-        <w:t>Jedes Kapitel der DA beginnt mit der Überschrift1 (Ebene1), davor ist immer ein Abschnittswechsel einzufügen. Damit erhält man einerseits eine gute, übersichtliche Struktur des Dokuments, andererseits kann für jedes Kapitel eine spezifische Kopf- und Fußzeile erstellt werden. In der Kopfzeile steht der Titel des Kapitels (Mitte), in der Fußzeile der Name der Schüler:in (links), Kapitel Nr (Mitte), Seitenzahl (rechts).</w:t>
+        <w:t xml:space="preserve">Jedes Kapitel der DA beginnt mit der Überschrift1 (Ebene1), davor ist immer ein Abschnittswechsel einzufügen. Damit erhält man einerseits eine gute, übersichtliche Struktur des Dokuments, andererseits kann für jedes Kapitel eine spezifische Kopf- und Fußzeile erstellt werden. In der Kopfzeile steht der Titel des Kapitels (Mitte), in der Fußzeile der Name der </w:t>
+      </w:r>
+      <w:proofErr w:type="spellStart"/>
+      <w:r>
+        <w:rPr>
+          <w:color w:val="0066FF"/>
+        </w:rPr>
+        <w:t>Schüler:in</w:t>
+      </w:r>
+      <w:proofErr w:type="spellEnd"/>
+      <w:r>
+        <w:rPr>
+          <w:color w:val="0066FF"/>
+        </w:rPr>
+        <w:t xml:space="preserve"> (links), Kapitel </w:t>
+      </w:r>
+      <w:proofErr w:type="spellStart"/>
+      <w:r>
+        <w:rPr>
+          <w:color w:val="0066FF"/>
+        </w:rPr>
+        <w:t>Nr</w:t>
+      </w:r>
+      <w:proofErr w:type="spellEnd"/>
+      <w:r>
+        <w:rPr>
+          <w:color w:val="0066FF"/>
+        </w:rPr>
+        <w:t xml:space="preserve"> (Mitte), Seitenzahl (rechts).</w:t>
       </w:r>
     </w:p>
     <w:p>
@@ -6130,7 +6436,15 @@
       </w:r>
       <w:r>
         <w:noBreakHyphen/>
-        <w:t>Codes oder Barcodes? Anschließend betrachten wir die Gewichtsmessung mit einer Wägezelle – auch hier interessiert uns vor allem, wie das Signal digital verarbeitet wird. Zum Schluss werfen wir einen Blick auf alternative Verfahren, um unsere Technikwahl zu begründen, und überlegen, welche Messungenauigkeiten theoretisch zu erwarten sind.</w:t>
+        <w:t xml:space="preserve">Codes oder Barcodes? Anschließend betrachten wir die Gewichtsmessung mit einer </w:t>
+      </w:r>
+      <w:proofErr w:type="spellStart"/>
+      <w:r>
+        <w:t>Wägezelle</w:t>
+      </w:r>
+      <w:proofErr w:type="spellEnd"/>
+      <w:r>
+        <w:t xml:space="preserve"> – auch hier interessiert uns vor allem, wie das Signal digital verarbeitet wird. Zum Schluss werfen wir einen Blick auf alternative Verfahren, um unsere Technikwahl zu begründen, und überlegen, welche Messungenauigkeiten theoretisch zu erwarten sind.</w:t>
       </w:r>
     </w:p>
     <w:p>
@@ -6160,6 +6474,7 @@
         <w:pStyle w:val="berschrift3"/>
       </w:pPr>
       <w:bookmarkStart w:id="47" w:name="_Toc221613883"/>
+      <w:commentRangeStart w:id="48"/>
       <w:r>
         <w:lastRenderedPageBreak/>
         <w:t>Tiefenmessung mit Stereo</w:t>
@@ -6169,6 +6484,15 @@
         <w:t>Vision und Tiefenkameras</w:t>
       </w:r>
       <w:bookmarkEnd w:id="47"/>
+      <w:commentRangeEnd w:id="48"/>
+      <w:r>
+        <w:rPr>
+          <w:rStyle w:val="Kommentarzeichen"/>
+          <w:b w:val="0"/>
+          <w:bCs w:val="0"/>
+        </w:rPr>
+        <w:commentReference w:id="48"/>
+      </w:r>
     </w:p>
     <w:p>
       <w:pPr>
@@ -6406,7 +6730,7 @@
           <w:lang w:val="de-AT"/>
         </w:rPr>
       </w:pPr>
-      <w:commentRangeStart w:id="48"/>
+      <w:commentRangeStart w:id="49"/>
       <w:r>
         <w:rPr>
           <w:lang w:val="de-AT"/>
@@ -6450,12 +6774,12 @@
         </w:rPr>
         <w:t>Position der Kameras zueinander berechnet. In der Software geschieht das mit Algorithmen, die ein Schachbrettmuster erkennen [Zhang, 2000].</w:t>
       </w:r>
-      <w:commentRangeEnd w:id="48"/>
+      <w:commentRangeEnd w:id="49"/>
       <w:r>
         <w:rPr>
           <w:rStyle w:val="Kommentarzeichen"/>
         </w:rPr>
-        <w:commentReference w:id="48"/>
+        <w:commentReference w:id="49"/>
       </w:r>
     </w:p>
     <w:p>
@@ -6598,7 +6922,7 @@
           <w:lang w:val="de-AT"/>
         </w:rPr>
       </w:pPr>
-      <w:commentRangeStart w:id="49"/>
+      <w:commentRangeStart w:id="50"/>
       <w:r>
         <w:rPr>
           <w:noProof/>
@@ -6657,12 +6981,12 @@
           </wp:inline>
         </w:drawing>
       </w:r>
-      <w:commentRangeEnd w:id="49"/>
+      <w:commentRangeEnd w:id="50"/>
       <w:r>
         <w:rPr>
           <w:rStyle w:val="Kommentarzeichen"/>
         </w:rPr>
-        <w:commentReference w:id="49"/>
+        <w:commentReference w:id="50"/>
       </w:r>
     </w:p>
     <w:p>
@@ -6815,12 +7139,22 @@
       <w:pPr>
         <w:pStyle w:val="berschrift3"/>
       </w:pPr>
-      <w:bookmarkStart w:id="50" w:name="_Toc221613884"/>
+      <w:bookmarkStart w:id="51" w:name="_Toc221613884"/>
+      <w:commentRangeStart w:id="52"/>
       <w:r>
         <w:lastRenderedPageBreak/>
         <w:t>Punktwolken und dreidimensionale Geometrie</w:t>
       </w:r>
-      <w:bookmarkEnd w:id="50"/>
+      <w:bookmarkEnd w:id="51"/>
+      <w:commentRangeEnd w:id="52"/>
+      <w:r>
+        <w:rPr>
+          <w:rStyle w:val="Kommentarzeichen"/>
+          <w:b w:val="0"/>
+          <w:bCs w:val="0"/>
+        </w:rPr>
+        <w:commentReference w:id="52"/>
+      </w:r>
     </w:p>
     <w:p>
       <w:pPr>
@@ -6886,12 +7220,14 @@
           <w:lang w:val="de-AT"/>
         </w:rPr>
       </w:pPr>
+      <w:proofErr w:type="spellStart"/>
       <w:r>
         <w:rPr>
           <w:lang w:val="de-AT"/>
         </w:rPr>
         <w:t>Bounding</w:t>
       </w:r>
+      <w:proofErr w:type="spellEnd"/>
       <w:r>
         <w:rPr>
           <w:lang w:val="de-AT"/>
@@ -6929,7 +7265,21 @@
         <w:rPr>
           <w:lang w:val="de-AT"/>
         </w:rPr>
-        <w:t>Typische Filtermethoden sind Mittelwertbildung, Medianfilter oder statistische Ausreißerentfernung. Diese Verfahren reduzieren Messrauschen und verbessern die Stabilität der geometrischen Bestimmung.</w:t>
+        <w:t xml:space="preserve">Typische Filtermethoden sind Mittelwertbildung, Medianfilter oder statistische </w:t>
+      </w:r>
+      <w:proofErr w:type="spellStart"/>
+      <w:r>
+        <w:rPr>
+          <w:lang w:val="de-AT"/>
+        </w:rPr>
+        <w:t>Ausreißerentfernung</w:t>
+      </w:r>
+      <w:proofErr w:type="spellEnd"/>
+      <w:r>
+        <w:rPr>
+          <w:lang w:val="de-AT"/>
+        </w:rPr>
+        <w:t>. Diese Verfahren reduzieren Messrauschen und verbessern die Stabilität der geometrischen Bestimmung.</w:t>
       </w:r>
     </w:p>
     <w:p>
@@ -6953,7 +7303,7 @@
           <w:lang w:val="de-AT"/>
         </w:rPr>
       </w:pPr>
-      <w:bookmarkStart w:id="51" w:name="_Toc221613885"/>
+      <w:bookmarkStart w:id="53" w:name="_Toc221613885"/>
       <w:r>
         <w:rPr>
           <w:lang w:val="de-AT"/>
@@ -6968,7 +7318,7 @@
         <w:noBreakHyphen/>
         <w:t>Erkennung</w:t>
       </w:r>
-      <w:bookmarkEnd w:id="51"/>
+      <w:bookmarkEnd w:id="53"/>
     </w:p>
     <w:p>
       <w:pPr>
@@ -7090,8 +7440,16 @@
         <w:rPr>
           <w:lang w:val="de-AT"/>
         </w:rPr>
-        <w:t>Bildverarbeitungsbibliotheken wie OpenCV</w:t>
-      </w:r>
+        <w:t xml:space="preserve">Bildverarbeitungsbibliotheken wie </w:t>
+      </w:r>
+      <w:proofErr w:type="spellStart"/>
+      <w:r>
+        <w:rPr>
+          <w:lang w:val="de-AT"/>
+        </w:rPr>
+        <w:t>OpenCV</w:t>
+      </w:r>
+      <w:proofErr w:type="spellEnd"/>
       <w:r>
         <w:rPr>
           <w:lang w:val="de-AT"/>
@@ -7322,7 +7680,23 @@
           <w:bCs/>
           <w:lang w:val="de-AT"/>
         </w:rPr>
-        <w:t>YOLO (You Only Look Once)</w:t>
+        <w:t>YOLO (</w:t>
+      </w:r>
+      <w:proofErr w:type="spellStart"/>
+      <w:r>
+        <w:rPr>
+          <w:bCs/>
+          <w:lang w:val="de-AT"/>
+        </w:rPr>
+        <w:t>You</w:t>
+      </w:r>
+      <w:proofErr w:type="spellEnd"/>
+      <w:r>
+        <w:rPr>
+          <w:bCs/>
+          <w:lang w:val="de-AT"/>
+        </w:rPr>
+        <w:t xml:space="preserve"> Only Look Once)</w:t>
       </w:r>
       <w:r>
         <w:rPr>
@@ -7380,8 +7754,16 @@
         <w:rPr>
           <w:lang w:val="de-AT"/>
         </w:rPr>
-        <w:t xml:space="preserve"> 8 verwenden, um die Code</w:t>
-      </w:r>
+        <w:t xml:space="preserve"> 8 verwenden, um </w:t>
+      </w:r>
+      <w:proofErr w:type="gramStart"/>
+      <w:r>
+        <w:rPr>
+          <w:lang w:val="de-AT"/>
+        </w:rPr>
+        <w:t>die Code</w:t>
+      </w:r>
+      <w:proofErr w:type="gramEnd"/>
       <w:r>
         <w:rPr>
           <w:lang w:val="de-AT"/>
@@ -7409,19 +7791,19 @@
         </w:rPr>
         <w:noBreakHyphen/>
       </w:r>
-      <w:commentRangeStart w:id="52"/>
+      <w:commentRangeStart w:id="54"/>
       <w:r>
         <w:rPr>
           <w:lang w:val="de-AT"/>
         </w:rPr>
         <w:t>Objekterkennungsmodells</w:t>
       </w:r>
-      <w:commentRangeEnd w:id="52"/>
+      <w:commentRangeEnd w:id="54"/>
       <w:r>
         <w:rPr>
           <w:rStyle w:val="Kommentarzeichen"/>
         </w:rPr>
-        <w:commentReference w:id="52"/>
+        <w:commentReference w:id="54"/>
       </w:r>
       <w:r>
         <w:rPr>
@@ -7469,6 +7851,7 @@
         </w:rPr>
         <w:t>Sobald wir wissen, wo der Code ist, schneiden wir diesen Bereich aus dem Bild aus. Dann kommt die Bibliothek </w:t>
       </w:r>
+      <w:proofErr w:type="spellStart"/>
       <w:r>
         <w:rPr>
           <w:bCs/>
@@ -7476,12 +7859,14 @@
         </w:rPr>
         <w:t>pyzbar</w:t>
       </w:r>
+      <w:proofErr w:type="spellEnd"/>
       <w:r>
         <w:rPr>
           <w:lang w:val="de-AT"/>
         </w:rPr>
         <w:t xml:space="preserve"> zum Einsatz. </w:t>
       </w:r>
+      <w:proofErr w:type="spellStart"/>
       <w:r>
         <w:rPr>
           <w:lang w:val="de-AT"/>
@@ -7492,7 +7877,14 @@
         <w:rPr>
           <w:lang w:val="de-AT"/>
         </w:rPr>
-        <w:t>yzbar ist ein Python</w:t>
+        <w:t>yzbar</w:t>
+      </w:r>
+      <w:proofErr w:type="spellEnd"/>
+      <w:r>
+        <w:rPr>
+          <w:lang w:val="de-AT"/>
+        </w:rPr>
+        <w:t xml:space="preserve"> ist ein Python</w:t>
       </w:r>
       <w:r>
         <w:rPr>
@@ -7506,7 +7898,21 @@
           <w:lang w:val="de-AT"/>
         </w:rPr>
         <w:noBreakHyphen/>
-        <w:t>Bibliothek ZBar anspricht. Es analysiert die Hell</w:t>
+        <w:t xml:space="preserve">Bibliothek </w:t>
+      </w:r>
+      <w:proofErr w:type="spellStart"/>
+      <w:r>
+        <w:rPr>
+          <w:lang w:val="de-AT"/>
+        </w:rPr>
+        <w:t>ZBar</w:t>
+      </w:r>
+      <w:proofErr w:type="spellEnd"/>
+      <w:r>
+        <w:rPr>
+          <w:lang w:val="de-AT"/>
+        </w:rPr>
+        <w:t xml:space="preserve"> anspricht. Es analysiert die Hell</w:t>
       </w:r>
       <w:r>
         <w:rPr>
@@ -7599,7 +8005,7 @@
           <w:lang w:val="de-AT"/>
         </w:rPr>
       </w:pPr>
-      <w:commentRangeStart w:id="53"/>
+      <w:commentRangeStart w:id="55"/>
       <w:r>
         <w:rPr>
           <w:b/>
@@ -7608,12 +8014,12 @@
         </w:rPr>
         <w:t>Ablauf in der Software:</w:t>
       </w:r>
-      <w:commentRangeEnd w:id="53"/>
+      <w:commentRangeEnd w:id="55"/>
       <w:r>
         <w:rPr>
           <w:rStyle w:val="Kommentarzeichen"/>
         </w:rPr>
-        <w:commentReference w:id="53"/>
+        <w:commentReference w:id="55"/>
       </w:r>
     </w:p>
     <w:p>
@@ -7667,7 +8073,21 @@
         <w:rPr>
           <w:lang w:val="de-AT"/>
         </w:rPr>
-        <w:t>Für jede gefundene Position: Bildausschnitt extrahieren, in Graustufen umwandeln, mit pyzbar decodieren.</w:t>
+        <w:t xml:space="preserve">Für jede gefundene Position: Bildausschnitt extrahieren, in Graustufen umwandeln, mit </w:t>
+      </w:r>
+      <w:proofErr w:type="spellStart"/>
+      <w:r>
+        <w:rPr>
+          <w:lang w:val="de-AT"/>
+        </w:rPr>
+        <w:t>pyzbar</w:t>
+      </w:r>
+      <w:proofErr w:type="spellEnd"/>
+      <w:r>
+        <w:rPr>
+          <w:lang w:val="de-AT"/>
+        </w:rPr>
+        <w:t xml:space="preserve"> decodieren.</w:t>
       </w:r>
     </w:p>
     <w:p>
@@ -7685,7 +8105,21 @@
         <w:rPr>
           <w:lang w:val="de-AT"/>
         </w:rPr>
-        <w:t>Falls YOLO nichts findet, probieren wir als Notlösung, pyzbar auf dem gesamten Bild laufen zu lassen.</w:t>
+        <w:t xml:space="preserve">Falls YOLO nichts findet, probieren wir als Notlösung, </w:t>
+      </w:r>
+      <w:proofErr w:type="spellStart"/>
+      <w:r>
+        <w:rPr>
+          <w:lang w:val="de-AT"/>
+        </w:rPr>
+        <w:t>pyzbar</w:t>
+      </w:r>
+      <w:proofErr w:type="spellEnd"/>
+      <w:r>
+        <w:rPr>
+          <w:lang w:val="de-AT"/>
+        </w:rPr>
+        <w:t xml:space="preserve"> auf dem gesamten Bild laufen zu lassen.</w:t>
       </w:r>
     </w:p>
     <w:p>
@@ -7709,7 +8143,8 @@
           <w:lang w:val="de-AT"/>
         </w:rPr>
       </w:pPr>
-      <w:bookmarkStart w:id="54" w:name="_Toc221613886"/>
+      <w:bookmarkStart w:id="56" w:name="_Toc221613886"/>
+      <w:commentRangeStart w:id="57"/>
       <w:r>
         <w:rPr>
           <w:lang w:val="de-AT"/>
@@ -7723,7 +8158,16 @@
         </w:rPr>
         <w:t>- Systemübersicht</w:t>
       </w:r>
-      <w:bookmarkEnd w:id="54"/>
+      <w:bookmarkEnd w:id="56"/>
+      <w:commentRangeEnd w:id="57"/>
+      <w:r>
+        <w:rPr>
+          <w:rStyle w:val="Kommentarzeichen"/>
+          <w:b w:val="0"/>
+          <w:bCs w:val="0"/>
+        </w:rPr>
+        <w:commentReference w:id="57"/>
+      </w:r>
     </w:p>
     <w:p>
       <w:pPr>
@@ -7819,7 +8263,8 @@
           <w:lang w:val="de-AT"/>
         </w:rPr>
       </w:pPr>
-      <w:bookmarkStart w:id="55" w:name="_Toc221613887"/>
+      <w:bookmarkStart w:id="58" w:name="_Toc221613887"/>
+      <w:commentRangeStart w:id="59"/>
       <w:r>
         <w:rPr>
           <w:lang w:val="de-AT"/>
@@ -7827,7 +8272,16 @@
         <w:lastRenderedPageBreak/>
         <w:t>Systemintegration und Datenverarbeitung</w:t>
       </w:r>
-      <w:bookmarkEnd w:id="55"/>
+      <w:bookmarkEnd w:id="58"/>
+      <w:commentRangeEnd w:id="59"/>
+      <w:r>
+        <w:rPr>
+          <w:rStyle w:val="Kommentarzeichen"/>
+          <w:b w:val="0"/>
+          <w:bCs w:val="0"/>
+        </w:rPr>
+        <w:commentReference w:id="59"/>
+      </w:r>
     </w:p>
     <w:p>
       <w:pPr>
@@ -7862,8 +8316,13 @@
         </w:numPr>
       </w:pPr>
       <w:r>
-        <w:t>Kamera bzw. Bildverarbeitung zur Code</w:t>
-      </w:r>
+        <w:t xml:space="preserve">Kamera bzw. Bildverarbeitung </w:t>
+      </w:r>
+      <w:proofErr w:type="gramStart"/>
+      <w:r>
+        <w:t>zur Code</w:t>
+      </w:r>
+      <w:proofErr w:type="gramEnd"/>
       <w:r>
         <w:noBreakHyphen/>
         <w:t>Erkennung</w:t>
@@ -7877,8 +8336,13 @@
           <w:numId w:val="24"/>
         </w:numPr>
       </w:pPr>
-      <w:r>
-        <w:t>Wägezelle zur Gewichtsmessung</w:t>
+      <w:proofErr w:type="spellStart"/>
+      <w:r>
+        <w:t>Wägezelle</w:t>
+      </w:r>
+      <w:proofErr w:type="spellEnd"/>
+      <w:r>
+        <w:t xml:space="preserve"> zur Gewichtsmessung</w:t>
       </w:r>
     </w:p>
     <w:p>
@@ -8178,12 +8642,12 @@
       <w:pPr>
         <w:pStyle w:val="berschrift3"/>
       </w:pPr>
-      <w:bookmarkStart w:id="56" w:name="_Toc221613888"/>
+      <w:bookmarkStart w:id="60" w:name="_Toc221613888"/>
       <w:r>
         <w:lastRenderedPageBreak/>
         <w:t>Verwendung von Literatur, Internetquellen und KI</w:t>
       </w:r>
-      <w:bookmarkEnd w:id="56"/>
+      <w:bookmarkEnd w:id="60"/>
     </w:p>
     <w:p>
       <w:pPr>
@@ -8221,14 +8685,14 @@
       <w:pPr>
         <w:pStyle w:val="berschrift3"/>
       </w:pPr>
-      <w:bookmarkStart w:id="57" w:name="_Toc221613889"/>
+      <w:bookmarkStart w:id="61" w:name="_Toc221613889"/>
       <w:r>
         <w:rPr>
           <w:color w:val="0066FF"/>
         </w:rPr>
         <w:t>Weitere Hinweise</w:t>
       </w:r>
-      <w:bookmarkEnd w:id="57"/>
+      <w:bookmarkEnd w:id="61"/>
       <w:r>
         <w:t xml:space="preserve"> </w:t>
       </w:r>
@@ -8251,7 +8715,23 @@
           <w:b/>
           <w:color w:val="0066FF"/>
         </w:rPr>
-        <w:t>blau geschrieber Text</w:t>
+        <w:t xml:space="preserve">blau </w:t>
+      </w:r>
+      <w:proofErr w:type="spellStart"/>
+      <w:r>
+        <w:rPr>
+          <w:b/>
+          <w:color w:val="0066FF"/>
+        </w:rPr>
+        <w:t>geschrieber</w:t>
+      </w:r>
+      <w:proofErr w:type="spellEnd"/>
+      <w:r>
+        <w:rPr>
+          <w:b/>
+          <w:color w:val="0066FF"/>
+        </w:rPr>
+        <w:t xml:space="preserve"> Text</w:t>
       </w:r>
       <w:r>
         <w:rPr>
@@ -8704,7 +9184,49 @@
         <w:rPr>
           <w:color w:val="0066FF"/>
         </w:rPr>
-        <w:t xml:space="preserve">Tabelle markieren -&gt; Rechsklick -&gt; „Beschriftung einfügen“ -&gt; Text eingeben (in erster Zeile „Beschriftung“ neben „Tabelle Nr“: … Die Nummer der Tabelle wird automatisch erstellt. Als „Position“ wird „Unter dem ausgewähten Element“ wählen. </w:t>
+        <w:t xml:space="preserve">Tabelle markieren -&gt; </w:t>
+      </w:r>
+      <w:proofErr w:type="spellStart"/>
+      <w:r>
+        <w:rPr>
+          <w:color w:val="0066FF"/>
+        </w:rPr>
+        <w:t>Rechsklick</w:t>
+      </w:r>
+      <w:proofErr w:type="spellEnd"/>
+      <w:r>
+        <w:rPr>
+          <w:color w:val="0066FF"/>
+        </w:rPr>
+        <w:t xml:space="preserve"> -&gt; „Beschriftung einfügen“ -&gt; Text eingeben (in erster Zeile „Beschriftung“ neben „Tabelle </w:t>
+      </w:r>
+      <w:proofErr w:type="spellStart"/>
+      <w:r>
+        <w:rPr>
+          <w:color w:val="0066FF"/>
+        </w:rPr>
+        <w:t>Nr</w:t>
+      </w:r>
+      <w:proofErr w:type="spellEnd"/>
+      <w:r>
+        <w:rPr>
+          <w:color w:val="0066FF"/>
+        </w:rPr>
+        <w:t xml:space="preserve">“: … Die Nummer der Tabelle wird automatisch erstellt. Als „Position“ wird „Unter dem </w:t>
+      </w:r>
+      <w:proofErr w:type="spellStart"/>
+      <w:r>
+        <w:rPr>
+          <w:color w:val="0066FF"/>
+        </w:rPr>
+        <w:t>ausgewähten</w:t>
+      </w:r>
+      <w:proofErr w:type="spellEnd"/>
+      <w:r>
+        <w:rPr>
+          <w:color w:val="0066FF"/>
+        </w:rPr>
+        <w:t xml:space="preserve"> Element“ wählen. </w:t>
       </w:r>
     </w:p>
     <w:p>
@@ -8744,11 +9266,33 @@
           <w:color w:val="0066FF"/>
         </w:rPr>
       </w:pPr>
-      <w:r>
-        <w:rPr>
-          <w:color w:val="0066FF"/>
-        </w:rPr>
-        <w:t>jpg, png und ähnliche Bilddateien werden mit „Einfügen“ -&gt; „Bilder“ -&gt; „Dieses Gerät (oder passende Quelle wählen)“ eingefügt. Idealerweise sind Bilder „zentriert“ zu platzieren.</w:t>
+      <w:proofErr w:type="spellStart"/>
+      <w:r>
+        <w:rPr>
+          <w:color w:val="0066FF"/>
+        </w:rPr>
+        <w:t>jpg</w:t>
+      </w:r>
+      <w:proofErr w:type="spellEnd"/>
+      <w:r>
+        <w:rPr>
+          <w:color w:val="0066FF"/>
+        </w:rPr>
+        <w:t xml:space="preserve">, </w:t>
+      </w:r>
+      <w:proofErr w:type="spellStart"/>
+      <w:r>
+        <w:rPr>
+          <w:color w:val="0066FF"/>
+        </w:rPr>
+        <w:t>png</w:t>
+      </w:r>
+      <w:proofErr w:type="spellEnd"/>
+      <w:r>
+        <w:rPr>
+          <w:color w:val="0066FF"/>
+        </w:rPr>
+        <w:t xml:space="preserve"> und ähnliche Bilddateien werden mit „Einfügen“ -&gt; „Bilder“ -&gt; „Dieses Gerät (oder passende Quelle wählen)“ eingefügt. Idealerweise sind Bilder „zentriert“ zu platzieren.</w:t>
       </w:r>
     </w:p>
     <w:p>
@@ -8839,12 +9383,12 @@
       <w:pPr>
         <w:pStyle w:val="berschrift2"/>
       </w:pPr>
-      <w:bookmarkStart w:id="58" w:name="_Toc221613890"/>
+      <w:bookmarkStart w:id="62" w:name="_Toc221613890"/>
       <w:r>
         <w:lastRenderedPageBreak/>
         <w:t>Praktische Umsetzung</w:t>
       </w:r>
-      <w:bookmarkEnd w:id="58"/>
+      <w:bookmarkEnd w:id="62"/>
     </w:p>
     <w:p>
       <w:r>
@@ -8858,11 +9402,11 @@
       <w:pPr>
         <w:pStyle w:val="berschrift2"/>
       </w:pPr>
-      <w:bookmarkStart w:id="59" w:name="_Toc221613891"/>
+      <w:bookmarkStart w:id="63" w:name="_Toc221613891"/>
       <w:r>
         <w:t>Weitere individuelle Abschnitte</w:t>
       </w:r>
-      <w:bookmarkEnd w:id="59"/>
+      <w:bookmarkEnd w:id="63"/>
       <w:r>
         <w:t xml:space="preserve"> </w:t>
       </w:r>
@@ -8878,7 +9422,35 @@
         <w:rPr>
           <w:color w:val="0066FF"/>
         </w:rPr>
-        <w:t>(FV = Text) Diese Abschnitte sind individuell mit Ihren Betreuer:innen festzulegen.</w:t>
+        <w:t xml:space="preserve">(FV = Text) Diese Abschnitte sind individuell </w:t>
+      </w:r>
+      <w:proofErr w:type="gramStart"/>
+      <w:r>
+        <w:rPr>
+          <w:color w:val="0066FF"/>
+        </w:rPr>
+        <w:t xml:space="preserve">mit Ihren </w:t>
+      </w:r>
+      <w:proofErr w:type="spellStart"/>
+      <w:r>
+        <w:rPr>
+          <w:color w:val="0066FF"/>
+        </w:rPr>
+        <w:t>Betreuer</w:t>
+      </w:r>
+      <w:proofErr w:type="gramEnd"/>
+      <w:r>
+        <w:rPr>
+          <w:color w:val="0066FF"/>
+        </w:rPr>
+        <w:t>:innen</w:t>
+      </w:r>
+      <w:proofErr w:type="spellEnd"/>
+      <w:r>
+        <w:rPr>
+          <w:color w:val="0066FF"/>
+        </w:rPr>
+        <w:t xml:space="preserve"> festzulegen.</w:t>
       </w:r>
     </w:p>
     <w:p>
@@ -8893,11 +9465,11 @@
       <w:pPr>
         <w:pStyle w:val="berschrift2"/>
       </w:pPr>
-      <w:bookmarkStart w:id="60" w:name="_Toc221613892"/>
+      <w:bookmarkStart w:id="64" w:name="_Toc221613892"/>
       <w:r>
         <w:t>Ergebnisse und Diskussion</w:t>
       </w:r>
-      <w:bookmarkEnd w:id="60"/>
+      <w:bookmarkEnd w:id="64"/>
     </w:p>
     <w:p>
       <w:pPr>
@@ -8917,23 +9489,37 @@
       <w:pPr>
         <w:pStyle w:val="berschrift2"/>
       </w:pPr>
-      <w:bookmarkStart w:id="61" w:name="_Toc221613893"/>
+      <w:bookmarkStart w:id="65" w:name="_Toc221613893"/>
       <w:r>
         <w:t>Zusammenfassung individueller Teil</w:t>
       </w:r>
-      <w:bookmarkEnd w:id="61"/>
-    </w:p>
-    <w:p>
-      <w:pPr>
-        <w:rPr>
-          <w:color w:val="0066FF"/>
-        </w:rPr>
-      </w:pPr>
-      <w:r>
-        <w:rPr>
-          <w:color w:val="0066FF"/>
-        </w:rPr>
-        <w:t>(FV = Text) Hier werden die wichtigsten Fakten der individuellen Aufgabe des Schülers / der Schülerin kurz zusammengefasst werden.</w:t>
+      <w:bookmarkEnd w:id="65"/>
+    </w:p>
+    <w:p>
+      <w:pPr>
+        <w:rPr>
+          <w:color w:val="0066FF"/>
+        </w:rPr>
+      </w:pPr>
+      <w:r>
+        <w:rPr>
+          <w:color w:val="0066FF"/>
+        </w:rPr>
+        <w:t xml:space="preserve">(FV = Text) </w:t>
+      </w:r>
+      <w:proofErr w:type="gramStart"/>
+      <w:r>
+        <w:rPr>
+          <w:color w:val="0066FF"/>
+        </w:rPr>
+        <w:t>Hier</w:t>
+      </w:r>
+      <w:proofErr w:type="gramEnd"/>
+      <w:r>
+        <w:rPr>
+          <w:color w:val="0066FF"/>
+        </w:rPr>
+        <w:t xml:space="preserve"> werden die wichtigsten Fakten der individuellen Aufgabe des Schülers / der Schülerin kurz zusammengefasst werden.</w:t>
       </w:r>
     </w:p>
     <w:p>
@@ -9053,26 +9639,26 @@
       <w:pPr>
         <w:pStyle w:val="berschrift1"/>
       </w:pPr>
-      <w:bookmarkStart w:id="62" w:name="_Ref200468988"/>
-      <w:bookmarkStart w:id="63" w:name="_Ref200469530"/>
-      <w:bookmarkStart w:id="64" w:name="_Toc221613894"/>
+      <w:bookmarkStart w:id="66" w:name="_Ref200468988"/>
+      <w:bookmarkStart w:id="67" w:name="_Ref200469530"/>
+      <w:bookmarkStart w:id="68" w:name="_Toc221613894"/>
       <w:r>
         <w:lastRenderedPageBreak/>
         <w:t>Zusammenfassung und Ausblick</w:t>
       </w:r>
-      <w:bookmarkEnd w:id="62"/>
-      <w:bookmarkEnd w:id="63"/>
-      <w:bookmarkEnd w:id="64"/>
+      <w:bookmarkEnd w:id="66"/>
+      <w:bookmarkEnd w:id="67"/>
+      <w:bookmarkEnd w:id="68"/>
     </w:p>
     <w:p>
       <w:pPr>
         <w:pStyle w:val="berschrift2"/>
       </w:pPr>
-      <w:bookmarkStart w:id="65" w:name="_Toc221613895"/>
+      <w:bookmarkStart w:id="69" w:name="_Toc221613895"/>
       <w:r>
         <w:t>Zusammenfassung der gesamten Arbeit</w:t>
       </w:r>
-      <w:bookmarkEnd w:id="65"/>
+      <w:bookmarkEnd w:id="69"/>
     </w:p>
     <w:p>
       <w:pPr>
@@ -9106,11 +9692,11 @@
       <w:pPr>
         <w:pStyle w:val="berschrift2"/>
       </w:pPr>
-      <w:bookmarkStart w:id="66" w:name="_Toc221613896"/>
+      <w:bookmarkStart w:id="70" w:name="_Toc221613896"/>
       <w:r>
         <w:t>Ausblick</w:t>
       </w:r>
-      <w:bookmarkEnd w:id="66"/>
+      <w:bookmarkEnd w:id="70"/>
     </w:p>
     <w:p>
       <w:pPr>
@@ -9230,8 +9816,16 @@
         <w:rPr>
           <w:color w:val="0066FF"/>
         </w:rPr>
-        <w:t>Erweiterung der Funktionalität des vorliegendes Projekts</w:t>
-      </w:r>
+        <w:t xml:space="preserve">Erweiterung der Funktionalität </w:t>
+      </w:r>
+      <w:proofErr w:type="gramStart"/>
+      <w:r>
+        <w:rPr>
+          <w:color w:val="0066FF"/>
+        </w:rPr>
+        <w:t>des vorliegendes Projekts</w:t>
+      </w:r>
+      <w:proofErr w:type="gramEnd"/>
     </w:p>
     <w:p>
       <w:pPr>
@@ -9253,14 +9847,14 @@
       <w:pPr>
         <w:pStyle w:val="berschrift1"/>
       </w:pPr>
-      <w:bookmarkStart w:id="67" w:name="_Ref200468159"/>
-      <w:bookmarkStart w:id="68" w:name="_Toc221613897"/>
+      <w:bookmarkStart w:id="71" w:name="_Ref200468159"/>
+      <w:bookmarkStart w:id="72" w:name="_Toc221613897"/>
       <w:r>
         <w:lastRenderedPageBreak/>
         <w:t>Erklärung der Eigenständigkeit</w:t>
       </w:r>
-      <w:bookmarkEnd w:id="67"/>
-      <w:bookmarkEnd w:id="68"/>
+      <w:bookmarkEnd w:id="71"/>
+      <w:bookmarkEnd w:id="72"/>
     </w:p>
     <w:p>
       <w:pPr>
@@ -9334,8 +9928,13 @@
             <w:pPr>
               <w:pStyle w:val="TextinTabelle"/>
             </w:pPr>
-            <w:r>
-              <w:t>Schüler:in 1</w:t>
+            <w:proofErr w:type="spellStart"/>
+            <w:r>
+              <w:t>Schüler:in</w:t>
+            </w:r>
+            <w:proofErr w:type="spellEnd"/>
+            <w:r>
+              <w:t xml:space="preserve"> 1</w:t>
             </w:r>
           </w:p>
         </w:tc>
@@ -9418,38 +10017,34 @@
           <w:docGrid w:type="lines" w:linePitch="360"/>
         </w:sectPr>
       </w:pPr>
-      <w:bookmarkStart w:id="69" w:name="_Ref200469499"/>
-      <w:bookmarkStart w:id="70" w:name="_Toc221613898"/>
+      <w:bookmarkStart w:id="73" w:name="_Ref200469499"/>
+      <w:bookmarkStart w:id="74" w:name="_Toc221613898"/>
       <w:r>
         <w:lastRenderedPageBreak/>
         <w:t>Arbeitsnachweise</w:t>
       </w:r>
-      <w:bookmarkEnd w:id="69"/>
-      <w:bookmarkEnd w:id="70"/>
+      <w:bookmarkEnd w:id="73"/>
+      <w:bookmarkEnd w:id="74"/>
     </w:p>
     <w:p>
       <w:pPr>
         <w:pStyle w:val="berschrift1"/>
       </w:pPr>
-      <w:bookmarkStart w:id="71" w:name="_Toc84751256"/>
-      <w:bookmarkStart w:id="72" w:name="_Toc211138167"/>
-      <w:bookmarkStart w:id="73" w:name="_Toc211137922"/>
-      <w:bookmarkStart w:id="74" w:name="_Toc84757221"/>
-      <w:bookmarkStart w:id="75" w:name="_Toc210560305"/>
-      <w:bookmarkStart w:id="76" w:name="_Toc210560252"/>
-      <w:bookmarkStart w:id="77" w:name="_Ref210560064"/>
-      <w:bookmarkStart w:id="78" w:name="_Toc84751368"/>
-      <w:bookmarkStart w:id="79" w:name="_Ref200467937"/>
-      <w:bookmarkStart w:id="80" w:name="_Ref200469033"/>
-      <w:bookmarkStart w:id="81" w:name="_Toc221613899"/>
+      <w:bookmarkStart w:id="75" w:name="_Toc84751256"/>
+      <w:bookmarkStart w:id="76" w:name="_Toc211138167"/>
+      <w:bookmarkStart w:id="77" w:name="_Toc211137922"/>
+      <w:bookmarkStart w:id="78" w:name="_Toc84757221"/>
+      <w:bookmarkStart w:id="79" w:name="_Toc210560305"/>
+      <w:bookmarkStart w:id="80" w:name="_Toc210560252"/>
+      <w:bookmarkStart w:id="81" w:name="_Ref210560064"/>
+      <w:bookmarkStart w:id="82" w:name="_Toc84751368"/>
+      <w:bookmarkStart w:id="83" w:name="_Ref200467937"/>
+      <w:bookmarkStart w:id="84" w:name="_Ref200469033"/>
+      <w:bookmarkStart w:id="85" w:name="_Toc221613899"/>
       <w:r>
         <w:lastRenderedPageBreak/>
         <w:t>Verzeichnisse</w:t>
       </w:r>
-      <w:bookmarkEnd w:id="71"/>
-      <w:bookmarkEnd w:id="72"/>
-      <w:bookmarkEnd w:id="73"/>
-      <w:bookmarkEnd w:id="74"/>
       <w:bookmarkEnd w:id="75"/>
       <w:bookmarkEnd w:id="76"/>
       <w:bookmarkEnd w:id="77"/>
@@ -9457,167 +10052,227 @@
       <w:bookmarkEnd w:id="79"/>
       <w:bookmarkEnd w:id="80"/>
       <w:bookmarkEnd w:id="81"/>
-      <w:r>
-        <w:t xml:space="preserve"> </w:t>
-      </w:r>
-    </w:p>
-    <w:p>
-      <w:pPr>
-        <w:pStyle w:val="berschrift2"/>
-      </w:pPr>
-      <w:bookmarkStart w:id="82" w:name="_Toc210560306"/>
-      <w:bookmarkStart w:id="83" w:name="_Toc211138168"/>
-      <w:bookmarkStart w:id="84" w:name="_Toc84757222"/>
-      <w:bookmarkStart w:id="85" w:name="_Toc84751369"/>
-      <w:bookmarkStart w:id="86" w:name="_Toc84751257"/>
-      <w:bookmarkStart w:id="87" w:name="_Toc210560253"/>
-      <w:bookmarkStart w:id="88" w:name="_Toc211137923"/>
-      <w:bookmarkStart w:id="89" w:name="_Toc221613900"/>
-      <w:r>
-        <w:t>Literatur</w:t>
-      </w:r>
       <w:bookmarkEnd w:id="82"/>
       <w:bookmarkEnd w:id="83"/>
       <w:bookmarkEnd w:id="84"/>
       <w:bookmarkEnd w:id="85"/>
+      <w:r>
+        <w:t xml:space="preserve"> </w:t>
+      </w:r>
+    </w:p>
+    <w:p>
+      <w:pPr>
+        <w:pStyle w:val="berschrift2"/>
+      </w:pPr>
+      <w:bookmarkStart w:id="86" w:name="_Toc210560306"/>
+      <w:bookmarkStart w:id="87" w:name="_Toc211138168"/>
+      <w:bookmarkStart w:id="88" w:name="_Toc84757222"/>
+      <w:bookmarkStart w:id="89" w:name="_Toc84751369"/>
+      <w:bookmarkStart w:id="90" w:name="_Toc84751257"/>
+      <w:bookmarkStart w:id="91" w:name="_Toc210560253"/>
+      <w:bookmarkStart w:id="92" w:name="_Toc211137923"/>
+      <w:bookmarkStart w:id="93" w:name="_Toc221613900"/>
+      <w:r>
+        <w:t>Literatur</w:t>
+      </w:r>
       <w:bookmarkEnd w:id="86"/>
       <w:bookmarkEnd w:id="87"/>
       <w:bookmarkEnd w:id="88"/>
-      <w:r>
-        <w:t>verzeichnis</w:t>
-      </w:r>
       <w:bookmarkEnd w:id="89"/>
-      <w:r>
-        <w:t xml:space="preserve"> </w:t>
-      </w:r>
-    </w:p>
-    <w:p>
-      <w:pPr>
-        <w:rPr>
-          <w:color w:val="0066FF"/>
-        </w:rPr>
-      </w:pPr>
-      <w:r>
-        <w:rPr>
-          <w:color w:val="0066FF"/>
-        </w:rPr>
-        <w:t>Wird mithilfe von Zotero erstellt…</w:t>
-      </w:r>
-    </w:p>
-    <w:p>
-      <w:pPr>
-        <w:pStyle w:val="berschrift2"/>
-      </w:pPr>
-      <w:bookmarkStart w:id="90" w:name="_Toc84757225"/>
-      <w:bookmarkStart w:id="91" w:name="_Toc211138171"/>
-      <w:bookmarkStart w:id="92" w:name="_Toc211137927"/>
-      <w:bookmarkStart w:id="93" w:name="_Toc84751260"/>
-      <w:bookmarkStart w:id="94" w:name="_Toc210560307"/>
-      <w:bookmarkStart w:id="95" w:name="_Toc210560254"/>
-      <w:bookmarkStart w:id="96" w:name="_Toc84751372"/>
-      <w:bookmarkStart w:id="97" w:name="_Toc221613901"/>
-      <w:r>
-        <w:t>Abkürzungsverzeichnis</w:t>
-      </w:r>
       <w:bookmarkEnd w:id="90"/>
       <w:bookmarkEnd w:id="91"/>
       <w:bookmarkEnd w:id="92"/>
+      <w:r>
+        <w:t>verzeichnis</w:t>
+      </w:r>
       <w:bookmarkEnd w:id="93"/>
+      <w:r>
+        <w:t xml:space="preserve"> </w:t>
+      </w:r>
+    </w:p>
+    <w:p>
+      <w:pPr>
+        <w:rPr>
+          <w:color w:val="0066FF"/>
+        </w:rPr>
+      </w:pPr>
+      <w:r>
+        <w:rPr>
+          <w:color w:val="0066FF"/>
+        </w:rPr>
+        <w:t xml:space="preserve">Wird mithilfe von </w:t>
+      </w:r>
+      <w:proofErr w:type="spellStart"/>
+      <w:r>
+        <w:rPr>
+          <w:color w:val="0066FF"/>
+        </w:rPr>
+        <w:t>Zotero</w:t>
+      </w:r>
+      <w:proofErr w:type="spellEnd"/>
+      <w:r>
+        <w:rPr>
+          <w:color w:val="0066FF"/>
+        </w:rPr>
+        <w:t xml:space="preserve"> erstellt…</w:t>
+      </w:r>
+    </w:p>
+    <w:p>
+      <w:pPr>
+        <w:pStyle w:val="berschrift2"/>
+      </w:pPr>
+      <w:bookmarkStart w:id="94" w:name="_Toc84757225"/>
+      <w:bookmarkStart w:id="95" w:name="_Toc211138171"/>
+      <w:bookmarkStart w:id="96" w:name="_Toc211137927"/>
+      <w:bookmarkStart w:id="97" w:name="_Toc84751260"/>
+      <w:bookmarkStart w:id="98" w:name="_Toc210560307"/>
+      <w:bookmarkStart w:id="99" w:name="_Toc210560254"/>
+      <w:bookmarkStart w:id="100" w:name="_Toc84751372"/>
+      <w:bookmarkStart w:id="101" w:name="_Toc221613901"/>
+      <w:r>
+        <w:t>Abkürzungsverzeichnis</w:t>
+      </w:r>
       <w:bookmarkEnd w:id="94"/>
       <w:bookmarkEnd w:id="95"/>
       <w:bookmarkEnd w:id="96"/>
       <w:bookmarkEnd w:id="97"/>
-    </w:p>
-    <w:p>
-      <w:pPr>
-        <w:pStyle w:val="Text"/>
-        <w:rPr>
-          <w:color w:val="0066FF"/>
-        </w:rPr>
-      </w:pPr>
-      <w:r>
-        <w:rPr>
-          <w:color w:val="0066FF"/>
-        </w:rPr>
-        <w:t>(FV Text)</w:t>
-      </w:r>
-      <w:bookmarkStart w:id="98" w:name="_Toc211138172"/>
-      <w:bookmarkStart w:id="99" w:name="_Toc211137928"/>
-      <w:bookmarkStart w:id="100" w:name="_Toc84757226"/>
-      <w:bookmarkStart w:id="101" w:name="_Toc84751373"/>
-      <w:bookmarkStart w:id="102" w:name="_Toc84751261"/>
-      <w:bookmarkStart w:id="103" w:name="_Toc210560308"/>
-      <w:bookmarkStart w:id="104" w:name="_Toc210560255"/>
-      <w:r>
-        <w:rPr>
-          <w:color w:val="0066FF"/>
-        </w:rPr>
-        <w:t xml:space="preserve"> Optionaler Abschnitt. Nur verwenden, wenn mehr als 10 verschiedene Abkürzungen im gesamten Dokument vorkommen.</w:t>
-      </w:r>
-    </w:p>
-    <w:p>
-      <w:pPr>
-        <w:pStyle w:val="berschrift2"/>
-      </w:pPr>
-      <w:bookmarkStart w:id="105" w:name="_Toc221613902"/>
-      <w:r>
-        <w:t>Tabellen</w:t>
-      </w:r>
       <w:bookmarkEnd w:id="98"/>
       <w:bookmarkEnd w:id="99"/>
       <w:bookmarkEnd w:id="100"/>
       <w:bookmarkEnd w:id="101"/>
+    </w:p>
+    <w:p>
+      <w:pPr>
+        <w:pStyle w:val="Text"/>
+        <w:rPr>
+          <w:color w:val="0066FF"/>
+        </w:rPr>
+      </w:pPr>
+      <w:r>
+        <w:rPr>
+          <w:color w:val="0066FF"/>
+        </w:rPr>
+        <w:t>(</w:t>
+      </w:r>
+      <w:proofErr w:type="gramStart"/>
+      <w:r>
+        <w:rPr>
+          <w:color w:val="0066FF"/>
+        </w:rPr>
+        <w:t>FV Text</w:t>
+      </w:r>
+      <w:proofErr w:type="gramEnd"/>
+      <w:r>
+        <w:rPr>
+          <w:color w:val="0066FF"/>
+        </w:rPr>
+        <w:t>)</w:t>
+      </w:r>
+      <w:bookmarkStart w:id="102" w:name="_Toc211138172"/>
+      <w:bookmarkStart w:id="103" w:name="_Toc211137928"/>
+      <w:bookmarkStart w:id="104" w:name="_Toc84757226"/>
+      <w:bookmarkStart w:id="105" w:name="_Toc84751373"/>
+      <w:bookmarkStart w:id="106" w:name="_Toc84751261"/>
+      <w:bookmarkStart w:id="107" w:name="_Toc210560308"/>
+      <w:bookmarkStart w:id="108" w:name="_Toc210560255"/>
+      <w:r>
+        <w:rPr>
+          <w:color w:val="0066FF"/>
+        </w:rPr>
+        <w:t xml:space="preserve"> Optionaler Abschnitt. Nur verwenden, wenn mehr als 10 verschiedene Abkürzungen im gesamten Dokument vorkommen.</w:t>
+      </w:r>
+    </w:p>
+    <w:p>
+      <w:pPr>
+        <w:pStyle w:val="berschrift2"/>
+      </w:pPr>
+      <w:bookmarkStart w:id="109" w:name="_Toc221613902"/>
+      <w:r>
+        <w:t>Tabellen</w:t>
+      </w:r>
       <w:bookmarkEnd w:id="102"/>
       <w:bookmarkEnd w:id="103"/>
       <w:bookmarkEnd w:id="104"/>
       <w:bookmarkEnd w:id="105"/>
-    </w:p>
-    <w:p>
-      <w:r>
-        <w:rPr>
-          <w:color w:val="0066FF"/>
-        </w:rPr>
-        <w:t>(FV Text) Optionaler Abschnitt. Nur verwenden, wenn mehr als 10 verschiedene Tabellen im gesamten Dokument vorkommen.</w:t>
-      </w:r>
-    </w:p>
-    <w:p>
-      <w:pPr>
-        <w:pStyle w:val="berschrift2"/>
-      </w:pPr>
-      <w:bookmarkStart w:id="106" w:name="_Toc210560256"/>
-      <w:bookmarkStart w:id="107" w:name="_Toc210560309"/>
-      <w:bookmarkStart w:id="108" w:name="_Toc211137929"/>
-      <w:bookmarkStart w:id="109" w:name="_Toc84757227"/>
-      <w:bookmarkStart w:id="110" w:name="_Toc84751374"/>
-      <w:bookmarkStart w:id="111" w:name="_Toc84751262"/>
-      <w:bookmarkStart w:id="112" w:name="_Toc211138173"/>
-      <w:bookmarkStart w:id="113" w:name="_Toc221613903"/>
-      <w:r>
-        <w:t>Abbildunge</w:t>
-      </w:r>
       <w:bookmarkEnd w:id="106"/>
       <w:bookmarkEnd w:id="107"/>
-      <w:r>
-        <w:t>n</w:t>
-      </w:r>
       <w:bookmarkEnd w:id="108"/>
       <w:bookmarkEnd w:id="109"/>
+    </w:p>
+    <w:p>
+      <w:r>
+        <w:rPr>
+          <w:color w:val="0066FF"/>
+        </w:rPr>
+        <w:t>(</w:t>
+      </w:r>
+      <w:proofErr w:type="gramStart"/>
+      <w:r>
+        <w:rPr>
+          <w:color w:val="0066FF"/>
+        </w:rPr>
+        <w:t>FV Text</w:t>
+      </w:r>
+      <w:proofErr w:type="gramEnd"/>
+      <w:r>
+        <w:rPr>
+          <w:color w:val="0066FF"/>
+        </w:rPr>
+        <w:t>) Optionaler Abschnitt. Nur verwenden, wenn mehr als 10 verschiedene Tabellen im gesamten Dokument vorkommen.</w:t>
+      </w:r>
+    </w:p>
+    <w:p>
+      <w:pPr>
+        <w:pStyle w:val="berschrift2"/>
+      </w:pPr>
+      <w:bookmarkStart w:id="110" w:name="_Toc210560256"/>
+      <w:bookmarkStart w:id="111" w:name="_Toc210560309"/>
+      <w:bookmarkStart w:id="112" w:name="_Toc211137929"/>
+      <w:bookmarkStart w:id="113" w:name="_Toc84757227"/>
+      <w:bookmarkStart w:id="114" w:name="_Toc84751374"/>
+      <w:bookmarkStart w:id="115" w:name="_Toc84751262"/>
+      <w:bookmarkStart w:id="116" w:name="_Toc211138173"/>
+      <w:bookmarkStart w:id="117" w:name="_Toc221613903"/>
+      <w:r>
+        <w:t>Abbildunge</w:t>
+      </w:r>
       <w:bookmarkEnd w:id="110"/>
       <w:bookmarkEnd w:id="111"/>
+      <w:r>
+        <w:t>n</w:t>
+      </w:r>
       <w:bookmarkEnd w:id="112"/>
       <w:bookmarkEnd w:id="113"/>
-    </w:p>
-    <w:p>
-      <w:pPr>
-        <w:rPr>
-          <w:color w:val="0066FF"/>
-        </w:rPr>
-      </w:pPr>
-      <w:r>
-        <w:rPr>
-          <w:color w:val="0066FF"/>
-        </w:rPr>
-        <w:t>(FV Text) Optionaler Abschnitt. Nur verwenden, wenn mehr als 10 verschiedene Bilder im gesamten Dokument vorkommen.</w:t>
+      <w:bookmarkEnd w:id="114"/>
+      <w:bookmarkEnd w:id="115"/>
+      <w:bookmarkEnd w:id="116"/>
+      <w:bookmarkEnd w:id="117"/>
+    </w:p>
+    <w:p>
+      <w:pPr>
+        <w:rPr>
+          <w:color w:val="0066FF"/>
+        </w:rPr>
+      </w:pPr>
+      <w:r>
+        <w:rPr>
+          <w:color w:val="0066FF"/>
+        </w:rPr>
+        <w:t>(</w:t>
+      </w:r>
+      <w:proofErr w:type="gramStart"/>
+      <w:r>
+        <w:rPr>
+          <w:color w:val="0066FF"/>
+        </w:rPr>
+        <w:t>FV Text</w:t>
+      </w:r>
+      <w:proofErr w:type="gramEnd"/>
+      <w:r>
+        <w:rPr>
+          <w:color w:val="0066FF"/>
+        </w:rPr>
+        <w:t>) Optionaler Abschnitt. Nur verwenden, wenn mehr als 10 verschiedene Bilder im gesamten Dokument vorkommen.</w:t>
       </w:r>
     </w:p>
     <w:p>
@@ -9642,37 +10297,51 @@
       <w:pPr>
         <w:pStyle w:val="berschrift1"/>
       </w:pPr>
-      <w:bookmarkStart w:id="114" w:name="_Toc211138174"/>
-      <w:bookmarkStart w:id="115" w:name="_Toc211137930"/>
-      <w:bookmarkStart w:id="116" w:name="_Toc84751375"/>
-      <w:bookmarkStart w:id="117" w:name="_Toc84751263"/>
-      <w:bookmarkStart w:id="118" w:name="_Ref84675439"/>
-      <w:bookmarkStart w:id="119" w:name="_Toc221613904"/>
+      <w:bookmarkStart w:id="118" w:name="_Toc211138174"/>
+      <w:bookmarkStart w:id="119" w:name="_Toc211137930"/>
+      <w:bookmarkStart w:id="120" w:name="_Toc84751375"/>
+      <w:bookmarkStart w:id="121" w:name="_Toc84751263"/>
+      <w:bookmarkStart w:id="122" w:name="_Ref84675439"/>
+      <w:bookmarkStart w:id="123" w:name="_Toc221613904"/>
       <w:r>
         <w:lastRenderedPageBreak/>
         <w:t>Anhang</w:t>
       </w:r>
-      <w:bookmarkEnd w:id="114"/>
-      <w:bookmarkEnd w:id="115"/>
-      <w:bookmarkEnd w:id="116"/>
-      <w:bookmarkEnd w:id="117"/>
       <w:bookmarkEnd w:id="118"/>
       <w:bookmarkEnd w:id="119"/>
-    </w:p>
-    <w:p>
-      <w:pPr>
-        <w:pStyle w:val="Text"/>
-      </w:pPr>
-      <w:bookmarkStart w:id="120" w:name="_Ref210468443"/>
-      <w:bookmarkStart w:id="121" w:name="_Ref210464602"/>
-      <w:r>
-        <w:rPr>
-          <w:color w:val="0066FF"/>
-        </w:rPr>
-        <w:t>(FV Text) Optionales Kapitel. Hier werden Datenblätter, große Zeichnungen, Skizzen, Bilder, etc. eingefügt, die im Fließtext der vorigen Kapitel nicht eingefügt werden, da sie dort die Übersichtlichkeit bzw. Struktur dieser Kapitel verschlechtern würden.</w:t>
-      </w:r>
       <w:bookmarkEnd w:id="120"/>
       <w:bookmarkEnd w:id="121"/>
+      <w:bookmarkEnd w:id="122"/>
+      <w:bookmarkEnd w:id="123"/>
+    </w:p>
+    <w:p>
+      <w:pPr>
+        <w:pStyle w:val="Text"/>
+      </w:pPr>
+      <w:bookmarkStart w:id="124" w:name="_Ref210468443"/>
+      <w:bookmarkStart w:id="125" w:name="_Ref210464602"/>
+      <w:r>
+        <w:rPr>
+          <w:color w:val="0066FF"/>
+        </w:rPr>
+        <w:t>(</w:t>
+      </w:r>
+      <w:proofErr w:type="gramStart"/>
+      <w:r>
+        <w:rPr>
+          <w:color w:val="0066FF"/>
+        </w:rPr>
+        <w:t>FV Text</w:t>
+      </w:r>
+      <w:proofErr w:type="gramEnd"/>
+      <w:r>
+        <w:rPr>
+          <w:color w:val="0066FF"/>
+        </w:rPr>
+        <w:t>) Optionales Kapitel. Hier werden Datenblätter, große Zeichnungen, Skizzen, Bilder, etc. eingefügt, die im Fließtext der vorigen Kapitel nicht eingefügt werden, da sie dort die Übersichtlichkeit bzw. Struktur dieser Kapitel verschlechtern würden.</w:t>
+      </w:r>
+      <w:bookmarkEnd w:id="124"/>
+      <w:bookmarkEnd w:id="125"/>
     </w:p>
     <w:sectPr>
       <w:headerReference w:type="default" r:id="rId66"/>
@@ -9691,7 +10360,7 @@
 
 <file path=word/comments.xml><?xml version="1.0" encoding="utf-8"?>
 <w:comments xmlns:wpc="http://schemas.microsoft.com/office/word/2010/wordprocessingCanvas" xmlns:cx="http://schemas.microsoft.com/office/drawing/2014/chartex" xmlns:cx1="http://schemas.microsoft.com/office/drawing/2015/9/8/chartex" xmlns:cx2="http://schemas.microsoft.com/office/drawing/2015/10/21/chartex" xmlns:cx3="http://schemas.microsoft.com/office/drawing/2016/5/9/chartex" xmlns:cx4="http://schemas.microsoft.com/office/drawing/2016/5/10/chartex" xmlns:cx5="http://schemas.microsoft.com/office/drawing/2016/5/11/chartex" xmlns:cx6="http://schemas.microsoft.com/office/drawing/2016/5/12/chartex" xmlns:cx7="http://schemas.microsoft.com/office/drawing/2016/5/13/chartex" xmlns:cx8="http://schemas.microsoft.com/office/drawing/2016/5/14/chartex" xmlns:mc="http://schemas.openxmlformats.org/markup-compatibility/2006" xmlns:aink="http://schemas.microsoft.com/office/drawing/2016/ink" xmlns:am3d="http://schemas.microsoft.com/office/drawing/2017/model3d" xmlns:o="urn:schemas-microsoft-com:office:office" xmlns:oel="http://schemas.microsoft.com/office/2019/extlst" xmlns:r="http://schemas.openxmlformats.org/officeDocument/2006/relationships" xmlns:m="http://schemas.openxmlformats.org/officeDocument/2006/math" xmlns:v="urn:schemas-microsoft-com:vml" xmlns:wp14="http://schemas.microsoft.com/office/word/2010/wordprocessingDrawing" xmlns:wp="http://schemas.openxmlformats.org/drawingml/2006/wordprocessingDrawing" xmlns:w10="urn:schemas-microsoft-com:office:word" xmlns:w="http://schemas.openxmlformats.org/wordprocessingml/2006/main" xmlns:w14="http://schemas.microsoft.com/office/word/2010/wordml" xmlns:w15="http://schemas.microsoft.com/office/word/2012/wordml" xmlns:w16cex="http://schemas.microsoft.com/office/word/2018/wordml/cex" xmlns:w16cid="http://schemas.microsoft.com/office/word/2016/wordml/cid" xmlns:w16="http://schemas.microsoft.com/office/word/2018/wordml" xmlns:w16du="http://schemas.microsoft.com/office/word/2023/wordml/word16du" xmlns:w16sdtdh="http://schemas.microsoft.com/office/word/2020/wordml/sdtdatahash" xmlns:w16sdtfl="http://schemas.microsoft.com/office/word/2024/wordml/sdtformatlock" xmlns:w16se="http://schemas.microsoft.com/office/word/2015/wordml/symex" xmlns:wpg="http://schemas.microsoft.com/office/word/2010/wordprocessingGroup" xmlns:wpi="http://schemas.microsoft.com/office/word/2010/wordprocessingInk" xmlns:wne="http://schemas.microsoft.com/office/word/2006/wordml" xmlns:wps="http://schemas.microsoft.com/office/word/2010/wordprocessingShape" mc:Ignorable="w14 w15 w16se w16cid w16 w16cex w16sdtdh w16sdtfl w16du wp14">
-  <w:comment w:id="48" w:author="GRANEGGER Felix, SchülerIn" w:date="2026-02-18T20:29:00Z" w:initials="FG">
+  <w:comment w:id="48" w:author="GRANEGGER Felix, SchülerIn" w:date="2026-02-18T21:00:00Z" w:initials="FG">
     <w:p>
       <w:pPr>
         <w:pStyle w:val="Kommentartext"/>
@@ -9707,11 +10376,55 @@
         <w:rPr>
           <w:lang w:val="de-AT"/>
         </w:rPr>
+        <w:t>Verbessern</w:t>
+      </w:r>
+    </w:p>
+    <w:p>
+      <w:pPr>
+        <w:pStyle w:val="Kommentartext"/>
+        <w:jc w:val="left"/>
+      </w:pPr>
+      <w:r>
+        <w:rPr>
+          <w:lang w:val="de-AT"/>
+        </w:rPr>
+        <w:t>Augenvergleich</w:t>
+      </w:r>
+    </w:p>
+    <w:p>
+      <w:pPr>
+        <w:pStyle w:val="Kommentartext"/>
+        <w:jc w:val="left"/>
+      </w:pPr>
+      <w:r>
+        <w:rPr>
+          <w:lang w:val="de-AT"/>
+        </w:rPr>
+        <w:t>Usw.</w:t>
+      </w:r>
+    </w:p>
+  </w:comment>
+  <w:comment w:id="49" w:author="GRANEGGER Felix, SchülerIn" w:date="2026-02-18T20:29:00Z" w:initials="FG">
+    <w:p>
+      <w:pPr>
+        <w:pStyle w:val="Kommentartext"/>
+        <w:jc w:val="left"/>
+      </w:pPr>
+      <w:r>
+        <w:rPr>
+          <w:rStyle w:val="Kommentarzeichen"/>
+        </w:rPr>
+        <w:annotationRef/>
+      </w:r>
+      <w:r>
+        <w:rPr>
+          <w:lang w:val="de-AT"/>
+        </w:rPr>
         <w:t>Vielleicht unnötig</w:t>
       </w:r>
     </w:p>
   </w:comment>
-  <w:comment w:id="49" w:author="GRANEGGER Felix, SchülerIn" w:date="2026-02-07T10:10:00Z" w:initials="FG">
+  <w:comment w:id="50" w:author="GRANEGGER Felix, SchülerIn" w:date="2026-02-07T10:10:00Z" w:initials="FG">
     <w:p>
       <w:pPr>
         <w:pStyle w:val="Kommentartext"/>
@@ -9776,7 +10489,27 @@
       </w:hyperlink>
     </w:p>
   </w:comment>
-  <w:comment w:id="52" w:author="GRANEGGER Felix, SchülerIn" w:date="2026-02-07T10:01:00Z" w:initials="FG">
+  <w:comment w:id="52" w:author="GRANEGGER Felix, SchülerIn" w:date="2026-02-18T20:53:00Z" w:initials="FG">
+    <w:p>
+      <w:pPr>
+        <w:pStyle w:val="Kommentartext"/>
+        <w:jc w:val="left"/>
+      </w:pPr>
+      <w:r>
+        <w:rPr>
+          <w:rStyle w:val="Kommentarzeichen"/>
+        </w:rPr>
+        <w:annotationRef/>
+      </w:r>
+      <w:r>
+        <w:rPr>
+          <w:lang w:val="de-AT"/>
+        </w:rPr>
+        <w:t>verbessern</w:t>
+      </w:r>
+    </w:p>
+  </w:comment>
+  <w:comment w:id="54" w:author="GRANEGGER Felix, SchülerIn" w:date="2026-02-07T10:01:00Z" w:initials="FG">
     <w:p>
       <w:pPr>
         <w:pStyle w:val="Kommentartext"/>
@@ -9798,7 +10531,7 @@
       </w:hyperlink>
     </w:p>
   </w:comment>
-  <w:comment w:id="53" w:author="GRANEGGER Felix, SchülerIn" w:date="2026-02-18T20:44:00Z" w:initials="FG">
+  <w:comment w:id="55" w:author="GRANEGGER Felix, SchülerIn" w:date="2026-02-18T20:44:00Z" w:initials="FG">
     <w:p>
       <w:pPr>
         <w:pStyle w:val="Kommentartext"/>
@@ -9817,6 +10550,46 @@
           <w:lang w:val="de-AT"/>
         </w:rPr>
         <w:t>Barcodev02.py</w:t>
+      </w:r>
+    </w:p>
+  </w:comment>
+  <w:comment w:id="57" w:author="GRANEGGER Felix, SchülerIn" w:date="2026-02-18T20:53:00Z" w:initials="FG">
+    <w:p>
+      <w:pPr>
+        <w:pStyle w:val="Kommentartext"/>
+        <w:jc w:val="left"/>
+      </w:pPr>
+      <w:r>
+        <w:rPr>
+          <w:rStyle w:val="Kommentarzeichen"/>
+        </w:rPr>
+        <w:annotationRef/>
+      </w:r>
+      <w:r>
+        <w:rPr>
+          <w:lang w:val="de-AT"/>
+        </w:rPr>
+        <w:t>Verbessern</w:t>
+      </w:r>
+    </w:p>
+  </w:comment>
+  <w:comment w:id="59" w:author="GRANEGGER Felix, SchülerIn" w:date="2026-02-18T20:53:00Z" w:initials="FG">
+    <w:p>
+      <w:pPr>
+        <w:pStyle w:val="Kommentartext"/>
+        <w:jc w:val="left"/>
+      </w:pPr>
+      <w:r>
+        <w:rPr>
+          <w:rStyle w:val="Kommentarzeichen"/>
+        </w:rPr>
+        <w:annotationRef/>
+      </w:r>
+      <w:r>
+        <w:rPr>
+          <w:lang w:val="de-AT"/>
+        </w:rPr>
+        <w:t>Genauer beschreiben</w:t>
       </w:r>
     </w:p>
   </w:comment>
@@ -9825,28 +10598,40 @@
 
 <file path=word/commentsExtended.xml><?xml version="1.0" encoding="utf-8"?>
 <w15:commentsEx xmlns:wpc="http://schemas.microsoft.com/office/word/2010/wordprocessingCanvas" xmlns:cx="http://schemas.microsoft.com/office/drawing/2014/chartex" xmlns:cx1="http://schemas.microsoft.com/office/drawing/2015/9/8/chartex" xmlns:cx2="http://schemas.microsoft.com/office/drawing/2015/10/21/chartex" xmlns:cx3="http://schemas.microsoft.com/office/drawing/2016/5/9/chartex" xmlns:cx4="http://schemas.microsoft.com/office/drawing/2016/5/10/chartex" xmlns:cx5="http://schemas.microsoft.com/office/drawing/2016/5/11/chartex" xmlns:cx6="http://schemas.microsoft.com/office/drawing/2016/5/12/chartex" xmlns:cx7="http://schemas.microsoft.com/office/drawing/2016/5/13/chartex" xmlns:cx8="http://schemas.microsoft.com/office/drawing/2016/5/14/chartex" xmlns:mc="http://schemas.openxmlformats.org/markup-compatibility/2006" xmlns:aink="http://schemas.microsoft.com/office/drawing/2016/ink" xmlns:am3d="http://schemas.microsoft.com/office/drawing/2017/model3d" xmlns:o="urn:schemas-microsoft-com:office:office" xmlns:oel="http://schemas.microsoft.com/office/2019/extlst" xmlns:r="http://schemas.openxmlformats.org/officeDocument/2006/relationships" xmlns:m="http://schemas.openxmlformats.org/officeDocument/2006/math" xmlns:v="urn:schemas-microsoft-com:vml" xmlns:wp14="http://schemas.microsoft.com/office/word/2010/wordprocessingDrawing" xmlns:wp="http://schemas.openxmlformats.org/drawingml/2006/wordprocessingDrawing" xmlns:w10="urn:schemas-microsoft-com:office:word" xmlns:w="http://schemas.openxmlformats.org/wordprocessingml/2006/main" xmlns:w14="http://schemas.microsoft.com/office/word/2010/wordml" xmlns:w15="http://schemas.microsoft.com/office/word/2012/wordml" xmlns:w16cex="http://schemas.microsoft.com/office/word/2018/wordml/cex" xmlns:w16cid="http://schemas.microsoft.com/office/word/2016/wordml/cid" xmlns:w16="http://schemas.microsoft.com/office/word/2018/wordml" xmlns:w16du="http://schemas.microsoft.com/office/word/2023/wordml/word16du" xmlns:w16sdtdh="http://schemas.microsoft.com/office/word/2020/wordml/sdtdatahash" xmlns:w16sdtfl="http://schemas.microsoft.com/office/word/2024/wordml/sdtformatlock" xmlns:w16se="http://schemas.microsoft.com/office/word/2015/wordml/symex" xmlns:wpg="http://schemas.microsoft.com/office/word/2010/wordprocessingGroup" xmlns:wpi="http://schemas.microsoft.com/office/word/2010/wordprocessingInk" xmlns:wne="http://schemas.microsoft.com/office/word/2006/wordml" xmlns:wps="http://schemas.microsoft.com/office/word/2010/wordprocessingShape" mc:Ignorable="w14 w15 w16se w16cid w16 w16cex w16sdtdh w16sdtfl w16du wp14">
+  <w15:commentEx w15:paraId="175C2077" w15:done="0"/>
   <w15:commentEx w15:paraId="27BE2ACC" w15:done="0"/>
   <w15:commentEx w15:paraId="69C786DA" w15:done="0"/>
+  <w15:commentEx w15:paraId="0D9638B2" w15:done="0"/>
   <w15:commentEx w15:paraId="4BEC553D" w15:done="0"/>
   <w15:commentEx w15:paraId="063CF687" w15:done="0"/>
+  <w15:commentEx w15:paraId="43C01025" w15:done="0"/>
+  <w15:commentEx w15:paraId="5C9F185F" w15:done="0"/>
 </w15:commentsEx>
 </file>
 
 <file path=word/commentsExtensible.xml><?xml version="1.0" encoding="utf-8"?>
 <w16cex:commentsExtensible xmlns:wpc="http://schemas.microsoft.com/office/word/2010/wordprocessingCanvas" xmlns:cx="http://schemas.microsoft.com/office/drawing/2014/chartex" xmlns:cx1="http://schemas.microsoft.com/office/drawing/2015/9/8/chartex" xmlns:cx2="http://schemas.microsoft.com/office/drawing/2015/10/21/chartex" xmlns:cx3="http://schemas.microsoft.com/office/drawing/2016/5/9/chartex" xmlns:cx4="http://schemas.microsoft.com/office/drawing/2016/5/10/chartex" xmlns:cx5="http://schemas.microsoft.com/office/drawing/2016/5/11/chartex" xmlns:cx6="http://schemas.microsoft.com/office/drawing/2016/5/12/chartex" xmlns:cx7="http://schemas.microsoft.com/office/drawing/2016/5/13/chartex" xmlns:cx8="http://schemas.microsoft.com/office/drawing/2016/5/14/chartex" xmlns:cr="http://schemas.microsoft.com/office/comments/2020/reactions" xmlns:mc="http://schemas.openxmlformats.org/markup-compatibility/2006" xmlns:aink="http://schemas.microsoft.com/office/drawing/2016/ink" xmlns:am3d="http://schemas.microsoft.com/office/drawing/2017/model3d" xmlns:o="urn:schemas-microsoft-com:office:office" xmlns:oel="http://schemas.microsoft.com/office/2019/extlst" xmlns:r="http://schemas.openxmlformats.org/officeDocument/2006/relationships" xmlns:m="http://schemas.openxmlformats.org/officeDocument/2006/math" xmlns:v="urn:schemas-microsoft-com:vml" xmlns:wp14="http://schemas.microsoft.com/office/word/2010/wordprocessingDrawing" xmlns:wp="http://schemas.openxmlformats.org/drawingml/2006/wordprocessingDrawing" xmlns:w10="urn:schemas-microsoft-com:office:word" xmlns:w="http://schemas.openxmlformats.org/wordprocessingml/2006/main" xmlns:w14="http://schemas.microsoft.com/office/word/2010/wordml" xmlns:w15="http://schemas.microsoft.com/office/word/2012/wordml" xmlns:w16cex="http://schemas.microsoft.com/office/word/2018/wordml/cex" xmlns:w16cid="http://schemas.microsoft.com/office/word/2016/wordml/cid" xmlns:w16="http://schemas.microsoft.com/office/word/2018/wordml" xmlns:w16du="http://schemas.microsoft.com/office/word/2023/wordml/word16du" xmlns:w16sdtdh="http://schemas.microsoft.com/office/word/2020/wordml/sdtdatahash" xmlns:w16sdtfl="http://schemas.microsoft.com/office/word/2024/wordml/sdtformatlock" xmlns:w16se="http://schemas.microsoft.com/office/word/2015/wordml/symex" xmlns:wpg="http://schemas.microsoft.com/office/word/2010/wordprocessingGroup" xmlns:wpi="http://schemas.microsoft.com/office/word/2010/wordprocessingInk" xmlns:wne="http://schemas.microsoft.com/office/word/2006/wordml" xmlns:wps="http://schemas.microsoft.com/office/word/2010/wordprocessingShape" mc:Ignorable="w14 w15 w16se w16cid w16 w16cex w16sdtdh w16sdtfl cr w16du wp14">
+  <w16cex:commentExtensible w16cex:durableId="690105D3" w16cex:dateUtc="2026-02-18T20:00:00Z"/>
   <w16cex:commentExtensible w16cex:durableId="522987CD" w16cex:dateUtc="2026-02-18T19:29:00Z"/>
   <w16cex:commentExtensible w16cex:durableId="693A552F" w16cex:dateUtc="2026-02-07T09:10:00Z"/>
+  <w16cex:commentExtensible w16cex:durableId="5E442B2D" w16cex:dateUtc="2026-02-18T19:53:00Z"/>
   <w16cex:commentExtensible w16cex:durableId="3487A857" w16cex:dateUtc="2026-02-07T09:01:00Z"/>
   <w16cex:commentExtensible w16cex:durableId="0B36FA17" w16cex:dateUtc="2026-02-18T19:44:00Z"/>
+  <w16cex:commentExtensible w16cex:durableId="48BA235E" w16cex:dateUtc="2026-02-18T19:53:00Z"/>
+  <w16cex:commentExtensible w16cex:durableId="02CEEAE4" w16cex:dateUtc="2026-02-18T19:53:00Z"/>
 </w16cex:commentsExtensible>
 </file>
 
 <file path=word/commentsIds.xml><?xml version="1.0" encoding="utf-8"?>
 <w16cid:commentsIds xmlns:wpc="http://schemas.microsoft.com/office/word/2010/wordprocessingCanvas" xmlns:cx="http://schemas.microsoft.com/office/drawing/2014/chartex" xmlns:cx1="http://schemas.microsoft.com/office/drawing/2015/9/8/chartex" xmlns:cx2="http://schemas.microsoft.com/office/drawing/2015/10/21/chartex" xmlns:cx3="http://schemas.microsoft.com/office/drawing/2016/5/9/chartex" xmlns:cx4="http://schemas.microsoft.com/office/drawing/2016/5/10/chartex" xmlns:cx5="http://schemas.microsoft.com/office/drawing/2016/5/11/chartex" xmlns:cx6="http://schemas.microsoft.com/office/drawing/2016/5/12/chartex" xmlns:cx7="http://schemas.microsoft.com/office/drawing/2016/5/13/chartex" xmlns:cx8="http://schemas.microsoft.com/office/drawing/2016/5/14/chartex" xmlns:mc="http://schemas.openxmlformats.org/markup-compatibility/2006" xmlns:aink="http://schemas.microsoft.com/office/drawing/2016/ink" xmlns:am3d="http://schemas.microsoft.com/office/drawing/2017/model3d" xmlns:o="urn:schemas-microsoft-com:office:office" xmlns:oel="http://schemas.microsoft.com/office/2019/extlst" xmlns:r="http://schemas.openxmlformats.org/officeDocument/2006/relationships" xmlns:m="http://schemas.openxmlformats.org/officeDocument/2006/math" xmlns:v="urn:schemas-microsoft-com:vml" xmlns:wp14="http://schemas.microsoft.com/office/word/2010/wordprocessingDrawing" xmlns:wp="http://schemas.openxmlformats.org/drawingml/2006/wordprocessingDrawing" xmlns:w10="urn:schemas-microsoft-com:office:word" xmlns:w="http://schemas.openxmlformats.org/wordprocessingml/2006/main" xmlns:w14="http://schemas.microsoft.com/office/word/2010/wordml" xmlns:w15="http://schemas.microsoft.com/office/word/2012/wordml" xmlns:w16cex="http://schemas.microsoft.com/office/word/2018/wordml/cex" xmlns:w16cid="http://schemas.microsoft.com/office/word/2016/wordml/cid" xmlns:w16="http://schemas.microsoft.com/office/word/2018/wordml" xmlns:w16du="http://schemas.microsoft.com/office/word/2023/wordml/word16du" xmlns:w16sdtdh="http://schemas.microsoft.com/office/word/2020/wordml/sdtdatahash" xmlns:w16sdtfl="http://schemas.microsoft.com/office/word/2024/wordml/sdtformatlock" xmlns:w16se="http://schemas.microsoft.com/office/word/2015/wordml/symex" xmlns:wpg="http://schemas.microsoft.com/office/word/2010/wordprocessingGroup" xmlns:wpi="http://schemas.microsoft.com/office/word/2010/wordprocessingInk" xmlns:wne="http://schemas.microsoft.com/office/word/2006/wordml" xmlns:wps="http://schemas.microsoft.com/office/word/2010/wordprocessingShape" mc:Ignorable="w14 w15 w16se w16cid w16 w16cex w16sdtdh w16sdtfl w16du wp14">
+  <w16cid:commentId w16cid:paraId="175C2077" w16cid:durableId="690105D3"/>
   <w16cid:commentId w16cid:paraId="27BE2ACC" w16cid:durableId="522987CD"/>
   <w16cid:commentId w16cid:paraId="69C786DA" w16cid:durableId="693A552F"/>
+  <w16cid:commentId w16cid:paraId="0D9638B2" w16cid:durableId="5E442B2D"/>
   <w16cid:commentId w16cid:paraId="4BEC553D" w16cid:durableId="3487A857"/>
   <w16cid:commentId w16cid:paraId="063CF687" w16cid:durableId="0B36FA17"/>
+  <w16cid:commentId w16cid:paraId="43C01025" w16cid:durableId="48BA235E"/>
+  <w16cid:commentId w16cid:paraId="5C9F185F" w16cid:durableId="02CEEAE4"/>
 </w16cid:commentsIds>
 </file>
 
@@ -10028,8 +10813,13 @@
       </w:pBdr>
     </w:pPr>
     <w:r>
-      <w:t>Granegger Felix</w:t>
+      <w:t xml:space="preserve">Granegger </w:t>
     </w:r>
+    <w:proofErr w:type="gramStart"/>
+    <w:r>
+      <w:t>Felix</w:t>
+    </w:r>
+    <w:proofErr w:type="gramEnd"/>
     <w:r>
       <w:tab/>
       <w:t xml:space="preserve">Kapitel </w:t>
@@ -10672,7 +11462,15 @@
       <w:fldChar w:fldCharType="separate"/>
     </w:r>
     <w:r>
-      <w:t xml:space="preserve">Dokumentation Schiechtl Alexander </w:t>
+      <w:t xml:space="preserve">Dokumentation </w:t>
+    </w:r>
+    <w:proofErr w:type="spellStart"/>
+    <w:r>
+      <w:t>Schiechtl</w:t>
+    </w:r>
+    <w:proofErr w:type="spellEnd"/>
+    <w:r>
+      <w:t xml:space="preserve"> Alexander </w:t>
     </w:r>
     <w:r>
       <w:fldChar w:fldCharType="end"/>

</xml_diff>